<commit_message>
update on 2025-11-08 04:33:46.059850
</commit_message>
<xml_diff>
--- a/py 深度学习.docx
+++ b/py 深度学习.docx
@@ -848,7 +848,7 @@
       <w:tblGrid>
         <w:gridCol w:w="1057"/>
         <w:gridCol w:w="3326"/>
-        <w:gridCol w:w="2937"/>
+        <w:gridCol w:w="2254"/>
       </w:tblGrid>
       <w:tr>
         <w:tblPrEx>
@@ -1079,7 +1079,7 @@
                   </w14:solidFill>
                 </w14:textFill>
               </w:rPr>
-              <w:t>实例化onnx文件的</w:t>
+              <w:t>onnx文件的</w:t>
             </w:r>
             <w:r>
               <w:rPr>
@@ -1102,6 +1102,12 @@
             <w:insideH w:val="single" w:color="auto" w:sz="4" w:space="0"/>
             <w:insideV w:val="single" w:color="auto" w:sz="4" w:space="0"/>
           </w:tblBorders>
+          <w:tblCellMar>
+            <w:top w:w="0" w:type="dxa"/>
+            <w:left w:w="108" w:type="dxa"/>
+            <w:bottom w:w="0" w:type="dxa"/>
+            <w:right w:w="108" w:type="dxa"/>
+          </w:tblCellMar>
         </w:tblPrEx>
         <w:tc>
           <w:tcPr>
@@ -2334,18 +2340,6 @@
             <w:r>
               <w:rPr>
                 <w:rFonts w:hint="eastAsia"/>
-                <w:color w:val="ED7D31" w:themeColor="accent2"/>
-                <w14:textFill>
-                  <w14:solidFill>
-                    <w14:schemeClr w14:val="accent2"/>
-                  </w14:solidFill>
-                </w14:textFill>
-              </w:rPr>
-              <w:t>实例化</w:t>
-            </w:r>
-            <w:r>
-              <w:rPr>
-                <w:rFonts w:hint="eastAsia"/>
                 <w:color w:val="EA82F1"/>
                 <w:szCs w:val="24"/>
               </w:rPr>
@@ -2356,14 +2350,6 @@
       </w:tr>
       <w:tr>
         <w:tblPrEx>
-          <w:tblBorders>
-            <w:top w:val="single" w:color="auto" w:sz="4" w:space="0"/>
-            <w:left w:val="single" w:color="auto" w:sz="4" w:space="0"/>
-            <w:bottom w:val="single" w:color="auto" w:sz="4" w:space="0"/>
-            <w:right w:val="single" w:color="auto" w:sz="4" w:space="0"/>
-            <w:insideH w:val="single" w:color="auto" w:sz="4" w:space="0"/>
-            <w:insideV w:val="single" w:color="auto" w:sz="4" w:space="0"/>
-          </w:tblBorders>
           <w:tblCellMar>
             <w:top w:w="0" w:type="dxa"/>
             <w:left w:w="108" w:type="dxa"/>
@@ -2665,7 +2651,7 @@
       <w:tblGrid>
         <w:gridCol w:w="1057"/>
         <w:gridCol w:w="2603"/>
-        <w:gridCol w:w="1688"/>
+        <w:gridCol w:w="1343"/>
       </w:tblGrid>
       <w:tr>
         <w:tblPrEx>
@@ -2734,18 +2720,6 @@
                 </w14:textFill>
               </w:rPr>
             </w:pPr>
-            <w:r>
-              <w:rPr>
-                <w:rFonts w:hint="eastAsia"/>
-                <w:color w:val="ED7D31" w:themeColor="accent2"/>
-                <w14:textFill>
-                  <w14:solidFill>
-                    <w14:schemeClr w14:val="accent2"/>
-                  </w14:solidFill>
-                </w14:textFill>
-              </w:rPr>
-              <w:t>实例化</w:t>
-            </w:r>
             <w:r>
               <w:rPr>
                 <w:rFonts w:hint="eastAsia"/>
@@ -6830,19 +6804,6 @@
             <w:r>
               <w:rPr>
                 <w:rFonts w:hint="eastAsia"/>
-                <w:color w:val="ED7D31" w:themeColor="accent2"/>
-                <w:spacing w:val="7"/>
-                <w14:textFill>
-                  <w14:solidFill>
-                    <w14:schemeClr w14:val="accent2"/>
-                  </w14:solidFill>
-                </w14:textFill>
-              </w:rPr>
-              <w:t>实例化</w:t>
-            </w:r>
-            <w:r>
-              <w:rPr>
-                <w:rFonts w:hint="eastAsia"/>
                 <w:color w:val="EA82F1"/>
                 <w:spacing w:val="7"/>
               </w:rPr>
@@ -7493,7 +7454,7 @@
       <w:tblGrid>
         <w:gridCol w:w="1482"/>
         <w:gridCol w:w="4990"/>
-        <w:gridCol w:w="2683"/>
+        <w:gridCol w:w="2030"/>
       </w:tblGrid>
       <w:tr>
         <w:tblPrEx>
@@ -7702,19 +7663,6 @@
                 <w:spacing w:val="7"/>
               </w:rPr>
             </w:pPr>
-            <w:r>
-              <w:rPr>
-                <w:rFonts w:hint="eastAsia"/>
-                <w:color w:val="ED7D31" w:themeColor="accent2"/>
-                <w:spacing w:val="7"/>
-                <w14:textFill>
-                  <w14:solidFill>
-                    <w14:schemeClr w14:val="accent2"/>
-                  </w14:solidFill>
-                </w14:textFill>
-              </w:rPr>
-              <w:t>实例化</w:t>
-            </w:r>
             <w:r>
               <w:rPr>
                 <w:rFonts w:hint="eastAsia"/>
@@ -7914,8 +7862,8 @@
           <w:color w:val="00B0F0"/>
         </w:rPr>
       </w:pPr>
-      <w:bookmarkStart w:id="9" w:name="_Toc30205"/>
-      <w:bookmarkStart w:id="10" w:name="_Toc19634"/>
+      <w:bookmarkStart w:id="9" w:name="_Toc19634"/>
+      <w:bookmarkStart w:id="10" w:name="_Toc30205"/>
       <w:r>
         <w:rPr>
           <w:rFonts w:hint="eastAsia"/>
@@ -7954,14 +7902,6 @@
       </w:tblGrid>
       <w:tr>
         <w:tblPrEx>
-          <w:tblBorders>
-            <w:top w:val="single" w:color="auto" w:sz="4" w:space="0"/>
-            <w:left w:val="single" w:color="auto" w:sz="4" w:space="0"/>
-            <w:bottom w:val="single" w:color="auto" w:sz="4" w:space="0"/>
-            <w:right w:val="single" w:color="auto" w:sz="4" w:space="0"/>
-            <w:insideH w:val="single" w:color="auto" w:sz="4" w:space="0"/>
-            <w:insideV w:val="single" w:color="auto" w:sz="4" w:space="0"/>
-          </w:tblBorders>
           <w:tblCellMar>
             <w:top w:w="0" w:type="dxa"/>
             <w:left w:w="108" w:type="dxa"/>
@@ -9036,6 +8976,12 @@
             <w:insideH w:val="single" w:color="auto" w:sz="4" w:space="0"/>
             <w:insideV w:val="single" w:color="auto" w:sz="4" w:space="0"/>
           </w:tblBorders>
+          <w:tblCellMar>
+            <w:top w:w="0" w:type="dxa"/>
+            <w:left w:w="108" w:type="dxa"/>
+            <w:bottom w:w="0" w:type="dxa"/>
+            <w:right w:w="108" w:type="dxa"/>
+          </w:tblCellMar>
         </w:tblPrEx>
         <w:tc>
           <w:tcPr>
@@ -10115,6 +10061,12 @@
             <w:insideH w:val="single" w:color="auto" w:sz="4" w:space="0"/>
             <w:insideV w:val="single" w:color="auto" w:sz="4" w:space="0"/>
           </w:tblBorders>
+          <w:tblCellMar>
+            <w:top w:w="0" w:type="dxa"/>
+            <w:left w:w="108" w:type="dxa"/>
+            <w:bottom w:w="0" w:type="dxa"/>
+            <w:right w:w="108" w:type="dxa"/>
+          </w:tblCellMar>
         </w:tblPrEx>
         <w:tc>
           <w:tcPr>
@@ -10446,18 +10398,6 @@
             <w:r>
               <w:rPr>
                 <w:rFonts w:hint="eastAsia"/>
-                <w:color w:val="ED7D31" w:themeColor="accent2"/>
-                <w14:textFill>
-                  <w14:solidFill>
-                    <w14:schemeClr w14:val="accent2"/>
-                  </w14:solidFill>
-                </w14:textFill>
-              </w:rPr>
-              <w:t>实例化</w:t>
-            </w:r>
-            <w:r>
-              <w:rPr>
-                <w:rFonts w:hint="eastAsia"/>
                 <w:color w:val="EA82F1"/>
                 <w:szCs w:val="24"/>
                 <w:lang w:val="en-US" w:eastAsia="zh-CN"/>
@@ -12264,6 +12204,12 @@
             <w:insideH w:val="single" w:color="auto" w:sz="4" w:space="0"/>
             <w:insideV w:val="single" w:color="auto" w:sz="4" w:space="0"/>
           </w:tblBorders>
+          <w:tblCellMar>
+            <w:top w:w="0" w:type="dxa"/>
+            <w:left w:w="108" w:type="dxa"/>
+            <w:bottom w:w="0" w:type="dxa"/>
+            <w:right w:w="108" w:type="dxa"/>
+          </w:tblCellMar>
         </w:tblPrEx>
         <w:tc>
           <w:tcPr>
@@ -13548,18 +13494,6 @@
             <w:r>
               <w:rPr>
                 <w:rFonts w:hint="eastAsia"/>
-                <w:color w:val="ED7D31" w:themeColor="accent2"/>
-                <w14:textFill>
-                  <w14:solidFill>
-                    <w14:schemeClr w14:val="accent2"/>
-                  </w14:solidFill>
-                </w14:textFill>
-              </w:rPr>
-              <w:t>实例化</w:t>
-            </w:r>
-            <w:r>
-              <w:rPr>
-                <w:rFonts w:hint="eastAsia"/>
                 <w:color w:val="EA82F1"/>
                 <w:szCs w:val="24"/>
                 <w:lang w:val="en-US" w:eastAsia="zh-CN"/>
@@ -13683,8 +13617,6 @@
           </w14:textFill>
         </w:rPr>
       </w:pPr>
-      <w:bookmarkStart w:id="44" w:name="_GoBack"/>
-      <w:bookmarkEnd w:id="44"/>
     </w:p>
     <w:p>
       <w:pPr>
@@ -14247,7 +14179,7 @@
       <w:tblGrid>
         <w:gridCol w:w="1057"/>
         <w:gridCol w:w="3443"/>
-        <w:gridCol w:w="1688"/>
+        <w:gridCol w:w="1057"/>
       </w:tblGrid>
       <w:tr>
         <w:tblPrEx>
@@ -14308,18 +14240,6 @@
                 </w14:textFill>
               </w:rPr>
             </w:pPr>
-            <w:r>
-              <w:rPr>
-                <w:rFonts w:hint="eastAsia"/>
-                <w:color w:val="ED7D31" w:themeColor="accent2"/>
-                <w14:textFill>
-                  <w14:solidFill>
-                    <w14:schemeClr w14:val="accent2"/>
-                  </w14:solidFill>
-                </w14:textFill>
-              </w:rPr>
-              <w:t>实例化</w:t>
-            </w:r>
             <w:r>
               <w:rPr>
                 <w:rFonts w:hint="eastAsia"/>
@@ -15037,6 +14957,12 @@
             <w:insideH w:val="single" w:color="auto" w:sz="4" w:space="0"/>
             <w:insideV w:val="single" w:color="auto" w:sz="4" w:space="0"/>
           </w:tblBorders>
+          <w:tblCellMar>
+            <w:top w:w="0" w:type="dxa"/>
+            <w:left w:w="108" w:type="dxa"/>
+            <w:bottom w:w="0" w:type="dxa"/>
+            <w:right w:w="108" w:type="dxa"/>
+          </w:tblCellMar>
         </w:tblPrEx>
         <w:tc>
           <w:tcPr>
@@ -16255,7 +16181,7 @@
       </w:tblPr>
       <w:tblGrid>
         <w:gridCol w:w="2149"/>
-        <w:gridCol w:w="2739"/>
+        <w:gridCol w:w="2108"/>
       </w:tblGrid>
       <w:tr>
         <w:tblPrEx>
@@ -16310,18 +16236,6 @@
                 </w14:textFill>
               </w:rPr>
             </w:pPr>
-            <w:r>
-              <w:rPr>
-                <w:rFonts w:hint="eastAsia"/>
-                <w:color w:val="ED7D31" w:themeColor="accent2"/>
-                <w14:textFill>
-                  <w14:solidFill>
-                    <w14:schemeClr w14:val="accent2"/>
-                  </w14:solidFill>
-                </w14:textFill>
-              </w:rPr>
-              <w:t>实例化</w:t>
-            </w:r>
             <w:r>
               <w:rPr>
                 <w:rFonts w:hint="eastAsia"/>
@@ -16428,18 +16342,6 @@
                 </w14:textFill>
               </w:rPr>
             </w:pPr>
-            <w:r>
-              <w:rPr>
-                <w:rFonts w:hint="eastAsia"/>
-                <w:color w:val="ED7D31" w:themeColor="accent2"/>
-                <w14:textFill>
-                  <w14:solidFill>
-                    <w14:schemeClr w14:val="accent2"/>
-                  </w14:solidFill>
-                </w14:textFill>
-              </w:rPr>
-              <w:t>实例化</w:t>
-            </w:r>
             <w:r>
               <w:rPr>
                 <w:rFonts w:hint="eastAsia"/>
@@ -17552,6 +17454,12 @@
             <w:insideH w:val="single" w:color="auto" w:sz="4" w:space="0"/>
             <w:insideV w:val="single" w:color="auto" w:sz="4" w:space="0"/>
           </w:tblBorders>
+          <w:tblCellMar>
+            <w:top w:w="0" w:type="dxa"/>
+            <w:left w:w="108" w:type="dxa"/>
+            <w:bottom w:w="0" w:type="dxa"/>
+            <w:right w:w="108" w:type="dxa"/>
+          </w:tblCellMar>
         </w:tblPrEx>
         <w:tc>
           <w:tcPr>
@@ -17794,7 +17702,7 @@
       <w:tblGrid>
         <w:gridCol w:w="1689"/>
         <w:gridCol w:w="3898"/>
-        <w:gridCol w:w="2108"/>
+        <w:gridCol w:w="1478"/>
       </w:tblGrid>
       <w:tr>
         <w:tblPrEx>
@@ -17862,19 +17770,6 @@
                 </w14:textFill>
               </w:rPr>
             </w:pPr>
-            <w:r>
-              <w:rPr>
-                <w:rFonts w:hint="eastAsia"/>
-                <w:color w:val="ED7D31" w:themeColor="accent2"/>
-                <w:lang w:val="en-US" w:eastAsia="zh-CN"/>
-                <w14:textFill>
-                  <w14:solidFill>
-                    <w14:schemeClr w14:val="accent2"/>
-                  </w14:solidFill>
-                </w14:textFill>
-              </w:rPr>
-              <w:t>实例化</w:t>
-            </w:r>
             <w:r>
               <w:rPr>
                 <w:rFonts w:hint="eastAsia"/>
@@ -18035,7 +17930,7 @@
       <w:tblGrid>
         <w:gridCol w:w="2270"/>
         <w:gridCol w:w="3162"/>
-        <w:gridCol w:w="1898"/>
+        <w:gridCol w:w="1562"/>
       </w:tblGrid>
       <w:tr>
         <w:tblPrEx>
@@ -18105,19 +18000,6 @@
                 </w14:textFill>
               </w:rPr>
             </w:pPr>
-            <w:r>
-              <w:rPr>
-                <w:rFonts w:hint="eastAsia"/>
-                <w:color w:val="ED7D31" w:themeColor="accent2"/>
-                <w:lang w:val="en-US" w:eastAsia="zh-CN"/>
-                <w14:textFill>
-                  <w14:solidFill>
-                    <w14:schemeClr w14:val="accent2"/>
-                  </w14:solidFill>
-                </w14:textFill>
-              </w:rPr>
-              <w:t>实例化</w:t>
-            </w:r>
             <w:r>
               <w:rPr>
                 <w:rFonts w:hint="eastAsia"/>
@@ -18684,12 +18566,6 @@
             <w:insideH w:val="single" w:color="auto" w:sz="4" w:space="0"/>
             <w:insideV w:val="single" w:color="auto" w:sz="4" w:space="0"/>
           </w:tblBorders>
-          <w:tblCellMar>
-            <w:top w:w="0" w:type="dxa"/>
-            <w:left w:w="108" w:type="dxa"/>
-            <w:bottom w:w="0" w:type="dxa"/>
-            <w:right w:w="108" w:type="dxa"/>
-          </w:tblCellMar>
         </w:tblPrEx>
         <w:trPr>
           <w:trHeight w:val="302" w:hRule="atLeast"/>
@@ -19317,19 +19193,6 @@
             <w:r>
               <w:rPr>
                 <w:rFonts w:hint="eastAsia"/>
-                <w:color w:val="ED7D31" w:themeColor="accent2"/>
-                <w:spacing w:val="7"/>
-                <w14:textFill>
-                  <w14:solidFill>
-                    <w14:schemeClr w14:val="accent2"/>
-                  </w14:solidFill>
-                </w14:textFill>
-              </w:rPr>
-              <w:t>实例化</w:t>
-            </w:r>
-            <w:r>
-              <w:rPr>
-                <w:rFonts w:hint="eastAsia"/>
                 <w:color w:val="EA82F1"/>
                 <w:spacing w:val="7"/>
                 <w:lang w:val="en-US" w:eastAsia="zh-CN"/>
@@ -19465,19 +19328,6 @@
                 <w:lang w:val="en-US" w:eastAsia="zh-CN" w:bidi="ar-SA"/>
               </w:rPr>
             </w:pPr>
-            <w:r>
-              <w:rPr>
-                <w:rFonts w:hint="eastAsia"/>
-                <w:color w:val="ED7D31" w:themeColor="accent2"/>
-                <w:spacing w:val="7"/>
-                <w14:textFill>
-                  <w14:solidFill>
-                    <w14:schemeClr w14:val="accent2"/>
-                  </w14:solidFill>
-                </w14:textFill>
-              </w:rPr>
-              <w:t>实例化</w:t>
-            </w:r>
             <w:r>
               <w:rPr>
                 <w:rFonts w:hint="eastAsia"/>
@@ -22111,7 +21961,7 @@
       <w:tblGrid>
         <w:gridCol w:w="3746"/>
         <w:gridCol w:w="3196"/>
-        <w:gridCol w:w="2712"/>
+        <w:gridCol w:w="2315"/>
       </w:tblGrid>
       <w:tr>
         <w:tblPrEx>
@@ -22804,12 +22654,6 @@
             <w:insideH w:val="single" w:color="auto" w:sz="4" w:space="0"/>
             <w:insideV w:val="single" w:color="auto" w:sz="4" w:space="0"/>
           </w:tblBorders>
-          <w:tblCellMar>
-            <w:top w:w="0" w:type="dxa"/>
-            <w:left w:w="108" w:type="dxa"/>
-            <w:bottom w:w="0" w:type="dxa"/>
-            <w:right w:w="108" w:type="dxa"/>
-          </w:tblCellMar>
         </w:tblPrEx>
         <w:tc>
           <w:tcPr>
@@ -23742,7 +23586,7 @@
       </w:tblPr>
       <w:tblGrid>
         <w:gridCol w:w="5125"/>
-        <w:gridCol w:w="4537"/>
+        <w:gridCol w:w="4402"/>
       </w:tblGrid>
       <w:tr>
         <w:tblPrEx>
@@ -25306,6 +25150,12 @@
             <w:insideH w:val="single" w:color="auto" w:sz="4" w:space="0"/>
             <w:insideV w:val="single" w:color="auto" w:sz="4" w:space="0"/>
           </w:tblBorders>
+          <w:tblCellMar>
+            <w:top w:w="0" w:type="dxa"/>
+            <w:left w:w="108" w:type="dxa"/>
+            <w:bottom w:w="0" w:type="dxa"/>
+            <w:right w:w="108" w:type="dxa"/>
+          </w:tblCellMar>
         </w:tblPrEx>
         <w:tc>
           <w:tcPr>
@@ -28841,6 +28691,12 @@
             <w:insideH w:val="single" w:color="auto" w:sz="4" w:space="0"/>
             <w:insideV w:val="single" w:color="auto" w:sz="4" w:space="0"/>
           </w:tblBorders>
+          <w:tblCellMar>
+            <w:top w:w="0" w:type="dxa"/>
+            <w:left w:w="108" w:type="dxa"/>
+            <w:bottom w:w="0" w:type="dxa"/>
+            <w:right w:w="108" w:type="dxa"/>
+          </w:tblCellMar>
         </w:tblPrEx>
         <w:tc>
           <w:tcPr>
@@ -31304,12 +31160,6 @@
             <w:insideH w:val="single" w:color="auto" w:sz="4" w:space="0"/>
             <w:insideV w:val="single" w:color="auto" w:sz="4" w:space="0"/>
           </w:tblBorders>
-          <w:tblCellMar>
-            <w:top w:w="0" w:type="dxa"/>
-            <w:left w:w="108" w:type="dxa"/>
-            <w:bottom w:w="0" w:type="dxa"/>
-            <w:right w:w="108" w:type="dxa"/>
-          </w:tblCellMar>
         </w:tblPrEx>
         <w:tc>
           <w:tcPr>
@@ -31450,6 +31300,12 @@
             <w:insideH w:val="single" w:color="auto" w:sz="4" w:space="0"/>
             <w:insideV w:val="single" w:color="auto" w:sz="4" w:space="0"/>
           </w:tblBorders>
+          <w:tblCellMar>
+            <w:top w:w="0" w:type="dxa"/>
+            <w:left w:w="108" w:type="dxa"/>
+            <w:bottom w:w="0" w:type="dxa"/>
+            <w:right w:w="108" w:type="dxa"/>
+          </w:tblCellMar>
         </w:tblPrEx>
         <w:tc>
           <w:tcPr>
@@ -31576,7 +31432,7 @@
       <w:tblGrid>
         <w:gridCol w:w="1576"/>
         <w:gridCol w:w="3543"/>
-        <w:gridCol w:w="4510"/>
+        <w:gridCol w:w="3827"/>
       </w:tblGrid>
       <w:tr>
         <w:tblPrEx>
@@ -31774,7 +31630,7 @@
                   </w14:solidFill>
                 </w14:textFill>
               </w:rPr>
-              <w:t>实例化SGD算法</w:t>
+              <w:t>SGD算法</w:t>
             </w:r>
             <w:r>
               <w:rPr>
@@ -31882,7 +31738,7 @@
                   </w14:solidFill>
                 </w14:textFill>
               </w:rPr>
-              <w:t>实例化Adam算法</w:t>
+              <w:t>Adam算法</w:t>
             </w:r>
             <w:r>
               <w:rPr>
@@ -32042,7 +31898,7 @@
                   </w14:solidFill>
                 </w14:textFill>
               </w:rPr>
-              <w:t>实例化Adam</w:t>
+              <w:t>Adam</w:t>
             </w:r>
             <w:r>
               <w:rPr>
@@ -32659,18 +32515,6 @@
             <w:r>
               <w:rPr>
                 <w:rFonts w:hint="eastAsia"/>
-                <w:color w:val="ED7D31" w:themeColor="accent2"/>
-                <w14:textFill>
-                  <w14:solidFill>
-                    <w14:schemeClr w14:val="accent2"/>
-                  </w14:solidFill>
-                </w14:textFill>
-              </w:rPr>
-              <w:t>实例化</w:t>
-            </w:r>
-            <w:r>
-              <w:rPr>
-                <w:rFonts w:hint="eastAsia"/>
                 <w:color w:val="EA82F1"/>
                 <w:szCs w:val="24"/>
               </w:rPr>
@@ -32841,7 +32685,7 @@
       <w:tblGrid>
         <w:gridCol w:w="2457"/>
         <w:gridCol w:w="2624"/>
-        <w:gridCol w:w="1898"/>
+        <w:gridCol w:w="1268"/>
         <w:gridCol w:w="2231"/>
       </w:tblGrid>
       <w:tr>
@@ -32905,18 +32749,6 @@
             <w:r>
               <w:rPr>
                 <w:rFonts w:hint="eastAsia"/>
-                <w:color w:val="ED7D31" w:themeColor="accent2"/>
-                <w14:textFill>
-                  <w14:solidFill>
-                    <w14:schemeClr w14:val="accent2"/>
-                  </w14:solidFill>
-                </w14:textFill>
-              </w:rPr>
-              <w:t>实例化</w:t>
-            </w:r>
-            <w:r>
-              <w:rPr>
-                <w:rFonts w:hint="eastAsia"/>
                 <w:color w:val="EA82F1"/>
                 <w:szCs w:val="24"/>
               </w:rPr>
@@ -33123,18 +32955,6 @@
                 </w14:textFill>
               </w:rPr>
             </w:pPr>
-            <w:r>
-              <w:rPr>
-                <w:rFonts w:hint="eastAsia"/>
-                <w:color w:val="ED7D31" w:themeColor="accent2"/>
-                <w14:textFill>
-                  <w14:solidFill>
-                    <w14:schemeClr w14:val="accent2"/>
-                  </w14:solidFill>
-                </w14:textFill>
-              </w:rPr>
-              <w:t>实例化</w:t>
-            </w:r>
             <w:r>
               <w:rPr>
                 <w:rFonts w:hint="eastAsia"/>
@@ -34089,7 +33909,7 @@
       <w:tblGrid>
         <w:gridCol w:w="1057"/>
         <w:gridCol w:w="4981"/>
-        <w:gridCol w:w="1923"/>
+        <w:gridCol w:w="1268"/>
       </w:tblGrid>
       <w:tr>
         <w:tblPrEx>
@@ -34155,7 +33975,7 @@
                   </w14:solidFill>
                 </w14:textFill>
               </w:rPr>
-              <w:t>实例化SW</w:t>
+              <w:t>SW</w:t>
             </w:r>
             <w:r>
               <w:rPr>
@@ -34280,6 +34100,12 @@
             <w:insideH w:val="single" w:color="auto" w:sz="4" w:space="0"/>
             <w:insideV w:val="single" w:color="auto" w:sz="4" w:space="0"/>
           </w:tblBorders>
+          <w:tblCellMar>
+            <w:top w:w="0" w:type="dxa"/>
+            <w:left w:w="108" w:type="dxa"/>
+            <w:bottom w:w="0" w:type="dxa"/>
+            <w:right w:w="108" w:type="dxa"/>
+          </w:tblCellMar>
         </w:tblPrEx>
         <w:tc>
           <w:tcPr>
@@ -34572,7 +34398,7 @@
       <w:tblGrid>
         <w:gridCol w:w="1598"/>
         <w:gridCol w:w="2975"/>
-        <w:gridCol w:w="2239"/>
+        <w:gridCol w:w="1976"/>
       </w:tblGrid>
       <w:tr>
         <w:tblPrEx>
@@ -34640,7 +34466,7 @@
                   </w14:solidFill>
                 </w14:textFill>
               </w:rPr>
-              <w:t>实例化CIFAR</w:t>
+              <w:t>CIFAR</w:t>
             </w:r>
             <w:r>
               <w:rPr>
@@ -35092,6 +34918,12 @@
             <w:insideH w:val="single" w:color="auto" w:sz="4" w:space="0"/>
             <w:insideV w:val="single" w:color="auto" w:sz="4" w:space="0"/>
           </w:tblBorders>
+          <w:tblCellMar>
+            <w:top w:w="0" w:type="dxa"/>
+            <w:left w:w="108" w:type="dxa"/>
+            <w:bottom w:w="0" w:type="dxa"/>
+            <w:right w:w="108" w:type="dxa"/>
+          </w:tblCellMar>
         </w:tblPrEx>
         <w:tc>
           <w:tcPr>
@@ -35531,7 +35363,7 @@
       </w:tblPr>
       <w:tblGrid>
         <w:gridCol w:w="5242"/>
-        <w:gridCol w:w="1898"/>
+        <w:gridCol w:w="1268"/>
         <w:gridCol w:w="1057"/>
         <w:gridCol w:w="1440"/>
       </w:tblGrid>
@@ -35599,7 +35431,7 @@
                   </w14:solidFill>
                 </w14:textFill>
               </w:rPr>
-              <w:t>实例化变换器实例的</w:t>
+              <w:t>变换器实例的</w:t>
             </w:r>
             <w:r>
               <w:rPr>
@@ -35662,18 +35494,6 @@
                 <w:szCs w:val="24"/>
               </w:rPr>
             </w:pPr>
-            <w:r>
-              <w:rPr>
-                <w:rFonts w:hint="eastAsia"/>
-                <w:color w:val="ED7D31" w:themeColor="accent2"/>
-                <w14:textFill>
-                  <w14:solidFill>
-                    <w14:schemeClr w14:val="accent2"/>
-                  </w14:solidFill>
-                </w14:textFill>
-              </w:rPr>
-              <w:t>实例化</w:t>
-            </w:r>
             <w:r>
               <w:rPr>
                 <w:rFonts w:hint="eastAsia"/>
@@ -35762,18 +35582,6 @@
                 </w14:textFill>
               </w:rPr>
             </w:pPr>
-            <w:r>
-              <w:rPr>
-                <w:rFonts w:hint="eastAsia"/>
-                <w:color w:val="ED7D31" w:themeColor="accent2"/>
-                <w14:textFill>
-                  <w14:solidFill>
-                    <w14:schemeClr w14:val="accent2"/>
-                  </w14:solidFill>
-                </w14:textFill>
-              </w:rPr>
-              <w:t>实例化</w:t>
-            </w:r>
             <w:r>
               <w:rPr>
                 <w:rFonts w:hint="eastAsia"/>
@@ -35898,18 +35706,6 @@
             <w:r>
               <w:rPr>
                 <w:rFonts w:hint="eastAsia"/>
-                <w:color w:val="ED7D31" w:themeColor="accent2"/>
-                <w14:textFill>
-                  <w14:solidFill>
-                    <w14:schemeClr w14:val="accent2"/>
-                  </w14:solidFill>
-                </w14:textFill>
-              </w:rPr>
-              <w:t>实例化</w:t>
-            </w:r>
-            <w:r>
-              <w:rPr>
-                <w:rFonts w:hint="eastAsia"/>
                 <w:color w:val="EA82F1"/>
                 <w:szCs w:val="24"/>
               </w:rPr>
@@ -35975,18 +35771,6 @@
             <w:r>
               <w:rPr>
                 <w:rFonts w:hint="eastAsia"/>
-                <w:color w:val="ED7D31" w:themeColor="accent2"/>
-                <w14:textFill>
-                  <w14:solidFill>
-                    <w14:schemeClr w14:val="accent2"/>
-                  </w14:solidFill>
-                </w14:textFill>
-              </w:rPr>
-              <w:t>实例化</w:t>
-            </w:r>
-            <w:r>
-              <w:rPr>
-                <w:rFonts w:hint="eastAsia"/>
                 <w:color w:val="EA82F1"/>
                 <w:szCs w:val="24"/>
               </w:rPr>
@@ -36052,18 +35836,6 @@
             <w:r>
               <w:rPr>
                 <w:rFonts w:hint="eastAsia"/>
-                <w:color w:val="ED7D31" w:themeColor="accent2"/>
-                <w14:textFill>
-                  <w14:solidFill>
-                    <w14:schemeClr w14:val="accent2"/>
-                  </w14:solidFill>
-                </w14:textFill>
-              </w:rPr>
-              <w:t>实例化</w:t>
-            </w:r>
-            <w:r>
-              <w:rPr>
-                <w:rFonts w:hint="eastAsia"/>
                 <w:color w:val="EA82F1"/>
                 <w:szCs w:val="24"/>
               </w:rPr>
@@ -36264,6 +36036,9 @@
             <w:right w:w="108" w:type="dxa"/>
           </w:tblCellMar>
         </w:tblPrEx>
+        <w:trPr>
+          <w:trHeight w:val="250" w:hRule="atLeast"/>
+        </w:trPr>
         <w:tc>
           <w:tcPr>
             <w:tcW w:w="0" w:type="auto"/>
@@ -36301,18 +36076,6 @@
                 </w14:textFill>
               </w:rPr>
             </w:pPr>
-            <w:r>
-              <w:rPr>
-                <w:rFonts w:hint="eastAsia"/>
-                <w:color w:val="ED7D31" w:themeColor="accent2"/>
-                <w14:textFill>
-                  <w14:solidFill>
-                    <w14:schemeClr w14:val="accent2"/>
-                  </w14:solidFill>
-                </w14:textFill>
-              </w:rPr>
-              <w:t>实例化</w:t>
-            </w:r>
             <w:r>
               <w:rPr>
                 <w:rFonts w:hint="eastAsia"/>
@@ -36381,18 +36144,6 @@
             <w:r>
               <w:rPr>
                 <w:rFonts w:hint="eastAsia"/>
-                <w:color w:val="ED7D31" w:themeColor="accent2"/>
-                <w14:textFill>
-                  <w14:solidFill>
-                    <w14:schemeClr w14:val="accent2"/>
-                  </w14:solidFill>
-                </w14:textFill>
-              </w:rPr>
-              <w:t>实例化</w:t>
-            </w:r>
-            <w:r>
-              <w:rPr>
-                <w:rFonts w:hint="eastAsia"/>
                 <w:color w:val="EA82F1"/>
                 <w:szCs w:val="24"/>
               </w:rPr>
@@ -36458,18 +36209,6 @@
             <w:r>
               <w:rPr>
                 <w:rFonts w:hint="eastAsia"/>
-                <w:color w:val="ED7D31" w:themeColor="accent2"/>
-                <w14:textFill>
-                  <w14:solidFill>
-                    <w14:schemeClr w14:val="accent2"/>
-                  </w14:solidFill>
-                </w14:textFill>
-              </w:rPr>
-              <w:t>实例化</w:t>
-            </w:r>
-            <w:r>
-              <w:rPr>
-                <w:rFonts w:hint="eastAsia"/>
                 <w:color w:val="EA82F1"/>
                 <w:szCs w:val="24"/>
               </w:rPr>
@@ -36535,18 +36274,6 @@
             <w:r>
               <w:rPr>
                 <w:rFonts w:hint="eastAsia"/>
-                <w:color w:val="ED7D31" w:themeColor="accent2"/>
-                <w14:textFill>
-                  <w14:solidFill>
-                    <w14:schemeClr w14:val="accent2"/>
-                  </w14:solidFill>
-                </w14:textFill>
-              </w:rPr>
-              <w:t>实例化</w:t>
-            </w:r>
-            <w:r>
-              <w:rPr>
-                <w:rFonts w:hint="eastAsia"/>
                 <w:color w:val="EA82F1"/>
                 <w:szCs w:val="24"/>
               </w:rPr>
@@ -36612,18 +36339,6 @@
             <w:r>
               <w:rPr>
                 <w:rFonts w:hint="eastAsia"/>
-                <w:color w:val="ED7D31" w:themeColor="accent2"/>
-                <w14:textFill>
-                  <w14:solidFill>
-                    <w14:schemeClr w14:val="accent2"/>
-                  </w14:solidFill>
-                </w14:textFill>
-              </w:rPr>
-              <w:t>实例化</w:t>
-            </w:r>
-            <w:r>
-              <w:rPr>
-                <w:rFonts w:hint="eastAsia"/>
                 <w:color w:val="EA82F1"/>
                 <w:szCs w:val="24"/>
               </w:rPr>
@@ -36686,18 +36401,6 @@
                 </w14:textFill>
               </w:rPr>
             </w:pPr>
-            <w:r>
-              <w:rPr>
-                <w:rFonts w:hint="eastAsia"/>
-                <w:color w:val="ED7D31" w:themeColor="accent2"/>
-                <w14:textFill>
-                  <w14:solidFill>
-                    <w14:schemeClr w14:val="accent2"/>
-                  </w14:solidFill>
-                </w14:textFill>
-              </w:rPr>
-              <w:t>实例化</w:t>
-            </w:r>
             <w:r>
               <w:rPr>
                 <w:rFonts w:hint="eastAsia"/>
@@ -36763,6 +36466,14 @@
           <w:lang w:val="en-US" w:eastAsia="zh-CN"/>
         </w:rPr>
       </w:pPr>
+      <w:r>
+        <w:rPr>
+          <w:rFonts w:hint="eastAsia"/>
+          <w:color w:val="0070C0"/>
+          <w:lang w:val="en-US" w:eastAsia="zh-CN"/>
+        </w:rPr>
+        <w:t>光栅化</w:t>
+      </w:r>
       <w:r>
         <w:rPr>
           <w:rFonts w:hint="default"/>
@@ -38190,94 +37901,19 @@
     </w:p>
     <w:p>
       <w:pPr>
-        <w:outlineLvl w:val="2"/>
+        <w:pStyle w:val="19"/>
+        <w:bidi w:val="0"/>
         <w:rPr>
-          <w:rFonts w:hint="eastAsia"/>
-          <w:color w:val="0070C0"/>
+          <w:rFonts w:hint="default"/>
           <w:lang w:val="en-US" w:eastAsia="zh-CN"/>
         </w:rPr>
       </w:pPr>
       <w:r>
         <w:rPr>
           <w:rFonts w:hint="eastAsia"/>
-          <w:color w:val="0070C0"/>
           <w:lang w:val="en-US" w:eastAsia="zh-CN"/>
         </w:rPr>
-        <w:t>fused_ssim：</w:t>
-      </w:r>
-    </w:p>
-    <w:p>
-      <w:pPr>
-        <w:rPr>
-          <w:rFonts w:hint="eastAsia"/>
-          <w:color w:val="0070C0"/>
-        </w:rPr>
-      </w:pPr>
-      <w:r>
-        <w:rPr>
-          <w:rFonts w:hint="eastAsia"/>
-          <w:color w:val="ED7D31" w:themeColor="accent2"/>
-          <w:spacing w:val="7"/>
-          <w14:textFill>
-            <w14:solidFill>
-              <w14:schemeClr w14:val="accent2"/>
-            </w14:solidFill>
-          </w14:textFill>
-        </w:rPr>
-        <w:fldChar w:fldCharType="begin"/>
-      </w:r>
-      <w:r>
-        <w:rPr>
-          <w:rFonts w:hint="eastAsia"/>
-          <w:color w:val="ED7D31" w:themeColor="accent2"/>
-          <w:spacing w:val="7"/>
-          <w14:textFill>
-            <w14:solidFill>
-              <w14:schemeClr w14:val="accent2"/>
-            </w14:solidFill>
-          </w14:textFill>
-        </w:rPr>
-        <w:instrText xml:space="preserve"> HYPERLINK "https://github.com/rahul-goel/fused-ssim" </w:instrText>
-      </w:r>
-      <w:r>
-        <w:rPr>
-          <w:rFonts w:hint="eastAsia"/>
-          <w:color w:val="ED7D31" w:themeColor="accent2"/>
-          <w:spacing w:val="7"/>
-          <w14:textFill>
-            <w14:solidFill>
-              <w14:schemeClr w14:val="accent2"/>
-            </w14:solidFill>
-          </w14:textFill>
-        </w:rPr>
-        <w:fldChar w:fldCharType="separate"/>
-      </w:r>
-      <w:r>
-        <w:rPr>
-          <w:rStyle w:val="15"/>
-          <w:rFonts w:hint="eastAsia"/>
-          <w:color w:val="ED7D31" w:themeColor="accent2"/>
-          <w:spacing w:val="7"/>
-          <w14:textFill>
-            <w14:solidFill>
-              <w14:schemeClr w14:val="accent2"/>
-            </w14:solidFill>
-          </w14:textFill>
-        </w:rPr>
-        <w:t>https://github.com/rahul-goel/fused-ssim</w:t>
-      </w:r>
-      <w:r>
-        <w:rPr>
-          <w:rFonts w:hint="eastAsia"/>
-          <w:color w:val="ED7D31" w:themeColor="accent2"/>
-          <w:spacing w:val="7"/>
-          <w14:textFill>
-            <w14:solidFill>
-              <w14:schemeClr w14:val="accent2"/>
-            </w14:solidFill>
-          </w14:textFill>
-        </w:rPr>
-        <w:fldChar w:fldCharType="end"/>
+        <w:t>教师ema_pytorch：</w:t>
       </w:r>
     </w:p>
     <w:tbl>
@@ -38302,8 +37938,9 @@
         </w:tblCellMar>
       </w:tblPr>
       <w:tblGrid>
-        <w:gridCol w:w="5654"/>
-        <w:gridCol w:w="1268"/>
+        <w:gridCol w:w="1073"/>
+        <w:gridCol w:w="7704"/>
+        <w:gridCol w:w="1177"/>
       </w:tblGrid>
       <w:tr>
         <w:tblPrEx>
@@ -38325,61 +37962,2594 @@
         <w:tc>
           <w:tcPr>
             <w:tcW w:w="0" w:type="auto"/>
-            <w:vAlign w:val="center"/>
-          </w:tcPr>
-          <w:p>
-            <w:pPr>
+            <w:gridSpan w:val="2"/>
+            <w:vAlign w:val="center"/>
+          </w:tcPr>
+          <w:p>
+            <w:pPr>
+              <w:pStyle w:val="26"/>
+              <w:bidi w:val="0"/>
               <w:jc w:val="both"/>
               <w:rPr>
-                <w:rFonts w:hint="default" w:eastAsia="华文中宋"/>
-                <w:color w:val="ED7D31" w:themeColor="accent2"/>
+                <w:rFonts w:hint="default"/>
+                <w:lang w:val="en-US" w:eastAsia="zh-CN"/>
+              </w:rPr>
+            </w:pPr>
+            <w:r>
+              <w:rPr>
+                <w:rFonts w:hint="eastAsia" w:cs="华文中宋"/>
+                <w:b/>
+                <w:bCs/>
+                <w:color w:val="FF0000"/>
+                <w:kern w:val="2"/>
+                <w:sz w:val="21"/>
+                <w:szCs w:val="21"/>
+                <w:lang w:val="en-US" w:eastAsia="zh-CN" w:bidi="ar-SA"/>
+              </w:rPr>
+              <w:t>EMA(model, beta, update_after_step, update_every, update_model_with_ema_every)</w:t>
+            </w:r>
+          </w:p>
+        </w:tc>
+        <w:tc>
+          <w:tcPr>
+            <w:tcW w:w="0" w:type="auto"/>
+            <w:vAlign w:val="center"/>
+          </w:tcPr>
+          <w:p>
+            <w:pPr>
+              <w:pStyle w:val="27"/>
+              <w:bidi w:val="0"/>
+              <w:jc w:val="both"/>
+              <w:rPr>
+                <w:rFonts w:hint="default"/>
                 <w:vertAlign w:val="baseline"/>
                 <w:lang w:val="en-US" w:eastAsia="zh-CN"/>
-                <w14:textFill>
-                  <w14:solidFill>
-                    <w14:schemeClr w14:val="accent2"/>
-                  </w14:solidFill>
-                </w14:textFill>
-              </w:rPr>
-            </w:pPr>
-            <w:r>
-              <w:rPr>
-                <w:rFonts w:hint="eastAsia"/>
-                <w:color w:val="FF0000"/>
-                <w:lang w:val="en-US" w:eastAsia="zh-CN"/>
-              </w:rPr>
-              <w:t>fused_ssim(img0, img1, padding="same", train=True)</w:t>
-            </w:r>
-          </w:p>
-        </w:tc>
-        <w:tc>
-          <w:tcPr>
-            <w:tcW w:w="0" w:type="auto"/>
-            <w:vAlign w:val="center"/>
-          </w:tcPr>
-          <w:p>
-            <w:pPr>
+              </w:rPr>
+            </w:pPr>
+            <w:r>
+              <w:rPr>
+                <w:rFonts w:hint="eastAsia"/>
+                <w:vertAlign w:val="baseline"/>
+                <w:lang w:val="en-US" w:eastAsia="zh-CN"/>
+              </w:rPr>
+              <w:t>EMA教师</w:t>
+            </w:r>
+          </w:p>
+        </w:tc>
+      </w:tr>
+      <w:tr>
+        <w:tblPrEx>
+          <w:tblBorders>
+            <w:top w:val="single" w:color="auto" w:sz="4" w:space="0"/>
+            <w:left w:val="single" w:color="auto" w:sz="4" w:space="0"/>
+            <w:bottom w:val="single" w:color="auto" w:sz="4" w:space="0"/>
+            <w:right w:val="single" w:color="auto" w:sz="4" w:space="0"/>
+            <w:insideH w:val="single" w:color="auto" w:sz="4" w:space="0"/>
+            <w:insideV w:val="single" w:color="auto" w:sz="4" w:space="0"/>
+          </w:tblBorders>
+          <w:tblCellMar>
+            <w:top w:w="0" w:type="dxa"/>
+            <w:left w:w="108" w:type="dxa"/>
+            <w:bottom w:w="0" w:type="dxa"/>
+            <w:right w:w="108" w:type="dxa"/>
+          </w:tblCellMar>
+        </w:tblPrEx>
+        <w:tc>
+          <w:tcPr>
+            <w:tcW w:w="0" w:type="auto"/>
+            <w:vMerge w:val="restart"/>
+            <w:vAlign w:val="center"/>
+          </w:tcPr>
+          <w:p>
+            <w:pPr>
+              <w:pStyle w:val="26"/>
+              <w:bidi w:val="0"/>
               <w:jc w:val="both"/>
               <w:rPr>
-                <w:rFonts w:hint="default" w:eastAsia="华文中宋"/>
-                <w:color w:val="ED7D31" w:themeColor="accent2"/>
+                <w:rFonts w:hint="default" w:cs="华文中宋"/>
+                <w:b/>
+                <w:bCs/>
+                <w:color w:val="ED7D31"/>
+                <w:kern w:val="2"/>
+                <w:sz w:val="21"/>
+                <w:szCs w:val="21"/>
                 <w:vertAlign w:val="baseline"/>
-                <w:lang w:val="en-US" w:eastAsia="zh-CN"/>
-                <w14:textFill>
-                  <w14:solidFill>
-                    <w14:schemeClr w14:val="accent2"/>
-                  </w14:solidFill>
-                </w14:textFill>
-              </w:rPr>
-            </w:pPr>
-            <w:r>
-              <w:rPr>
-                <w:rFonts w:hint="eastAsia"/>
-                <w:color w:val="EA82F1"/>
-                <w:szCs w:val="24"/>
-                <w:lang w:val="en-US" w:eastAsia="zh-CN"/>
-              </w:rPr>
-              <w:t>结构相似性</w:t>
+                <w:lang w:val="en-US" w:eastAsia="zh-CN" w:bidi="ar-SA"/>
+              </w:rPr>
+            </w:pPr>
+            <w:r>
+              <w:rPr>
+                <w:rFonts w:hint="eastAsia" w:cs="华文中宋"/>
+                <w:b/>
+                <w:bCs/>
+                <w:color w:val="ED7D31"/>
+                <w:kern w:val="2"/>
+                <w:sz w:val="21"/>
+                <w:szCs w:val="21"/>
+                <w:vertAlign w:val="baseline"/>
+                <w:lang w:val="en-US" w:eastAsia="zh-CN" w:bidi="ar-SA"/>
+              </w:rPr>
+              <w:t>实例方法</w:t>
+            </w:r>
+          </w:p>
+        </w:tc>
+        <w:tc>
+          <w:tcPr>
+            <w:tcW w:w="0" w:type="auto"/>
+            <w:vAlign w:val="center"/>
+          </w:tcPr>
+          <w:p>
+            <w:pPr>
+              <w:pStyle w:val="26"/>
+              <w:bidi w:val="0"/>
+              <w:jc w:val="both"/>
+              <w:rPr>
+                <w:rFonts w:hint="default" w:cs="华文中宋"/>
+                <w:b/>
+                <w:bCs/>
+                <w:color w:val="FF0000"/>
+                <w:kern w:val="2"/>
+                <w:sz w:val="21"/>
+                <w:szCs w:val="21"/>
+                <w:lang w:val="en-US" w:eastAsia="zh-CN" w:bidi="ar-SA"/>
+              </w:rPr>
+            </w:pPr>
+            <w:r>
+              <w:rPr>
+                <w:rFonts w:hint="eastAsia" w:cs="华文中宋"/>
+                <w:b/>
+                <w:bCs/>
+                <w:color w:val="FF0000"/>
+                <w:kern w:val="2"/>
+                <w:sz w:val="21"/>
+                <w:szCs w:val="21"/>
+                <w:lang w:val="en-US" w:eastAsia="zh-CN" w:bidi="ar-SA"/>
+              </w:rPr>
+              <w:t>update()</w:t>
+            </w:r>
+          </w:p>
+        </w:tc>
+        <w:tc>
+          <w:tcPr>
+            <w:tcW w:w="0" w:type="auto"/>
+            <w:vAlign w:val="center"/>
+          </w:tcPr>
+          <w:p>
+            <w:pPr>
+              <w:pStyle w:val="27"/>
+              <w:bidi w:val="0"/>
+              <w:jc w:val="both"/>
+              <w:rPr>
+                <w:rFonts w:hint="default"/>
+                <w:vertAlign w:val="baseline"/>
+                <w:lang w:val="en-US" w:eastAsia="zh-CN"/>
+              </w:rPr>
+            </w:pPr>
+            <w:r>
+              <w:rPr>
+                <w:rFonts w:hint="eastAsia"/>
+                <w:vertAlign w:val="baseline"/>
+                <w:lang w:val="en-US" w:eastAsia="zh-CN"/>
+              </w:rPr>
+              <w:t>更新</w:t>
+            </w:r>
+          </w:p>
+        </w:tc>
+      </w:tr>
+      <w:tr>
+        <w:tblPrEx>
+          <w:tblBorders>
+            <w:top w:val="single" w:color="auto" w:sz="4" w:space="0"/>
+            <w:left w:val="single" w:color="auto" w:sz="4" w:space="0"/>
+            <w:bottom w:val="single" w:color="auto" w:sz="4" w:space="0"/>
+            <w:right w:val="single" w:color="auto" w:sz="4" w:space="0"/>
+            <w:insideH w:val="single" w:color="auto" w:sz="4" w:space="0"/>
+            <w:insideV w:val="single" w:color="auto" w:sz="4" w:space="0"/>
+          </w:tblBorders>
+          <w:tblCellMar>
+            <w:top w:w="0" w:type="dxa"/>
+            <w:left w:w="108" w:type="dxa"/>
+            <w:bottom w:w="0" w:type="dxa"/>
+            <w:right w:w="108" w:type="dxa"/>
+          </w:tblCellMar>
+        </w:tblPrEx>
+        <w:tc>
+          <w:tcPr>
+            <w:tcW w:w="0" w:type="auto"/>
+            <w:vMerge w:val="continue"/>
+            <w:tcBorders/>
+            <w:vAlign w:val="center"/>
+          </w:tcPr>
+          <w:p>
+            <w:pPr>
+              <w:pStyle w:val="26"/>
+              <w:bidi w:val="0"/>
+              <w:jc w:val="both"/>
+              <w:rPr>
+                <w:rFonts w:hint="eastAsia" w:cs="华文中宋"/>
+                <w:b/>
+                <w:bCs/>
+                <w:color w:val="ED7D31"/>
+                <w:kern w:val="2"/>
+                <w:sz w:val="21"/>
+                <w:szCs w:val="21"/>
+                <w:vertAlign w:val="baseline"/>
+                <w:lang w:val="en-US" w:eastAsia="zh-CN" w:bidi="ar-SA"/>
+              </w:rPr>
+            </w:pPr>
+          </w:p>
+        </w:tc>
+        <w:tc>
+          <w:tcPr>
+            <w:tcW w:w="0" w:type="auto"/>
+            <w:vAlign w:val="center"/>
+          </w:tcPr>
+          <w:p>
+            <w:pPr>
+              <w:pStyle w:val="26"/>
+              <w:bidi w:val="0"/>
+              <w:jc w:val="both"/>
+              <w:rPr>
+                <w:rFonts w:hint="default" w:cs="华文中宋"/>
+                <w:b/>
+                <w:bCs/>
+                <w:color w:val="FF0000"/>
+                <w:kern w:val="2"/>
+                <w:sz w:val="21"/>
+                <w:szCs w:val="21"/>
+                <w:lang w:val="en-US" w:eastAsia="zh-CN" w:bidi="ar-SA"/>
+              </w:rPr>
+            </w:pPr>
+            <w:r>
+              <w:rPr>
+                <w:rFonts w:hint="eastAsia" w:cs="华文中宋"/>
+                <w:b/>
+                <w:bCs/>
+                <w:color w:val="FF0000"/>
+                <w:kern w:val="2"/>
+                <w:sz w:val="21"/>
+                <w:szCs w:val="21"/>
+                <w:lang w:val="en-US" w:eastAsia="zh-CN" w:bidi="ar-SA"/>
+              </w:rPr>
+              <w:t>copy_params_from_model_to_ema / copy_params_from_ema_to_model()</w:t>
+            </w:r>
+          </w:p>
+        </w:tc>
+        <w:tc>
+          <w:tcPr>
+            <w:tcW w:w="0" w:type="auto"/>
+            <w:vAlign w:val="center"/>
+          </w:tcPr>
+          <w:p>
+            <w:pPr>
+              <w:pStyle w:val="27"/>
+              <w:bidi w:val="0"/>
+              <w:jc w:val="both"/>
+              <w:rPr>
+                <w:rFonts w:hint="default"/>
+                <w:vertAlign w:val="baseline"/>
+                <w:lang w:val="en-US" w:eastAsia="zh-CN"/>
+              </w:rPr>
+            </w:pPr>
+            <w:r>
+              <w:rPr>
+                <w:rFonts w:hint="eastAsia"/>
+                <w:vertAlign w:val="baseline"/>
+                <w:lang w:val="en-US" w:eastAsia="zh-CN"/>
+              </w:rPr>
+              <w:t>拷贝</w:t>
+            </w:r>
+            <w:r>
+              <w:rPr>
+                <w:rFonts w:hint="eastAsia" w:cs="华文中宋"/>
+                <w:b/>
+                <w:bCs/>
+                <w:color w:val="ED7D31"/>
+                <w:kern w:val="2"/>
+                <w:sz w:val="21"/>
+                <w:szCs w:val="21"/>
+                <w:vertAlign w:val="baseline"/>
+                <w:lang w:val="en-US" w:eastAsia="zh-CN" w:bidi="ar-SA"/>
+              </w:rPr>
+              <w:t>权重</w:t>
+            </w:r>
+          </w:p>
+        </w:tc>
+      </w:tr>
+      <w:tr>
+        <w:tblPrEx>
+          <w:tblBorders>
+            <w:top w:val="single" w:color="auto" w:sz="4" w:space="0"/>
+            <w:left w:val="single" w:color="auto" w:sz="4" w:space="0"/>
+            <w:bottom w:val="single" w:color="auto" w:sz="4" w:space="0"/>
+            <w:right w:val="single" w:color="auto" w:sz="4" w:space="0"/>
+            <w:insideH w:val="single" w:color="auto" w:sz="4" w:space="0"/>
+            <w:insideV w:val="single" w:color="auto" w:sz="4" w:space="0"/>
+          </w:tblBorders>
+          <w:tblCellMar>
+            <w:top w:w="0" w:type="dxa"/>
+            <w:left w:w="108" w:type="dxa"/>
+            <w:bottom w:w="0" w:type="dxa"/>
+            <w:right w:w="108" w:type="dxa"/>
+          </w:tblCellMar>
+        </w:tblPrEx>
+        <w:tc>
+          <w:tcPr>
+            <w:tcW w:w="0" w:type="auto"/>
+            <w:vMerge w:val="continue"/>
+            <w:tcBorders/>
+            <w:vAlign w:val="center"/>
+          </w:tcPr>
+          <w:p>
+            <w:pPr>
+              <w:pStyle w:val="26"/>
+              <w:bidi w:val="0"/>
+              <w:jc w:val="both"/>
+              <w:rPr>
+                <w:rFonts w:hint="eastAsia" w:cs="华文中宋"/>
+                <w:b/>
+                <w:bCs/>
+                <w:color w:val="ED7D31"/>
+                <w:kern w:val="2"/>
+                <w:sz w:val="21"/>
+                <w:szCs w:val="21"/>
+                <w:vertAlign w:val="baseline"/>
+                <w:lang w:val="en-US" w:eastAsia="zh-CN" w:bidi="ar-SA"/>
+              </w:rPr>
+            </w:pPr>
+          </w:p>
+        </w:tc>
+        <w:tc>
+          <w:tcPr>
+            <w:tcW w:w="0" w:type="auto"/>
+            <w:vAlign w:val="center"/>
+          </w:tcPr>
+          <w:p>
+            <w:pPr>
+              <w:pStyle w:val="26"/>
+              <w:bidi w:val="0"/>
+              <w:jc w:val="both"/>
+              <w:rPr>
+                <w:rFonts w:hint="default" w:cs="华文中宋"/>
+                <w:b/>
+                <w:bCs/>
+                <w:color w:val="FF0000"/>
+                <w:kern w:val="2"/>
+                <w:sz w:val="21"/>
+                <w:szCs w:val="21"/>
+                <w:lang w:val="en-US" w:eastAsia="zh-CN" w:bidi="ar-SA"/>
+              </w:rPr>
+            </w:pPr>
+            <w:r>
+              <w:rPr>
+                <w:rFonts w:hint="eastAsia" w:cs="华文中宋"/>
+                <w:b/>
+                <w:bCs/>
+                <w:color w:val="FF0000"/>
+                <w:kern w:val="2"/>
+                <w:sz w:val="21"/>
+                <w:szCs w:val="21"/>
+                <w:lang w:val="en-US" w:eastAsia="zh-CN" w:bidi="ar-SA"/>
+              </w:rPr>
+              <w:t>forward_eval(*args, **kwargs)</w:t>
+            </w:r>
+          </w:p>
+        </w:tc>
+        <w:tc>
+          <w:tcPr>
+            <w:tcW w:w="0" w:type="auto"/>
+            <w:vAlign w:val="center"/>
+          </w:tcPr>
+          <w:p>
+            <w:pPr>
+              <w:pStyle w:val="27"/>
+              <w:bidi w:val="0"/>
+              <w:jc w:val="both"/>
+              <w:rPr>
+                <w:rFonts w:hint="default"/>
+                <w:vertAlign w:val="baseline"/>
+                <w:lang w:val="en-US" w:eastAsia="zh-CN"/>
+              </w:rPr>
+            </w:pPr>
+            <w:r>
+              <w:rPr>
+                <w:rFonts w:hint="eastAsia"/>
+                <w:vertAlign w:val="baseline"/>
+                <w:lang w:val="en-US" w:eastAsia="zh-CN"/>
+              </w:rPr>
+              <w:t>推导</w:t>
+            </w:r>
+          </w:p>
+        </w:tc>
+      </w:tr>
+    </w:tbl>
+    <w:p>
+      <w:pPr>
+        <w:outlineLvl w:val="9"/>
+        <w:rPr>
+          <w:rFonts w:hint="eastAsia"/>
+          <w:color w:val="0070C0"/>
+          <w:lang w:val="en-US" w:eastAsia="zh-CN"/>
+        </w:rPr>
+      </w:pPr>
+    </w:p>
+    <w:p>
+      <w:pPr>
+        <w:outlineLvl w:val="9"/>
+        <w:rPr>
+          <w:rFonts w:hint="eastAsia"/>
+          <w:color w:val="0070C0"/>
+          <w:lang w:val="en-US" w:eastAsia="zh-CN"/>
+        </w:rPr>
+      </w:pPr>
+    </w:p>
+    <w:p>
+      <w:pPr>
+        <w:outlineLvl w:val="9"/>
+        <w:rPr>
+          <w:rFonts w:hint="eastAsia"/>
+          <w:color w:val="0070C0"/>
+        </w:rPr>
+      </w:pPr>
+    </w:p>
+    <w:p>
+      <w:pPr>
+        <w:pStyle w:val="19"/>
+        <w:bidi w:val="0"/>
+        <w:rPr>
+          <w:rFonts w:hint="eastAsia" w:eastAsia="华文中宋"/>
+          <w:lang w:eastAsia="zh-CN"/>
+        </w:rPr>
+      </w:pPr>
+      <w:r>
+        <w:rPr>
+          <w:rFonts w:hint="eastAsia"/>
+          <w:lang w:val="en-US" w:eastAsia="zh-CN"/>
+        </w:rPr>
+        <w:t>简化</w:t>
+      </w:r>
+      <w:r>
+        <w:rPr>
+          <w:rFonts w:hint="eastAsia"/>
+        </w:rPr>
+        <w:t>pytorch_lightning</w:t>
+      </w:r>
+      <w:r>
+        <w:rPr>
+          <w:rFonts w:hint="eastAsia"/>
+          <w:lang w:eastAsia="zh-CN"/>
+        </w:rPr>
+        <w:t>：</w:t>
+      </w:r>
+    </w:p>
+    <w:p>
+      <w:pPr>
+        <w:rPr>
+          <w:rFonts w:hint="eastAsia"/>
+          <w:color w:val="ED7D31" w:themeColor="accent2"/>
+          <w:u w:val="single"/>
+          <w14:textFill>
+            <w14:solidFill>
+              <w14:schemeClr w14:val="accent2"/>
+            </w14:solidFill>
+          </w14:textFill>
+        </w:rPr>
+      </w:pPr>
+      <w:r>
+        <w:rPr>
+          <w:rFonts w:hint="eastAsia"/>
+          <w:color w:val="ED7D31" w:themeColor="accent2"/>
+          <w:u w:val="single"/>
+          <w14:textFill>
+            <w14:solidFill>
+              <w14:schemeClr w14:val="accent2"/>
+            </w14:solidFill>
+          </w14:textFill>
+        </w:rPr>
+        <w:t>import pytorch_lightning as pl</w:t>
+      </w:r>
+    </w:p>
+    <w:p>
+      <w:pPr>
+        <w:outlineLvl w:val="9"/>
+        <w:rPr>
+          <w:rFonts w:hint="eastAsia"/>
+          <w:color w:val="0070C0"/>
+        </w:rPr>
+      </w:pPr>
+    </w:p>
+    <w:tbl>
+      <w:tblPr>
+        <w:tblStyle w:val="12"/>
+        <w:tblW w:w="0" w:type="auto"/>
+        <w:tblInd w:w="0" w:type="dxa"/>
+        <w:tblBorders>
+          <w:top w:val="single" w:color="auto" w:sz="4" w:space="0"/>
+          <w:left w:val="single" w:color="auto" w:sz="4" w:space="0"/>
+          <w:bottom w:val="single" w:color="auto" w:sz="4" w:space="0"/>
+          <w:right w:val="single" w:color="auto" w:sz="4" w:space="0"/>
+          <w:insideH w:val="single" w:color="auto" w:sz="4" w:space="0"/>
+          <w:insideV w:val="single" w:color="auto" w:sz="4" w:space="0"/>
+        </w:tblBorders>
+        <w:tblLayout w:type="autofit"/>
+        <w:tblCellMar>
+          <w:top w:w="0" w:type="dxa"/>
+          <w:left w:w="108" w:type="dxa"/>
+          <w:bottom w:w="0" w:type="dxa"/>
+          <w:right w:w="108" w:type="dxa"/>
+        </w:tblCellMar>
+      </w:tblPr>
+      <w:tblGrid>
+        <w:gridCol w:w="1057"/>
+        <w:gridCol w:w="4834"/>
+        <w:gridCol w:w="3691"/>
+      </w:tblGrid>
+      <w:tr>
+        <w:tblPrEx>
+          <w:tblBorders>
+            <w:top w:val="single" w:color="auto" w:sz="4" w:space="0"/>
+            <w:left w:val="single" w:color="auto" w:sz="4" w:space="0"/>
+            <w:bottom w:val="single" w:color="auto" w:sz="4" w:space="0"/>
+            <w:right w:val="single" w:color="auto" w:sz="4" w:space="0"/>
+            <w:insideH w:val="single" w:color="auto" w:sz="4" w:space="0"/>
+            <w:insideV w:val="single" w:color="auto" w:sz="4" w:space="0"/>
+          </w:tblBorders>
+          <w:tblCellMar>
+            <w:top w:w="0" w:type="dxa"/>
+            <w:left w:w="108" w:type="dxa"/>
+            <w:bottom w:w="0" w:type="dxa"/>
+            <w:right w:w="108" w:type="dxa"/>
+          </w:tblCellMar>
+        </w:tblPrEx>
+        <w:tc>
+          <w:tcPr>
+            <w:tcW w:w="0" w:type="auto"/>
+            <w:gridSpan w:val="2"/>
+            <w:vAlign w:val="center"/>
+          </w:tcPr>
+          <w:p>
+            <w:pPr>
+              <w:pStyle w:val="26"/>
+              <w:bidi w:val="0"/>
+              <w:jc w:val="both"/>
+              <w:rPr>
+                <w:rFonts w:hint="default"/>
+                <w:lang w:val="en-US" w:eastAsia="zh-CN"/>
+              </w:rPr>
+            </w:pPr>
+            <w:r>
+              <w:rPr>
+                <w:rFonts w:hint="eastAsia" w:cs="华文中宋"/>
+                <w:b/>
+                <w:bCs/>
+                <w:color w:val="FF0000"/>
+                <w:kern w:val="2"/>
+                <w:sz w:val="21"/>
+                <w:szCs w:val="21"/>
+                <w:lang w:val="en-US" w:eastAsia="zh-CN" w:bidi="ar-SA"/>
+              </w:rPr>
+              <w:t>LightningModule</w:t>
+            </w:r>
+          </w:p>
+        </w:tc>
+        <w:tc>
+          <w:tcPr>
+            <w:tcW w:w="0" w:type="auto"/>
+            <w:vAlign w:val="center"/>
+          </w:tcPr>
+          <w:p>
+            <w:pPr>
+              <w:pStyle w:val="27"/>
+              <w:bidi w:val="0"/>
+              <w:jc w:val="both"/>
+              <w:rPr>
+                <w:rFonts w:hint="default"/>
+                <w:vertAlign w:val="baseline"/>
+                <w:lang w:val="en-US" w:eastAsia="zh-CN"/>
+              </w:rPr>
+            </w:pPr>
+            <w:r>
+              <w:rPr>
+                <w:rFonts w:hint="eastAsia"/>
+                <w:vertAlign w:val="baseline"/>
+                <w:lang w:val="en-US" w:eastAsia="zh-CN"/>
+              </w:rPr>
+              <w:t>模型基类</w:t>
+            </w:r>
+          </w:p>
+        </w:tc>
+      </w:tr>
+      <w:tr>
+        <w:tblPrEx>
+          <w:tblBorders>
+            <w:top w:val="single" w:color="auto" w:sz="4" w:space="0"/>
+            <w:left w:val="single" w:color="auto" w:sz="4" w:space="0"/>
+            <w:bottom w:val="single" w:color="auto" w:sz="4" w:space="0"/>
+            <w:right w:val="single" w:color="auto" w:sz="4" w:space="0"/>
+            <w:insideH w:val="single" w:color="auto" w:sz="4" w:space="0"/>
+            <w:insideV w:val="single" w:color="auto" w:sz="4" w:space="0"/>
+          </w:tblBorders>
+          <w:tblCellMar>
+            <w:top w:w="0" w:type="dxa"/>
+            <w:left w:w="108" w:type="dxa"/>
+            <w:bottom w:w="0" w:type="dxa"/>
+            <w:right w:w="108" w:type="dxa"/>
+          </w:tblCellMar>
+        </w:tblPrEx>
+        <w:tc>
+          <w:tcPr>
+            <w:tcW w:w="0" w:type="auto"/>
+            <w:vAlign w:val="center"/>
+          </w:tcPr>
+          <w:p>
+            <w:pPr>
+              <w:pStyle w:val="26"/>
+              <w:bidi w:val="0"/>
+              <w:jc w:val="both"/>
+              <w:rPr>
+                <w:rFonts w:hint="default" w:cs="华文中宋"/>
+                <w:b/>
+                <w:bCs/>
+                <w:color w:val="ED7D31"/>
+                <w:kern w:val="2"/>
+                <w:sz w:val="21"/>
+                <w:szCs w:val="21"/>
+                <w:vertAlign w:val="baseline"/>
+                <w:lang w:val="en-US" w:eastAsia="zh-CN" w:bidi="ar-SA"/>
+              </w:rPr>
+            </w:pPr>
+            <w:r>
+              <w:rPr>
+                <w:rFonts w:hint="eastAsia" w:cs="华文中宋"/>
+                <w:b/>
+                <w:bCs/>
+                <w:color w:val="ED7D31"/>
+                <w:kern w:val="2"/>
+                <w:sz w:val="21"/>
+                <w:szCs w:val="21"/>
+                <w:vertAlign w:val="baseline"/>
+                <w:lang w:val="en-US" w:eastAsia="zh-CN" w:bidi="ar-SA"/>
+              </w:rPr>
+              <w:t>实例属性</w:t>
+            </w:r>
+          </w:p>
+        </w:tc>
+        <w:tc>
+          <w:tcPr>
+            <w:tcW w:w="0" w:type="auto"/>
+            <w:vAlign w:val="center"/>
+          </w:tcPr>
+          <w:p>
+            <w:pPr>
+              <w:pStyle w:val="26"/>
+              <w:bidi w:val="0"/>
+              <w:jc w:val="both"/>
+              <w:rPr>
+                <w:rFonts w:hint="default" w:cs="华文中宋"/>
+                <w:b/>
+                <w:bCs/>
+                <w:color w:val="FF0000"/>
+                <w:kern w:val="2"/>
+                <w:sz w:val="21"/>
+                <w:szCs w:val="21"/>
+                <w:lang w:val="en-US" w:eastAsia="zh-CN" w:bidi="ar-SA"/>
+              </w:rPr>
+            </w:pPr>
+            <w:r>
+              <w:rPr>
+                <w:rFonts w:hint="eastAsia" w:cs="华文中宋"/>
+                <w:b/>
+                <w:bCs/>
+                <w:color w:val="FF0000"/>
+                <w:kern w:val="2"/>
+                <w:sz w:val="21"/>
+                <w:szCs w:val="21"/>
+                <w:lang w:val="en-US" w:eastAsia="zh-CN" w:bidi="ar-SA"/>
+              </w:rPr>
+              <w:t>trainer</w:t>
+            </w:r>
+          </w:p>
+        </w:tc>
+        <w:tc>
+          <w:tcPr>
+            <w:tcW w:w="0" w:type="auto"/>
+            <w:vAlign w:val="center"/>
+          </w:tcPr>
+          <w:p>
+            <w:pPr>
+              <w:pStyle w:val="27"/>
+              <w:bidi w:val="0"/>
+              <w:jc w:val="both"/>
+              <w:rPr>
+                <w:rFonts w:hint="default"/>
+                <w:vertAlign w:val="baseline"/>
+                <w:lang w:val="en-US" w:eastAsia="zh-CN"/>
+              </w:rPr>
+            </w:pPr>
+            <w:r>
+              <w:rPr>
+                <w:rFonts w:hint="eastAsia"/>
+                <w:vertAlign w:val="baseline"/>
+                <w:lang w:val="en-US" w:eastAsia="zh-CN"/>
+              </w:rPr>
+              <w:t>训练器</w:t>
+            </w:r>
+          </w:p>
+        </w:tc>
+      </w:tr>
+      <w:tr>
+        <w:tblPrEx>
+          <w:tblBorders>
+            <w:top w:val="single" w:color="auto" w:sz="4" w:space="0"/>
+            <w:left w:val="single" w:color="auto" w:sz="4" w:space="0"/>
+            <w:bottom w:val="single" w:color="auto" w:sz="4" w:space="0"/>
+            <w:right w:val="single" w:color="auto" w:sz="4" w:space="0"/>
+            <w:insideH w:val="single" w:color="auto" w:sz="4" w:space="0"/>
+            <w:insideV w:val="single" w:color="auto" w:sz="4" w:space="0"/>
+          </w:tblBorders>
+          <w:tblCellMar>
+            <w:top w:w="0" w:type="dxa"/>
+            <w:left w:w="108" w:type="dxa"/>
+            <w:bottom w:w="0" w:type="dxa"/>
+            <w:right w:w="108" w:type="dxa"/>
+          </w:tblCellMar>
+        </w:tblPrEx>
+        <w:tc>
+          <w:tcPr>
+            <w:tcW w:w="0" w:type="auto"/>
+            <w:vMerge w:val="restart"/>
+            <w:vAlign w:val="center"/>
+          </w:tcPr>
+          <w:p>
+            <w:pPr>
+              <w:pStyle w:val="26"/>
+              <w:bidi w:val="0"/>
+              <w:jc w:val="both"/>
+              <w:rPr>
+                <w:rFonts w:hint="default" w:cs="华文中宋"/>
+                <w:b/>
+                <w:bCs/>
+                <w:color w:val="ED7D31"/>
+                <w:kern w:val="2"/>
+                <w:sz w:val="21"/>
+                <w:szCs w:val="21"/>
+                <w:vertAlign w:val="baseline"/>
+                <w:lang w:val="en-US" w:eastAsia="zh-CN" w:bidi="ar-SA"/>
+              </w:rPr>
+            </w:pPr>
+            <w:r>
+              <w:rPr>
+                <w:rFonts w:hint="eastAsia" w:cs="华文中宋"/>
+                <w:b/>
+                <w:bCs/>
+                <w:color w:val="ED7D31"/>
+                <w:kern w:val="2"/>
+                <w:sz w:val="21"/>
+                <w:szCs w:val="21"/>
+                <w:vertAlign w:val="baseline"/>
+                <w:lang w:val="en-US" w:eastAsia="zh-CN" w:bidi="ar-SA"/>
+              </w:rPr>
+              <w:t>实例方法</w:t>
+            </w:r>
+          </w:p>
+        </w:tc>
+        <w:tc>
+          <w:tcPr>
+            <w:tcW w:w="0" w:type="auto"/>
+            <w:vAlign w:val="center"/>
+          </w:tcPr>
+          <w:p>
+            <w:pPr>
+              <w:pStyle w:val="26"/>
+              <w:bidi w:val="0"/>
+              <w:jc w:val="both"/>
+              <w:rPr>
+                <w:rFonts w:hint="eastAsia" w:cs="华文中宋"/>
+                <w:b/>
+                <w:bCs/>
+                <w:color w:val="FF0000"/>
+                <w:kern w:val="2"/>
+                <w:sz w:val="21"/>
+                <w:szCs w:val="21"/>
+                <w:lang w:val="en-US" w:eastAsia="zh-CN" w:bidi="ar-SA"/>
+              </w:rPr>
+            </w:pPr>
+            <w:r>
+              <w:rPr>
+                <w:rFonts w:hint="eastAsia" w:cs="华文中宋"/>
+                <w:b/>
+                <w:bCs/>
+                <w:color w:val="FF0000"/>
+                <w:kern w:val="2"/>
+                <w:sz w:val="21"/>
+                <w:szCs w:val="21"/>
+                <w:lang w:val="en-US" w:eastAsia="zh-CN" w:bidi="ar-SA"/>
+              </w:rPr>
+              <w:t xml:space="preserve">log / log_dict(name, value, prog_bar, </w:t>
+            </w:r>
+          </w:p>
+          <w:p>
+            <w:pPr>
+              <w:pStyle w:val="26"/>
+              <w:bidi w:val="0"/>
+              <w:jc w:val="both"/>
+              <w:rPr>
+                <w:rFonts w:hint="default" w:cs="华文中宋"/>
+                <w:b/>
+                <w:bCs/>
+                <w:color w:val="FF0000"/>
+                <w:kern w:val="2"/>
+                <w:sz w:val="21"/>
+                <w:szCs w:val="21"/>
+                <w:lang w:val="en-US" w:eastAsia="zh-CN" w:bidi="ar-SA"/>
+              </w:rPr>
+            </w:pPr>
+            <w:r>
+              <w:rPr>
+                <w:rFonts w:hint="eastAsia" w:cs="华文中宋"/>
+                <w:b/>
+                <w:bCs/>
+                <w:color w:val="FF0000"/>
+                <w:kern w:val="2"/>
+                <w:sz w:val="21"/>
+                <w:szCs w:val="21"/>
+                <w:lang w:val="en-US" w:eastAsia="zh-CN" w:bidi="ar-SA"/>
+              </w:rPr>
+              <w:t>on_step, on_epoch, reduce_fx)</w:t>
+            </w:r>
+          </w:p>
+        </w:tc>
+        <w:tc>
+          <w:tcPr>
+            <w:tcW w:w="0" w:type="auto"/>
+            <w:vAlign w:val="center"/>
+          </w:tcPr>
+          <w:p>
+            <w:pPr>
+              <w:pStyle w:val="27"/>
+              <w:bidi w:val="0"/>
+              <w:jc w:val="both"/>
+              <w:rPr>
+                <w:rFonts w:hint="default"/>
+                <w:vertAlign w:val="baseline"/>
+                <w:lang w:val="en-US" w:eastAsia="zh-CN"/>
+              </w:rPr>
+            </w:pPr>
+            <w:r>
+              <w:rPr>
+                <w:rFonts w:hint="eastAsia"/>
+                <w:vertAlign w:val="baseline"/>
+                <w:lang w:val="en-US" w:eastAsia="zh-CN"/>
+              </w:rPr>
+              <w:t>记录</w:t>
+            </w:r>
+          </w:p>
+        </w:tc>
+      </w:tr>
+      <w:tr>
+        <w:tblPrEx>
+          <w:tblBorders>
+            <w:top w:val="single" w:color="auto" w:sz="4" w:space="0"/>
+            <w:left w:val="single" w:color="auto" w:sz="4" w:space="0"/>
+            <w:bottom w:val="single" w:color="auto" w:sz="4" w:space="0"/>
+            <w:right w:val="single" w:color="auto" w:sz="4" w:space="0"/>
+            <w:insideH w:val="single" w:color="auto" w:sz="4" w:space="0"/>
+            <w:insideV w:val="single" w:color="auto" w:sz="4" w:space="0"/>
+          </w:tblBorders>
+          <w:tblCellMar>
+            <w:top w:w="0" w:type="dxa"/>
+            <w:left w:w="108" w:type="dxa"/>
+            <w:bottom w:w="0" w:type="dxa"/>
+            <w:right w:w="108" w:type="dxa"/>
+          </w:tblCellMar>
+        </w:tblPrEx>
+        <w:tc>
+          <w:tcPr>
+            <w:tcW w:w="0" w:type="auto"/>
+            <w:vMerge w:val="continue"/>
+            <w:vAlign w:val="center"/>
+          </w:tcPr>
+          <w:p>
+            <w:pPr>
+              <w:pStyle w:val="26"/>
+              <w:bidi w:val="0"/>
+              <w:jc w:val="both"/>
+              <w:rPr>
+                <w:rFonts w:hint="eastAsia" w:cs="华文中宋"/>
+                <w:b/>
+                <w:bCs/>
+                <w:color w:val="ED7D31"/>
+                <w:kern w:val="2"/>
+                <w:sz w:val="21"/>
+                <w:szCs w:val="21"/>
+                <w:vertAlign w:val="baseline"/>
+                <w:lang w:val="en-US" w:eastAsia="zh-CN" w:bidi="ar-SA"/>
+              </w:rPr>
+            </w:pPr>
+          </w:p>
+        </w:tc>
+        <w:tc>
+          <w:tcPr>
+            <w:tcW w:w="0" w:type="auto"/>
+            <w:vAlign w:val="center"/>
+          </w:tcPr>
+          <w:p>
+            <w:pPr>
+              <w:pStyle w:val="26"/>
+              <w:bidi w:val="0"/>
+              <w:jc w:val="both"/>
+              <w:rPr>
+                <w:rFonts w:hint="default" w:cs="华文中宋"/>
+                <w:b/>
+                <w:bCs/>
+                <w:color w:val="FF0000"/>
+                <w:kern w:val="2"/>
+                <w:sz w:val="21"/>
+                <w:szCs w:val="21"/>
+                <w:lang w:val="en-US" w:eastAsia="zh-CN" w:bidi="ar-SA"/>
+              </w:rPr>
+            </w:pPr>
+            <w:r>
+              <w:rPr>
+                <w:rFonts w:hint="eastAsia" w:cs="华文中宋"/>
+                <w:b/>
+                <w:bCs/>
+                <w:color w:val="FF0000"/>
+                <w:kern w:val="2"/>
+                <w:sz w:val="21"/>
+                <w:szCs w:val="21"/>
+                <w:lang w:val="en-US" w:eastAsia="zh-CN" w:bidi="ar-SA"/>
+              </w:rPr>
+              <w:t>freeze / unfreeze()</w:t>
+            </w:r>
+          </w:p>
+        </w:tc>
+        <w:tc>
+          <w:tcPr>
+            <w:tcW w:w="0" w:type="auto"/>
+            <w:vAlign w:val="center"/>
+          </w:tcPr>
+          <w:p>
+            <w:pPr>
+              <w:pStyle w:val="27"/>
+              <w:bidi w:val="0"/>
+              <w:jc w:val="both"/>
+              <w:rPr>
+                <w:rFonts w:hint="default"/>
+                <w:vertAlign w:val="baseline"/>
+                <w:lang w:val="en-US" w:eastAsia="zh-CN"/>
+              </w:rPr>
+            </w:pPr>
+            <w:r>
+              <w:rPr>
+                <w:rFonts w:hint="eastAsia"/>
+                <w:vertAlign w:val="baseline"/>
+                <w:lang w:val="en-US" w:eastAsia="zh-CN"/>
+              </w:rPr>
+              <w:t>参数冻结</w:t>
+            </w:r>
+          </w:p>
+        </w:tc>
+      </w:tr>
+      <w:tr>
+        <w:tblPrEx>
+          <w:tblBorders>
+            <w:top w:val="single" w:color="auto" w:sz="4" w:space="0"/>
+            <w:left w:val="single" w:color="auto" w:sz="4" w:space="0"/>
+            <w:bottom w:val="single" w:color="auto" w:sz="4" w:space="0"/>
+            <w:right w:val="single" w:color="auto" w:sz="4" w:space="0"/>
+            <w:insideH w:val="single" w:color="auto" w:sz="4" w:space="0"/>
+            <w:insideV w:val="single" w:color="auto" w:sz="4" w:space="0"/>
+          </w:tblBorders>
+          <w:tblCellMar>
+            <w:top w:w="0" w:type="dxa"/>
+            <w:left w:w="108" w:type="dxa"/>
+            <w:bottom w:w="0" w:type="dxa"/>
+            <w:right w:w="108" w:type="dxa"/>
+          </w:tblCellMar>
+        </w:tblPrEx>
+        <w:tc>
+          <w:tcPr>
+            <w:tcW w:w="0" w:type="auto"/>
+            <w:vMerge w:val="continue"/>
+            <w:tcBorders/>
+            <w:vAlign w:val="center"/>
+          </w:tcPr>
+          <w:p>
+            <w:pPr>
+              <w:pStyle w:val="26"/>
+              <w:bidi w:val="0"/>
+              <w:jc w:val="both"/>
+              <w:rPr>
+                <w:rFonts w:hint="eastAsia" w:cs="华文中宋"/>
+                <w:b/>
+                <w:bCs/>
+                <w:color w:val="ED7D31"/>
+                <w:kern w:val="2"/>
+                <w:sz w:val="21"/>
+                <w:szCs w:val="21"/>
+                <w:vertAlign w:val="baseline"/>
+                <w:lang w:val="en-US" w:eastAsia="zh-CN" w:bidi="ar-SA"/>
+              </w:rPr>
+            </w:pPr>
+          </w:p>
+        </w:tc>
+        <w:tc>
+          <w:tcPr>
+            <w:tcW w:w="0" w:type="auto"/>
+            <w:vAlign w:val="center"/>
+          </w:tcPr>
+          <w:p>
+            <w:pPr>
+              <w:pStyle w:val="26"/>
+              <w:bidi w:val="0"/>
+              <w:jc w:val="both"/>
+              <w:rPr>
+                <w:rFonts w:hint="default" w:cs="华文中宋"/>
+                <w:b/>
+                <w:bCs/>
+                <w:color w:val="FF0000"/>
+                <w:kern w:val="2"/>
+                <w:sz w:val="21"/>
+                <w:szCs w:val="21"/>
+                <w:lang w:val="en-US" w:eastAsia="zh-CN" w:bidi="ar-SA"/>
+              </w:rPr>
+            </w:pPr>
+            <w:r>
+              <w:rPr>
+                <w:rFonts w:hint="eastAsia" w:cs="华文中宋"/>
+                <w:b/>
+                <w:bCs/>
+                <w:color w:val="FF0000"/>
+                <w:kern w:val="2"/>
+                <w:sz w:val="21"/>
+                <w:szCs w:val="21"/>
+                <w:lang w:val="en-US" w:eastAsia="zh-CN" w:bidi="ar-SA"/>
+              </w:rPr>
+              <w:t>to_onnx / to_torchscript(file, input)</w:t>
+            </w:r>
+          </w:p>
+        </w:tc>
+        <w:tc>
+          <w:tcPr>
+            <w:tcW w:w="0" w:type="auto"/>
+            <w:vAlign w:val="center"/>
+          </w:tcPr>
+          <w:p>
+            <w:pPr>
+              <w:pStyle w:val="27"/>
+              <w:bidi w:val="0"/>
+              <w:jc w:val="both"/>
+              <w:rPr>
+                <w:rFonts w:hint="default"/>
+                <w:vertAlign w:val="baseline"/>
+                <w:lang w:val="en-US" w:eastAsia="zh-CN"/>
+              </w:rPr>
+            </w:pPr>
+            <w:r>
+              <w:rPr>
+                <w:rFonts w:hint="eastAsia"/>
+                <w:vertAlign w:val="baseline"/>
+                <w:lang w:val="en-US" w:eastAsia="zh-CN"/>
+              </w:rPr>
+              <w:t>导出</w:t>
+            </w:r>
+          </w:p>
+        </w:tc>
+      </w:tr>
+      <w:tr>
+        <w:tblPrEx>
+          <w:tblBorders>
+            <w:top w:val="single" w:color="auto" w:sz="4" w:space="0"/>
+            <w:left w:val="single" w:color="auto" w:sz="4" w:space="0"/>
+            <w:bottom w:val="single" w:color="auto" w:sz="4" w:space="0"/>
+            <w:right w:val="single" w:color="auto" w:sz="4" w:space="0"/>
+            <w:insideH w:val="single" w:color="auto" w:sz="4" w:space="0"/>
+            <w:insideV w:val="single" w:color="auto" w:sz="4" w:space="0"/>
+          </w:tblBorders>
+          <w:tblCellMar>
+            <w:top w:w="0" w:type="dxa"/>
+            <w:left w:w="108" w:type="dxa"/>
+            <w:bottom w:w="0" w:type="dxa"/>
+            <w:right w:w="108" w:type="dxa"/>
+          </w:tblCellMar>
+        </w:tblPrEx>
+        <w:tc>
+          <w:tcPr>
+            <w:tcW w:w="0" w:type="auto"/>
+            <w:vMerge w:val="restart"/>
+            <w:vAlign w:val="center"/>
+          </w:tcPr>
+          <w:p>
+            <w:pPr>
+              <w:pStyle w:val="26"/>
+              <w:bidi w:val="0"/>
+              <w:jc w:val="both"/>
+              <w:rPr>
+                <w:rFonts w:hint="default" w:ascii="华文中宋" w:hAnsi="华文中宋" w:eastAsia="华文中宋" w:cs="华文中宋"/>
+                <w:b/>
+                <w:bCs/>
+                <w:color w:val="FF0000"/>
+                <w:kern w:val="2"/>
+                <w:sz w:val="21"/>
+                <w:szCs w:val="21"/>
+                <w:lang w:val="en-US" w:eastAsia="zh-CN" w:bidi="ar-SA"/>
+              </w:rPr>
+            </w:pPr>
+            <w:r>
+              <w:rPr>
+                <w:rFonts w:hint="eastAsia" w:cs="华文中宋"/>
+                <w:b/>
+                <w:bCs/>
+                <w:color w:val="ED7D31"/>
+                <w:kern w:val="2"/>
+                <w:sz w:val="21"/>
+                <w:szCs w:val="21"/>
+                <w:vertAlign w:val="baseline"/>
+                <w:lang w:val="en-US" w:eastAsia="zh-CN" w:bidi="ar-SA"/>
+              </w:rPr>
+              <w:t>抽象方法</w:t>
+            </w:r>
+          </w:p>
+        </w:tc>
+        <w:tc>
+          <w:tcPr>
+            <w:tcW w:w="0" w:type="auto"/>
+            <w:vAlign w:val="center"/>
+          </w:tcPr>
+          <w:p>
+            <w:pPr>
+              <w:pStyle w:val="26"/>
+              <w:bidi w:val="0"/>
+              <w:jc w:val="both"/>
+              <w:rPr>
+                <w:rFonts w:hint="default" w:ascii="华文中宋" w:hAnsi="华文中宋" w:eastAsia="华文中宋" w:cs="华文中宋"/>
+                <w:b/>
+                <w:bCs/>
+                <w:color w:val="FF0000"/>
+                <w:kern w:val="2"/>
+                <w:sz w:val="21"/>
+                <w:szCs w:val="21"/>
+                <w:lang w:val="en-US" w:eastAsia="zh-CN" w:bidi="ar-SA"/>
+              </w:rPr>
+            </w:pPr>
+            <w:r>
+              <w:rPr>
+                <w:rFonts w:hint="eastAsia" w:cs="华文中宋"/>
+                <w:b/>
+                <w:bCs/>
+                <w:color w:val="FF0000"/>
+                <w:kern w:val="2"/>
+                <w:sz w:val="21"/>
+                <w:szCs w:val="21"/>
+                <w:lang w:val="en-US" w:eastAsia="zh-CN" w:bidi="ar-SA"/>
+              </w:rPr>
+              <w:t>configure_optimizers(self)</w:t>
+            </w:r>
+          </w:p>
+        </w:tc>
+        <w:tc>
+          <w:tcPr>
+            <w:tcW w:w="0" w:type="auto"/>
+            <w:vAlign w:val="center"/>
+          </w:tcPr>
+          <w:p>
+            <w:pPr>
+              <w:pStyle w:val="27"/>
+              <w:bidi w:val="0"/>
+              <w:jc w:val="both"/>
+              <w:rPr>
+                <w:rFonts w:hint="default"/>
+                <w:vertAlign w:val="baseline"/>
+                <w:lang w:val="en-US" w:eastAsia="zh-CN"/>
+              </w:rPr>
+            </w:pPr>
+            <w:r>
+              <w:rPr>
+                <w:rFonts w:hint="eastAsia" w:cs="华文中宋"/>
+                <w:b/>
+                <w:bCs/>
+                <w:color w:val="ED7D31"/>
+                <w:kern w:val="2"/>
+                <w:sz w:val="21"/>
+                <w:szCs w:val="21"/>
+                <w:vertAlign w:val="baseline"/>
+                <w:lang w:val="en-US" w:eastAsia="zh-CN" w:bidi="ar-SA"/>
+              </w:rPr>
+              <w:t>return</w:t>
+            </w:r>
+            <w:r>
+              <w:rPr>
+                <w:rFonts w:hint="eastAsia"/>
+                <w:vertAlign w:val="baseline"/>
+                <w:lang w:val="en-US" w:eastAsia="zh-CN"/>
+              </w:rPr>
+              <w:t xml:space="preserve"> </w:t>
+            </w:r>
+            <w:r>
+              <w:rPr>
+                <w:rFonts w:hint="default"/>
+                <w:vertAlign w:val="baseline"/>
+                <w:lang w:val="en-US" w:eastAsia="zh-CN"/>
+              </w:rPr>
+              <w:t>{</w:t>
+            </w:r>
+          </w:p>
+          <w:p>
+            <w:pPr>
+              <w:pStyle w:val="27"/>
+              <w:bidi w:val="0"/>
+              <w:jc w:val="both"/>
+              <w:rPr>
+                <w:rFonts w:hint="default"/>
+                <w:vertAlign w:val="baseline"/>
+                <w:lang w:val="en-US" w:eastAsia="zh-CN"/>
+              </w:rPr>
+            </w:pPr>
+            <w:r>
+              <w:rPr>
+                <w:rFonts w:hint="default"/>
+                <w:vertAlign w:val="baseline"/>
+                <w:lang w:val="en-US" w:eastAsia="zh-CN"/>
+              </w:rPr>
+              <w:t xml:space="preserve">    "optimizer": optimizer,</w:t>
+            </w:r>
+          </w:p>
+          <w:p>
+            <w:pPr>
+              <w:pStyle w:val="27"/>
+              <w:bidi w:val="0"/>
+              <w:ind w:firstLine="421"/>
+              <w:jc w:val="both"/>
+              <w:rPr>
+                <w:rFonts w:hint="default"/>
+                <w:vertAlign w:val="baseline"/>
+                <w:lang w:val="en-US" w:eastAsia="zh-CN"/>
+              </w:rPr>
+            </w:pPr>
+            <w:r>
+              <w:rPr>
+                <w:rFonts w:hint="default"/>
+                <w:vertAlign w:val="baseline"/>
+                <w:lang w:val="en-US" w:eastAsia="zh-CN"/>
+              </w:rPr>
+              <w:t>"lr_scheduler": {</w:t>
+            </w:r>
+          </w:p>
+          <w:p>
+            <w:pPr>
+              <w:pStyle w:val="27"/>
+              <w:bidi w:val="0"/>
+              <w:ind w:firstLine="841" w:firstLineChars="400"/>
+              <w:jc w:val="both"/>
+              <w:rPr>
+                <w:rFonts w:hint="default"/>
+                <w:vertAlign w:val="baseline"/>
+                <w:lang w:val="en-US" w:eastAsia="zh-CN"/>
+              </w:rPr>
+            </w:pPr>
+            <w:r>
+              <w:rPr>
+                <w:rFonts w:hint="default"/>
+                <w:vertAlign w:val="baseline"/>
+                <w:lang w:val="en-US" w:eastAsia="zh-CN"/>
+              </w:rPr>
+              <w:t xml:space="preserve">"scheduler": lr_scheduler, </w:t>
+            </w:r>
+          </w:p>
+          <w:p>
+            <w:pPr>
+              <w:pStyle w:val="27"/>
+              <w:bidi w:val="0"/>
+              <w:ind w:firstLine="841" w:firstLineChars="400"/>
+              <w:jc w:val="both"/>
+              <w:rPr>
+                <w:rFonts w:hint="default"/>
+                <w:vertAlign w:val="baseline"/>
+                <w:lang w:val="en-US" w:eastAsia="zh-CN"/>
+              </w:rPr>
+            </w:pPr>
+            <w:r>
+              <w:rPr>
+                <w:rFonts w:hint="default"/>
+                <w:vertAlign w:val="baseline"/>
+                <w:lang w:val="en-US" w:eastAsia="zh-CN"/>
+              </w:rPr>
+              <w:t xml:space="preserve">"interval": </w:t>
+            </w:r>
+            <w:r>
+              <w:rPr>
+                <w:rFonts w:hint="eastAsia"/>
+                <w:vertAlign w:val="baseline"/>
+                <w:lang w:val="en-US" w:eastAsia="zh-CN"/>
+              </w:rPr>
+              <w:t>"epoch"</w:t>
+            </w:r>
+            <w:r>
+              <w:rPr>
+                <w:rFonts w:hint="default"/>
+                <w:vertAlign w:val="baseline"/>
+                <w:lang w:val="en-US" w:eastAsia="zh-CN"/>
+              </w:rPr>
+              <w:t>}</w:t>
+            </w:r>
+          </w:p>
+          <w:p>
+            <w:pPr>
+              <w:pStyle w:val="27"/>
+              <w:bidi w:val="0"/>
+              <w:jc w:val="both"/>
+              <w:rPr>
+                <w:rFonts w:hint="default"/>
+                <w:vertAlign w:val="baseline"/>
+                <w:lang w:val="en-US" w:eastAsia="zh-CN"/>
+              </w:rPr>
+            </w:pPr>
+            <w:r>
+              <w:rPr>
+                <w:rFonts w:hint="default"/>
+                <w:vertAlign w:val="baseline"/>
+                <w:lang w:val="en-US" w:eastAsia="zh-CN"/>
+              </w:rPr>
+              <w:t>}</w:t>
+            </w:r>
+          </w:p>
+        </w:tc>
+      </w:tr>
+      <w:tr>
+        <w:tblPrEx>
+          <w:tblBorders>
+            <w:top w:val="single" w:color="auto" w:sz="4" w:space="0"/>
+            <w:left w:val="single" w:color="auto" w:sz="4" w:space="0"/>
+            <w:bottom w:val="single" w:color="auto" w:sz="4" w:space="0"/>
+            <w:right w:val="single" w:color="auto" w:sz="4" w:space="0"/>
+            <w:insideH w:val="single" w:color="auto" w:sz="4" w:space="0"/>
+            <w:insideV w:val="single" w:color="auto" w:sz="4" w:space="0"/>
+          </w:tblBorders>
+          <w:tblCellMar>
+            <w:top w:w="0" w:type="dxa"/>
+            <w:left w:w="108" w:type="dxa"/>
+            <w:bottom w:w="0" w:type="dxa"/>
+            <w:right w:w="108" w:type="dxa"/>
+          </w:tblCellMar>
+        </w:tblPrEx>
+        <w:tc>
+          <w:tcPr>
+            <w:tcW w:w="0" w:type="auto"/>
+            <w:vMerge w:val="continue"/>
+            <w:tcBorders/>
+            <w:vAlign w:val="center"/>
+          </w:tcPr>
+          <w:p>
+            <w:pPr>
+              <w:pStyle w:val="26"/>
+              <w:bidi w:val="0"/>
+              <w:jc w:val="both"/>
+              <w:rPr>
+                <w:rFonts w:hint="eastAsia" w:cs="华文中宋"/>
+                <w:b/>
+                <w:bCs/>
+                <w:color w:val="ED7D31"/>
+                <w:kern w:val="2"/>
+                <w:sz w:val="21"/>
+                <w:szCs w:val="21"/>
+                <w:vertAlign w:val="baseline"/>
+                <w:lang w:val="en-US" w:eastAsia="zh-CN" w:bidi="ar-SA"/>
+              </w:rPr>
+            </w:pPr>
+          </w:p>
+        </w:tc>
+        <w:tc>
+          <w:tcPr>
+            <w:tcW w:w="0" w:type="auto"/>
+            <w:vAlign w:val="center"/>
+          </w:tcPr>
+          <w:p>
+            <w:pPr>
+              <w:pStyle w:val="26"/>
+              <w:bidi w:val="0"/>
+              <w:jc w:val="both"/>
+              <w:rPr>
+                <w:rFonts w:hint="eastAsia" w:cs="华文中宋"/>
+                <w:b/>
+                <w:bCs/>
+                <w:color w:val="FF0000"/>
+                <w:kern w:val="2"/>
+                <w:sz w:val="21"/>
+                <w:szCs w:val="21"/>
+                <w:lang w:val="en-US" w:eastAsia="zh-CN" w:bidi="ar-SA"/>
+              </w:rPr>
+            </w:pPr>
+            <w:r>
+              <w:rPr>
+                <w:rFonts w:hint="eastAsia" w:cs="华文中宋"/>
+                <w:b/>
+                <w:bCs/>
+                <w:color w:val="FF0000"/>
+                <w:kern w:val="2"/>
+                <w:sz w:val="21"/>
+                <w:szCs w:val="21"/>
+                <w:lang w:val="en-US" w:eastAsia="zh-CN" w:bidi="ar-SA"/>
+              </w:rPr>
+              <w:t xml:space="preserve">training_step / </w:t>
+            </w:r>
+          </w:p>
+          <w:p>
+            <w:pPr>
+              <w:pStyle w:val="26"/>
+              <w:bidi w:val="0"/>
+              <w:jc w:val="both"/>
+              <w:rPr>
+                <w:rFonts w:hint="default" w:cs="华文中宋"/>
+                <w:b/>
+                <w:bCs/>
+                <w:color w:val="FF0000"/>
+                <w:kern w:val="2"/>
+                <w:sz w:val="21"/>
+                <w:szCs w:val="21"/>
+                <w:lang w:val="en-US" w:eastAsia="zh-CN" w:bidi="ar-SA"/>
+              </w:rPr>
+            </w:pPr>
+            <w:r>
+              <w:rPr>
+                <w:rFonts w:hint="eastAsia" w:cs="华文中宋"/>
+                <w:b/>
+                <w:bCs/>
+                <w:color w:val="FF0000"/>
+                <w:kern w:val="2"/>
+                <w:sz w:val="21"/>
+                <w:szCs w:val="21"/>
+                <w:lang w:val="en-US" w:eastAsia="zh-CN" w:bidi="ar-SA"/>
+              </w:rPr>
+              <w:t>validation_step(batch, batch_idx)</w:t>
+            </w:r>
+          </w:p>
+        </w:tc>
+        <w:tc>
+          <w:tcPr>
+            <w:tcW w:w="0" w:type="auto"/>
+            <w:vAlign w:val="center"/>
+          </w:tcPr>
+          <w:p>
+            <w:pPr>
+              <w:pStyle w:val="27"/>
+              <w:bidi w:val="0"/>
+              <w:jc w:val="both"/>
+              <w:rPr>
+                <w:rFonts w:hint="eastAsia"/>
+                <w:vertAlign w:val="baseline"/>
+                <w:lang w:val="en-US" w:eastAsia="zh-CN"/>
+              </w:rPr>
+            </w:pPr>
+            <w:r>
+              <w:rPr>
+                <w:rFonts w:hint="eastAsia" w:cs="华文中宋"/>
+                <w:b/>
+                <w:bCs/>
+                <w:color w:val="ED7D31"/>
+                <w:kern w:val="2"/>
+                <w:sz w:val="21"/>
+                <w:szCs w:val="21"/>
+                <w:vertAlign w:val="baseline"/>
+                <w:lang w:val="en-US" w:eastAsia="zh-CN" w:bidi="ar-SA"/>
+              </w:rPr>
+              <w:t xml:space="preserve">return </w:t>
+            </w:r>
+            <w:r>
+              <w:rPr>
+                <w:rFonts w:hint="eastAsia"/>
+                <w:vertAlign w:val="baseline"/>
+                <w:lang w:val="en-US" w:eastAsia="zh-CN"/>
+              </w:rPr>
+              <w:t>loss</w:t>
+            </w:r>
+          </w:p>
+          <w:p>
+            <w:pPr>
+              <w:pStyle w:val="27"/>
+              <w:bidi w:val="0"/>
+              <w:jc w:val="both"/>
+              <w:rPr>
+                <w:rFonts w:hint="default" w:cs="华文中宋"/>
+                <w:b/>
+                <w:bCs/>
+                <w:color w:val="ED7D31"/>
+                <w:kern w:val="2"/>
+                <w:sz w:val="21"/>
+                <w:szCs w:val="21"/>
+                <w:vertAlign w:val="baseline"/>
+                <w:lang w:val="en-US" w:eastAsia="zh-CN" w:bidi="ar-SA"/>
+              </w:rPr>
+            </w:pPr>
+            <w:r>
+              <w:rPr>
+                <w:rFonts w:hint="eastAsia" w:cs="华文中宋"/>
+                <w:b/>
+                <w:bCs/>
+                <w:color w:val="ED7D31"/>
+                <w:kern w:val="2"/>
+                <w:sz w:val="21"/>
+                <w:szCs w:val="21"/>
+                <w:vertAlign w:val="baseline"/>
+                <w:lang w:val="en-US" w:eastAsia="zh-CN" w:bidi="ar-SA"/>
+              </w:rPr>
+              <w:t>return</w:t>
+            </w:r>
+            <w:r>
+              <w:rPr>
+                <w:rFonts w:hint="eastAsia"/>
+                <w:vertAlign w:val="baseline"/>
+                <w:lang w:val="en-US" w:eastAsia="zh-CN"/>
+              </w:rPr>
+              <w:t xml:space="preserve"> {"loss": ...}</w:t>
+            </w:r>
+          </w:p>
+        </w:tc>
+      </w:tr>
+      <w:tr>
+        <w:tblPrEx>
+          <w:tblBorders>
+            <w:top w:val="single" w:color="auto" w:sz="4" w:space="0"/>
+            <w:left w:val="single" w:color="auto" w:sz="4" w:space="0"/>
+            <w:bottom w:val="single" w:color="auto" w:sz="4" w:space="0"/>
+            <w:right w:val="single" w:color="auto" w:sz="4" w:space="0"/>
+            <w:insideH w:val="single" w:color="auto" w:sz="4" w:space="0"/>
+            <w:insideV w:val="single" w:color="auto" w:sz="4" w:space="0"/>
+          </w:tblBorders>
+          <w:tblCellMar>
+            <w:top w:w="0" w:type="dxa"/>
+            <w:left w:w="108" w:type="dxa"/>
+            <w:bottom w:w="0" w:type="dxa"/>
+            <w:right w:w="108" w:type="dxa"/>
+          </w:tblCellMar>
+        </w:tblPrEx>
+        <w:tc>
+          <w:tcPr>
+            <w:tcW w:w="0" w:type="auto"/>
+            <w:vMerge w:val="continue"/>
+            <w:tcBorders/>
+            <w:vAlign w:val="center"/>
+          </w:tcPr>
+          <w:p>
+            <w:pPr>
+              <w:pStyle w:val="26"/>
+              <w:bidi w:val="0"/>
+              <w:jc w:val="both"/>
+              <w:rPr>
+                <w:rFonts w:hint="eastAsia" w:cs="华文中宋"/>
+                <w:b/>
+                <w:bCs/>
+                <w:color w:val="ED7D31"/>
+                <w:kern w:val="2"/>
+                <w:sz w:val="21"/>
+                <w:szCs w:val="21"/>
+                <w:vertAlign w:val="baseline"/>
+                <w:lang w:val="en-US" w:eastAsia="zh-CN" w:bidi="ar-SA"/>
+              </w:rPr>
+            </w:pPr>
+          </w:p>
+        </w:tc>
+        <w:tc>
+          <w:tcPr>
+            <w:tcW w:w="0" w:type="auto"/>
+            <w:vAlign w:val="center"/>
+          </w:tcPr>
+          <w:p>
+            <w:pPr>
+              <w:pStyle w:val="26"/>
+              <w:bidi w:val="0"/>
+              <w:jc w:val="both"/>
+              <w:rPr>
+                <w:rFonts w:hint="eastAsia" w:cs="华文中宋"/>
+                <w:b/>
+                <w:bCs/>
+                <w:color w:val="FF0000"/>
+                <w:kern w:val="2"/>
+                <w:sz w:val="21"/>
+                <w:szCs w:val="21"/>
+                <w:lang w:val="en-US" w:eastAsia="zh-CN" w:bidi="ar-SA"/>
+              </w:rPr>
+            </w:pPr>
+            <w:r>
+              <w:rPr>
+                <w:rFonts w:hint="eastAsia" w:cs="华文中宋"/>
+                <w:b/>
+                <w:bCs/>
+                <w:color w:val="FF0000"/>
+                <w:kern w:val="2"/>
+                <w:sz w:val="21"/>
+                <w:szCs w:val="21"/>
+                <w:lang w:val="en-US" w:eastAsia="zh-CN" w:bidi="ar-SA"/>
+              </w:rPr>
+              <w:t xml:space="preserve">on_train_start / on_train_end / </w:t>
+            </w:r>
+          </w:p>
+          <w:p>
+            <w:pPr>
+              <w:pStyle w:val="26"/>
+              <w:bidi w:val="0"/>
+              <w:jc w:val="both"/>
+              <w:rPr>
+                <w:rFonts w:hint="default" w:cs="华文中宋"/>
+                <w:b/>
+                <w:bCs/>
+                <w:color w:val="FF0000"/>
+                <w:kern w:val="2"/>
+                <w:sz w:val="21"/>
+                <w:szCs w:val="21"/>
+                <w:lang w:val="en-US" w:eastAsia="zh-CN" w:bidi="ar-SA"/>
+              </w:rPr>
+            </w:pPr>
+            <w:r>
+              <w:rPr>
+                <w:rFonts w:hint="eastAsia" w:cs="华文中宋"/>
+                <w:b/>
+                <w:bCs/>
+                <w:color w:val="FF0000"/>
+                <w:kern w:val="2"/>
+                <w:sz w:val="21"/>
+                <w:szCs w:val="21"/>
+                <w:lang w:val="en-US" w:eastAsia="zh-CN" w:bidi="ar-SA"/>
+              </w:rPr>
+              <w:t>on_train_batch_start / on_train_batch_end /</w:t>
+            </w:r>
+          </w:p>
+          <w:p>
+            <w:pPr>
+              <w:pStyle w:val="26"/>
+              <w:bidi w:val="0"/>
+              <w:jc w:val="both"/>
+              <w:rPr>
+                <w:rFonts w:hint="default" w:cs="华文中宋"/>
+                <w:b/>
+                <w:bCs/>
+                <w:color w:val="FF0000"/>
+                <w:kern w:val="2"/>
+                <w:sz w:val="21"/>
+                <w:szCs w:val="21"/>
+                <w:lang w:val="en-US" w:eastAsia="zh-CN" w:bidi="ar-SA"/>
+              </w:rPr>
+            </w:pPr>
+            <w:r>
+              <w:rPr>
+                <w:rFonts w:hint="eastAsia" w:cs="华文中宋"/>
+                <w:b/>
+                <w:bCs/>
+                <w:color w:val="FF0000"/>
+                <w:kern w:val="2"/>
+                <w:sz w:val="21"/>
+                <w:szCs w:val="21"/>
+                <w:lang w:val="en-US" w:eastAsia="zh-CN" w:bidi="ar-SA"/>
+              </w:rPr>
+              <w:t xml:space="preserve">on_train_epoch_start / on_train_epoch_end </w:t>
+            </w:r>
+          </w:p>
+        </w:tc>
+        <w:tc>
+          <w:tcPr>
+            <w:tcW w:w="0" w:type="auto"/>
+            <w:vAlign w:val="center"/>
+          </w:tcPr>
+          <w:p>
+            <w:pPr>
+              <w:pStyle w:val="27"/>
+              <w:bidi w:val="0"/>
+              <w:jc w:val="both"/>
+              <w:rPr>
+                <w:rFonts w:hint="default" w:cs="华文中宋"/>
+                <w:b/>
+                <w:bCs/>
+                <w:color w:val="ED7D31"/>
+                <w:kern w:val="2"/>
+                <w:sz w:val="21"/>
+                <w:szCs w:val="21"/>
+                <w:vertAlign w:val="baseline"/>
+                <w:lang w:val="en-US" w:eastAsia="zh-CN" w:bidi="ar-SA"/>
+              </w:rPr>
+            </w:pPr>
+            <w:r>
+              <w:rPr>
+                <w:rFonts w:hint="eastAsia"/>
+                <w:vertAlign w:val="baseline"/>
+                <w:lang w:val="en-US" w:eastAsia="zh-CN"/>
+              </w:rPr>
+              <w:t>事件</w:t>
+            </w:r>
+          </w:p>
+        </w:tc>
+      </w:tr>
+    </w:tbl>
+    <w:p>
+      <w:pPr>
+        <w:outlineLvl w:val="9"/>
+        <w:rPr>
+          <w:rFonts w:hint="eastAsia"/>
+          <w:color w:val="0070C0"/>
+        </w:rPr>
+      </w:pPr>
+    </w:p>
+    <w:tbl>
+      <w:tblPr>
+        <w:tblStyle w:val="12"/>
+        <w:tblW w:w="0" w:type="auto"/>
+        <w:tblInd w:w="0" w:type="dxa"/>
+        <w:tblBorders>
+          <w:top w:val="single" w:color="auto" w:sz="4" w:space="0"/>
+          <w:left w:val="single" w:color="auto" w:sz="4" w:space="0"/>
+          <w:bottom w:val="single" w:color="auto" w:sz="4" w:space="0"/>
+          <w:right w:val="single" w:color="auto" w:sz="4" w:space="0"/>
+          <w:insideH w:val="single" w:color="auto" w:sz="4" w:space="0"/>
+          <w:insideV w:val="single" w:color="auto" w:sz="4" w:space="0"/>
+        </w:tblBorders>
+        <w:tblLayout w:type="autofit"/>
+        <w:tblCellMar>
+          <w:top w:w="0" w:type="dxa"/>
+          <w:left w:w="108" w:type="dxa"/>
+          <w:bottom w:w="0" w:type="dxa"/>
+          <w:right w:w="108" w:type="dxa"/>
+        </w:tblCellMar>
+      </w:tblPr>
+      <w:tblGrid>
+        <w:gridCol w:w="1057"/>
+        <w:gridCol w:w="4876"/>
+        <w:gridCol w:w="2130"/>
+      </w:tblGrid>
+      <w:tr>
+        <w:tblPrEx>
+          <w:tblBorders>
+            <w:top w:val="single" w:color="auto" w:sz="4" w:space="0"/>
+            <w:left w:val="single" w:color="auto" w:sz="4" w:space="0"/>
+            <w:bottom w:val="single" w:color="auto" w:sz="4" w:space="0"/>
+            <w:right w:val="single" w:color="auto" w:sz="4" w:space="0"/>
+            <w:insideH w:val="single" w:color="auto" w:sz="4" w:space="0"/>
+            <w:insideV w:val="single" w:color="auto" w:sz="4" w:space="0"/>
+          </w:tblBorders>
+          <w:tblCellMar>
+            <w:top w:w="0" w:type="dxa"/>
+            <w:left w:w="108" w:type="dxa"/>
+            <w:bottom w:w="0" w:type="dxa"/>
+            <w:right w:w="108" w:type="dxa"/>
+          </w:tblCellMar>
+        </w:tblPrEx>
+        <w:tc>
+          <w:tcPr>
+            <w:tcW w:w="0" w:type="auto"/>
+            <w:gridSpan w:val="2"/>
+            <w:vAlign w:val="center"/>
+          </w:tcPr>
+          <w:p>
+            <w:pPr>
+              <w:pStyle w:val="26"/>
+              <w:bidi w:val="0"/>
+              <w:jc w:val="both"/>
+              <w:rPr>
+                <w:rFonts w:hint="default" w:cs="华文中宋"/>
+                <w:b/>
+                <w:bCs/>
+                <w:color w:val="FF0000"/>
+                <w:kern w:val="2"/>
+                <w:sz w:val="21"/>
+                <w:szCs w:val="21"/>
+                <w:lang w:val="en-US" w:eastAsia="zh-CN" w:bidi="ar-SA"/>
+              </w:rPr>
+            </w:pPr>
+            <w:r>
+              <w:rPr>
+                <w:rFonts w:hint="eastAsia" w:cs="华文中宋"/>
+                <w:b/>
+                <w:bCs/>
+                <w:color w:val="FF0000"/>
+                <w:kern w:val="2"/>
+                <w:sz w:val="21"/>
+                <w:szCs w:val="21"/>
+                <w:lang w:val="en-US" w:eastAsia="zh-CN" w:bidi="ar-SA"/>
+              </w:rPr>
+              <w:t>Trainer(num_nodes, precision, default_root_dir,</w:t>
+            </w:r>
+          </w:p>
+          <w:p>
+            <w:pPr>
+              <w:pStyle w:val="26"/>
+              <w:bidi w:val="0"/>
+              <w:jc w:val="both"/>
+              <w:rPr>
+                <w:rFonts w:hint="default"/>
+                <w:lang w:val="en-US" w:eastAsia="zh-CN"/>
+              </w:rPr>
+            </w:pPr>
+            <w:r>
+              <w:rPr>
+                <w:rFonts w:hint="eastAsia" w:cs="华文中宋"/>
+                <w:b/>
+                <w:bCs/>
+                <w:color w:val="FF0000"/>
+                <w:kern w:val="2"/>
+                <w:sz w:val="21"/>
+                <w:szCs w:val="21"/>
+                <w:lang w:val="en-US" w:eastAsia="zh-CN" w:bidi="ar-SA"/>
+              </w:rPr>
+              <w:t>max_epochs, check_val_every_n_epoch)</w:t>
+            </w:r>
+          </w:p>
+        </w:tc>
+        <w:tc>
+          <w:tcPr>
+            <w:tcW w:w="0" w:type="auto"/>
+            <w:vAlign w:val="center"/>
+          </w:tcPr>
+          <w:p>
+            <w:pPr>
+              <w:pStyle w:val="27"/>
+              <w:bidi w:val="0"/>
+              <w:jc w:val="both"/>
+              <w:rPr>
+                <w:rFonts w:hint="default"/>
+                <w:vertAlign w:val="baseline"/>
+                <w:lang w:val="en-US" w:eastAsia="zh-CN"/>
+              </w:rPr>
+            </w:pPr>
+            <w:r>
+              <w:rPr>
+                <w:rFonts w:hint="eastAsia"/>
+                <w:vertAlign w:val="baseline"/>
+                <w:lang w:val="en-US" w:eastAsia="zh-CN"/>
+              </w:rPr>
+              <w:t>训练器</w:t>
+            </w:r>
+          </w:p>
+        </w:tc>
+      </w:tr>
+      <w:tr>
+        <w:tblPrEx>
+          <w:tblBorders>
+            <w:top w:val="single" w:color="auto" w:sz="4" w:space="0"/>
+            <w:left w:val="single" w:color="auto" w:sz="4" w:space="0"/>
+            <w:bottom w:val="single" w:color="auto" w:sz="4" w:space="0"/>
+            <w:right w:val="single" w:color="auto" w:sz="4" w:space="0"/>
+            <w:insideH w:val="single" w:color="auto" w:sz="4" w:space="0"/>
+            <w:insideV w:val="single" w:color="auto" w:sz="4" w:space="0"/>
+          </w:tblBorders>
+          <w:tblCellMar>
+            <w:top w:w="0" w:type="dxa"/>
+            <w:left w:w="108" w:type="dxa"/>
+            <w:bottom w:w="0" w:type="dxa"/>
+            <w:right w:w="108" w:type="dxa"/>
+          </w:tblCellMar>
+        </w:tblPrEx>
+        <w:tc>
+          <w:tcPr>
+            <w:tcW w:w="0" w:type="auto"/>
+            <w:vAlign w:val="center"/>
+          </w:tcPr>
+          <w:p>
+            <w:pPr>
+              <w:pStyle w:val="26"/>
+              <w:bidi w:val="0"/>
+              <w:jc w:val="both"/>
+              <w:rPr>
+                <w:rFonts w:hint="default" w:cs="华文中宋"/>
+                <w:b/>
+                <w:bCs/>
+                <w:color w:val="ED7D31"/>
+                <w:kern w:val="2"/>
+                <w:sz w:val="21"/>
+                <w:szCs w:val="21"/>
+                <w:vertAlign w:val="baseline"/>
+                <w:lang w:val="en-US" w:eastAsia="zh-CN" w:bidi="ar-SA"/>
+              </w:rPr>
+            </w:pPr>
+            <w:r>
+              <w:rPr>
+                <w:rFonts w:hint="eastAsia" w:cs="华文中宋"/>
+                <w:b/>
+                <w:bCs/>
+                <w:color w:val="ED7D31"/>
+                <w:kern w:val="2"/>
+                <w:sz w:val="21"/>
+                <w:szCs w:val="21"/>
+                <w:vertAlign w:val="baseline"/>
+                <w:lang w:val="en-US" w:eastAsia="zh-CN" w:bidi="ar-SA"/>
+              </w:rPr>
+              <w:t>实例属性</w:t>
+            </w:r>
+          </w:p>
+        </w:tc>
+        <w:tc>
+          <w:tcPr>
+            <w:tcW w:w="0" w:type="auto"/>
+            <w:vAlign w:val="center"/>
+          </w:tcPr>
+          <w:p>
+            <w:pPr>
+              <w:pStyle w:val="26"/>
+              <w:bidi w:val="0"/>
+              <w:jc w:val="both"/>
+              <w:rPr>
+                <w:rFonts w:hint="default" w:cs="华文中宋"/>
+                <w:b/>
+                <w:bCs/>
+                <w:color w:val="FF0000"/>
+                <w:kern w:val="2"/>
+                <w:sz w:val="21"/>
+                <w:szCs w:val="21"/>
+                <w:lang w:val="en-US" w:eastAsia="zh-CN" w:bidi="ar-SA"/>
+              </w:rPr>
+            </w:pPr>
+            <w:r>
+              <w:rPr>
+                <w:rFonts w:hint="eastAsia" w:cs="华文中宋"/>
+                <w:b/>
+                <w:bCs/>
+                <w:color w:val="FF0000"/>
+                <w:kern w:val="2"/>
+                <w:sz w:val="21"/>
+                <w:szCs w:val="21"/>
+                <w:lang w:val="en-US" w:eastAsia="zh-CN" w:bidi="ar-SA"/>
+              </w:rPr>
+              <w:t>callback_metrics</w:t>
+            </w:r>
+          </w:p>
+        </w:tc>
+        <w:tc>
+          <w:tcPr>
+            <w:tcW w:w="0" w:type="auto"/>
+            <w:vAlign w:val="center"/>
+          </w:tcPr>
+          <w:p>
+            <w:pPr>
+              <w:pStyle w:val="27"/>
+              <w:bidi w:val="0"/>
+              <w:jc w:val="both"/>
+              <w:rPr>
+                <w:rFonts w:hint="default"/>
+                <w:vertAlign w:val="baseline"/>
+                <w:lang w:val="en-US" w:eastAsia="zh-CN"/>
+              </w:rPr>
+            </w:pPr>
+            <w:r>
+              <w:rPr>
+                <w:rFonts w:hint="eastAsia"/>
+                <w:vertAlign w:val="baseline"/>
+                <w:lang w:val="en-US" w:eastAsia="zh-CN"/>
+              </w:rPr>
+              <w:t>指标</w:t>
+            </w:r>
+          </w:p>
+        </w:tc>
+      </w:tr>
+      <w:tr>
+        <w:tblPrEx>
+          <w:tblBorders>
+            <w:top w:val="single" w:color="auto" w:sz="4" w:space="0"/>
+            <w:left w:val="single" w:color="auto" w:sz="4" w:space="0"/>
+            <w:bottom w:val="single" w:color="auto" w:sz="4" w:space="0"/>
+            <w:right w:val="single" w:color="auto" w:sz="4" w:space="0"/>
+            <w:insideH w:val="single" w:color="auto" w:sz="4" w:space="0"/>
+            <w:insideV w:val="single" w:color="auto" w:sz="4" w:space="0"/>
+          </w:tblBorders>
+          <w:tblCellMar>
+            <w:top w:w="0" w:type="dxa"/>
+            <w:left w:w="108" w:type="dxa"/>
+            <w:bottom w:w="0" w:type="dxa"/>
+            <w:right w:w="108" w:type="dxa"/>
+          </w:tblCellMar>
+        </w:tblPrEx>
+        <w:tc>
+          <w:tcPr>
+            <w:tcW w:w="0" w:type="auto"/>
+            <w:vAlign w:val="center"/>
+          </w:tcPr>
+          <w:p>
+            <w:pPr>
+              <w:pStyle w:val="26"/>
+              <w:bidi w:val="0"/>
+              <w:jc w:val="both"/>
+              <w:rPr>
+                <w:rFonts w:hint="default" w:ascii="华文中宋" w:hAnsi="华文中宋" w:eastAsia="华文中宋" w:cs="华文中宋"/>
+                <w:b/>
+                <w:bCs/>
+                <w:color w:val="FF0000"/>
+                <w:kern w:val="2"/>
+                <w:sz w:val="21"/>
+                <w:szCs w:val="21"/>
+                <w:lang w:val="en-US" w:eastAsia="zh-CN" w:bidi="ar-SA"/>
+              </w:rPr>
+            </w:pPr>
+            <w:r>
+              <w:rPr>
+                <w:rFonts w:hint="eastAsia" w:cs="华文中宋"/>
+                <w:b/>
+                <w:bCs/>
+                <w:color w:val="ED7D31"/>
+                <w:kern w:val="2"/>
+                <w:sz w:val="21"/>
+                <w:szCs w:val="21"/>
+                <w:vertAlign w:val="baseline"/>
+                <w:lang w:val="en-US" w:eastAsia="zh-CN" w:bidi="ar-SA"/>
+              </w:rPr>
+              <w:t>抽象方法</w:t>
+            </w:r>
+          </w:p>
+        </w:tc>
+        <w:tc>
+          <w:tcPr>
+            <w:tcW w:w="0" w:type="auto"/>
+            <w:vAlign w:val="center"/>
+          </w:tcPr>
+          <w:p>
+            <w:pPr>
+              <w:pStyle w:val="26"/>
+              <w:bidi w:val="0"/>
+              <w:jc w:val="both"/>
+              <w:rPr>
+                <w:rFonts w:hint="default" w:ascii="华文中宋" w:hAnsi="华文中宋" w:eastAsia="华文中宋" w:cs="华文中宋"/>
+                <w:b/>
+                <w:bCs/>
+                <w:color w:val="FF0000"/>
+                <w:kern w:val="2"/>
+                <w:sz w:val="21"/>
+                <w:szCs w:val="21"/>
+                <w:lang w:val="en-US" w:eastAsia="zh-CN" w:bidi="ar-SA"/>
+              </w:rPr>
+            </w:pPr>
+            <w:r>
+              <w:rPr>
+                <w:rFonts w:hint="eastAsia" w:cs="华文中宋"/>
+                <w:b/>
+                <w:bCs/>
+                <w:color w:val="FF0000"/>
+                <w:kern w:val="2"/>
+                <w:sz w:val="21"/>
+                <w:szCs w:val="21"/>
+                <w:lang w:val="en-US" w:eastAsia="zh-CN" w:bidi="ar-SA"/>
+              </w:rPr>
+              <w:t>fit(model, train_loader, val_loader, ckpt_path)</w:t>
+            </w:r>
+          </w:p>
+        </w:tc>
+        <w:tc>
+          <w:tcPr>
+            <w:tcW w:w="0" w:type="auto"/>
+            <w:vAlign w:val="center"/>
+          </w:tcPr>
+          <w:p>
+            <w:pPr>
+              <w:pStyle w:val="27"/>
+              <w:bidi w:val="0"/>
+              <w:jc w:val="both"/>
+              <w:rPr>
+                <w:rFonts w:hint="default"/>
+                <w:vertAlign w:val="baseline"/>
+                <w:lang w:val="en-US" w:eastAsia="zh-CN"/>
+              </w:rPr>
+            </w:pPr>
+            <w:r>
+              <w:rPr>
+                <w:rFonts w:hint="eastAsia"/>
+                <w:vertAlign w:val="baseline"/>
+                <w:lang w:val="en-US" w:eastAsia="zh-CN"/>
+              </w:rPr>
+              <w:t>启动</w:t>
+            </w:r>
+            <w:r>
+              <w:rPr>
+                <w:rFonts w:hint="eastAsia" w:cs="华文中宋"/>
+                <w:b/>
+                <w:bCs/>
+                <w:color w:val="ED7D31"/>
+                <w:kern w:val="2"/>
+                <w:sz w:val="21"/>
+                <w:szCs w:val="21"/>
+                <w:vertAlign w:val="baseline"/>
+                <w:lang w:val="en-US" w:eastAsia="zh-CN" w:bidi="ar-SA"/>
+              </w:rPr>
+              <w:t xml:space="preserve"> (指定文件恢复)</w:t>
+            </w:r>
+          </w:p>
+        </w:tc>
+      </w:tr>
+    </w:tbl>
+    <w:p>
+      <w:pPr>
+        <w:outlineLvl w:val="9"/>
+        <w:rPr>
+          <w:rFonts w:hint="eastAsia"/>
+          <w:color w:val="0070C0"/>
+        </w:rPr>
+      </w:pPr>
+    </w:p>
+    <w:p>
+      <w:pPr>
+        <w:outlineLvl w:val="9"/>
+        <w:rPr>
+          <w:rFonts w:hint="eastAsia"/>
+          <w:color w:val="0070C0"/>
+        </w:rPr>
+      </w:pPr>
+    </w:p>
+    <w:p>
+      <w:pPr>
+        <w:pStyle w:val="19"/>
+        <w:bidi w:val="0"/>
+        <w:outlineLvl w:val="3"/>
+        <w:rPr>
+          <w:rFonts w:hint="eastAsia"/>
+          <w:color w:val="0070C0"/>
+        </w:rPr>
+      </w:pPr>
+      <w:r>
+        <w:rPr>
+          <w:rFonts w:hint="eastAsia" w:ascii="华文中宋" w:hAnsi="华文中宋" w:eastAsia="华文中宋" w:cs="华文中宋"/>
+          <w:b/>
+          <w:bCs/>
+          <w:color w:val="7030A0"/>
+          <w:spacing w:val="0"/>
+          <w:kern w:val="2"/>
+          <w:sz w:val="21"/>
+          <w:szCs w:val="21"/>
+          <w:lang w:val="en-US" w:eastAsia="zh-CN" w:bidi="ar-SA"/>
+        </w:rPr>
+        <w:t>回调callbacks：</w:t>
+      </w:r>
+    </w:p>
+    <w:tbl>
+      <w:tblPr>
+        <w:tblStyle w:val="12"/>
+        <w:tblW w:w="0" w:type="auto"/>
+        <w:tblInd w:w="0" w:type="dxa"/>
+        <w:tblBorders>
+          <w:top w:val="single" w:color="auto" w:sz="4" w:space="0"/>
+          <w:left w:val="single" w:color="auto" w:sz="4" w:space="0"/>
+          <w:bottom w:val="single" w:color="auto" w:sz="4" w:space="0"/>
+          <w:right w:val="single" w:color="auto" w:sz="4" w:space="0"/>
+          <w:insideH w:val="single" w:color="auto" w:sz="4" w:space="0"/>
+          <w:insideV w:val="single" w:color="auto" w:sz="4" w:space="0"/>
+        </w:tblBorders>
+        <w:tblLayout w:type="autofit"/>
+        <w:tblCellMar>
+          <w:top w:w="0" w:type="dxa"/>
+          <w:left w:w="108" w:type="dxa"/>
+          <w:bottom w:w="0" w:type="dxa"/>
+          <w:right w:w="108" w:type="dxa"/>
+        </w:tblCellMar>
+      </w:tblPr>
+      <w:tblGrid>
+        <w:gridCol w:w="2487"/>
+        <w:gridCol w:w="4468"/>
+        <w:gridCol w:w="1057"/>
+      </w:tblGrid>
+      <w:tr>
+        <w:tblPrEx>
+          <w:tblBorders>
+            <w:top w:val="single" w:color="auto" w:sz="4" w:space="0"/>
+            <w:left w:val="single" w:color="auto" w:sz="4" w:space="0"/>
+            <w:bottom w:val="single" w:color="auto" w:sz="4" w:space="0"/>
+            <w:right w:val="single" w:color="auto" w:sz="4" w:space="0"/>
+            <w:insideH w:val="single" w:color="auto" w:sz="4" w:space="0"/>
+            <w:insideV w:val="single" w:color="auto" w:sz="4" w:space="0"/>
+          </w:tblBorders>
+          <w:tblCellMar>
+            <w:top w:w="0" w:type="dxa"/>
+            <w:left w:w="108" w:type="dxa"/>
+            <w:bottom w:w="0" w:type="dxa"/>
+            <w:right w:w="108" w:type="dxa"/>
+          </w:tblCellMar>
+        </w:tblPrEx>
+        <w:tc>
+          <w:tcPr>
+            <w:tcW w:w="0" w:type="auto"/>
+            <w:gridSpan w:val="2"/>
+            <w:vAlign w:val="center"/>
+          </w:tcPr>
+          <w:p>
+            <w:pPr>
+              <w:pStyle w:val="26"/>
+              <w:bidi w:val="0"/>
+              <w:jc w:val="both"/>
+              <w:rPr>
+                <w:rFonts w:hint="default"/>
+                <w:lang w:val="en-US" w:eastAsia="zh-CN"/>
+              </w:rPr>
+            </w:pPr>
+            <w:r>
+              <w:rPr>
+                <w:rFonts w:hint="eastAsia" w:cs="华文中宋"/>
+                <w:b/>
+                <w:bCs/>
+                <w:color w:val="FF0000"/>
+                <w:kern w:val="2"/>
+                <w:sz w:val="21"/>
+                <w:szCs w:val="21"/>
+                <w:lang w:val="en-US" w:eastAsia="zh-CN" w:bidi="ar-SA"/>
+              </w:rPr>
+              <w:t>ModelCheckpoint(filename, monitor, mode, save_last, save_top_k)</w:t>
+            </w:r>
+          </w:p>
+        </w:tc>
+        <w:tc>
+          <w:tcPr>
+            <w:tcW w:w="0" w:type="auto"/>
+            <w:vAlign w:val="center"/>
+          </w:tcPr>
+          <w:p>
+            <w:pPr>
+              <w:pStyle w:val="27"/>
+              <w:bidi w:val="0"/>
+              <w:jc w:val="both"/>
+              <w:rPr>
+                <w:rFonts w:hint="default"/>
+                <w:vertAlign w:val="baseline"/>
+                <w:lang w:val="en-US" w:eastAsia="zh-CN"/>
+              </w:rPr>
+            </w:pPr>
+            <w:r>
+              <w:rPr>
+                <w:rFonts w:hint="eastAsia"/>
+                <w:vertAlign w:val="baseline"/>
+                <w:lang w:val="en-US" w:eastAsia="zh-CN"/>
+              </w:rPr>
+              <w:t>模型权重</w:t>
+            </w:r>
+          </w:p>
+        </w:tc>
+      </w:tr>
+      <w:tr>
+        <w:tblPrEx>
+          <w:tblBorders>
+            <w:top w:val="single" w:color="auto" w:sz="4" w:space="0"/>
+            <w:left w:val="single" w:color="auto" w:sz="4" w:space="0"/>
+            <w:bottom w:val="single" w:color="auto" w:sz="4" w:space="0"/>
+            <w:right w:val="single" w:color="auto" w:sz="4" w:space="0"/>
+            <w:insideH w:val="single" w:color="auto" w:sz="4" w:space="0"/>
+            <w:insideV w:val="single" w:color="auto" w:sz="4" w:space="0"/>
+          </w:tblBorders>
+          <w:tblCellMar>
+            <w:top w:w="0" w:type="dxa"/>
+            <w:left w:w="108" w:type="dxa"/>
+            <w:bottom w:w="0" w:type="dxa"/>
+            <w:right w:w="108" w:type="dxa"/>
+          </w:tblCellMar>
+        </w:tblPrEx>
+        <w:tc>
+          <w:tcPr>
+            <w:tcW w:w="0" w:type="auto"/>
+            <w:vAlign w:val="center"/>
+          </w:tcPr>
+          <w:p>
+            <w:pPr>
+              <w:pStyle w:val="26"/>
+              <w:bidi w:val="0"/>
+              <w:jc w:val="both"/>
+              <w:rPr>
+                <w:rFonts w:hint="eastAsia" w:cs="华文中宋"/>
+                <w:b/>
+                <w:bCs/>
+                <w:color w:val="FF0000"/>
+                <w:kern w:val="2"/>
+                <w:sz w:val="21"/>
+                <w:szCs w:val="21"/>
+                <w:lang w:val="en-US" w:eastAsia="zh-CN" w:bidi="ar-SA"/>
+              </w:rPr>
+            </w:pPr>
+            <w:r>
+              <w:rPr>
+                <w:rFonts w:hint="eastAsia" w:cs="华文中宋"/>
+                <w:b/>
+                <w:bCs/>
+                <w:color w:val="ED7D31"/>
+                <w:kern w:val="2"/>
+                <w:sz w:val="21"/>
+                <w:szCs w:val="21"/>
+                <w:vertAlign w:val="baseline"/>
+                <w:lang w:val="en-US" w:eastAsia="zh-CN" w:bidi="ar-SA"/>
+              </w:rPr>
+              <w:t>实例属性</w:t>
+            </w:r>
+          </w:p>
+        </w:tc>
+        <w:tc>
+          <w:tcPr>
+            <w:tcW w:w="0" w:type="auto"/>
+            <w:vAlign w:val="center"/>
+          </w:tcPr>
+          <w:p>
+            <w:pPr>
+              <w:pStyle w:val="26"/>
+              <w:bidi w:val="0"/>
+              <w:jc w:val="both"/>
+              <w:rPr>
+                <w:rFonts w:hint="default" w:cs="华文中宋"/>
+                <w:b/>
+                <w:bCs/>
+                <w:color w:val="FF0000"/>
+                <w:kern w:val="2"/>
+                <w:sz w:val="21"/>
+                <w:szCs w:val="21"/>
+                <w:lang w:val="en-US" w:eastAsia="zh-CN" w:bidi="ar-SA"/>
+              </w:rPr>
+            </w:pPr>
+            <w:r>
+              <w:rPr>
+                <w:rFonts w:hint="eastAsia" w:cs="华文中宋"/>
+                <w:b/>
+                <w:bCs/>
+                <w:color w:val="FF0000"/>
+                <w:kern w:val="2"/>
+                <w:sz w:val="21"/>
+                <w:szCs w:val="21"/>
+                <w:lang w:val="en-US" w:eastAsia="zh-CN" w:bidi="ar-SA"/>
+              </w:rPr>
+              <w:t>state_dict()</w:t>
+            </w:r>
+          </w:p>
+        </w:tc>
+        <w:tc>
+          <w:tcPr>
+            <w:tcW w:w="0" w:type="auto"/>
+            <w:vAlign w:val="center"/>
+          </w:tcPr>
+          <w:p>
+            <w:pPr>
+              <w:pStyle w:val="27"/>
+              <w:bidi w:val="0"/>
+              <w:jc w:val="both"/>
+              <w:rPr>
+                <w:rFonts w:hint="default"/>
+                <w:vertAlign w:val="baseline"/>
+                <w:lang w:val="en-US" w:eastAsia="zh-CN"/>
+              </w:rPr>
+            </w:pPr>
+            <w:r>
+              <w:rPr>
+                <w:rFonts w:hint="eastAsia"/>
+                <w:vertAlign w:val="baseline"/>
+                <w:lang w:val="en-US" w:eastAsia="zh-CN"/>
+              </w:rPr>
+              <w:t>属性</w:t>
+            </w:r>
+            <w:bookmarkStart w:id="44" w:name="_GoBack"/>
+            <w:bookmarkEnd w:id="44"/>
+          </w:p>
+        </w:tc>
+      </w:tr>
+    </w:tbl>
+    <w:p>
+      <w:pPr>
+        <w:outlineLvl w:val="9"/>
+        <w:rPr>
+          <w:rFonts w:hint="eastAsia"/>
+          <w:color w:val="0070C0"/>
+        </w:rPr>
+      </w:pPr>
+    </w:p>
+    <w:tbl>
+      <w:tblPr>
+        <w:tblStyle w:val="12"/>
+        <w:tblW w:w="0" w:type="auto"/>
+        <w:tblInd w:w="0" w:type="dxa"/>
+        <w:tblBorders>
+          <w:top w:val="single" w:color="auto" w:sz="4" w:space="0"/>
+          <w:left w:val="single" w:color="auto" w:sz="4" w:space="0"/>
+          <w:bottom w:val="single" w:color="auto" w:sz="4" w:space="0"/>
+          <w:right w:val="single" w:color="auto" w:sz="4" w:space="0"/>
+          <w:insideH w:val="single" w:color="auto" w:sz="4" w:space="0"/>
+          <w:insideV w:val="single" w:color="auto" w:sz="4" w:space="0"/>
+        </w:tblBorders>
+        <w:tblLayout w:type="autofit"/>
+        <w:tblCellMar>
+          <w:top w:w="0" w:type="dxa"/>
+          <w:left w:w="108" w:type="dxa"/>
+          <w:bottom w:w="0" w:type="dxa"/>
+          <w:right w:w="108" w:type="dxa"/>
+        </w:tblCellMar>
+      </w:tblPr>
+      <w:tblGrid>
+        <w:gridCol w:w="1057"/>
+        <w:gridCol w:w="4283"/>
+        <w:gridCol w:w="1799"/>
+      </w:tblGrid>
+      <w:tr>
+        <w:tblPrEx>
+          <w:tblBorders>
+            <w:top w:val="single" w:color="auto" w:sz="4" w:space="0"/>
+            <w:left w:val="single" w:color="auto" w:sz="4" w:space="0"/>
+            <w:bottom w:val="single" w:color="auto" w:sz="4" w:space="0"/>
+            <w:right w:val="single" w:color="auto" w:sz="4" w:space="0"/>
+            <w:insideH w:val="single" w:color="auto" w:sz="4" w:space="0"/>
+            <w:insideV w:val="single" w:color="auto" w:sz="4" w:space="0"/>
+          </w:tblBorders>
+          <w:tblCellMar>
+            <w:top w:w="0" w:type="dxa"/>
+            <w:left w:w="108" w:type="dxa"/>
+            <w:bottom w:w="0" w:type="dxa"/>
+            <w:right w:w="108" w:type="dxa"/>
+          </w:tblCellMar>
+        </w:tblPrEx>
+        <w:tc>
+          <w:tcPr>
+            <w:tcW w:w="0" w:type="auto"/>
+            <w:gridSpan w:val="2"/>
+            <w:vAlign w:val="center"/>
+          </w:tcPr>
+          <w:p>
+            <w:pPr>
+              <w:pStyle w:val="26"/>
+              <w:bidi w:val="0"/>
+              <w:jc w:val="both"/>
+              <w:rPr>
+                <w:rFonts w:hint="default"/>
+                <w:lang w:val="en-US" w:eastAsia="zh-CN"/>
+              </w:rPr>
+            </w:pPr>
+            <w:r>
+              <w:rPr>
+                <w:rFonts w:hint="eastAsia" w:cs="华文中宋"/>
+                <w:b/>
+                <w:bCs/>
+                <w:color w:val="FF0000"/>
+                <w:kern w:val="2"/>
+                <w:sz w:val="21"/>
+                <w:szCs w:val="21"/>
+                <w:lang w:val="en-US" w:eastAsia="zh-CN" w:bidi="ar-SA"/>
+              </w:rPr>
+              <w:t>TQDMProgressBar</w:t>
+            </w:r>
+          </w:p>
+        </w:tc>
+        <w:tc>
+          <w:tcPr>
+            <w:tcW w:w="0" w:type="auto"/>
+            <w:vAlign w:val="center"/>
+          </w:tcPr>
+          <w:p>
+            <w:pPr>
+              <w:pStyle w:val="27"/>
+              <w:bidi w:val="0"/>
+              <w:jc w:val="both"/>
+              <w:rPr>
+                <w:rFonts w:hint="default"/>
+                <w:vertAlign w:val="baseline"/>
+                <w:lang w:val="en-US" w:eastAsia="zh-CN"/>
+              </w:rPr>
+            </w:pPr>
+            <w:r>
+              <w:rPr>
+                <w:rFonts w:hint="eastAsia"/>
+                <w:vertAlign w:val="baseline"/>
+                <w:lang w:val="en-US" w:eastAsia="zh-CN"/>
+              </w:rPr>
+              <w:t>进度条</w:t>
+            </w:r>
+          </w:p>
+        </w:tc>
+      </w:tr>
+      <w:tr>
+        <w:tblPrEx>
+          <w:tblBorders>
+            <w:top w:val="single" w:color="auto" w:sz="4" w:space="0"/>
+            <w:left w:val="single" w:color="auto" w:sz="4" w:space="0"/>
+            <w:bottom w:val="single" w:color="auto" w:sz="4" w:space="0"/>
+            <w:right w:val="single" w:color="auto" w:sz="4" w:space="0"/>
+            <w:insideH w:val="single" w:color="auto" w:sz="4" w:space="0"/>
+            <w:insideV w:val="single" w:color="auto" w:sz="4" w:space="0"/>
+          </w:tblBorders>
+          <w:tblCellMar>
+            <w:top w:w="0" w:type="dxa"/>
+            <w:left w:w="108" w:type="dxa"/>
+            <w:bottom w:w="0" w:type="dxa"/>
+            <w:right w:w="108" w:type="dxa"/>
+          </w:tblCellMar>
+        </w:tblPrEx>
+        <w:tc>
+          <w:tcPr>
+            <w:tcW w:w="0" w:type="auto"/>
+            <w:vAlign w:val="center"/>
+          </w:tcPr>
+          <w:p>
+            <w:pPr>
+              <w:pStyle w:val="26"/>
+              <w:bidi w:val="0"/>
+              <w:jc w:val="both"/>
+              <w:rPr>
+                <w:rFonts w:hint="eastAsia" w:cs="华文中宋"/>
+                <w:b/>
+                <w:bCs/>
+                <w:color w:val="FF0000"/>
+                <w:kern w:val="2"/>
+                <w:sz w:val="21"/>
+                <w:szCs w:val="21"/>
+                <w:lang w:val="en-US" w:eastAsia="zh-CN" w:bidi="ar-SA"/>
+              </w:rPr>
+            </w:pPr>
+            <w:r>
+              <w:rPr>
+                <w:rFonts w:hint="eastAsia" w:cs="华文中宋"/>
+                <w:b/>
+                <w:bCs/>
+                <w:color w:val="ED7D31"/>
+                <w:kern w:val="2"/>
+                <w:sz w:val="21"/>
+                <w:szCs w:val="21"/>
+                <w:vertAlign w:val="baseline"/>
+                <w:lang w:val="en-US" w:eastAsia="zh-CN" w:bidi="ar-SA"/>
+              </w:rPr>
+              <w:t>抽象方法</w:t>
+            </w:r>
+          </w:p>
+        </w:tc>
+        <w:tc>
+          <w:tcPr>
+            <w:tcW w:w="0" w:type="auto"/>
+            <w:vAlign w:val="center"/>
+          </w:tcPr>
+          <w:p>
+            <w:pPr>
+              <w:pStyle w:val="26"/>
+              <w:bidi w:val="0"/>
+              <w:jc w:val="both"/>
+              <w:rPr>
+                <w:rFonts w:hint="default" w:cs="华文中宋"/>
+                <w:b/>
+                <w:bCs/>
+                <w:color w:val="FF0000"/>
+                <w:kern w:val="2"/>
+                <w:sz w:val="21"/>
+                <w:szCs w:val="21"/>
+                <w:lang w:val="en-US" w:eastAsia="zh-CN" w:bidi="ar-SA"/>
+              </w:rPr>
+            </w:pPr>
+            <w:r>
+              <w:rPr>
+                <w:rFonts w:hint="eastAsia" w:cs="华文中宋"/>
+                <w:b/>
+                <w:bCs/>
+                <w:color w:val="FF0000"/>
+                <w:kern w:val="2"/>
+                <w:sz w:val="21"/>
+                <w:szCs w:val="21"/>
+                <w:lang w:val="en-US" w:eastAsia="zh-CN" w:bidi="ar-SA"/>
+              </w:rPr>
+              <w:t>init_train_tqdm / init_validation_tqdm()</w:t>
+            </w:r>
+          </w:p>
+        </w:tc>
+        <w:tc>
+          <w:tcPr>
+            <w:tcW w:w="0" w:type="auto"/>
+            <w:vAlign w:val="center"/>
+          </w:tcPr>
+          <w:p>
+            <w:pPr>
+              <w:pStyle w:val="27"/>
+              <w:bidi w:val="0"/>
+              <w:jc w:val="both"/>
+              <w:rPr>
+                <w:rFonts w:hint="default"/>
+                <w:vertAlign w:val="baseline"/>
+                <w:lang w:val="en-US" w:eastAsia="zh-CN"/>
+              </w:rPr>
+            </w:pPr>
+            <w:r>
+              <w:rPr>
+                <w:rFonts w:hint="eastAsia" w:cs="华文中宋"/>
+                <w:b/>
+                <w:bCs/>
+                <w:color w:val="ED7D31"/>
+                <w:kern w:val="2"/>
+                <w:sz w:val="21"/>
+                <w:szCs w:val="21"/>
+                <w:vertAlign w:val="baseline"/>
+                <w:lang w:val="en-US" w:eastAsia="zh-CN" w:bidi="ar-SA"/>
+              </w:rPr>
+              <w:t xml:space="preserve">return </w:t>
+            </w:r>
+            <w:r>
+              <w:rPr>
+                <w:rFonts w:hint="eastAsia"/>
+                <w:vertAlign w:val="baseline"/>
+                <w:lang w:val="en-US" w:eastAsia="zh-CN"/>
+              </w:rPr>
+              <w:t>tqdm(...)</w:t>
             </w:r>
           </w:p>
         </w:tc>
@@ -38409,6 +40579,33 @@
         <w:rPr>
           <w:rFonts w:hint="eastAsia"/>
           <w:color w:val="0070C0"/>
+        </w:rPr>
+      </w:pPr>
+    </w:p>
+    <w:p>
+      <w:pPr>
+        <w:pStyle w:val="18"/>
+        <w:bidi w:val="0"/>
+        <w:rPr>
+          <w:rFonts w:hint="eastAsia"/>
+          <w:lang w:val="en-US" w:eastAsia="zh-CN"/>
+        </w:rPr>
+      </w:pPr>
+      <w:r>
+        <w:rPr>
+          <w:rFonts w:hint="eastAsia"/>
+          <w:lang w:val="en-US" w:eastAsia="zh-CN"/>
+        </w:rPr>
+        <w:t>视觉OpenMMLab：</w:t>
+      </w:r>
+    </w:p>
+    <w:p>
+      <w:pPr>
+        <w:outlineLvl w:val="9"/>
+        <w:rPr>
+          <w:rFonts w:hint="default"/>
+          <w:color w:val="0070C0"/>
+          <w:lang w:val="en-US" w:eastAsia="zh-CN"/>
         </w:rPr>
       </w:pPr>
     </w:p>
@@ -39789,7 +41986,7 @@
         <w:gridCol w:w="637"/>
         <w:gridCol w:w="1437"/>
         <w:gridCol w:w="4071"/>
-        <w:gridCol w:w="2130"/>
+        <w:gridCol w:w="1499"/>
       </w:tblGrid>
       <w:tr>
         <w:tblPrEx>
@@ -40294,15 +42491,6 @@
                 </w14:textFill>
               </w:rPr>
             </w:pPr>
-            <w:r>
-              <w:rPr>
-                <w:rFonts w:hint="eastAsia"/>
-                <w:color w:val="EA82F1"/>
-                <w:szCs w:val="24"/>
-                <w:lang w:val="en-US" w:eastAsia="zh-CN"/>
-              </w:rPr>
-              <w:t>实例化</w:t>
-            </w:r>
             <w:r>
               <w:rPr>
                 <w:rFonts w:hint="eastAsia"/>
@@ -41740,15 +43928,6 @@
                 <w:lang w:val="en-US" w:eastAsia="zh-CN"/>
               </w:rPr>
             </w:pPr>
-            <w:r>
-              <w:rPr>
-                <w:rFonts w:hint="eastAsia"/>
-                <w:color w:val="EA82F1"/>
-                <w:szCs w:val="24"/>
-                <w:lang w:val="en-US" w:eastAsia="zh-CN"/>
-              </w:rPr>
-              <w:t>实例化</w:t>
-            </w:r>
             <w:r>
               <w:rPr>
                 <w:rFonts w:hint="eastAsia"/>
@@ -42212,15 +44391,6 @@
             <w:r>
               <w:rPr>
                 <w:rFonts w:hint="eastAsia"/>
-                <w:color w:val="EA82F1"/>
-                <w:szCs w:val="24"/>
-                <w:lang w:val="en-US" w:eastAsia="zh-CN"/>
-              </w:rPr>
-              <w:t>实例化</w:t>
-            </w:r>
-            <w:r>
-              <w:rPr>
-                <w:rFonts w:hint="eastAsia"/>
                 <w:color w:val="ED7D31" w:themeColor="accent2"/>
                 <w:lang w:val="en-US" w:eastAsia="zh-CN"/>
                 <w14:textFill>
@@ -45251,7 +47421,7 @@
       </w:tblPr>
       <w:tblGrid>
         <w:gridCol w:w="3772"/>
-        <w:gridCol w:w="1913"/>
+        <w:gridCol w:w="1230"/>
       </w:tblGrid>
       <w:tr>
         <w:tblPrEx>
@@ -45311,19 +47481,6 @@
                 </w14:textFill>
               </w:rPr>
             </w:pPr>
-            <w:r>
-              <w:rPr>
-                <w:rFonts w:hint="eastAsia"/>
-                <w:color w:val="ED7D31" w:themeColor="accent2"/>
-                <w:lang w:val="en-US" w:eastAsia="zh-CN"/>
-                <w14:textFill>
-                  <w14:solidFill>
-                    <w14:schemeClr w14:val="accent2"/>
-                  </w14:solidFill>
-                </w14:textFill>
-              </w:rPr>
-              <w:t>实例化</w:t>
-            </w:r>
             <w:r>
               <w:rPr>
                 <w:rFonts w:hint="eastAsia"/>
@@ -45456,12 +47613,6 @@
             <w:insideH w:val="single" w:color="auto" w:sz="4" w:space="0"/>
             <w:insideV w:val="single" w:color="auto" w:sz="4" w:space="0"/>
           </w:tblBorders>
-          <w:tblCellMar>
-            <w:top w:w="0" w:type="dxa"/>
-            <w:left w:w="108" w:type="dxa"/>
-            <w:bottom w:w="0" w:type="dxa"/>
-            <w:right w:w="108" w:type="dxa"/>
-          </w:tblCellMar>
         </w:tblPrEx>
         <w:tc>
           <w:tcPr>

</xml_diff>

<commit_message>
update on 2025-11-08 11:55:49.799880
</commit_message>
<xml_diff>
--- a/py 深度学习.docx
+++ b/py 深度学习.docx
@@ -4032,12 +4032,6 @@
             <w:insideH w:val="single" w:color="auto" w:sz="4" w:space="0"/>
             <w:insideV w:val="single" w:color="auto" w:sz="4" w:space="0"/>
           </w:tblBorders>
-          <w:tblCellMar>
-            <w:top w:w="0" w:type="dxa"/>
-            <w:left w:w="108" w:type="dxa"/>
-            <w:bottom w:w="0" w:type="dxa"/>
-            <w:right w:w="108" w:type="dxa"/>
-          </w:tblCellMar>
         </w:tblPrEx>
         <w:trPr>
           <w:trHeight w:val="128" w:hRule="atLeast"/>
@@ -6520,12 +6514,6 @@
             <w:insideH w:val="single" w:color="auto" w:sz="4" w:space="0"/>
             <w:insideV w:val="single" w:color="auto" w:sz="4" w:space="0"/>
           </w:tblBorders>
-          <w:tblCellMar>
-            <w:top w:w="0" w:type="dxa"/>
-            <w:left w:w="108" w:type="dxa"/>
-            <w:bottom w:w="0" w:type="dxa"/>
-            <w:right w:w="108" w:type="dxa"/>
-          </w:tblCellMar>
         </w:tblPrEx>
         <w:tc>
           <w:tcPr>
@@ -8294,6 +8282,12 @@
             <w:insideH w:val="single" w:color="auto" w:sz="4" w:space="0"/>
             <w:insideV w:val="single" w:color="auto" w:sz="4" w:space="0"/>
           </w:tblBorders>
+          <w:tblCellMar>
+            <w:top w:w="0" w:type="dxa"/>
+            <w:left w:w="108" w:type="dxa"/>
+            <w:bottom w:w="0" w:type="dxa"/>
+            <w:right w:w="108" w:type="dxa"/>
+          </w:tblCellMar>
         </w:tblPrEx>
         <w:tc>
           <w:tcPr>
@@ -11899,12 +11893,6 @@
             <w:insideH w:val="single" w:color="auto" w:sz="4" w:space="0"/>
             <w:insideV w:val="single" w:color="auto" w:sz="4" w:space="0"/>
           </w:tblBorders>
-          <w:tblCellMar>
-            <w:top w:w="0" w:type="dxa"/>
-            <w:left w:w="108" w:type="dxa"/>
-            <w:bottom w:w="0" w:type="dxa"/>
-            <w:right w:w="108" w:type="dxa"/>
-          </w:tblCellMar>
         </w:tblPrEx>
         <w:tc>
           <w:tcPr>
@@ -13354,6 +13342,12 @@
             <w:insideH w:val="single" w:color="auto" w:sz="4" w:space="0"/>
             <w:insideV w:val="single" w:color="auto" w:sz="4" w:space="0"/>
           </w:tblBorders>
+          <w:tblCellMar>
+            <w:top w:w="0" w:type="dxa"/>
+            <w:left w:w="108" w:type="dxa"/>
+            <w:bottom w:w="0" w:type="dxa"/>
+            <w:right w:w="108" w:type="dxa"/>
+          </w:tblCellMar>
         </w:tblPrEx>
         <w:tc>
           <w:tcPr>
@@ -14682,12 +14676,6 @@
             <w:insideH w:val="single" w:color="auto" w:sz="4" w:space="0"/>
             <w:insideV w:val="single" w:color="auto" w:sz="4" w:space="0"/>
           </w:tblBorders>
-          <w:tblCellMar>
-            <w:top w:w="0" w:type="dxa"/>
-            <w:left w:w="108" w:type="dxa"/>
-            <w:bottom w:w="0" w:type="dxa"/>
-            <w:right w:w="108" w:type="dxa"/>
-          </w:tblCellMar>
         </w:tblPrEx>
         <w:trPr>
           <w:trHeight w:val="90" w:hRule="atLeast"/>
@@ -16300,6 +16288,12 @@
             <w:insideH w:val="single" w:color="auto" w:sz="4" w:space="0"/>
             <w:insideV w:val="single" w:color="auto" w:sz="4" w:space="0"/>
           </w:tblBorders>
+          <w:tblCellMar>
+            <w:top w:w="0" w:type="dxa"/>
+            <w:left w:w="108" w:type="dxa"/>
+            <w:bottom w:w="0" w:type="dxa"/>
+            <w:right w:w="108" w:type="dxa"/>
+          </w:tblCellMar>
         </w:tblPrEx>
         <w:tc>
           <w:tcPr>
@@ -17712,6 +17706,12 @@
             <w:insideH w:val="single" w:color="auto" w:sz="4" w:space="0"/>
             <w:insideV w:val="single" w:color="auto" w:sz="4" w:space="0"/>
           </w:tblBorders>
+          <w:tblCellMar>
+            <w:top w:w="0" w:type="dxa"/>
+            <w:left w:w="108" w:type="dxa"/>
+            <w:bottom w:w="0" w:type="dxa"/>
+            <w:right w:w="108" w:type="dxa"/>
+          </w:tblCellMar>
         </w:tblPrEx>
         <w:trPr>
           <w:trHeight w:val="302" w:hRule="atLeast"/>
@@ -18558,6 +18558,12 @@
             <w:insideH w:val="single" w:color="auto" w:sz="4" w:space="0"/>
             <w:insideV w:val="single" w:color="auto" w:sz="4" w:space="0"/>
           </w:tblBorders>
+          <w:tblCellMar>
+            <w:top w:w="0" w:type="dxa"/>
+            <w:left w:w="108" w:type="dxa"/>
+            <w:bottom w:w="0" w:type="dxa"/>
+            <w:right w:w="108" w:type="dxa"/>
+          </w:tblCellMar>
         </w:tblPrEx>
         <w:trPr>
           <w:trHeight w:val="302" w:hRule="atLeast"/>
@@ -18753,12 +18759,6 @@
             <w:insideH w:val="single" w:color="auto" w:sz="4" w:space="0"/>
             <w:insideV w:val="single" w:color="auto" w:sz="4" w:space="0"/>
           </w:tblBorders>
-          <w:tblCellMar>
-            <w:top w:w="0" w:type="dxa"/>
-            <w:left w:w="108" w:type="dxa"/>
-            <w:bottom w:w="0" w:type="dxa"/>
-            <w:right w:w="108" w:type="dxa"/>
-          </w:tblCellMar>
         </w:tblPrEx>
         <w:trPr>
           <w:trHeight w:val="311" w:hRule="atLeast"/>
@@ -23596,12 +23596,6 @@
             <w:insideH w:val="single" w:color="auto" w:sz="4" w:space="0"/>
             <w:insideV w:val="single" w:color="auto" w:sz="4" w:space="0"/>
           </w:tblBorders>
-          <w:tblCellMar>
-            <w:top w:w="0" w:type="dxa"/>
-            <w:left w:w="108" w:type="dxa"/>
-            <w:bottom w:w="0" w:type="dxa"/>
-            <w:right w:w="108" w:type="dxa"/>
-          </w:tblCellMar>
         </w:tblPrEx>
         <w:tc>
           <w:tcPr>
@@ -25004,12 +24998,6 @@
             <w:insideH w:val="single" w:color="auto" w:sz="4" w:space="0"/>
             <w:insideV w:val="single" w:color="auto" w:sz="4" w:space="0"/>
           </w:tblBorders>
-          <w:tblCellMar>
-            <w:top w:w="0" w:type="dxa"/>
-            <w:left w:w="108" w:type="dxa"/>
-            <w:bottom w:w="0" w:type="dxa"/>
-            <w:right w:w="108" w:type="dxa"/>
-          </w:tblCellMar>
         </w:tblPrEx>
         <w:tc>
           <w:tcPr>
@@ -33332,12 +33320,6 @@
             <w:insideH w:val="single" w:color="auto" w:sz="4" w:space="0"/>
             <w:insideV w:val="single" w:color="auto" w:sz="4" w:space="0"/>
           </w:tblBorders>
-          <w:tblCellMar>
-            <w:top w:w="0" w:type="dxa"/>
-            <w:left w:w="108" w:type="dxa"/>
-            <w:bottom w:w="0" w:type="dxa"/>
-            <w:right w:w="108" w:type="dxa"/>
-          </w:tblCellMar>
         </w:tblPrEx>
         <w:tc>
           <w:tcPr>
@@ -38489,6 +38471,1530 @@
         </w:tblCellMar>
       </w:tblPr>
       <w:tblGrid>
+        <w:gridCol w:w="4665"/>
+        <w:gridCol w:w="1057"/>
+      </w:tblGrid>
+      <w:tr>
+        <w:tblPrEx>
+          <w:tblBorders>
+            <w:top w:val="single" w:color="auto" w:sz="4" w:space="0"/>
+            <w:left w:val="single" w:color="auto" w:sz="4" w:space="0"/>
+            <w:bottom w:val="single" w:color="auto" w:sz="4" w:space="0"/>
+            <w:right w:val="single" w:color="auto" w:sz="4" w:space="0"/>
+            <w:insideH w:val="single" w:color="auto" w:sz="4" w:space="0"/>
+            <w:insideV w:val="single" w:color="auto" w:sz="4" w:space="0"/>
+          </w:tblBorders>
+          <w:tblCellMar>
+            <w:top w:w="0" w:type="dxa"/>
+            <w:left w:w="108" w:type="dxa"/>
+            <w:bottom w:w="0" w:type="dxa"/>
+            <w:right w:w="108" w:type="dxa"/>
+          </w:tblCellMar>
+        </w:tblPrEx>
+        <w:tc>
+          <w:tcPr>
+            <w:tcW w:w="0" w:type="auto"/>
+            <w:vAlign w:val="center"/>
+          </w:tcPr>
+          <w:p>
+            <w:pPr>
+              <w:pStyle w:val="26"/>
+              <w:bidi w:val="0"/>
+              <w:jc w:val="both"/>
+              <w:rPr>
+                <w:rFonts w:hint="default"/>
+                <w:lang w:val="en-US" w:eastAsia="zh-CN"/>
+              </w:rPr>
+            </w:pPr>
+            <w:r>
+              <w:rPr>
+                <w:rFonts w:hint="eastAsia" w:cs="华文中宋"/>
+                <w:b/>
+                <w:bCs/>
+                <w:color w:val="FF0000"/>
+                <w:kern w:val="2"/>
+                <w:sz w:val="21"/>
+                <w:szCs w:val="21"/>
+                <w:lang w:val="en-US" w:eastAsia="zh-CN" w:bidi="ar-SA"/>
+              </w:rPr>
+              <w:t>seed_everything(seed, workers)</w:t>
+            </w:r>
+          </w:p>
+        </w:tc>
+        <w:tc>
+          <w:tcPr>
+            <w:tcW w:w="0" w:type="auto"/>
+            <w:vAlign w:val="center"/>
+          </w:tcPr>
+          <w:p>
+            <w:pPr>
+              <w:pStyle w:val="27"/>
+              <w:bidi w:val="0"/>
+              <w:jc w:val="both"/>
+              <w:rPr>
+                <w:rFonts w:hint="default"/>
+                <w:vertAlign w:val="baseline"/>
+                <w:lang w:val="en-US" w:eastAsia="zh-CN"/>
+              </w:rPr>
+            </w:pPr>
+            <w:r>
+              <w:rPr>
+                <w:rFonts w:hint="eastAsia"/>
+                <w:vertAlign w:val="baseline"/>
+                <w:lang w:val="en-US" w:eastAsia="zh-CN"/>
+              </w:rPr>
+              <w:t>随机种子</w:t>
+            </w:r>
+          </w:p>
+        </w:tc>
+      </w:tr>
+      <w:tr>
+        <w:tblPrEx>
+          <w:tblBorders>
+            <w:top w:val="single" w:color="auto" w:sz="4" w:space="0"/>
+            <w:left w:val="single" w:color="auto" w:sz="4" w:space="0"/>
+            <w:bottom w:val="single" w:color="auto" w:sz="4" w:space="0"/>
+            <w:right w:val="single" w:color="auto" w:sz="4" w:space="0"/>
+            <w:insideH w:val="single" w:color="auto" w:sz="4" w:space="0"/>
+            <w:insideV w:val="single" w:color="auto" w:sz="4" w:space="0"/>
+          </w:tblBorders>
+          <w:tblCellMar>
+            <w:top w:w="0" w:type="dxa"/>
+            <w:left w:w="108" w:type="dxa"/>
+            <w:bottom w:w="0" w:type="dxa"/>
+            <w:right w:w="108" w:type="dxa"/>
+          </w:tblCellMar>
+        </w:tblPrEx>
+        <w:tc>
+          <w:tcPr>
+            <w:tcW w:w="0" w:type="auto"/>
+            <w:vAlign w:val="center"/>
+          </w:tcPr>
+          <w:p>
+            <w:pPr>
+              <w:pStyle w:val="26"/>
+              <w:bidi w:val="0"/>
+              <w:jc w:val="both"/>
+              <w:rPr>
+                <w:rFonts w:hint="default" w:cs="华文中宋"/>
+                <w:b/>
+                <w:bCs/>
+                <w:color w:val="FF0000"/>
+                <w:kern w:val="2"/>
+                <w:sz w:val="21"/>
+                <w:szCs w:val="21"/>
+                <w:lang w:val="en-US" w:eastAsia="zh-CN" w:bidi="ar-SA"/>
+              </w:rPr>
+            </w:pPr>
+            <w:r>
+              <w:rPr>
+                <w:rFonts w:hint="eastAsia" w:cs="华文中宋"/>
+                <w:b/>
+                <w:bCs/>
+                <w:color w:val="FF0000"/>
+                <w:kern w:val="2"/>
+                <w:sz w:val="21"/>
+                <w:szCs w:val="21"/>
+                <w:lang w:val="en-US" w:eastAsia="zh-CN" w:bidi="ar-SA"/>
+              </w:rPr>
+              <w:t>disable_possible_user_warnings(module="")</w:t>
+            </w:r>
+          </w:p>
+        </w:tc>
+        <w:tc>
+          <w:tcPr>
+            <w:tcW w:w="0" w:type="auto"/>
+            <w:vAlign w:val="center"/>
+          </w:tcPr>
+          <w:p>
+            <w:pPr>
+              <w:pStyle w:val="27"/>
+              <w:bidi w:val="0"/>
+              <w:jc w:val="both"/>
+              <w:rPr>
+                <w:rFonts w:hint="default"/>
+                <w:vertAlign w:val="baseline"/>
+                <w:lang w:val="en-US" w:eastAsia="zh-CN"/>
+              </w:rPr>
+            </w:pPr>
+            <w:r>
+              <w:rPr>
+                <w:rFonts w:hint="eastAsia"/>
+                <w:vertAlign w:val="baseline"/>
+                <w:lang w:val="en-US" w:eastAsia="zh-CN"/>
+              </w:rPr>
+              <w:t>忽略警告</w:t>
+            </w:r>
+          </w:p>
+        </w:tc>
+      </w:tr>
+    </w:tbl>
+    <w:p>
+      <w:pPr>
+        <w:rPr>
+          <w:rFonts w:hint="eastAsia"/>
+          <w:color w:val="ED7D31" w:themeColor="accent2"/>
+          <w:u w:val="single"/>
+          <w14:textFill>
+            <w14:solidFill>
+              <w14:schemeClr w14:val="accent2"/>
+            </w14:solidFill>
+          </w14:textFill>
+        </w:rPr>
+      </w:pPr>
+    </w:p>
+    <w:tbl>
+      <w:tblPr>
+        <w:tblStyle w:val="12"/>
+        <w:tblW w:w="0" w:type="auto"/>
+        <w:tblInd w:w="0" w:type="dxa"/>
+        <w:tblBorders>
+          <w:top w:val="single" w:color="auto" w:sz="4" w:space="0"/>
+          <w:left w:val="single" w:color="auto" w:sz="4" w:space="0"/>
+          <w:bottom w:val="single" w:color="auto" w:sz="4" w:space="0"/>
+          <w:right w:val="single" w:color="auto" w:sz="4" w:space="0"/>
+          <w:insideH w:val="single" w:color="auto" w:sz="4" w:space="0"/>
+          <w:insideV w:val="single" w:color="auto" w:sz="4" w:space="0"/>
+        </w:tblBorders>
+        <w:tblLayout w:type="autofit"/>
+        <w:tblCellMar>
+          <w:top w:w="0" w:type="dxa"/>
+          <w:left w:w="108" w:type="dxa"/>
+          <w:bottom w:w="0" w:type="dxa"/>
+          <w:right w:w="108" w:type="dxa"/>
+        </w:tblCellMar>
+      </w:tblPr>
+      <w:tblGrid>
+        <w:gridCol w:w="1057"/>
+        <w:gridCol w:w="7633"/>
+        <w:gridCol w:w="1344"/>
+      </w:tblGrid>
+      <w:tr>
+        <w:tblPrEx>
+          <w:tblBorders>
+            <w:top w:val="single" w:color="auto" w:sz="4" w:space="0"/>
+            <w:left w:val="single" w:color="auto" w:sz="4" w:space="0"/>
+            <w:bottom w:val="single" w:color="auto" w:sz="4" w:space="0"/>
+            <w:right w:val="single" w:color="auto" w:sz="4" w:space="0"/>
+            <w:insideH w:val="single" w:color="auto" w:sz="4" w:space="0"/>
+            <w:insideV w:val="single" w:color="auto" w:sz="4" w:space="0"/>
+          </w:tblBorders>
+          <w:tblCellMar>
+            <w:top w:w="0" w:type="dxa"/>
+            <w:left w:w="108" w:type="dxa"/>
+            <w:bottom w:w="0" w:type="dxa"/>
+            <w:right w:w="108" w:type="dxa"/>
+          </w:tblCellMar>
+        </w:tblPrEx>
+        <w:tc>
+          <w:tcPr>
+            <w:tcW w:w="0" w:type="auto"/>
+            <w:gridSpan w:val="2"/>
+            <w:vAlign w:val="center"/>
+          </w:tcPr>
+          <w:p>
+            <w:pPr>
+              <w:pStyle w:val="26"/>
+              <w:bidi w:val="0"/>
+              <w:jc w:val="both"/>
+              <w:rPr>
+                <w:rFonts w:hint="default"/>
+                <w:lang w:val="en-US" w:eastAsia="zh-CN"/>
+              </w:rPr>
+            </w:pPr>
+            <w:r>
+              <w:rPr>
+                <w:rFonts w:hint="eastAsia" w:cs="华文中宋"/>
+                <w:b/>
+                <w:bCs/>
+                <w:color w:val="FF0000"/>
+                <w:kern w:val="2"/>
+                <w:sz w:val="21"/>
+                <w:szCs w:val="21"/>
+                <w:lang w:val="en-US" w:eastAsia="zh-CN" w:bidi="ar-SA"/>
+              </w:rPr>
+              <w:t>Callback</w:t>
+            </w:r>
+          </w:p>
+        </w:tc>
+        <w:tc>
+          <w:tcPr>
+            <w:tcW w:w="0" w:type="auto"/>
+            <w:vAlign w:val="center"/>
+          </w:tcPr>
+          <w:p>
+            <w:pPr>
+              <w:pStyle w:val="27"/>
+              <w:bidi w:val="0"/>
+              <w:jc w:val="both"/>
+              <w:rPr>
+                <w:rFonts w:hint="default"/>
+                <w:vertAlign w:val="baseline"/>
+                <w:lang w:val="en-US" w:eastAsia="zh-CN"/>
+              </w:rPr>
+            </w:pPr>
+            <w:r>
+              <w:rPr>
+                <w:rFonts w:hint="eastAsia"/>
+                <w:vertAlign w:val="baseline"/>
+                <w:lang w:val="en-US" w:eastAsia="zh-CN"/>
+              </w:rPr>
+              <w:t>回调</w:t>
+            </w:r>
+          </w:p>
+        </w:tc>
+      </w:tr>
+      <w:tr>
+        <w:tblPrEx>
+          <w:tblBorders>
+            <w:top w:val="single" w:color="auto" w:sz="4" w:space="0"/>
+            <w:left w:val="single" w:color="auto" w:sz="4" w:space="0"/>
+            <w:bottom w:val="single" w:color="auto" w:sz="4" w:space="0"/>
+            <w:right w:val="single" w:color="auto" w:sz="4" w:space="0"/>
+            <w:insideH w:val="single" w:color="auto" w:sz="4" w:space="0"/>
+            <w:insideV w:val="single" w:color="auto" w:sz="4" w:space="0"/>
+          </w:tblBorders>
+          <w:tblCellMar>
+            <w:top w:w="0" w:type="dxa"/>
+            <w:left w:w="108" w:type="dxa"/>
+            <w:bottom w:w="0" w:type="dxa"/>
+            <w:right w:w="108" w:type="dxa"/>
+          </w:tblCellMar>
+        </w:tblPrEx>
+        <w:trPr>
+          <w:trHeight w:val="90" w:hRule="atLeast"/>
+        </w:trPr>
+        <w:tc>
+          <w:tcPr>
+            <w:tcW w:w="0" w:type="auto"/>
+            <w:vMerge w:val="restart"/>
+            <w:vAlign w:val="center"/>
+          </w:tcPr>
+          <w:p>
+            <w:pPr>
+              <w:pStyle w:val="26"/>
+              <w:bidi w:val="0"/>
+              <w:jc w:val="both"/>
+              <w:rPr>
+                <w:rFonts w:hint="default" w:ascii="华文中宋" w:hAnsi="华文中宋" w:eastAsia="华文中宋" w:cs="华文中宋"/>
+                <w:b/>
+                <w:bCs/>
+                <w:color w:val="FF0000"/>
+                <w:kern w:val="2"/>
+                <w:sz w:val="21"/>
+                <w:szCs w:val="21"/>
+                <w:lang w:val="en-US" w:eastAsia="zh-CN" w:bidi="ar-SA"/>
+              </w:rPr>
+            </w:pPr>
+            <w:r>
+              <w:rPr>
+                <w:rFonts w:hint="eastAsia" w:cs="华文中宋"/>
+                <w:b/>
+                <w:bCs/>
+                <w:color w:val="ED7D31"/>
+                <w:kern w:val="2"/>
+                <w:sz w:val="21"/>
+                <w:szCs w:val="21"/>
+                <w:vertAlign w:val="baseline"/>
+                <w:lang w:val="en-US" w:eastAsia="zh-CN" w:bidi="ar-SA"/>
+              </w:rPr>
+              <w:t>抽象方法</w:t>
+            </w:r>
+          </w:p>
+        </w:tc>
+        <w:tc>
+          <w:tcPr>
+            <w:tcW w:w="0" w:type="auto"/>
+            <w:vAlign w:val="center"/>
+          </w:tcPr>
+          <w:p>
+            <w:pPr>
+              <w:pStyle w:val="26"/>
+              <w:bidi w:val="0"/>
+              <w:jc w:val="both"/>
+              <w:rPr>
+                <w:rFonts w:hint="default" w:cs="华文中宋"/>
+                <w:b/>
+                <w:bCs/>
+                <w:color w:val="FF0000"/>
+                <w:kern w:val="2"/>
+                <w:sz w:val="21"/>
+                <w:szCs w:val="21"/>
+                <w:lang w:val="en-US" w:eastAsia="zh-CN" w:bidi="ar-SA"/>
+              </w:rPr>
+            </w:pPr>
+            <w:r>
+              <w:rPr>
+                <w:rFonts w:hint="eastAsia" w:cs="华文中宋"/>
+                <w:b/>
+                <w:bCs/>
+                <w:color w:val="FF0000"/>
+                <w:kern w:val="2"/>
+                <w:sz w:val="21"/>
+                <w:szCs w:val="21"/>
+                <w:lang w:val="en-US" w:eastAsia="zh-CN" w:bidi="ar-SA"/>
+              </w:rPr>
+              <w:t>state_dict(self) / load_state_dict(self, state_dict)</w:t>
+            </w:r>
+          </w:p>
+        </w:tc>
+        <w:tc>
+          <w:tcPr>
+            <w:tcW w:w="0" w:type="auto"/>
+            <w:vAlign w:val="center"/>
+          </w:tcPr>
+          <w:p>
+            <w:pPr>
+              <w:pStyle w:val="27"/>
+              <w:bidi w:val="0"/>
+              <w:jc w:val="both"/>
+              <w:rPr>
+                <w:rFonts w:hint="default"/>
+                <w:vertAlign w:val="baseline"/>
+                <w:lang w:val="en-US" w:eastAsia="zh-CN"/>
+              </w:rPr>
+            </w:pPr>
+            <w:r>
+              <w:rPr>
+                <w:rFonts w:hint="eastAsia"/>
+                <w:vertAlign w:val="baseline"/>
+                <w:lang w:val="en-US" w:eastAsia="zh-CN"/>
+              </w:rPr>
+              <w:t>state</w:t>
+            </w:r>
+          </w:p>
+        </w:tc>
+      </w:tr>
+      <w:tr>
+        <w:tblPrEx>
+          <w:tblBorders>
+            <w:top w:val="single" w:color="auto" w:sz="4" w:space="0"/>
+            <w:left w:val="single" w:color="auto" w:sz="4" w:space="0"/>
+            <w:bottom w:val="single" w:color="auto" w:sz="4" w:space="0"/>
+            <w:right w:val="single" w:color="auto" w:sz="4" w:space="0"/>
+            <w:insideH w:val="single" w:color="auto" w:sz="4" w:space="0"/>
+            <w:insideV w:val="single" w:color="auto" w:sz="4" w:space="0"/>
+          </w:tblBorders>
+          <w:tblCellMar>
+            <w:top w:w="0" w:type="dxa"/>
+            <w:left w:w="108" w:type="dxa"/>
+            <w:bottom w:w="0" w:type="dxa"/>
+            <w:right w:w="108" w:type="dxa"/>
+          </w:tblCellMar>
+        </w:tblPrEx>
+        <w:trPr>
+          <w:trHeight w:val="90" w:hRule="atLeast"/>
+        </w:trPr>
+        <w:tc>
+          <w:tcPr>
+            <w:tcW w:w="0" w:type="auto"/>
+            <w:vMerge w:val="continue"/>
+            <w:vAlign w:val="center"/>
+          </w:tcPr>
+          <w:p>
+            <w:pPr>
+              <w:pStyle w:val="26"/>
+              <w:bidi w:val="0"/>
+              <w:jc w:val="both"/>
+              <w:rPr>
+                <w:rFonts w:hint="eastAsia" w:cs="华文中宋"/>
+                <w:b/>
+                <w:bCs/>
+                <w:color w:val="ED7D31"/>
+                <w:kern w:val="2"/>
+                <w:sz w:val="21"/>
+                <w:szCs w:val="21"/>
+                <w:vertAlign w:val="baseline"/>
+                <w:lang w:val="en-US" w:eastAsia="zh-CN" w:bidi="ar-SA"/>
+              </w:rPr>
+            </w:pPr>
+          </w:p>
+        </w:tc>
+        <w:tc>
+          <w:tcPr>
+            <w:tcW w:w="0" w:type="auto"/>
+            <w:vAlign w:val="center"/>
+          </w:tcPr>
+          <w:p>
+            <w:pPr>
+              <w:pStyle w:val="26"/>
+              <w:bidi w:val="0"/>
+              <w:jc w:val="both"/>
+              <w:rPr>
+                <w:rFonts w:hint="default" w:cs="华文中宋"/>
+                <w:b/>
+                <w:bCs/>
+                <w:color w:val="FF0000"/>
+                <w:kern w:val="2"/>
+                <w:sz w:val="21"/>
+                <w:szCs w:val="21"/>
+                <w:lang w:val="en-US" w:eastAsia="zh-CN" w:bidi="ar-SA"/>
+              </w:rPr>
+            </w:pPr>
+            <w:r>
+              <w:rPr>
+                <w:rFonts w:hint="eastAsia" w:cs="华文中宋"/>
+                <w:b/>
+                <w:bCs/>
+                <w:color w:val="FF0000"/>
+                <w:kern w:val="2"/>
+                <w:sz w:val="21"/>
+                <w:szCs w:val="21"/>
+                <w:lang w:val="en-US" w:eastAsia="zh-CN" w:bidi="ar-SA"/>
+              </w:rPr>
+              <w:t>on_save_checkpoint / on_load_checkpoint(self, trainer, pl_module, ckpt)</w:t>
+            </w:r>
+          </w:p>
+        </w:tc>
+        <w:tc>
+          <w:tcPr>
+            <w:tcW w:w="0" w:type="auto"/>
+            <w:vAlign w:val="center"/>
+          </w:tcPr>
+          <w:p>
+            <w:pPr>
+              <w:pStyle w:val="27"/>
+              <w:bidi w:val="0"/>
+              <w:jc w:val="both"/>
+              <w:rPr>
+                <w:rFonts w:hint="default"/>
+                <w:vertAlign w:val="baseline"/>
+                <w:lang w:val="en-US" w:eastAsia="zh-CN"/>
+              </w:rPr>
+            </w:pPr>
+            <w:r>
+              <w:rPr>
+                <w:rFonts w:hint="eastAsia"/>
+                <w:vertAlign w:val="baseline"/>
+                <w:lang w:val="en-US" w:eastAsia="zh-CN"/>
+              </w:rPr>
+              <w:t>checkpoint</w:t>
+            </w:r>
+          </w:p>
+        </w:tc>
+      </w:tr>
+      <w:tr>
+        <w:tblPrEx>
+          <w:tblBorders>
+            <w:top w:val="single" w:color="auto" w:sz="4" w:space="0"/>
+            <w:left w:val="single" w:color="auto" w:sz="4" w:space="0"/>
+            <w:bottom w:val="single" w:color="auto" w:sz="4" w:space="0"/>
+            <w:right w:val="single" w:color="auto" w:sz="4" w:space="0"/>
+            <w:insideH w:val="single" w:color="auto" w:sz="4" w:space="0"/>
+            <w:insideV w:val="single" w:color="auto" w:sz="4" w:space="0"/>
+          </w:tblBorders>
+          <w:tblCellMar>
+            <w:top w:w="0" w:type="dxa"/>
+            <w:left w:w="108" w:type="dxa"/>
+            <w:bottom w:w="0" w:type="dxa"/>
+            <w:right w:w="108" w:type="dxa"/>
+          </w:tblCellMar>
+        </w:tblPrEx>
+        <w:tc>
+          <w:tcPr>
+            <w:tcW w:w="0" w:type="auto"/>
+            <w:vMerge w:val="continue"/>
+            <w:vAlign w:val="center"/>
+          </w:tcPr>
+          <w:p>
+            <w:pPr>
+              <w:pStyle w:val="26"/>
+              <w:bidi w:val="0"/>
+              <w:jc w:val="both"/>
+              <w:rPr>
+                <w:rFonts w:hint="default" w:ascii="华文中宋" w:hAnsi="华文中宋" w:eastAsia="华文中宋" w:cs="华文中宋"/>
+                <w:b/>
+                <w:bCs/>
+                <w:color w:val="FF0000"/>
+                <w:kern w:val="2"/>
+                <w:sz w:val="21"/>
+                <w:szCs w:val="21"/>
+                <w:lang w:val="en-US" w:eastAsia="zh-CN" w:bidi="ar-SA"/>
+              </w:rPr>
+            </w:pPr>
+          </w:p>
+        </w:tc>
+        <w:tc>
+          <w:tcPr>
+            <w:tcW w:w="0" w:type="auto"/>
+            <w:vAlign w:val="center"/>
+          </w:tcPr>
+          <w:p>
+            <w:pPr>
+              <w:pStyle w:val="26"/>
+              <w:bidi w:val="0"/>
+              <w:jc w:val="both"/>
+              <w:rPr>
+                <w:rFonts w:hint="eastAsia" w:cs="华文中宋"/>
+                <w:b/>
+                <w:bCs/>
+                <w:color w:val="FF0000"/>
+                <w:kern w:val="2"/>
+                <w:sz w:val="21"/>
+                <w:szCs w:val="21"/>
+                <w:lang w:val="en-US" w:eastAsia="zh-CN" w:bidi="ar-SA"/>
+              </w:rPr>
+            </w:pPr>
+            <w:r>
+              <w:rPr>
+                <w:rFonts w:hint="eastAsia" w:cs="华文中宋"/>
+                <w:b/>
+                <w:bCs/>
+                <w:color w:val="FF0000"/>
+                <w:kern w:val="2"/>
+                <w:sz w:val="21"/>
+                <w:szCs w:val="21"/>
+                <w:lang w:val="en-US" w:eastAsia="zh-CN" w:bidi="ar-SA"/>
+              </w:rPr>
+              <w:t xml:space="preserve">on_fit_start / on_fit_end / </w:t>
+            </w:r>
+          </w:p>
+          <w:p>
+            <w:pPr>
+              <w:pStyle w:val="26"/>
+              <w:bidi w:val="0"/>
+              <w:jc w:val="both"/>
+              <w:rPr>
+                <w:rFonts w:hint="eastAsia" w:cs="华文中宋"/>
+                <w:b/>
+                <w:bCs/>
+                <w:color w:val="FF0000"/>
+                <w:kern w:val="2"/>
+                <w:sz w:val="21"/>
+                <w:szCs w:val="21"/>
+                <w:lang w:val="en-US" w:eastAsia="zh-CN" w:bidi="ar-SA"/>
+              </w:rPr>
+            </w:pPr>
+            <w:r>
+              <w:rPr>
+                <w:rFonts w:hint="eastAsia" w:cs="华文中宋"/>
+                <w:b/>
+                <w:bCs/>
+                <w:color w:val="FF0000"/>
+                <w:kern w:val="2"/>
+                <w:sz w:val="21"/>
+                <w:szCs w:val="21"/>
+                <w:lang w:val="en-US" w:eastAsia="zh-CN" w:bidi="ar-SA"/>
+              </w:rPr>
+              <w:t xml:space="preserve">on_train_start / on_train_end / </w:t>
+            </w:r>
+          </w:p>
+          <w:p>
+            <w:pPr>
+              <w:pStyle w:val="26"/>
+              <w:bidi w:val="0"/>
+              <w:jc w:val="both"/>
+              <w:rPr>
+                <w:rFonts w:hint="eastAsia" w:cs="华文中宋"/>
+                <w:b/>
+                <w:bCs/>
+                <w:color w:val="FF0000"/>
+                <w:kern w:val="2"/>
+                <w:sz w:val="21"/>
+                <w:szCs w:val="21"/>
+                <w:lang w:val="en-US" w:eastAsia="zh-CN" w:bidi="ar-SA"/>
+              </w:rPr>
+            </w:pPr>
+            <w:r>
+              <w:rPr>
+                <w:rFonts w:hint="eastAsia" w:cs="华文中宋"/>
+                <w:b/>
+                <w:bCs/>
+                <w:color w:val="FF0000"/>
+                <w:kern w:val="2"/>
+                <w:sz w:val="21"/>
+                <w:szCs w:val="21"/>
+                <w:lang w:val="en-US" w:eastAsia="zh-CN" w:bidi="ar-SA"/>
+              </w:rPr>
+              <w:t xml:space="preserve">on_validation_start / on_validation_end / </w:t>
+            </w:r>
+          </w:p>
+          <w:p>
+            <w:pPr>
+              <w:pStyle w:val="26"/>
+              <w:bidi w:val="0"/>
+              <w:jc w:val="both"/>
+              <w:rPr>
+                <w:rFonts w:hint="eastAsia" w:cs="华文中宋"/>
+                <w:b/>
+                <w:bCs/>
+                <w:color w:val="FF0000"/>
+                <w:kern w:val="2"/>
+                <w:sz w:val="21"/>
+                <w:szCs w:val="21"/>
+                <w:lang w:val="en-US" w:eastAsia="zh-CN" w:bidi="ar-SA"/>
+              </w:rPr>
+            </w:pPr>
+            <w:r>
+              <w:rPr>
+                <w:rFonts w:hint="eastAsia" w:cs="华文中宋"/>
+                <w:b/>
+                <w:bCs/>
+                <w:color w:val="FF0000"/>
+                <w:kern w:val="2"/>
+                <w:sz w:val="21"/>
+                <w:szCs w:val="21"/>
+                <w:lang w:val="en-US" w:eastAsia="zh-CN" w:bidi="ar-SA"/>
+              </w:rPr>
+              <w:t xml:space="preserve">on_test_start / on_test_end / </w:t>
+            </w:r>
+          </w:p>
+          <w:p>
+            <w:pPr>
+              <w:pStyle w:val="26"/>
+              <w:bidi w:val="0"/>
+              <w:jc w:val="both"/>
+              <w:rPr>
+                <w:rFonts w:hint="default" w:cs="华文中宋"/>
+                <w:b/>
+                <w:bCs/>
+                <w:color w:val="FF0000"/>
+                <w:kern w:val="2"/>
+                <w:sz w:val="21"/>
+                <w:szCs w:val="21"/>
+                <w:lang w:val="en-US" w:eastAsia="zh-CN" w:bidi="ar-SA"/>
+              </w:rPr>
+            </w:pPr>
+            <w:r>
+              <w:rPr>
+                <w:rFonts w:hint="eastAsia" w:cs="华文中宋"/>
+                <w:b/>
+                <w:bCs/>
+                <w:color w:val="FF0000"/>
+                <w:kern w:val="2"/>
+                <w:sz w:val="21"/>
+                <w:szCs w:val="21"/>
+                <w:lang w:val="en-US" w:eastAsia="zh-CN" w:bidi="ar-SA"/>
+              </w:rPr>
+              <w:t>on_predict_start / on_predict_end(self, trainer, pl_module)</w:t>
+            </w:r>
+          </w:p>
+        </w:tc>
+        <w:tc>
+          <w:tcPr>
+            <w:tcW w:w="0" w:type="auto"/>
+            <w:vAlign w:val="center"/>
+          </w:tcPr>
+          <w:p>
+            <w:pPr>
+              <w:pStyle w:val="27"/>
+              <w:bidi w:val="0"/>
+              <w:jc w:val="both"/>
+              <w:rPr>
+                <w:rFonts w:hint="default"/>
+                <w:vertAlign w:val="baseline"/>
+                <w:lang w:val="en-US" w:eastAsia="zh-CN"/>
+              </w:rPr>
+            </w:pPr>
+            <w:r>
+              <w:rPr>
+                <w:rFonts w:hint="eastAsia"/>
+                <w:vertAlign w:val="baseline"/>
+                <w:lang w:val="en-US" w:eastAsia="zh-CN"/>
+              </w:rPr>
+              <w:t>stage</w:t>
+            </w:r>
+          </w:p>
+        </w:tc>
+      </w:tr>
+      <w:tr>
+        <w:tblPrEx>
+          <w:tblBorders>
+            <w:top w:val="single" w:color="auto" w:sz="4" w:space="0"/>
+            <w:left w:val="single" w:color="auto" w:sz="4" w:space="0"/>
+            <w:bottom w:val="single" w:color="auto" w:sz="4" w:space="0"/>
+            <w:right w:val="single" w:color="auto" w:sz="4" w:space="0"/>
+            <w:insideH w:val="single" w:color="auto" w:sz="4" w:space="0"/>
+            <w:insideV w:val="single" w:color="auto" w:sz="4" w:space="0"/>
+          </w:tblBorders>
+          <w:tblCellMar>
+            <w:top w:w="0" w:type="dxa"/>
+            <w:left w:w="108" w:type="dxa"/>
+            <w:bottom w:w="0" w:type="dxa"/>
+            <w:right w:w="108" w:type="dxa"/>
+          </w:tblCellMar>
+        </w:tblPrEx>
+        <w:tc>
+          <w:tcPr>
+            <w:tcW w:w="0" w:type="auto"/>
+            <w:vMerge w:val="continue"/>
+            <w:vAlign w:val="center"/>
+          </w:tcPr>
+          <w:p>
+            <w:pPr>
+              <w:pStyle w:val="26"/>
+              <w:bidi w:val="0"/>
+              <w:jc w:val="both"/>
+              <w:rPr>
+                <w:rFonts w:hint="eastAsia" w:cs="华文中宋"/>
+                <w:b/>
+                <w:bCs/>
+                <w:color w:val="ED7D31"/>
+                <w:kern w:val="2"/>
+                <w:sz w:val="21"/>
+                <w:szCs w:val="21"/>
+                <w:vertAlign w:val="baseline"/>
+                <w:lang w:val="en-US" w:eastAsia="zh-CN" w:bidi="ar-SA"/>
+              </w:rPr>
+            </w:pPr>
+          </w:p>
+        </w:tc>
+        <w:tc>
+          <w:tcPr>
+            <w:tcW w:w="7633" w:type="dxa"/>
+            <w:shd w:val="clear" w:color="auto" w:fill="auto"/>
+            <w:vAlign w:val="center"/>
+          </w:tcPr>
+          <w:p>
+            <w:pPr>
+              <w:pStyle w:val="26"/>
+              <w:bidi w:val="0"/>
+              <w:jc w:val="both"/>
+              <w:rPr>
+                <w:rFonts w:hint="eastAsia" w:cs="华文中宋"/>
+                <w:b/>
+                <w:bCs/>
+                <w:color w:val="FF0000"/>
+                <w:kern w:val="2"/>
+                <w:sz w:val="21"/>
+                <w:szCs w:val="21"/>
+                <w:lang w:val="en-US" w:eastAsia="zh-CN" w:bidi="ar-SA"/>
+              </w:rPr>
+            </w:pPr>
+            <w:r>
+              <w:rPr>
+                <w:rFonts w:hint="eastAsia" w:cs="华文中宋"/>
+                <w:b/>
+                <w:bCs/>
+                <w:color w:val="FF0000"/>
+                <w:kern w:val="2"/>
+                <w:sz w:val="21"/>
+                <w:szCs w:val="21"/>
+                <w:lang w:val="en-US" w:eastAsia="zh-CN" w:bidi="ar-SA"/>
+              </w:rPr>
+              <w:t xml:space="preserve">on_train_batch_start / on_validation_batch_start / </w:t>
+            </w:r>
+          </w:p>
+          <w:p>
+            <w:pPr>
+              <w:pStyle w:val="26"/>
+              <w:bidi w:val="0"/>
+              <w:jc w:val="both"/>
+              <w:rPr>
+                <w:rFonts w:hint="eastAsia" w:cs="华文中宋"/>
+                <w:b/>
+                <w:bCs/>
+                <w:color w:val="FF0000"/>
+                <w:kern w:val="2"/>
+                <w:sz w:val="21"/>
+                <w:szCs w:val="21"/>
+                <w:lang w:val="en-US" w:eastAsia="zh-CN" w:bidi="ar-SA"/>
+              </w:rPr>
+            </w:pPr>
+            <w:r>
+              <w:rPr>
+                <w:rFonts w:hint="eastAsia" w:cs="华文中宋"/>
+                <w:b/>
+                <w:bCs/>
+                <w:color w:val="FF0000"/>
+                <w:kern w:val="2"/>
+                <w:sz w:val="21"/>
+                <w:szCs w:val="21"/>
+                <w:lang w:val="en-US" w:eastAsia="zh-CN" w:bidi="ar-SA"/>
+              </w:rPr>
+              <w:t>on_test_batch_start / on_predict_batch_start</w:t>
+            </w:r>
+          </w:p>
+          <w:p>
+            <w:pPr>
+              <w:pStyle w:val="26"/>
+              <w:bidi w:val="0"/>
+              <w:jc w:val="both"/>
+              <w:rPr>
+                <w:rFonts w:hint="eastAsia" w:ascii="华文中宋" w:hAnsi="华文中宋" w:eastAsia="华文中宋" w:cs="华文中宋"/>
+                <w:b/>
+                <w:bCs/>
+                <w:color w:val="FF0000"/>
+                <w:kern w:val="2"/>
+                <w:sz w:val="21"/>
+                <w:szCs w:val="21"/>
+                <w:lang w:val="en-US" w:eastAsia="zh-CN" w:bidi="ar-SA"/>
+              </w:rPr>
+            </w:pPr>
+            <w:r>
+              <w:rPr>
+                <w:rFonts w:hint="eastAsia" w:cs="华文中宋"/>
+                <w:b/>
+                <w:bCs/>
+                <w:color w:val="FF0000"/>
+                <w:kern w:val="2"/>
+                <w:sz w:val="21"/>
+                <w:szCs w:val="21"/>
+                <w:lang w:val="en-US" w:eastAsia="zh-CN" w:bidi="ar-SA"/>
+              </w:rPr>
+              <w:t>(self, trainer, pl_module, ...)</w:t>
+            </w:r>
+          </w:p>
+        </w:tc>
+        <w:tc>
+          <w:tcPr>
+            <w:tcW w:w="1218" w:type="dxa"/>
+            <w:shd w:val="clear" w:color="auto" w:fill="auto"/>
+            <w:vAlign w:val="center"/>
+          </w:tcPr>
+          <w:p>
+            <w:pPr>
+              <w:pStyle w:val="27"/>
+              <w:bidi w:val="0"/>
+              <w:jc w:val="both"/>
+              <w:rPr>
+                <w:rFonts w:hint="default" w:ascii="华文中宋" w:hAnsi="华文中宋" w:eastAsia="华文中宋" w:cs="华文中宋"/>
+                <w:b/>
+                <w:bCs/>
+                <w:color w:val="EA82E5"/>
+                <w:kern w:val="2"/>
+                <w:sz w:val="21"/>
+                <w:szCs w:val="21"/>
+                <w:vertAlign w:val="baseline"/>
+                <w:lang w:val="en-US" w:eastAsia="zh-CN" w:bidi="ar-SA"/>
+              </w:rPr>
+            </w:pPr>
+            <w:r>
+              <w:rPr>
+                <w:rFonts w:hint="eastAsia" w:cs="华文中宋"/>
+                <w:b/>
+                <w:bCs/>
+                <w:color w:val="EA82E5"/>
+                <w:kern w:val="2"/>
+                <w:sz w:val="21"/>
+                <w:szCs w:val="21"/>
+                <w:vertAlign w:val="baseline"/>
+                <w:lang w:val="en-US" w:eastAsia="zh-CN" w:bidi="ar-SA"/>
+              </w:rPr>
+              <w:t>step start</w:t>
+            </w:r>
+          </w:p>
+        </w:tc>
+      </w:tr>
+      <w:tr>
+        <w:tblPrEx>
+          <w:tblBorders>
+            <w:top w:val="single" w:color="auto" w:sz="4" w:space="0"/>
+            <w:left w:val="single" w:color="auto" w:sz="4" w:space="0"/>
+            <w:bottom w:val="single" w:color="auto" w:sz="4" w:space="0"/>
+            <w:right w:val="single" w:color="auto" w:sz="4" w:space="0"/>
+            <w:insideH w:val="single" w:color="auto" w:sz="4" w:space="0"/>
+            <w:insideV w:val="single" w:color="auto" w:sz="4" w:space="0"/>
+          </w:tblBorders>
+          <w:tblCellMar>
+            <w:top w:w="0" w:type="dxa"/>
+            <w:left w:w="108" w:type="dxa"/>
+            <w:bottom w:w="0" w:type="dxa"/>
+            <w:right w:w="108" w:type="dxa"/>
+          </w:tblCellMar>
+        </w:tblPrEx>
+        <w:tc>
+          <w:tcPr>
+            <w:tcW w:w="0" w:type="auto"/>
+            <w:vMerge w:val="continue"/>
+            <w:vAlign w:val="center"/>
+          </w:tcPr>
+          <w:p>
+            <w:pPr>
+              <w:pStyle w:val="26"/>
+              <w:bidi w:val="0"/>
+              <w:jc w:val="both"/>
+              <w:rPr>
+                <w:rFonts w:hint="eastAsia" w:cs="华文中宋"/>
+                <w:b/>
+                <w:bCs/>
+                <w:color w:val="ED7D31"/>
+                <w:kern w:val="2"/>
+                <w:sz w:val="21"/>
+                <w:szCs w:val="21"/>
+                <w:vertAlign w:val="baseline"/>
+                <w:lang w:val="en-US" w:eastAsia="zh-CN" w:bidi="ar-SA"/>
+              </w:rPr>
+            </w:pPr>
+          </w:p>
+        </w:tc>
+        <w:tc>
+          <w:tcPr>
+            <w:tcW w:w="7633" w:type="dxa"/>
+            <w:shd w:val="clear" w:color="auto" w:fill="auto"/>
+            <w:vAlign w:val="center"/>
+          </w:tcPr>
+          <w:p>
+            <w:pPr>
+              <w:pStyle w:val="26"/>
+              <w:bidi w:val="0"/>
+              <w:jc w:val="both"/>
+              <w:rPr>
+                <w:rFonts w:hint="eastAsia" w:cs="华文中宋"/>
+                <w:b/>
+                <w:bCs/>
+                <w:color w:val="FF0000"/>
+                <w:kern w:val="2"/>
+                <w:sz w:val="21"/>
+                <w:szCs w:val="21"/>
+                <w:lang w:val="en-US" w:eastAsia="zh-CN" w:bidi="ar-SA"/>
+              </w:rPr>
+            </w:pPr>
+            <w:r>
+              <w:rPr>
+                <w:rFonts w:hint="eastAsia" w:cs="华文中宋"/>
+                <w:b/>
+                <w:bCs/>
+                <w:color w:val="FF0000"/>
+                <w:kern w:val="2"/>
+                <w:sz w:val="21"/>
+                <w:szCs w:val="21"/>
+                <w:lang w:val="en-US" w:eastAsia="zh-CN" w:bidi="ar-SA"/>
+              </w:rPr>
+              <w:t xml:space="preserve">on_train_batch_end / on_validation_batch_end / </w:t>
+            </w:r>
+          </w:p>
+          <w:p>
+            <w:pPr>
+              <w:pStyle w:val="26"/>
+              <w:bidi w:val="0"/>
+              <w:jc w:val="both"/>
+              <w:rPr>
+                <w:rFonts w:hint="eastAsia" w:cs="华文中宋"/>
+                <w:b/>
+                <w:bCs/>
+                <w:color w:val="FF0000"/>
+                <w:kern w:val="2"/>
+                <w:sz w:val="21"/>
+                <w:szCs w:val="21"/>
+                <w:lang w:val="en-US" w:eastAsia="zh-CN" w:bidi="ar-SA"/>
+              </w:rPr>
+            </w:pPr>
+            <w:r>
+              <w:rPr>
+                <w:rFonts w:hint="eastAsia" w:cs="华文中宋"/>
+                <w:b/>
+                <w:bCs/>
+                <w:color w:val="FF0000"/>
+                <w:kern w:val="2"/>
+                <w:sz w:val="21"/>
+                <w:szCs w:val="21"/>
+                <w:lang w:val="en-US" w:eastAsia="zh-CN" w:bidi="ar-SA"/>
+              </w:rPr>
+              <w:t>on_test_batch_end / on_predict_batch_end</w:t>
+            </w:r>
+          </w:p>
+          <w:p>
+            <w:pPr>
+              <w:pStyle w:val="26"/>
+              <w:bidi w:val="0"/>
+              <w:jc w:val="both"/>
+              <w:rPr>
+                <w:rFonts w:hint="eastAsia" w:cs="华文中宋"/>
+                <w:b/>
+                <w:bCs/>
+                <w:color w:val="FF0000"/>
+                <w:kern w:val="2"/>
+                <w:sz w:val="21"/>
+                <w:szCs w:val="21"/>
+                <w:lang w:val="en-US" w:eastAsia="zh-CN" w:bidi="ar-SA"/>
+              </w:rPr>
+            </w:pPr>
+            <w:r>
+              <w:rPr>
+                <w:rFonts w:hint="eastAsia" w:cs="华文中宋"/>
+                <w:b/>
+                <w:bCs/>
+                <w:color w:val="FF0000"/>
+                <w:kern w:val="2"/>
+                <w:sz w:val="21"/>
+                <w:szCs w:val="21"/>
+                <w:lang w:val="en-US" w:eastAsia="zh-CN" w:bidi="ar-SA"/>
+              </w:rPr>
+              <w:t>(self, trainer, pl_module, ...)</w:t>
+            </w:r>
+          </w:p>
+        </w:tc>
+        <w:tc>
+          <w:tcPr>
+            <w:tcW w:w="1218" w:type="dxa"/>
+            <w:shd w:val="clear" w:color="auto" w:fill="auto"/>
+            <w:vAlign w:val="center"/>
+          </w:tcPr>
+          <w:p>
+            <w:pPr>
+              <w:pStyle w:val="27"/>
+              <w:bidi w:val="0"/>
+              <w:jc w:val="both"/>
+              <w:rPr>
+                <w:rFonts w:hint="eastAsia" w:cs="华文中宋"/>
+                <w:b/>
+                <w:bCs/>
+                <w:color w:val="EA82E5"/>
+                <w:kern w:val="2"/>
+                <w:sz w:val="21"/>
+                <w:szCs w:val="21"/>
+                <w:vertAlign w:val="baseline"/>
+                <w:lang w:val="en-US" w:eastAsia="zh-CN" w:bidi="ar-SA"/>
+              </w:rPr>
+            </w:pPr>
+            <w:r>
+              <w:rPr>
+                <w:rFonts w:hint="eastAsia" w:cs="华文中宋"/>
+                <w:b/>
+                <w:bCs/>
+                <w:color w:val="EA82E5"/>
+                <w:kern w:val="2"/>
+                <w:sz w:val="21"/>
+                <w:szCs w:val="21"/>
+                <w:vertAlign w:val="baseline"/>
+                <w:lang w:val="en-US" w:eastAsia="zh-CN" w:bidi="ar-SA"/>
+              </w:rPr>
+              <w:t>step end</w:t>
+            </w:r>
+          </w:p>
+        </w:tc>
+      </w:tr>
+      <w:tr>
+        <w:tblPrEx>
+          <w:tblBorders>
+            <w:top w:val="single" w:color="auto" w:sz="4" w:space="0"/>
+            <w:left w:val="single" w:color="auto" w:sz="4" w:space="0"/>
+            <w:bottom w:val="single" w:color="auto" w:sz="4" w:space="0"/>
+            <w:right w:val="single" w:color="auto" w:sz="4" w:space="0"/>
+            <w:insideH w:val="single" w:color="auto" w:sz="4" w:space="0"/>
+            <w:insideV w:val="single" w:color="auto" w:sz="4" w:space="0"/>
+          </w:tblBorders>
+          <w:tblCellMar>
+            <w:top w:w="0" w:type="dxa"/>
+            <w:left w:w="108" w:type="dxa"/>
+            <w:bottom w:w="0" w:type="dxa"/>
+            <w:right w:w="108" w:type="dxa"/>
+          </w:tblCellMar>
+        </w:tblPrEx>
+        <w:tc>
+          <w:tcPr>
+            <w:tcW w:w="0" w:type="auto"/>
+            <w:vMerge w:val="continue"/>
+            <w:vAlign w:val="center"/>
+          </w:tcPr>
+          <w:p>
+            <w:pPr>
+              <w:pStyle w:val="26"/>
+              <w:bidi w:val="0"/>
+              <w:jc w:val="both"/>
+              <w:rPr>
+                <w:rFonts w:hint="eastAsia" w:cs="华文中宋"/>
+                <w:b/>
+                <w:bCs/>
+                <w:color w:val="ED7D31"/>
+                <w:kern w:val="2"/>
+                <w:sz w:val="21"/>
+                <w:szCs w:val="21"/>
+                <w:vertAlign w:val="baseline"/>
+                <w:lang w:val="en-US" w:eastAsia="zh-CN" w:bidi="ar-SA"/>
+              </w:rPr>
+            </w:pPr>
+          </w:p>
+        </w:tc>
+        <w:tc>
+          <w:tcPr>
+            <w:tcW w:w="0" w:type="auto"/>
+            <w:shd w:val="clear" w:color="auto" w:fill="auto"/>
+            <w:vAlign w:val="center"/>
+          </w:tcPr>
+          <w:p>
+            <w:pPr>
+              <w:pStyle w:val="26"/>
+              <w:bidi w:val="0"/>
+              <w:jc w:val="both"/>
+              <w:rPr>
+                <w:rFonts w:hint="eastAsia" w:cs="华文中宋"/>
+                <w:b/>
+                <w:bCs/>
+                <w:color w:val="FF0000"/>
+                <w:kern w:val="2"/>
+                <w:sz w:val="21"/>
+                <w:szCs w:val="21"/>
+                <w:lang w:val="en-US" w:eastAsia="zh-CN" w:bidi="ar-SA"/>
+              </w:rPr>
+            </w:pPr>
+            <w:r>
+              <w:rPr>
+                <w:rFonts w:hint="eastAsia" w:cs="华文中宋"/>
+                <w:b/>
+                <w:bCs/>
+                <w:color w:val="FF0000"/>
+                <w:kern w:val="2"/>
+                <w:sz w:val="21"/>
+                <w:szCs w:val="21"/>
+                <w:lang w:val="en-US" w:eastAsia="zh-CN" w:bidi="ar-SA"/>
+              </w:rPr>
+              <w:t xml:space="preserve">on_train_epoch_start / on_train_epoch_end / </w:t>
+            </w:r>
+          </w:p>
+          <w:p>
+            <w:pPr>
+              <w:pStyle w:val="26"/>
+              <w:bidi w:val="0"/>
+              <w:jc w:val="both"/>
+              <w:rPr>
+                <w:rFonts w:hint="eastAsia" w:cs="华文中宋"/>
+                <w:b/>
+                <w:bCs/>
+                <w:color w:val="FF0000"/>
+                <w:kern w:val="2"/>
+                <w:sz w:val="21"/>
+                <w:szCs w:val="21"/>
+                <w:lang w:val="en-US" w:eastAsia="zh-CN" w:bidi="ar-SA"/>
+              </w:rPr>
+            </w:pPr>
+            <w:r>
+              <w:rPr>
+                <w:rFonts w:hint="eastAsia" w:cs="华文中宋"/>
+                <w:b/>
+                <w:bCs/>
+                <w:color w:val="FF0000"/>
+                <w:kern w:val="2"/>
+                <w:sz w:val="21"/>
+                <w:szCs w:val="21"/>
+                <w:lang w:val="en-US" w:eastAsia="zh-CN" w:bidi="ar-SA"/>
+              </w:rPr>
+              <w:t xml:space="preserve">on_validation_epoch_start / on_validation_epoch_end / </w:t>
+            </w:r>
+          </w:p>
+          <w:p>
+            <w:pPr>
+              <w:pStyle w:val="26"/>
+              <w:bidi w:val="0"/>
+              <w:jc w:val="both"/>
+              <w:rPr>
+                <w:rFonts w:hint="eastAsia" w:cs="华文中宋"/>
+                <w:b/>
+                <w:bCs/>
+                <w:color w:val="FF0000"/>
+                <w:kern w:val="2"/>
+                <w:sz w:val="21"/>
+                <w:szCs w:val="21"/>
+                <w:lang w:val="en-US" w:eastAsia="zh-CN" w:bidi="ar-SA"/>
+              </w:rPr>
+            </w:pPr>
+            <w:r>
+              <w:rPr>
+                <w:rFonts w:hint="eastAsia" w:cs="华文中宋"/>
+                <w:b/>
+                <w:bCs/>
+                <w:color w:val="FF0000"/>
+                <w:kern w:val="2"/>
+                <w:sz w:val="21"/>
+                <w:szCs w:val="21"/>
+                <w:lang w:val="en-US" w:eastAsia="zh-CN" w:bidi="ar-SA"/>
+              </w:rPr>
+              <w:t xml:space="preserve">on_test_epoch_start / on_test_epoch_end / </w:t>
+            </w:r>
+          </w:p>
+          <w:p>
+            <w:pPr>
+              <w:pStyle w:val="26"/>
+              <w:bidi w:val="0"/>
+              <w:jc w:val="both"/>
+              <w:rPr>
+                <w:rFonts w:hint="default" w:cs="华文中宋"/>
+                <w:b/>
+                <w:bCs/>
+                <w:color w:val="FF0000"/>
+                <w:kern w:val="2"/>
+                <w:sz w:val="21"/>
+                <w:szCs w:val="21"/>
+                <w:lang w:val="en-US" w:eastAsia="zh-CN" w:bidi="ar-SA"/>
+              </w:rPr>
+            </w:pPr>
+            <w:r>
+              <w:rPr>
+                <w:rFonts w:hint="eastAsia" w:cs="华文中宋"/>
+                <w:b/>
+                <w:bCs/>
+                <w:color w:val="FF0000"/>
+                <w:kern w:val="2"/>
+                <w:sz w:val="21"/>
+                <w:szCs w:val="21"/>
+                <w:lang w:val="en-US" w:eastAsia="zh-CN" w:bidi="ar-SA"/>
+              </w:rPr>
+              <w:t>on_predict_epoch_start / on_predict_epoch_end(self, trainer, pl_module)</w:t>
+            </w:r>
+          </w:p>
+        </w:tc>
+        <w:tc>
+          <w:tcPr>
+            <w:tcW w:w="0" w:type="auto"/>
+            <w:shd w:val="clear" w:color="auto" w:fill="auto"/>
+            <w:vAlign w:val="center"/>
+          </w:tcPr>
+          <w:p>
+            <w:pPr>
+              <w:pStyle w:val="27"/>
+              <w:bidi w:val="0"/>
+              <w:jc w:val="both"/>
+              <w:rPr>
+                <w:rFonts w:hint="default" w:cs="华文中宋"/>
+                <w:b/>
+                <w:bCs/>
+                <w:color w:val="EA82E5"/>
+                <w:kern w:val="2"/>
+                <w:sz w:val="21"/>
+                <w:szCs w:val="21"/>
+                <w:vertAlign w:val="baseline"/>
+                <w:lang w:val="en-US" w:eastAsia="zh-CN" w:bidi="ar-SA"/>
+              </w:rPr>
+            </w:pPr>
+            <w:r>
+              <w:rPr>
+                <w:rFonts w:hint="eastAsia" w:cs="华文中宋"/>
+                <w:b/>
+                <w:bCs/>
+                <w:color w:val="EA82E5"/>
+                <w:kern w:val="2"/>
+                <w:sz w:val="21"/>
+                <w:szCs w:val="21"/>
+                <w:vertAlign w:val="baseline"/>
+                <w:lang w:val="en-US" w:eastAsia="zh-CN" w:bidi="ar-SA"/>
+              </w:rPr>
+              <w:t>epoch</w:t>
+            </w:r>
+          </w:p>
+        </w:tc>
+      </w:tr>
+      <w:tr>
+        <w:tblPrEx>
+          <w:tblBorders>
+            <w:top w:val="single" w:color="auto" w:sz="4" w:space="0"/>
+            <w:left w:val="single" w:color="auto" w:sz="4" w:space="0"/>
+            <w:bottom w:val="single" w:color="auto" w:sz="4" w:space="0"/>
+            <w:right w:val="single" w:color="auto" w:sz="4" w:space="0"/>
+            <w:insideH w:val="single" w:color="auto" w:sz="4" w:space="0"/>
+            <w:insideV w:val="single" w:color="auto" w:sz="4" w:space="0"/>
+          </w:tblBorders>
+          <w:tblCellMar>
+            <w:top w:w="0" w:type="dxa"/>
+            <w:left w:w="108" w:type="dxa"/>
+            <w:bottom w:w="0" w:type="dxa"/>
+            <w:right w:w="108" w:type="dxa"/>
+          </w:tblCellMar>
+        </w:tblPrEx>
+        <w:tc>
+          <w:tcPr>
+            <w:tcW w:w="0" w:type="auto"/>
+            <w:vMerge w:val="continue"/>
+            <w:vAlign w:val="center"/>
+          </w:tcPr>
+          <w:p>
+            <w:pPr>
+              <w:pStyle w:val="26"/>
+              <w:bidi w:val="0"/>
+              <w:jc w:val="both"/>
+              <w:rPr>
+                <w:rFonts w:hint="eastAsia" w:cs="华文中宋"/>
+                <w:b/>
+                <w:bCs/>
+                <w:color w:val="ED7D31"/>
+                <w:kern w:val="2"/>
+                <w:sz w:val="21"/>
+                <w:szCs w:val="21"/>
+                <w:vertAlign w:val="baseline"/>
+                <w:lang w:val="en-US" w:eastAsia="zh-CN" w:bidi="ar-SA"/>
+              </w:rPr>
+            </w:pPr>
+          </w:p>
+        </w:tc>
+        <w:tc>
+          <w:tcPr>
+            <w:tcW w:w="0" w:type="auto"/>
+            <w:shd w:val="clear" w:color="auto" w:fill="auto"/>
+            <w:vAlign w:val="center"/>
+          </w:tcPr>
+          <w:p>
+            <w:pPr>
+              <w:pStyle w:val="26"/>
+              <w:bidi w:val="0"/>
+              <w:jc w:val="both"/>
+              <w:rPr>
+                <w:rFonts w:hint="eastAsia" w:cs="华文中宋"/>
+                <w:b/>
+                <w:bCs/>
+                <w:color w:val="FF0000"/>
+                <w:kern w:val="2"/>
+                <w:sz w:val="21"/>
+                <w:szCs w:val="21"/>
+                <w:lang w:val="en-US" w:eastAsia="zh-CN" w:bidi="ar-SA"/>
+              </w:rPr>
+            </w:pPr>
+            <w:r>
+              <w:rPr>
+                <w:rFonts w:hint="eastAsia" w:cs="华文中宋"/>
+                <w:b/>
+                <w:bCs/>
+                <w:color w:val="FF0000"/>
+                <w:kern w:val="2"/>
+                <w:sz w:val="21"/>
+                <w:szCs w:val="21"/>
+                <w:lang w:val="en-US" w:eastAsia="zh-CN" w:bidi="ar-SA"/>
+              </w:rPr>
+              <w:t>on_before_zero_grad(self, optimizer) /</w:t>
+            </w:r>
+          </w:p>
+          <w:p>
+            <w:pPr>
+              <w:pStyle w:val="26"/>
+              <w:bidi w:val="0"/>
+              <w:jc w:val="both"/>
+              <w:rPr>
+                <w:rFonts w:hint="eastAsia" w:cs="华文中宋"/>
+                <w:b/>
+                <w:bCs/>
+                <w:color w:val="FF0000"/>
+                <w:kern w:val="2"/>
+                <w:sz w:val="21"/>
+                <w:szCs w:val="21"/>
+                <w:lang w:val="en-US" w:eastAsia="zh-CN" w:bidi="ar-SA"/>
+              </w:rPr>
+            </w:pPr>
+            <w:r>
+              <w:rPr>
+                <w:rFonts w:hint="default" w:cs="华文中宋"/>
+                <w:b/>
+                <w:bCs/>
+                <w:color w:val="FF0000"/>
+                <w:kern w:val="2"/>
+                <w:sz w:val="21"/>
+                <w:szCs w:val="21"/>
+                <w:lang w:val="en-US" w:eastAsia="zh-CN" w:bidi="ar-SA"/>
+              </w:rPr>
+              <w:t>on_before_backward(self, loss)</w:t>
+            </w:r>
+            <w:r>
+              <w:rPr>
+                <w:rFonts w:hint="eastAsia" w:cs="华文中宋"/>
+                <w:b/>
+                <w:bCs/>
+                <w:color w:val="FF0000"/>
+                <w:kern w:val="2"/>
+                <w:sz w:val="21"/>
+                <w:szCs w:val="21"/>
+                <w:lang w:val="en-US" w:eastAsia="zh-CN" w:bidi="ar-SA"/>
+              </w:rPr>
+              <w:t xml:space="preserve"> / on_after_backward(self) /</w:t>
+            </w:r>
+          </w:p>
+          <w:p>
+            <w:pPr>
+              <w:pStyle w:val="26"/>
+              <w:bidi w:val="0"/>
+              <w:jc w:val="both"/>
+              <w:rPr>
+                <w:rFonts w:hint="default" w:cs="华文中宋"/>
+                <w:b/>
+                <w:bCs/>
+                <w:color w:val="FF0000"/>
+                <w:kern w:val="2"/>
+                <w:sz w:val="21"/>
+                <w:szCs w:val="21"/>
+                <w:lang w:val="en-US" w:eastAsia="zh-CN" w:bidi="ar-SA"/>
+              </w:rPr>
+            </w:pPr>
+            <w:r>
+              <w:rPr>
+                <w:rFonts w:hint="default" w:cs="华文中宋"/>
+                <w:b/>
+                <w:bCs/>
+                <w:color w:val="FF0000"/>
+                <w:kern w:val="2"/>
+                <w:sz w:val="21"/>
+                <w:szCs w:val="21"/>
+                <w:lang w:val="en-US" w:eastAsia="zh-CN" w:bidi="ar-SA"/>
+              </w:rPr>
+              <w:t>on_before_optimizer_step(self, optimizer)</w:t>
+            </w:r>
+          </w:p>
+        </w:tc>
+        <w:tc>
+          <w:tcPr>
+            <w:tcW w:w="0" w:type="auto"/>
+            <w:shd w:val="clear" w:color="auto" w:fill="auto"/>
+            <w:vAlign w:val="center"/>
+          </w:tcPr>
+          <w:p>
+            <w:pPr>
+              <w:pStyle w:val="27"/>
+              <w:bidi w:val="0"/>
+              <w:jc w:val="both"/>
+              <w:rPr>
+                <w:rFonts w:hint="default" w:cs="华文中宋"/>
+                <w:b/>
+                <w:bCs/>
+                <w:color w:val="EA82E5"/>
+                <w:kern w:val="2"/>
+                <w:sz w:val="21"/>
+                <w:szCs w:val="21"/>
+                <w:vertAlign w:val="baseline"/>
+                <w:lang w:val="en-US" w:eastAsia="zh-CN" w:bidi="ar-SA"/>
+              </w:rPr>
+            </w:pPr>
+            <w:r>
+              <w:rPr>
+                <w:rFonts w:hint="eastAsia" w:cs="华文中宋"/>
+                <w:b/>
+                <w:bCs/>
+                <w:color w:val="EA82E5"/>
+                <w:kern w:val="2"/>
+                <w:sz w:val="21"/>
+                <w:szCs w:val="21"/>
+                <w:vertAlign w:val="baseline"/>
+                <w:lang w:val="en-US" w:eastAsia="zh-CN" w:bidi="ar-SA"/>
+              </w:rPr>
+              <w:t>backward</w:t>
+            </w:r>
+          </w:p>
+        </w:tc>
+      </w:tr>
+    </w:tbl>
+    <w:p>
+      <w:pPr>
+        <w:rPr>
+          <w:rFonts w:hint="eastAsia"/>
+          <w:color w:val="ED7D31" w:themeColor="accent2"/>
+          <w:u w:val="single"/>
+          <w14:textFill>
+            <w14:solidFill>
+              <w14:schemeClr w14:val="accent2"/>
+            </w14:solidFill>
+          </w14:textFill>
+        </w:rPr>
+      </w:pPr>
+      <w:bookmarkStart w:id="44" w:name="_GoBack"/>
+      <w:bookmarkEnd w:id="44"/>
+    </w:p>
+    <w:tbl>
+      <w:tblPr>
+        <w:tblStyle w:val="12"/>
+        <w:tblW w:w="0" w:type="auto"/>
+        <w:tblInd w:w="0" w:type="dxa"/>
+        <w:tblBorders>
+          <w:top w:val="single" w:color="auto" w:sz="4" w:space="0"/>
+          <w:left w:val="single" w:color="auto" w:sz="4" w:space="0"/>
+          <w:bottom w:val="single" w:color="auto" w:sz="4" w:space="0"/>
+          <w:right w:val="single" w:color="auto" w:sz="4" w:space="0"/>
+          <w:insideH w:val="single" w:color="auto" w:sz="4" w:space="0"/>
+          <w:insideV w:val="single" w:color="auto" w:sz="4" w:space="0"/>
+        </w:tblBorders>
+        <w:tblLayout w:type="autofit"/>
+        <w:tblCellMar>
+          <w:top w:w="0" w:type="dxa"/>
+          <w:left w:w="108" w:type="dxa"/>
+          <w:bottom w:w="0" w:type="dxa"/>
+          <w:right w:w="108" w:type="dxa"/>
+        </w:tblCellMar>
+      </w:tblPr>
+      <w:tblGrid>
         <w:gridCol w:w="1057"/>
         <w:gridCol w:w="5612"/>
         <w:gridCol w:w="1344"/>
@@ -38736,6 +40242,12 @@
             <w:insideH w:val="single" w:color="auto" w:sz="4" w:space="0"/>
             <w:insideV w:val="single" w:color="auto" w:sz="4" w:space="0"/>
           </w:tblBorders>
+          <w:tblCellMar>
+            <w:top w:w="0" w:type="dxa"/>
+            <w:left w:w="108" w:type="dxa"/>
+            <w:bottom w:w="0" w:type="dxa"/>
+            <w:right w:w="108" w:type="dxa"/>
+          </w:tblCellMar>
         </w:tblPrEx>
         <w:tc>
           <w:tcPr>
@@ -42252,1343 +43764,6 @@
         </w:tblCellMar>
       </w:tblPr>
       <w:tblGrid>
-        <w:gridCol w:w="1057"/>
-        <w:gridCol w:w="7633"/>
-        <w:gridCol w:w="1344"/>
-      </w:tblGrid>
-      <w:tr>
-        <w:tblPrEx>
-          <w:tblBorders>
-            <w:top w:val="single" w:color="auto" w:sz="4" w:space="0"/>
-            <w:left w:val="single" w:color="auto" w:sz="4" w:space="0"/>
-            <w:bottom w:val="single" w:color="auto" w:sz="4" w:space="0"/>
-            <w:right w:val="single" w:color="auto" w:sz="4" w:space="0"/>
-            <w:insideH w:val="single" w:color="auto" w:sz="4" w:space="0"/>
-            <w:insideV w:val="single" w:color="auto" w:sz="4" w:space="0"/>
-          </w:tblBorders>
-          <w:tblCellMar>
-            <w:top w:w="0" w:type="dxa"/>
-            <w:left w:w="108" w:type="dxa"/>
-            <w:bottom w:w="0" w:type="dxa"/>
-            <w:right w:w="108" w:type="dxa"/>
-          </w:tblCellMar>
-        </w:tblPrEx>
-        <w:tc>
-          <w:tcPr>
-            <w:tcW w:w="0" w:type="auto"/>
-            <w:gridSpan w:val="2"/>
-            <w:vAlign w:val="center"/>
-          </w:tcPr>
-          <w:p>
-            <w:pPr>
-              <w:pStyle w:val="26"/>
-              <w:bidi w:val="0"/>
-              <w:jc w:val="both"/>
-              <w:rPr>
-                <w:rFonts w:hint="default"/>
-                <w:lang w:val="en-US" w:eastAsia="zh-CN"/>
-              </w:rPr>
-            </w:pPr>
-            <w:r>
-              <w:rPr>
-                <w:rFonts w:hint="eastAsia" w:cs="华文中宋"/>
-                <w:b/>
-                <w:bCs/>
-                <w:color w:val="FF0000"/>
-                <w:kern w:val="2"/>
-                <w:sz w:val="21"/>
-                <w:szCs w:val="21"/>
-                <w:lang w:val="en-US" w:eastAsia="zh-CN" w:bidi="ar-SA"/>
-              </w:rPr>
-              <w:t>Callback</w:t>
-            </w:r>
-          </w:p>
-        </w:tc>
-        <w:tc>
-          <w:tcPr>
-            <w:tcW w:w="0" w:type="auto"/>
-            <w:vAlign w:val="center"/>
-          </w:tcPr>
-          <w:p>
-            <w:pPr>
-              <w:pStyle w:val="27"/>
-              <w:bidi w:val="0"/>
-              <w:jc w:val="both"/>
-              <w:rPr>
-                <w:rFonts w:hint="default"/>
-                <w:vertAlign w:val="baseline"/>
-                <w:lang w:val="en-US" w:eastAsia="zh-CN"/>
-              </w:rPr>
-            </w:pPr>
-            <w:r>
-              <w:rPr>
-                <w:rFonts w:hint="eastAsia"/>
-                <w:vertAlign w:val="baseline"/>
-                <w:lang w:val="en-US" w:eastAsia="zh-CN"/>
-              </w:rPr>
-              <w:t>回调</w:t>
-            </w:r>
-          </w:p>
-        </w:tc>
-      </w:tr>
-      <w:tr>
-        <w:tblPrEx>
-          <w:tblBorders>
-            <w:top w:val="single" w:color="auto" w:sz="4" w:space="0"/>
-            <w:left w:val="single" w:color="auto" w:sz="4" w:space="0"/>
-            <w:bottom w:val="single" w:color="auto" w:sz="4" w:space="0"/>
-            <w:right w:val="single" w:color="auto" w:sz="4" w:space="0"/>
-            <w:insideH w:val="single" w:color="auto" w:sz="4" w:space="0"/>
-            <w:insideV w:val="single" w:color="auto" w:sz="4" w:space="0"/>
-          </w:tblBorders>
-          <w:tblCellMar>
-            <w:top w:w="0" w:type="dxa"/>
-            <w:left w:w="108" w:type="dxa"/>
-            <w:bottom w:w="0" w:type="dxa"/>
-            <w:right w:w="108" w:type="dxa"/>
-          </w:tblCellMar>
-        </w:tblPrEx>
-        <w:trPr>
-          <w:trHeight w:val="90" w:hRule="atLeast"/>
-        </w:trPr>
-        <w:tc>
-          <w:tcPr>
-            <w:tcW w:w="0" w:type="auto"/>
-            <w:vMerge w:val="restart"/>
-            <w:vAlign w:val="center"/>
-          </w:tcPr>
-          <w:p>
-            <w:pPr>
-              <w:pStyle w:val="26"/>
-              <w:bidi w:val="0"/>
-              <w:jc w:val="both"/>
-              <w:rPr>
-                <w:rFonts w:hint="default" w:ascii="华文中宋" w:hAnsi="华文中宋" w:eastAsia="华文中宋" w:cs="华文中宋"/>
-                <w:b/>
-                <w:bCs/>
-                <w:color w:val="FF0000"/>
-                <w:kern w:val="2"/>
-                <w:sz w:val="21"/>
-                <w:szCs w:val="21"/>
-                <w:lang w:val="en-US" w:eastAsia="zh-CN" w:bidi="ar-SA"/>
-              </w:rPr>
-            </w:pPr>
-            <w:r>
-              <w:rPr>
-                <w:rFonts w:hint="eastAsia" w:cs="华文中宋"/>
-                <w:b/>
-                <w:bCs/>
-                <w:color w:val="ED7D31"/>
-                <w:kern w:val="2"/>
-                <w:sz w:val="21"/>
-                <w:szCs w:val="21"/>
-                <w:vertAlign w:val="baseline"/>
-                <w:lang w:val="en-US" w:eastAsia="zh-CN" w:bidi="ar-SA"/>
-              </w:rPr>
-              <w:t>抽象方法</w:t>
-            </w:r>
-          </w:p>
-        </w:tc>
-        <w:tc>
-          <w:tcPr>
-            <w:tcW w:w="0" w:type="auto"/>
-            <w:vAlign w:val="center"/>
-          </w:tcPr>
-          <w:p>
-            <w:pPr>
-              <w:pStyle w:val="26"/>
-              <w:bidi w:val="0"/>
-              <w:jc w:val="both"/>
-              <w:rPr>
-                <w:rFonts w:hint="default" w:cs="华文中宋"/>
-                <w:b/>
-                <w:bCs/>
-                <w:color w:val="FF0000"/>
-                <w:kern w:val="2"/>
-                <w:sz w:val="21"/>
-                <w:szCs w:val="21"/>
-                <w:lang w:val="en-US" w:eastAsia="zh-CN" w:bidi="ar-SA"/>
-              </w:rPr>
-            </w:pPr>
-            <w:r>
-              <w:rPr>
-                <w:rFonts w:hint="eastAsia" w:cs="华文中宋"/>
-                <w:b/>
-                <w:bCs/>
-                <w:color w:val="FF0000"/>
-                <w:kern w:val="2"/>
-                <w:sz w:val="21"/>
-                <w:szCs w:val="21"/>
-                <w:lang w:val="en-US" w:eastAsia="zh-CN" w:bidi="ar-SA"/>
-              </w:rPr>
-              <w:t>state_dict(self) / load_state_dict(self, state_dict)</w:t>
-            </w:r>
-          </w:p>
-        </w:tc>
-        <w:tc>
-          <w:tcPr>
-            <w:tcW w:w="0" w:type="auto"/>
-            <w:vAlign w:val="center"/>
-          </w:tcPr>
-          <w:p>
-            <w:pPr>
-              <w:pStyle w:val="27"/>
-              <w:bidi w:val="0"/>
-              <w:jc w:val="both"/>
-              <w:rPr>
-                <w:rFonts w:hint="default"/>
-                <w:vertAlign w:val="baseline"/>
-                <w:lang w:val="en-US" w:eastAsia="zh-CN"/>
-              </w:rPr>
-            </w:pPr>
-            <w:r>
-              <w:rPr>
-                <w:rFonts w:hint="eastAsia"/>
-                <w:vertAlign w:val="baseline"/>
-                <w:lang w:val="en-US" w:eastAsia="zh-CN"/>
-              </w:rPr>
-              <w:t>state</w:t>
-            </w:r>
-          </w:p>
-        </w:tc>
-      </w:tr>
-      <w:tr>
-        <w:tblPrEx>
-          <w:tblBorders>
-            <w:top w:val="single" w:color="auto" w:sz="4" w:space="0"/>
-            <w:left w:val="single" w:color="auto" w:sz="4" w:space="0"/>
-            <w:bottom w:val="single" w:color="auto" w:sz="4" w:space="0"/>
-            <w:right w:val="single" w:color="auto" w:sz="4" w:space="0"/>
-            <w:insideH w:val="single" w:color="auto" w:sz="4" w:space="0"/>
-            <w:insideV w:val="single" w:color="auto" w:sz="4" w:space="0"/>
-          </w:tblBorders>
-          <w:tblCellMar>
-            <w:top w:w="0" w:type="dxa"/>
-            <w:left w:w="108" w:type="dxa"/>
-            <w:bottom w:w="0" w:type="dxa"/>
-            <w:right w:w="108" w:type="dxa"/>
-          </w:tblCellMar>
-        </w:tblPrEx>
-        <w:trPr>
-          <w:trHeight w:val="90" w:hRule="atLeast"/>
-        </w:trPr>
-        <w:tc>
-          <w:tcPr>
-            <w:tcW w:w="0" w:type="auto"/>
-            <w:vMerge w:val="continue"/>
-            <w:vAlign w:val="center"/>
-          </w:tcPr>
-          <w:p>
-            <w:pPr>
-              <w:pStyle w:val="26"/>
-              <w:bidi w:val="0"/>
-              <w:jc w:val="both"/>
-              <w:rPr>
-                <w:rFonts w:hint="eastAsia" w:cs="华文中宋"/>
-                <w:b/>
-                <w:bCs/>
-                <w:color w:val="ED7D31"/>
-                <w:kern w:val="2"/>
-                <w:sz w:val="21"/>
-                <w:szCs w:val="21"/>
-                <w:vertAlign w:val="baseline"/>
-                <w:lang w:val="en-US" w:eastAsia="zh-CN" w:bidi="ar-SA"/>
-              </w:rPr>
-            </w:pPr>
-          </w:p>
-        </w:tc>
-        <w:tc>
-          <w:tcPr>
-            <w:tcW w:w="0" w:type="auto"/>
-            <w:vAlign w:val="center"/>
-          </w:tcPr>
-          <w:p>
-            <w:pPr>
-              <w:pStyle w:val="26"/>
-              <w:bidi w:val="0"/>
-              <w:jc w:val="both"/>
-              <w:rPr>
-                <w:rFonts w:hint="default" w:cs="华文中宋"/>
-                <w:b/>
-                <w:bCs/>
-                <w:color w:val="FF0000"/>
-                <w:kern w:val="2"/>
-                <w:sz w:val="21"/>
-                <w:szCs w:val="21"/>
-                <w:lang w:val="en-US" w:eastAsia="zh-CN" w:bidi="ar-SA"/>
-              </w:rPr>
-            </w:pPr>
-            <w:r>
-              <w:rPr>
-                <w:rFonts w:hint="eastAsia" w:cs="华文中宋"/>
-                <w:b/>
-                <w:bCs/>
-                <w:color w:val="FF0000"/>
-                <w:kern w:val="2"/>
-                <w:sz w:val="21"/>
-                <w:szCs w:val="21"/>
-                <w:lang w:val="en-US" w:eastAsia="zh-CN" w:bidi="ar-SA"/>
-              </w:rPr>
-              <w:t>on_save_checkpoint / on_load_checkpoint(self, trainer, pl_module, ckpt)</w:t>
-            </w:r>
-          </w:p>
-        </w:tc>
-        <w:tc>
-          <w:tcPr>
-            <w:tcW w:w="0" w:type="auto"/>
-            <w:vAlign w:val="center"/>
-          </w:tcPr>
-          <w:p>
-            <w:pPr>
-              <w:pStyle w:val="27"/>
-              <w:bidi w:val="0"/>
-              <w:jc w:val="both"/>
-              <w:rPr>
-                <w:rFonts w:hint="default"/>
-                <w:vertAlign w:val="baseline"/>
-                <w:lang w:val="en-US" w:eastAsia="zh-CN"/>
-              </w:rPr>
-            </w:pPr>
-            <w:r>
-              <w:rPr>
-                <w:rFonts w:hint="eastAsia"/>
-                <w:vertAlign w:val="baseline"/>
-                <w:lang w:val="en-US" w:eastAsia="zh-CN"/>
-              </w:rPr>
-              <w:t>checkpoint</w:t>
-            </w:r>
-          </w:p>
-        </w:tc>
-      </w:tr>
-      <w:tr>
-        <w:tblPrEx>
-          <w:tblBorders>
-            <w:top w:val="single" w:color="auto" w:sz="4" w:space="0"/>
-            <w:left w:val="single" w:color="auto" w:sz="4" w:space="0"/>
-            <w:bottom w:val="single" w:color="auto" w:sz="4" w:space="0"/>
-            <w:right w:val="single" w:color="auto" w:sz="4" w:space="0"/>
-            <w:insideH w:val="single" w:color="auto" w:sz="4" w:space="0"/>
-            <w:insideV w:val="single" w:color="auto" w:sz="4" w:space="0"/>
-          </w:tblBorders>
-          <w:tblCellMar>
-            <w:top w:w="0" w:type="dxa"/>
-            <w:left w:w="108" w:type="dxa"/>
-            <w:bottom w:w="0" w:type="dxa"/>
-            <w:right w:w="108" w:type="dxa"/>
-          </w:tblCellMar>
-        </w:tblPrEx>
-        <w:tc>
-          <w:tcPr>
-            <w:tcW w:w="0" w:type="auto"/>
-            <w:vMerge w:val="continue"/>
-            <w:tcBorders/>
-            <w:vAlign w:val="center"/>
-          </w:tcPr>
-          <w:p>
-            <w:pPr>
-              <w:pStyle w:val="26"/>
-              <w:bidi w:val="0"/>
-              <w:jc w:val="both"/>
-              <w:rPr>
-                <w:rFonts w:hint="default" w:ascii="华文中宋" w:hAnsi="华文中宋" w:eastAsia="华文中宋" w:cs="华文中宋"/>
-                <w:b/>
-                <w:bCs/>
-                <w:color w:val="FF0000"/>
-                <w:kern w:val="2"/>
-                <w:sz w:val="21"/>
-                <w:szCs w:val="21"/>
-                <w:lang w:val="en-US" w:eastAsia="zh-CN" w:bidi="ar-SA"/>
-              </w:rPr>
-            </w:pPr>
-          </w:p>
-        </w:tc>
-        <w:tc>
-          <w:tcPr>
-            <w:tcW w:w="0" w:type="auto"/>
-            <w:vAlign w:val="center"/>
-          </w:tcPr>
-          <w:p>
-            <w:pPr>
-              <w:pStyle w:val="26"/>
-              <w:bidi w:val="0"/>
-              <w:jc w:val="both"/>
-              <w:rPr>
-                <w:rFonts w:hint="eastAsia" w:cs="华文中宋"/>
-                <w:b/>
-                <w:bCs/>
-                <w:color w:val="FF0000"/>
-                <w:kern w:val="2"/>
-                <w:sz w:val="21"/>
-                <w:szCs w:val="21"/>
-                <w:lang w:val="en-US" w:eastAsia="zh-CN" w:bidi="ar-SA"/>
-              </w:rPr>
-            </w:pPr>
-            <w:r>
-              <w:rPr>
-                <w:rFonts w:hint="eastAsia" w:cs="华文中宋"/>
-                <w:b/>
-                <w:bCs/>
-                <w:color w:val="FF0000"/>
-                <w:kern w:val="2"/>
-                <w:sz w:val="21"/>
-                <w:szCs w:val="21"/>
-                <w:lang w:val="en-US" w:eastAsia="zh-CN" w:bidi="ar-SA"/>
-              </w:rPr>
-              <w:t xml:space="preserve">on_fit_start / on_fit_end / </w:t>
-            </w:r>
-          </w:p>
-          <w:p>
-            <w:pPr>
-              <w:pStyle w:val="26"/>
-              <w:bidi w:val="0"/>
-              <w:jc w:val="both"/>
-              <w:rPr>
-                <w:rFonts w:hint="eastAsia" w:cs="华文中宋"/>
-                <w:b/>
-                <w:bCs/>
-                <w:color w:val="FF0000"/>
-                <w:kern w:val="2"/>
-                <w:sz w:val="21"/>
-                <w:szCs w:val="21"/>
-                <w:lang w:val="en-US" w:eastAsia="zh-CN" w:bidi="ar-SA"/>
-              </w:rPr>
-            </w:pPr>
-            <w:r>
-              <w:rPr>
-                <w:rFonts w:hint="eastAsia" w:cs="华文中宋"/>
-                <w:b/>
-                <w:bCs/>
-                <w:color w:val="FF0000"/>
-                <w:kern w:val="2"/>
-                <w:sz w:val="21"/>
-                <w:szCs w:val="21"/>
-                <w:lang w:val="en-US" w:eastAsia="zh-CN" w:bidi="ar-SA"/>
-              </w:rPr>
-              <w:t xml:space="preserve">on_train_start / on_train_end / </w:t>
-            </w:r>
-          </w:p>
-          <w:p>
-            <w:pPr>
-              <w:pStyle w:val="26"/>
-              <w:bidi w:val="0"/>
-              <w:jc w:val="both"/>
-              <w:rPr>
-                <w:rFonts w:hint="eastAsia" w:cs="华文中宋"/>
-                <w:b/>
-                <w:bCs/>
-                <w:color w:val="FF0000"/>
-                <w:kern w:val="2"/>
-                <w:sz w:val="21"/>
-                <w:szCs w:val="21"/>
-                <w:lang w:val="en-US" w:eastAsia="zh-CN" w:bidi="ar-SA"/>
-              </w:rPr>
-            </w:pPr>
-            <w:r>
-              <w:rPr>
-                <w:rFonts w:hint="eastAsia" w:cs="华文中宋"/>
-                <w:b/>
-                <w:bCs/>
-                <w:color w:val="FF0000"/>
-                <w:kern w:val="2"/>
-                <w:sz w:val="21"/>
-                <w:szCs w:val="21"/>
-                <w:lang w:val="en-US" w:eastAsia="zh-CN" w:bidi="ar-SA"/>
-              </w:rPr>
-              <w:t xml:space="preserve">on_validation_start / on_validation_end / </w:t>
-            </w:r>
-          </w:p>
-          <w:p>
-            <w:pPr>
-              <w:pStyle w:val="26"/>
-              <w:bidi w:val="0"/>
-              <w:jc w:val="both"/>
-              <w:rPr>
-                <w:rFonts w:hint="eastAsia" w:cs="华文中宋"/>
-                <w:b/>
-                <w:bCs/>
-                <w:color w:val="FF0000"/>
-                <w:kern w:val="2"/>
-                <w:sz w:val="21"/>
-                <w:szCs w:val="21"/>
-                <w:lang w:val="en-US" w:eastAsia="zh-CN" w:bidi="ar-SA"/>
-              </w:rPr>
-            </w:pPr>
-            <w:r>
-              <w:rPr>
-                <w:rFonts w:hint="eastAsia" w:cs="华文中宋"/>
-                <w:b/>
-                <w:bCs/>
-                <w:color w:val="FF0000"/>
-                <w:kern w:val="2"/>
-                <w:sz w:val="21"/>
-                <w:szCs w:val="21"/>
-                <w:lang w:val="en-US" w:eastAsia="zh-CN" w:bidi="ar-SA"/>
-              </w:rPr>
-              <w:t xml:space="preserve">on_test_start / on_test_end / </w:t>
-            </w:r>
-          </w:p>
-          <w:p>
-            <w:pPr>
-              <w:pStyle w:val="26"/>
-              <w:bidi w:val="0"/>
-              <w:jc w:val="both"/>
-              <w:rPr>
-                <w:rFonts w:hint="default" w:cs="华文中宋"/>
-                <w:b/>
-                <w:bCs/>
-                <w:color w:val="FF0000"/>
-                <w:kern w:val="2"/>
-                <w:sz w:val="21"/>
-                <w:szCs w:val="21"/>
-                <w:lang w:val="en-US" w:eastAsia="zh-CN" w:bidi="ar-SA"/>
-              </w:rPr>
-            </w:pPr>
-            <w:r>
-              <w:rPr>
-                <w:rFonts w:hint="eastAsia" w:cs="华文中宋"/>
-                <w:b/>
-                <w:bCs/>
-                <w:color w:val="FF0000"/>
-                <w:kern w:val="2"/>
-                <w:sz w:val="21"/>
-                <w:szCs w:val="21"/>
-                <w:lang w:val="en-US" w:eastAsia="zh-CN" w:bidi="ar-SA"/>
-              </w:rPr>
-              <w:t>on_predict_start / on_predict_end(self, trainer, pl_module)</w:t>
-            </w:r>
-          </w:p>
-        </w:tc>
-        <w:tc>
-          <w:tcPr>
-            <w:tcW w:w="0" w:type="auto"/>
-            <w:vAlign w:val="center"/>
-          </w:tcPr>
-          <w:p>
-            <w:pPr>
-              <w:pStyle w:val="27"/>
-              <w:bidi w:val="0"/>
-              <w:jc w:val="both"/>
-              <w:rPr>
-                <w:rFonts w:hint="default"/>
-                <w:vertAlign w:val="baseline"/>
-                <w:lang w:val="en-US" w:eastAsia="zh-CN"/>
-              </w:rPr>
-            </w:pPr>
-            <w:r>
-              <w:rPr>
-                <w:rFonts w:hint="eastAsia"/>
-                <w:vertAlign w:val="baseline"/>
-                <w:lang w:val="en-US" w:eastAsia="zh-CN"/>
-              </w:rPr>
-              <w:t>stage</w:t>
-            </w:r>
-          </w:p>
-        </w:tc>
-      </w:tr>
-      <w:tr>
-        <w:tblPrEx>
-          <w:tblBorders>
-            <w:top w:val="single" w:color="auto" w:sz="4" w:space="0"/>
-            <w:left w:val="single" w:color="auto" w:sz="4" w:space="0"/>
-            <w:bottom w:val="single" w:color="auto" w:sz="4" w:space="0"/>
-            <w:right w:val="single" w:color="auto" w:sz="4" w:space="0"/>
-            <w:insideH w:val="single" w:color="auto" w:sz="4" w:space="0"/>
-            <w:insideV w:val="single" w:color="auto" w:sz="4" w:space="0"/>
-          </w:tblBorders>
-          <w:tblCellMar>
-            <w:top w:w="0" w:type="dxa"/>
-            <w:left w:w="108" w:type="dxa"/>
-            <w:bottom w:w="0" w:type="dxa"/>
-            <w:right w:w="108" w:type="dxa"/>
-          </w:tblCellMar>
-        </w:tblPrEx>
-        <w:tc>
-          <w:tcPr>
-            <w:tcW w:w="0" w:type="auto"/>
-            <w:vMerge w:val="continue"/>
-            <w:tcBorders/>
-            <w:vAlign w:val="center"/>
-          </w:tcPr>
-          <w:p>
-            <w:pPr>
-              <w:pStyle w:val="26"/>
-              <w:bidi w:val="0"/>
-              <w:jc w:val="both"/>
-              <w:rPr>
-                <w:rFonts w:hint="eastAsia" w:cs="华文中宋"/>
-                <w:b/>
-                <w:bCs/>
-                <w:color w:val="ED7D31"/>
-                <w:kern w:val="2"/>
-                <w:sz w:val="21"/>
-                <w:szCs w:val="21"/>
-                <w:vertAlign w:val="baseline"/>
-                <w:lang w:val="en-US" w:eastAsia="zh-CN" w:bidi="ar-SA"/>
-              </w:rPr>
-            </w:pPr>
-          </w:p>
-        </w:tc>
-        <w:tc>
-          <w:tcPr>
-            <w:tcW w:w="7633" w:type="dxa"/>
-            <w:shd w:val="clear" w:color="auto" w:fill="auto"/>
-            <w:vAlign w:val="center"/>
-          </w:tcPr>
-          <w:p>
-            <w:pPr>
-              <w:pStyle w:val="26"/>
-              <w:bidi w:val="0"/>
-              <w:jc w:val="both"/>
-              <w:rPr>
-                <w:rFonts w:hint="eastAsia" w:cs="华文中宋"/>
-                <w:b/>
-                <w:bCs/>
-                <w:color w:val="FF0000"/>
-                <w:kern w:val="2"/>
-                <w:sz w:val="21"/>
-                <w:szCs w:val="21"/>
-                <w:lang w:val="en-US" w:eastAsia="zh-CN" w:bidi="ar-SA"/>
-              </w:rPr>
-            </w:pPr>
-            <w:r>
-              <w:rPr>
-                <w:rFonts w:hint="eastAsia" w:cs="华文中宋"/>
-                <w:b/>
-                <w:bCs/>
-                <w:color w:val="FF0000"/>
-                <w:kern w:val="2"/>
-                <w:sz w:val="21"/>
-                <w:szCs w:val="21"/>
-                <w:lang w:val="en-US" w:eastAsia="zh-CN" w:bidi="ar-SA"/>
-              </w:rPr>
-              <w:t xml:space="preserve">on_train_batch_start / on_validation_batch_start / </w:t>
-            </w:r>
-          </w:p>
-          <w:p>
-            <w:pPr>
-              <w:pStyle w:val="26"/>
-              <w:bidi w:val="0"/>
-              <w:jc w:val="both"/>
-              <w:rPr>
-                <w:rFonts w:hint="eastAsia" w:cs="华文中宋"/>
-                <w:b/>
-                <w:bCs/>
-                <w:color w:val="FF0000"/>
-                <w:kern w:val="2"/>
-                <w:sz w:val="21"/>
-                <w:szCs w:val="21"/>
-                <w:lang w:val="en-US" w:eastAsia="zh-CN" w:bidi="ar-SA"/>
-              </w:rPr>
-            </w:pPr>
-            <w:r>
-              <w:rPr>
-                <w:rFonts w:hint="eastAsia" w:cs="华文中宋"/>
-                <w:b/>
-                <w:bCs/>
-                <w:color w:val="FF0000"/>
-                <w:kern w:val="2"/>
-                <w:sz w:val="21"/>
-                <w:szCs w:val="21"/>
-                <w:lang w:val="en-US" w:eastAsia="zh-CN" w:bidi="ar-SA"/>
-              </w:rPr>
-              <w:t>on_test_batch_start / on_predict_batch_start</w:t>
-            </w:r>
-          </w:p>
-          <w:p>
-            <w:pPr>
-              <w:pStyle w:val="26"/>
-              <w:bidi w:val="0"/>
-              <w:jc w:val="both"/>
-              <w:rPr>
-                <w:rFonts w:hint="eastAsia" w:ascii="华文中宋" w:hAnsi="华文中宋" w:eastAsia="华文中宋" w:cs="华文中宋"/>
-                <w:b/>
-                <w:bCs/>
-                <w:color w:val="FF0000"/>
-                <w:kern w:val="2"/>
-                <w:sz w:val="21"/>
-                <w:szCs w:val="21"/>
-                <w:lang w:val="en-US" w:eastAsia="zh-CN" w:bidi="ar-SA"/>
-              </w:rPr>
-            </w:pPr>
-            <w:r>
-              <w:rPr>
-                <w:rFonts w:hint="eastAsia" w:cs="华文中宋"/>
-                <w:b/>
-                <w:bCs/>
-                <w:color w:val="FF0000"/>
-                <w:kern w:val="2"/>
-                <w:sz w:val="21"/>
-                <w:szCs w:val="21"/>
-                <w:lang w:val="en-US" w:eastAsia="zh-CN" w:bidi="ar-SA"/>
-              </w:rPr>
-              <w:t>(self, trainer, pl_module, ...)</w:t>
-            </w:r>
-          </w:p>
-        </w:tc>
-        <w:tc>
-          <w:tcPr>
-            <w:tcW w:w="1218" w:type="dxa"/>
-            <w:shd w:val="clear" w:color="auto" w:fill="auto"/>
-            <w:vAlign w:val="center"/>
-          </w:tcPr>
-          <w:p>
-            <w:pPr>
-              <w:pStyle w:val="27"/>
-              <w:bidi w:val="0"/>
-              <w:jc w:val="both"/>
-              <w:rPr>
-                <w:rFonts w:hint="default" w:ascii="华文中宋" w:hAnsi="华文中宋" w:eastAsia="华文中宋" w:cs="华文中宋"/>
-                <w:b/>
-                <w:bCs/>
-                <w:color w:val="EA82E5"/>
-                <w:kern w:val="2"/>
-                <w:sz w:val="21"/>
-                <w:szCs w:val="21"/>
-                <w:vertAlign w:val="baseline"/>
-                <w:lang w:val="en-US" w:eastAsia="zh-CN" w:bidi="ar-SA"/>
-              </w:rPr>
-            </w:pPr>
-            <w:r>
-              <w:rPr>
-                <w:rFonts w:hint="eastAsia" w:cs="华文中宋"/>
-                <w:b/>
-                <w:bCs/>
-                <w:color w:val="EA82E5"/>
-                <w:kern w:val="2"/>
-                <w:sz w:val="21"/>
-                <w:szCs w:val="21"/>
-                <w:vertAlign w:val="baseline"/>
-                <w:lang w:val="en-US" w:eastAsia="zh-CN" w:bidi="ar-SA"/>
-              </w:rPr>
-              <w:t>step start</w:t>
-            </w:r>
-          </w:p>
-        </w:tc>
-      </w:tr>
-      <w:tr>
-        <w:tblPrEx>
-          <w:tblBorders>
-            <w:top w:val="single" w:color="auto" w:sz="4" w:space="0"/>
-            <w:left w:val="single" w:color="auto" w:sz="4" w:space="0"/>
-            <w:bottom w:val="single" w:color="auto" w:sz="4" w:space="0"/>
-            <w:right w:val="single" w:color="auto" w:sz="4" w:space="0"/>
-            <w:insideH w:val="single" w:color="auto" w:sz="4" w:space="0"/>
-            <w:insideV w:val="single" w:color="auto" w:sz="4" w:space="0"/>
-          </w:tblBorders>
-          <w:tblCellMar>
-            <w:top w:w="0" w:type="dxa"/>
-            <w:left w:w="108" w:type="dxa"/>
-            <w:bottom w:w="0" w:type="dxa"/>
-            <w:right w:w="108" w:type="dxa"/>
-          </w:tblCellMar>
-        </w:tblPrEx>
-        <w:tc>
-          <w:tcPr>
-            <w:tcW w:w="0" w:type="auto"/>
-            <w:vMerge w:val="continue"/>
-            <w:tcBorders/>
-            <w:vAlign w:val="center"/>
-          </w:tcPr>
-          <w:p>
-            <w:pPr>
-              <w:pStyle w:val="26"/>
-              <w:bidi w:val="0"/>
-              <w:jc w:val="both"/>
-              <w:rPr>
-                <w:rFonts w:hint="eastAsia" w:cs="华文中宋"/>
-                <w:b/>
-                <w:bCs/>
-                <w:color w:val="ED7D31"/>
-                <w:kern w:val="2"/>
-                <w:sz w:val="21"/>
-                <w:szCs w:val="21"/>
-                <w:vertAlign w:val="baseline"/>
-                <w:lang w:val="en-US" w:eastAsia="zh-CN" w:bidi="ar-SA"/>
-              </w:rPr>
-            </w:pPr>
-          </w:p>
-        </w:tc>
-        <w:tc>
-          <w:tcPr>
-            <w:tcW w:w="7633" w:type="dxa"/>
-            <w:shd w:val="clear" w:color="auto" w:fill="auto"/>
-            <w:vAlign w:val="center"/>
-          </w:tcPr>
-          <w:p>
-            <w:pPr>
-              <w:pStyle w:val="26"/>
-              <w:bidi w:val="0"/>
-              <w:jc w:val="both"/>
-              <w:rPr>
-                <w:rFonts w:hint="eastAsia" w:cs="华文中宋"/>
-                <w:b/>
-                <w:bCs/>
-                <w:color w:val="FF0000"/>
-                <w:kern w:val="2"/>
-                <w:sz w:val="21"/>
-                <w:szCs w:val="21"/>
-                <w:lang w:val="en-US" w:eastAsia="zh-CN" w:bidi="ar-SA"/>
-              </w:rPr>
-            </w:pPr>
-            <w:r>
-              <w:rPr>
-                <w:rFonts w:hint="eastAsia" w:cs="华文中宋"/>
-                <w:b/>
-                <w:bCs/>
-                <w:color w:val="FF0000"/>
-                <w:kern w:val="2"/>
-                <w:sz w:val="21"/>
-                <w:szCs w:val="21"/>
-                <w:lang w:val="en-US" w:eastAsia="zh-CN" w:bidi="ar-SA"/>
-              </w:rPr>
-              <w:t xml:space="preserve">on_train_batch_end / on_validation_batch_end / </w:t>
-            </w:r>
-          </w:p>
-          <w:p>
-            <w:pPr>
-              <w:pStyle w:val="26"/>
-              <w:bidi w:val="0"/>
-              <w:jc w:val="both"/>
-              <w:rPr>
-                <w:rFonts w:hint="eastAsia" w:cs="华文中宋"/>
-                <w:b/>
-                <w:bCs/>
-                <w:color w:val="FF0000"/>
-                <w:kern w:val="2"/>
-                <w:sz w:val="21"/>
-                <w:szCs w:val="21"/>
-                <w:lang w:val="en-US" w:eastAsia="zh-CN" w:bidi="ar-SA"/>
-              </w:rPr>
-            </w:pPr>
-            <w:r>
-              <w:rPr>
-                <w:rFonts w:hint="eastAsia" w:cs="华文中宋"/>
-                <w:b/>
-                <w:bCs/>
-                <w:color w:val="FF0000"/>
-                <w:kern w:val="2"/>
-                <w:sz w:val="21"/>
-                <w:szCs w:val="21"/>
-                <w:lang w:val="en-US" w:eastAsia="zh-CN" w:bidi="ar-SA"/>
-              </w:rPr>
-              <w:t>on_test_batch_end / on_predict_batch_end</w:t>
-            </w:r>
-          </w:p>
-          <w:p>
-            <w:pPr>
-              <w:pStyle w:val="26"/>
-              <w:bidi w:val="0"/>
-              <w:jc w:val="both"/>
-              <w:rPr>
-                <w:rFonts w:hint="eastAsia" w:cs="华文中宋"/>
-                <w:b/>
-                <w:bCs/>
-                <w:color w:val="FF0000"/>
-                <w:kern w:val="2"/>
-                <w:sz w:val="21"/>
-                <w:szCs w:val="21"/>
-                <w:lang w:val="en-US" w:eastAsia="zh-CN" w:bidi="ar-SA"/>
-              </w:rPr>
-            </w:pPr>
-            <w:r>
-              <w:rPr>
-                <w:rFonts w:hint="eastAsia" w:cs="华文中宋"/>
-                <w:b/>
-                <w:bCs/>
-                <w:color w:val="FF0000"/>
-                <w:kern w:val="2"/>
-                <w:sz w:val="21"/>
-                <w:szCs w:val="21"/>
-                <w:lang w:val="en-US" w:eastAsia="zh-CN" w:bidi="ar-SA"/>
-              </w:rPr>
-              <w:t>(self, trainer, pl_module, ...)</w:t>
-            </w:r>
-          </w:p>
-        </w:tc>
-        <w:tc>
-          <w:tcPr>
-            <w:tcW w:w="1218" w:type="dxa"/>
-            <w:shd w:val="clear" w:color="auto" w:fill="auto"/>
-            <w:vAlign w:val="center"/>
-          </w:tcPr>
-          <w:p>
-            <w:pPr>
-              <w:pStyle w:val="27"/>
-              <w:bidi w:val="0"/>
-              <w:jc w:val="both"/>
-              <w:rPr>
-                <w:rFonts w:hint="eastAsia" w:cs="华文中宋"/>
-                <w:b/>
-                <w:bCs/>
-                <w:color w:val="EA82E5"/>
-                <w:kern w:val="2"/>
-                <w:sz w:val="21"/>
-                <w:szCs w:val="21"/>
-                <w:vertAlign w:val="baseline"/>
-                <w:lang w:val="en-US" w:eastAsia="zh-CN" w:bidi="ar-SA"/>
-              </w:rPr>
-            </w:pPr>
-            <w:r>
-              <w:rPr>
-                <w:rFonts w:hint="eastAsia" w:cs="华文中宋"/>
-                <w:b/>
-                <w:bCs/>
-                <w:color w:val="EA82E5"/>
-                <w:kern w:val="2"/>
-                <w:sz w:val="21"/>
-                <w:szCs w:val="21"/>
-                <w:vertAlign w:val="baseline"/>
-                <w:lang w:val="en-US" w:eastAsia="zh-CN" w:bidi="ar-SA"/>
-              </w:rPr>
-              <w:t>step end</w:t>
-            </w:r>
-          </w:p>
-        </w:tc>
-      </w:tr>
-      <w:tr>
-        <w:tblPrEx>
-          <w:tblBorders>
-            <w:top w:val="single" w:color="auto" w:sz="4" w:space="0"/>
-            <w:left w:val="single" w:color="auto" w:sz="4" w:space="0"/>
-            <w:bottom w:val="single" w:color="auto" w:sz="4" w:space="0"/>
-            <w:right w:val="single" w:color="auto" w:sz="4" w:space="0"/>
-            <w:insideH w:val="single" w:color="auto" w:sz="4" w:space="0"/>
-            <w:insideV w:val="single" w:color="auto" w:sz="4" w:space="0"/>
-          </w:tblBorders>
-          <w:tblCellMar>
-            <w:top w:w="0" w:type="dxa"/>
-            <w:left w:w="108" w:type="dxa"/>
-            <w:bottom w:w="0" w:type="dxa"/>
-            <w:right w:w="108" w:type="dxa"/>
-          </w:tblCellMar>
-        </w:tblPrEx>
-        <w:tc>
-          <w:tcPr>
-            <w:tcW w:w="0" w:type="auto"/>
-            <w:vMerge w:val="continue"/>
-            <w:tcBorders/>
-            <w:vAlign w:val="center"/>
-          </w:tcPr>
-          <w:p>
-            <w:pPr>
-              <w:pStyle w:val="26"/>
-              <w:bidi w:val="0"/>
-              <w:jc w:val="both"/>
-              <w:rPr>
-                <w:rFonts w:hint="eastAsia" w:cs="华文中宋"/>
-                <w:b/>
-                <w:bCs/>
-                <w:color w:val="ED7D31"/>
-                <w:kern w:val="2"/>
-                <w:sz w:val="21"/>
-                <w:szCs w:val="21"/>
-                <w:vertAlign w:val="baseline"/>
-                <w:lang w:val="en-US" w:eastAsia="zh-CN" w:bidi="ar-SA"/>
-              </w:rPr>
-            </w:pPr>
-          </w:p>
-        </w:tc>
-        <w:tc>
-          <w:tcPr>
-            <w:tcW w:w="0" w:type="auto"/>
-            <w:shd w:val="clear" w:color="auto" w:fill="auto"/>
-            <w:vAlign w:val="center"/>
-          </w:tcPr>
-          <w:p>
-            <w:pPr>
-              <w:pStyle w:val="26"/>
-              <w:bidi w:val="0"/>
-              <w:jc w:val="both"/>
-              <w:rPr>
-                <w:rFonts w:hint="eastAsia" w:cs="华文中宋"/>
-                <w:b/>
-                <w:bCs/>
-                <w:color w:val="FF0000"/>
-                <w:kern w:val="2"/>
-                <w:sz w:val="21"/>
-                <w:szCs w:val="21"/>
-                <w:lang w:val="en-US" w:eastAsia="zh-CN" w:bidi="ar-SA"/>
-              </w:rPr>
-            </w:pPr>
-            <w:r>
-              <w:rPr>
-                <w:rFonts w:hint="eastAsia" w:cs="华文中宋"/>
-                <w:b/>
-                <w:bCs/>
-                <w:color w:val="FF0000"/>
-                <w:kern w:val="2"/>
-                <w:sz w:val="21"/>
-                <w:szCs w:val="21"/>
-                <w:lang w:val="en-US" w:eastAsia="zh-CN" w:bidi="ar-SA"/>
-              </w:rPr>
-              <w:t xml:space="preserve">on_train_epoch_start / on_train_epoch_end / </w:t>
-            </w:r>
-          </w:p>
-          <w:p>
-            <w:pPr>
-              <w:pStyle w:val="26"/>
-              <w:bidi w:val="0"/>
-              <w:jc w:val="both"/>
-              <w:rPr>
-                <w:rFonts w:hint="eastAsia" w:cs="华文中宋"/>
-                <w:b/>
-                <w:bCs/>
-                <w:color w:val="FF0000"/>
-                <w:kern w:val="2"/>
-                <w:sz w:val="21"/>
-                <w:szCs w:val="21"/>
-                <w:lang w:val="en-US" w:eastAsia="zh-CN" w:bidi="ar-SA"/>
-              </w:rPr>
-            </w:pPr>
-            <w:r>
-              <w:rPr>
-                <w:rFonts w:hint="eastAsia" w:cs="华文中宋"/>
-                <w:b/>
-                <w:bCs/>
-                <w:color w:val="FF0000"/>
-                <w:kern w:val="2"/>
-                <w:sz w:val="21"/>
-                <w:szCs w:val="21"/>
-                <w:lang w:val="en-US" w:eastAsia="zh-CN" w:bidi="ar-SA"/>
-              </w:rPr>
-              <w:t xml:space="preserve">on_validation_epoch_start / on_validation_epoch_end / </w:t>
-            </w:r>
-          </w:p>
-          <w:p>
-            <w:pPr>
-              <w:pStyle w:val="26"/>
-              <w:bidi w:val="0"/>
-              <w:jc w:val="both"/>
-              <w:rPr>
-                <w:rFonts w:hint="eastAsia" w:cs="华文中宋"/>
-                <w:b/>
-                <w:bCs/>
-                <w:color w:val="FF0000"/>
-                <w:kern w:val="2"/>
-                <w:sz w:val="21"/>
-                <w:szCs w:val="21"/>
-                <w:lang w:val="en-US" w:eastAsia="zh-CN" w:bidi="ar-SA"/>
-              </w:rPr>
-            </w:pPr>
-            <w:r>
-              <w:rPr>
-                <w:rFonts w:hint="eastAsia" w:cs="华文中宋"/>
-                <w:b/>
-                <w:bCs/>
-                <w:color w:val="FF0000"/>
-                <w:kern w:val="2"/>
-                <w:sz w:val="21"/>
-                <w:szCs w:val="21"/>
-                <w:lang w:val="en-US" w:eastAsia="zh-CN" w:bidi="ar-SA"/>
-              </w:rPr>
-              <w:t xml:space="preserve">on_test_epoch_start / on_test_epoch_end / </w:t>
-            </w:r>
-          </w:p>
-          <w:p>
-            <w:pPr>
-              <w:pStyle w:val="26"/>
-              <w:bidi w:val="0"/>
-              <w:jc w:val="both"/>
-              <w:rPr>
-                <w:rFonts w:hint="default" w:cs="华文中宋"/>
-                <w:b/>
-                <w:bCs/>
-                <w:color w:val="FF0000"/>
-                <w:kern w:val="2"/>
-                <w:sz w:val="21"/>
-                <w:szCs w:val="21"/>
-                <w:lang w:val="en-US" w:eastAsia="zh-CN" w:bidi="ar-SA"/>
-              </w:rPr>
-            </w:pPr>
-            <w:r>
-              <w:rPr>
-                <w:rFonts w:hint="eastAsia" w:cs="华文中宋"/>
-                <w:b/>
-                <w:bCs/>
-                <w:color w:val="FF0000"/>
-                <w:kern w:val="2"/>
-                <w:sz w:val="21"/>
-                <w:szCs w:val="21"/>
-                <w:lang w:val="en-US" w:eastAsia="zh-CN" w:bidi="ar-SA"/>
-              </w:rPr>
-              <w:t>on_predict_epoch_start / on_predict_epoch_end(self, trainer, pl_module)</w:t>
-            </w:r>
-          </w:p>
-        </w:tc>
-        <w:tc>
-          <w:tcPr>
-            <w:tcW w:w="0" w:type="auto"/>
-            <w:shd w:val="clear" w:color="auto" w:fill="auto"/>
-            <w:vAlign w:val="center"/>
-          </w:tcPr>
-          <w:p>
-            <w:pPr>
-              <w:pStyle w:val="27"/>
-              <w:bidi w:val="0"/>
-              <w:jc w:val="both"/>
-              <w:rPr>
-                <w:rFonts w:hint="default" w:cs="华文中宋"/>
-                <w:b/>
-                <w:bCs/>
-                <w:color w:val="EA82E5"/>
-                <w:kern w:val="2"/>
-                <w:sz w:val="21"/>
-                <w:szCs w:val="21"/>
-                <w:vertAlign w:val="baseline"/>
-                <w:lang w:val="en-US" w:eastAsia="zh-CN" w:bidi="ar-SA"/>
-              </w:rPr>
-            </w:pPr>
-            <w:r>
-              <w:rPr>
-                <w:rFonts w:hint="eastAsia" w:cs="华文中宋"/>
-                <w:b/>
-                <w:bCs/>
-                <w:color w:val="EA82E5"/>
-                <w:kern w:val="2"/>
-                <w:sz w:val="21"/>
-                <w:szCs w:val="21"/>
-                <w:vertAlign w:val="baseline"/>
-                <w:lang w:val="en-US" w:eastAsia="zh-CN" w:bidi="ar-SA"/>
-              </w:rPr>
-              <w:t>epoch</w:t>
-            </w:r>
-          </w:p>
-        </w:tc>
-      </w:tr>
-      <w:tr>
-        <w:tblPrEx>
-          <w:tblBorders>
-            <w:top w:val="single" w:color="auto" w:sz="4" w:space="0"/>
-            <w:left w:val="single" w:color="auto" w:sz="4" w:space="0"/>
-            <w:bottom w:val="single" w:color="auto" w:sz="4" w:space="0"/>
-            <w:right w:val="single" w:color="auto" w:sz="4" w:space="0"/>
-            <w:insideH w:val="single" w:color="auto" w:sz="4" w:space="0"/>
-            <w:insideV w:val="single" w:color="auto" w:sz="4" w:space="0"/>
-          </w:tblBorders>
-          <w:tblCellMar>
-            <w:top w:w="0" w:type="dxa"/>
-            <w:left w:w="108" w:type="dxa"/>
-            <w:bottom w:w="0" w:type="dxa"/>
-            <w:right w:w="108" w:type="dxa"/>
-          </w:tblCellMar>
-        </w:tblPrEx>
-        <w:tc>
-          <w:tcPr>
-            <w:tcW w:w="0" w:type="auto"/>
-            <w:vMerge w:val="continue"/>
-            <w:tcBorders/>
-            <w:vAlign w:val="center"/>
-          </w:tcPr>
-          <w:p>
-            <w:pPr>
-              <w:pStyle w:val="26"/>
-              <w:bidi w:val="0"/>
-              <w:jc w:val="both"/>
-              <w:rPr>
-                <w:rFonts w:hint="eastAsia" w:cs="华文中宋"/>
-                <w:b/>
-                <w:bCs/>
-                <w:color w:val="ED7D31"/>
-                <w:kern w:val="2"/>
-                <w:sz w:val="21"/>
-                <w:szCs w:val="21"/>
-                <w:vertAlign w:val="baseline"/>
-                <w:lang w:val="en-US" w:eastAsia="zh-CN" w:bidi="ar-SA"/>
-              </w:rPr>
-            </w:pPr>
-          </w:p>
-        </w:tc>
-        <w:tc>
-          <w:tcPr>
-            <w:tcW w:w="0" w:type="auto"/>
-            <w:shd w:val="clear" w:color="auto" w:fill="auto"/>
-            <w:vAlign w:val="center"/>
-          </w:tcPr>
-          <w:p>
-            <w:pPr>
-              <w:pStyle w:val="26"/>
-              <w:bidi w:val="0"/>
-              <w:jc w:val="both"/>
-              <w:rPr>
-                <w:rFonts w:hint="eastAsia" w:cs="华文中宋"/>
-                <w:b/>
-                <w:bCs/>
-                <w:color w:val="FF0000"/>
-                <w:kern w:val="2"/>
-                <w:sz w:val="21"/>
-                <w:szCs w:val="21"/>
-                <w:lang w:val="en-US" w:eastAsia="zh-CN" w:bidi="ar-SA"/>
-              </w:rPr>
-            </w:pPr>
-            <w:r>
-              <w:rPr>
-                <w:rFonts w:hint="eastAsia" w:cs="华文中宋"/>
-                <w:b/>
-                <w:bCs/>
-                <w:color w:val="FF0000"/>
-                <w:kern w:val="2"/>
-                <w:sz w:val="21"/>
-                <w:szCs w:val="21"/>
-                <w:lang w:val="en-US" w:eastAsia="zh-CN" w:bidi="ar-SA"/>
-              </w:rPr>
-              <w:t>on_before_zero_grad(self, optimizer) /</w:t>
-            </w:r>
-          </w:p>
-          <w:p>
-            <w:pPr>
-              <w:pStyle w:val="26"/>
-              <w:bidi w:val="0"/>
-              <w:jc w:val="both"/>
-              <w:rPr>
-                <w:rFonts w:hint="eastAsia" w:cs="华文中宋"/>
-                <w:b/>
-                <w:bCs/>
-                <w:color w:val="FF0000"/>
-                <w:kern w:val="2"/>
-                <w:sz w:val="21"/>
-                <w:szCs w:val="21"/>
-                <w:lang w:val="en-US" w:eastAsia="zh-CN" w:bidi="ar-SA"/>
-              </w:rPr>
-            </w:pPr>
-            <w:r>
-              <w:rPr>
-                <w:rFonts w:hint="default" w:cs="华文中宋"/>
-                <w:b/>
-                <w:bCs/>
-                <w:color w:val="FF0000"/>
-                <w:kern w:val="2"/>
-                <w:sz w:val="21"/>
-                <w:szCs w:val="21"/>
-                <w:lang w:val="en-US" w:eastAsia="zh-CN" w:bidi="ar-SA"/>
-              </w:rPr>
-              <w:t>on_before_backward(self, loss)</w:t>
-            </w:r>
-            <w:r>
-              <w:rPr>
-                <w:rFonts w:hint="eastAsia" w:cs="华文中宋"/>
-                <w:b/>
-                <w:bCs/>
-                <w:color w:val="FF0000"/>
-                <w:kern w:val="2"/>
-                <w:sz w:val="21"/>
-                <w:szCs w:val="21"/>
-                <w:lang w:val="en-US" w:eastAsia="zh-CN" w:bidi="ar-SA"/>
-              </w:rPr>
-              <w:t xml:space="preserve"> / on_after_backward(self) /</w:t>
-            </w:r>
-          </w:p>
-          <w:p>
-            <w:pPr>
-              <w:pStyle w:val="26"/>
-              <w:bidi w:val="0"/>
-              <w:jc w:val="both"/>
-              <w:rPr>
-                <w:rFonts w:hint="default" w:cs="华文中宋"/>
-                <w:b/>
-                <w:bCs/>
-                <w:color w:val="FF0000"/>
-                <w:kern w:val="2"/>
-                <w:sz w:val="21"/>
-                <w:szCs w:val="21"/>
-                <w:lang w:val="en-US" w:eastAsia="zh-CN" w:bidi="ar-SA"/>
-              </w:rPr>
-            </w:pPr>
-            <w:r>
-              <w:rPr>
-                <w:rFonts w:hint="default" w:cs="华文中宋"/>
-                <w:b/>
-                <w:bCs/>
-                <w:color w:val="FF0000"/>
-                <w:kern w:val="2"/>
-                <w:sz w:val="21"/>
-                <w:szCs w:val="21"/>
-                <w:lang w:val="en-US" w:eastAsia="zh-CN" w:bidi="ar-SA"/>
-              </w:rPr>
-              <w:t>on_before_optimizer_step(self, optimizer)</w:t>
-            </w:r>
-          </w:p>
-        </w:tc>
-        <w:tc>
-          <w:tcPr>
-            <w:tcW w:w="0" w:type="auto"/>
-            <w:shd w:val="clear" w:color="auto" w:fill="auto"/>
-            <w:vAlign w:val="center"/>
-          </w:tcPr>
-          <w:p>
-            <w:pPr>
-              <w:pStyle w:val="27"/>
-              <w:bidi w:val="0"/>
-              <w:jc w:val="both"/>
-              <w:rPr>
-                <w:rFonts w:hint="default" w:cs="华文中宋"/>
-                <w:b/>
-                <w:bCs/>
-                <w:color w:val="EA82E5"/>
-                <w:kern w:val="2"/>
-                <w:sz w:val="21"/>
-                <w:szCs w:val="21"/>
-                <w:vertAlign w:val="baseline"/>
-                <w:lang w:val="en-US" w:eastAsia="zh-CN" w:bidi="ar-SA"/>
-              </w:rPr>
-            </w:pPr>
-            <w:r>
-              <w:rPr>
-                <w:rFonts w:hint="eastAsia" w:cs="华文中宋"/>
-                <w:b/>
-                <w:bCs/>
-                <w:color w:val="EA82E5"/>
-                <w:kern w:val="2"/>
-                <w:sz w:val="21"/>
-                <w:szCs w:val="21"/>
-                <w:vertAlign w:val="baseline"/>
-                <w:lang w:val="en-US" w:eastAsia="zh-CN" w:bidi="ar-SA"/>
-              </w:rPr>
-              <w:t>backward</w:t>
-            </w:r>
-          </w:p>
-        </w:tc>
-      </w:tr>
-    </w:tbl>
-    <w:p>
-      <w:pPr>
-        <w:pStyle w:val="19"/>
-        <w:bidi w:val="0"/>
-        <w:outlineLvl w:val="9"/>
-        <w:rPr>
-          <w:rFonts w:hint="eastAsia" w:ascii="华文中宋" w:hAnsi="华文中宋" w:eastAsia="华文中宋" w:cs="华文中宋"/>
-          <w:b/>
-          <w:bCs/>
-          <w:color w:val="7030A0"/>
-          <w:spacing w:val="0"/>
-          <w:kern w:val="2"/>
-          <w:sz w:val="21"/>
-          <w:szCs w:val="21"/>
-          <w:lang w:val="en-US" w:eastAsia="zh-CN" w:bidi="ar-SA"/>
-        </w:rPr>
-      </w:pPr>
-    </w:p>
-    <w:tbl>
-      <w:tblPr>
-        <w:tblStyle w:val="12"/>
-        <w:tblW w:w="0" w:type="auto"/>
-        <w:tblInd w:w="0" w:type="dxa"/>
-        <w:tblBorders>
-          <w:top w:val="single" w:color="auto" w:sz="4" w:space="0"/>
-          <w:left w:val="single" w:color="auto" w:sz="4" w:space="0"/>
-          <w:bottom w:val="single" w:color="auto" w:sz="4" w:space="0"/>
-          <w:right w:val="single" w:color="auto" w:sz="4" w:space="0"/>
-          <w:insideH w:val="single" w:color="auto" w:sz="4" w:space="0"/>
-          <w:insideV w:val="single" w:color="auto" w:sz="4" w:space="0"/>
-        </w:tblBorders>
-        <w:tblLayout w:type="autofit"/>
-        <w:tblCellMar>
-          <w:top w:w="0" w:type="dxa"/>
-          <w:left w:w="108" w:type="dxa"/>
-          <w:bottom w:w="0" w:type="dxa"/>
-          <w:right w:w="108" w:type="dxa"/>
-        </w:tblCellMar>
-      </w:tblPr>
-      <w:tblGrid>
         <w:gridCol w:w="4640"/>
         <w:gridCol w:w="1057"/>
       </w:tblGrid>
@@ -43671,22 +43846,7 @@
                 <w:szCs w:val="21"/>
                 <w:lang w:val="en-US" w:eastAsia="zh-CN" w:bidi="ar-SA"/>
               </w:rPr>
-              <w:t>save_last, save_top_k)</w:t>
-            </w:r>
-            <w:bookmarkStart w:id="44" w:name="_GoBack"/>
-            <w:bookmarkEnd w:id="44"/>
-            <w:r>
-              <w:rPr>
-                <w:rFonts w:hint="eastAsia" w:cs="华文中宋"/>
-                <w:b/>
-                <w:bCs/>
-                <w:color w:val="FF0000"/>
-                <w:kern w:val="2"/>
-                <w:sz w:val="21"/>
-                <w:szCs w:val="21"/>
-                <w:lang w:val="en-US" w:eastAsia="zh-CN" w:bidi="ar-SA"/>
-              </w:rPr>
-              <w:t xml:space="preserve"> </w:t>
+              <w:t xml:space="preserve">save_last, save_top_k) </w:t>
             </w:r>
             <w:r>
               <w:rPr>

</xml_diff>

<commit_message>
update on 2025-11-10 22:40:57.778039
</commit_message>
<xml_diff>
--- a/py 深度学习.docx
+++ b/py 深度学习.docx
@@ -1952,6 +1952,12 @@
             <w:insideH w:val="single" w:color="auto" w:sz="4" w:space="0"/>
             <w:insideV w:val="single" w:color="auto" w:sz="4" w:space="0"/>
           </w:tblBorders>
+          <w:tblCellMar>
+            <w:top w:w="0" w:type="dxa"/>
+            <w:left w:w="108" w:type="dxa"/>
+            <w:bottom w:w="0" w:type="dxa"/>
+            <w:right w:w="108" w:type="dxa"/>
+          </w:tblCellMar>
         </w:tblPrEx>
         <w:tc>
           <w:tcPr>
@@ -8830,6 +8836,12 @@
             <w:insideH w:val="single" w:color="auto" w:sz="4" w:space="0"/>
             <w:insideV w:val="single" w:color="auto" w:sz="4" w:space="0"/>
           </w:tblBorders>
+          <w:tblCellMar>
+            <w:top w:w="0" w:type="dxa"/>
+            <w:left w:w="108" w:type="dxa"/>
+            <w:bottom w:w="0" w:type="dxa"/>
+            <w:right w:w="108" w:type="dxa"/>
+          </w:tblCellMar>
         </w:tblPrEx>
         <w:tc>
           <w:tcPr>
@@ -8980,12 +8992,6 @@
             <w:insideH w:val="single" w:color="auto" w:sz="4" w:space="0"/>
             <w:insideV w:val="single" w:color="auto" w:sz="4" w:space="0"/>
           </w:tblBorders>
-          <w:tblCellMar>
-            <w:top w:w="0" w:type="dxa"/>
-            <w:left w:w="108" w:type="dxa"/>
-            <w:bottom w:w="0" w:type="dxa"/>
-            <w:right w:w="108" w:type="dxa"/>
-          </w:tblCellMar>
         </w:tblPrEx>
         <w:tc>
           <w:tcPr>
@@ -10065,12 +10071,6 @@
             <w:insideH w:val="single" w:color="auto" w:sz="4" w:space="0"/>
             <w:insideV w:val="single" w:color="auto" w:sz="4" w:space="0"/>
           </w:tblBorders>
-          <w:tblCellMar>
-            <w:top w:w="0" w:type="dxa"/>
-            <w:left w:w="108" w:type="dxa"/>
-            <w:bottom w:w="0" w:type="dxa"/>
-            <w:right w:w="108" w:type="dxa"/>
-          </w:tblCellMar>
         </w:tblPrEx>
         <w:tc>
           <w:tcPr>
@@ -10717,12 +10717,6 @@
             <w:insideH w:val="single" w:color="auto" w:sz="4" w:space="0"/>
             <w:insideV w:val="single" w:color="auto" w:sz="4" w:space="0"/>
           </w:tblBorders>
-          <w:tblCellMar>
-            <w:top w:w="0" w:type="dxa"/>
-            <w:left w:w="108" w:type="dxa"/>
-            <w:bottom w:w="0" w:type="dxa"/>
-            <w:right w:w="108" w:type="dxa"/>
-          </w:tblCellMar>
         </w:tblPrEx>
         <w:tc>
           <w:tcPr>
@@ -12208,12 +12202,6 @@
             <w:insideH w:val="single" w:color="auto" w:sz="4" w:space="0"/>
             <w:insideV w:val="single" w:color="auto" w:sz="4" w:space="0"/>
           </w:tblBorders>
-          <w:tblCellMar>
-            <w:top w:w="0" w:type="dxa"/>
-            <w:left w:w="108" w:type="dxa"/>
-            <w:bottom w:w="0" w:type="dxa"/>
-            <w:right w:w="108" w:type="dxa"/>
-          </w:tblCellMar>
         </w:tblPrEx>
         <w:tc>
           <w:tcPr>
@@ -14961,12 +14949,6 @@
             <w:insideH w:val="single" w:color="auto" w:sz="4" w:space="0"/>
             <w:insideV w:val="single" w:color="auto" w:sz="4" w:space="0"/>
           </w:tblBorders>
-          <w:tblCellMar>
-            <w:top w:w="0" w:type="dxa"/>
-            <w:left w:w="108" w:type="dxa"/>
-            <w:bottom w:w="0" w:type="dxa"/>
-            <w:right w:w="108" w:type="dxa"/>
-          </w:tblCellMar>
         </w:tblPrEx>
         <w:tc>
           <w:tcPr>
@@ -16197,6 +16179,12 @@
             <w:insideH w:val="single" w:color="auto" w:sz="4" w:space="0"/>
             <w:insideV w:val="single" w:color="auto" w:sz="4" w:space="0"/>
           </w:tblBorders>
+          <w:tblCellMar>
+            <w:top w:w="0" w:type="dxa"/>
+            <w:left w:w="108" w:type="dxa"/>
+            <w:bottom w:w="0" w:type="dxa"/>
+            <w:right w:w="108" w:type="dxa"/>
+          </w:tblCellMar>
         </w:tblPrEx>
         <w:tc>
           <w:tcPr>
@@ -16767,6 +16755,12 @@
             <w:insideH w:val="single" w:color="auto" w:sz="4" w:space="0"/>
             <w:insideV w:val="single" w:color="auto" w:sz="4" w:space="0"/>
           </w:tblBorders>
+          <w:tblCellMar>
+            <w:top w:w="0" w:type="dxa"/>
+            <w:left w:w="108" w:type="dxa"/>
+            <w:bottom w:w="0" w:type="dxa"/>
+            <w:right w:w="108" w:type="dxa"/>
+          </w:tblCellMar>
         </w:tblPrEx>
         <w:trPr>
           <w:trHeight w:val="151" w:hRule="atLeast"/>
@@ -16959,6 +16953,12 @@
             <w:insideH w:val="single" w:color="auto" w:sz="4" w:space="0"/>
             <w:insideV w:val="single" w:color="auto" w:sz="4" w:space="0"/>
           </w:tblBorders>
+          <w:tblCellMar>
+            <w:top w:w="0" w:type="dxa"/>
+            <w:left w:w="108" w:type="dxa"/>
+            <w:bottom w:w="0" w:type="dxa"/>
+            <w:right w:w="108" w:type="dxa"/>
+          </w:tblCellMar>
         </w:tblPrEx>
         <w:trPr>
           <w:trHeight w:val="151" w:hRule="atLeast"/>
@@ -17440,12 +17440,6 @@
             <w:insideH w:val="single" w:color="auto" w:sz="4" w:space="0"/>
             <w:insideV w:val="single" w:color="auto" w:sz="4" w:space="0"/>
           </w:tblBorders>
-          <w:tblCellMar>
-            <w:top w:w="0" w:type="dxa"/>
-            <w:left w:w="108" w:type="dxa"/>
-            <w:bottom w:w="0" w:type="dxa"/>
-            <w:right w:w="108" w:type="dxa"/>
-          </w:tblCellMar>
         </w:tblPrEx>
         <w:tc>
           <w:tcPr>
@@ -17700,6 +17694,12 @@
             <w:insideH w:val="single" w:color="auto" w:sz="4" w:space="0"/>
             <w:insideV w:val="single" w:color="auto" w:sz="4" w:space="0"/>
           </w:tblBorders>
+          <w:tblCellMar>
+            <w:top w:w="0" w:type="dxa"/>
+            <w:left w:w="108" w:type="dxa"/>
+            <w:bottom w:w="0" w:type="dxa"/>
+            <w:right w:w="108" w:type="dxa"/>
+          </w:tblCellMar>
         </w:tblPrEx>
         <w:trPr>
           <w:trHeight w:val="302" w:hRule="atLeast"/>
@@ -18201,470 +18201,6 @@
                 </w14:textFill>
               </w:rPr>
               <w:t>切换</w:t>
-            </w:r>
-          </w:p>
-        </w:tc>
-      </w:tr>
-    </w:tbl>
-    <w:p>
-      <w:pPr>
-        <w:rPr>
-          <w:color w:val="70AD47" w:themeColor="accent6"/>
-          <w14:textFill>
-            <w14:solidFill>
-              <w14:schemeClr w14:val="accent6"/>
-            </w14:solidFill>
-          </w14:textFill>
-        </w:rPr>
-      </w:pPr>
-    </w:p>
-    <w:p>
-      <w:pPr>
-        <w:rPr>
-          <w:color w:val="70AD47" w:themeColor="accent6"/>
-          <w14:textFill>
-            <w14:solidFill>
-              <w14:schemeClr w14:val="accent6"/>
-            </w14:solidFill>
-          </w14:textFill>
-        </w:rPr>
-      </w:pPr>
-    </w:p>
-    <w:p>
-      <w:pPr>
-        <w:outlineLvl w:val="1"/>
-        <w:rPr>
-          <w:color w:val="00B0F0"/>
-        </w:rPr>
-      </w:pPr>
-      <w:bookmarkStart w:id="21" w:name="_Toc6664"/>
-      <w:r>
-        <w:rPr>
-          <w:rFonts w:hint="eastAsia"/>
-          <w:color w:val="00B0F0"/>
-        </w:rPr>
-        <w:t>激活gradcam：</w:t>
-      </w:r>
-      <w:bookmarkEnd w:id="21"/>
-    </w:p>
-    <w:p>
-      <w:r>
-        <w:rPr>
-          <w:rFonts w:hint="eastAsia"/>
-          <w:color w:val="ED7D31" w:themeColor="accent2"/>
-          <w:spacing w:val="7"/>
-          <w:u w:val="single"/>
-          <w14:textFill>
-            <w14:solidFill>
-              <w14:schemeClr w14:val="accent2"/>
-            </w14:solidFill>
-          </w14:textFill>
-        </w:rPr>
-        <w:t>import pytorch_grad_cam as gradcam</w:t>
-      </w:r>
-    </w:p>
-    <w:tbl>
-      <w:tblPr>
-        <w:tblStyle w:val="12"/>
-        <w:tblW w:w="0" w:type="auto"/>
-        <w:tblInd w:w="0" w:type="dxa"/>
-        <w:tblBorders>
-          <w:top w:val="single" w:color="auto" w:sz="4" w:space="0"/>
-          <w:left w:val="single" w:color="auto" w:sz="4" w:space="0"/>
-          <w:bottom w:val="single" w:color="auto" w:sz="4" w:space="0"/>
-          <w:right w:val="single" w:color="auto" w:sz="4" w:space="0"/>
-          <w:insideH w:val="single" w:color="auto" w:sz="4" w:space="0"/>
-          <w:insideV w:val="single" w:color="auto" w:sz="4" w:space="0"/>
-        </w:tblBorders>
-        <w:tblLayout w:type="autofit"/>
-        <w:tblCellMar>
-          <w:top w:w="0" w:type="dxa"/>
-          <w:left w:w="108" w:type="dxa"/>
-          <w:bottom w:w="0" w:type="dxa"/>
-          <w:right w:w="108" w:type="dxa"/>
-        </w:tblCellMar>
-      </w:tblPr>
-      <w:tblGrid>
-        <w:gridCol w:w="2277"/>
-        <w:gridCol w:w="3129"/>
-        <w:gridCol w:w="2462"/>
-      </w:tblGrid>
-      <w:tr>
-        <w:tblPrEx>
-          <w:tblBorders>
-            <w:top w:val="single" w:color="auto" w:sz="4" w:space="0"/>
-            <w:left w:val="single" w:color="auto" w:sz="4" w:space="0"/>
-            <w:bottom w:val="single" w:color="auto" w:sz="4" w:space="0"/>
-            <w:right w:val="single" w:color="auto" w:sz="4" w:space="0"/>
-            <w:insideH w:val="single" w:color="auto" w:sz="4" w:space="0"/>
-            <w:insideV w:val="single" w:color="auto" w:sz="4" w:space="0"/>
-          </w:tblBorders>
-          <w:tblCellMar>
-            <w:top w:w="0" w:type="dxa"/>
-            <w:left w:w="108" w:type="dxa"/>
-            <w:bottom w:w="0" w:type="dxa"/>
-            <w:right w:w="108" w:type="dxa"/>
-          </w:tblCellMar>
-        </w:tblPrEx>
-        <w:trPr>
-          <w:trHeight w:val="302" w:hRule="atLeast"/>
-        </w:trPr>
-        <w:tc>
-          <w:tcPr>
-            <w:tcW w:w="0" w:type="auto"/>
-            <w:gridSpan w:val="2"/>
-            <w:vAlign w:val="center"/>
-          </w:tcPr>
-          <w:p>
-            <w:pPr>
-              <w:rPr>
-                <w:color w:val="FF0000"/>
-                <w:spacing w:val="7"/>
-              </w:rPr>
-            </w:pPr>
-            <w:r>
-              <w:rPr>
-                <w:rFonts w:hint="eastAsia"/>
-                <w:color w:val="FF0000"/>
-                <w:spacing w:val="7"/>
-              </w:rPr>
-              <w:t>EigenGradCAM(model, target_layers, use_cuda)</w:t>
-            </w:r>
-          </w:p>
-        </w:tc>
-        <w:tc>
-          <w:tcPr>
-            <w:tcW w:w="0" w:type="auto"/>
-            <w:vAlign w:val="center"/>
-          </w:tcPr>
-          <w:p>
-            <w:pPr>
-              <w:rPr>
-                <w:color w:val="ED7D31" w:themeColor="accent2"/>
-                <w14:textFill>
-                  <w14:solidFill>
-                    <w14:schemeClr w14:val="accent2"/>
-                  </w14:solidFill>
-                </w14:textFill>
-              </w:rPr>
-            </w:pPr>
-            <w:r>
-              <w:rPr>
-                <w:rFonts w:hint="eastAsia"/>
-                <w:color w:val="ED7D31" w:themeColor="accent2"/>
-                <w14:textFill>
-                  <w14:solidFill>
-                    <w14:schemeClr w14:val="accent2"/>
-                  </w14:solidFill>
-                </w14:textFill>
-              </w:rPr>
-              <w:t>返回</w:t>
-            </w:r>
-            <w:r>
-              <w:rPr>
-                <w:rFonts w:hint="eastAsia"/>
-                <w:color w:val="EA82F1"/>
-                <w:szCs w:val="24"/>
-              </w:rPr>
-              <w:t>Grad-CAM绘制器</w:t>
-            </w:r>
-          </w:p>
-        </w:tc>
-      </w:tr>
-      <w:tr>
-        <w:tblPrEx>
-          <w:tblBorders>
-            <w:top w:val="single" w:color="auto" w:sz="4" w:space="0"/>
-            <w:left w:val="single" w:color="auto" w:sz="4" w:space="0"/>
-            <w:bottom w:val="single" w:color="auto" w:sz="4" w:space="0"/>
-            <w:right w:val="single" w:color="auto" w:sz="4" w:space="0"/>
-            <w:insideH w:val="single" w:color="auto" w:sz="4" w:space="0"/>
-            <w:insideV w:val="single" w:color="auto" w:sz="4" w:space="0"/>
-          </w:tblBorders>
-          <w:tblCellMar>
-            <w:top w:w="0" w:type="dxa"/>
-            <w:left w:w="108" w:type="dxa"/>
-            <w:bottom w:w="0" w:type="dxa"/>
-            <w:right w:w="108" w:type="dxa"/>
-          </w:tblCellMar>
-        </w:tblPrEx>
-        <w:trPr>
-          <w:trHeight w:val="156" w:hRule="atLeast"/>
-        </w:trPr>
-        <w:tc>
-          <w:tcPr>
-            <w:tcW w:w="0" w:type="auto"/>
-            <w:vAlign w:val="center"/>
-          </w:tcPr>
-          <w:p>
-            <w:r>
-              <w:rPr>
-                <w:rFonts w:hint="eastAsia"/>
-                <w:color w:val="ED7D31" w:themeColor="accent2"/>
-                <w14:textFill>
-                  <w14:solidFill>
-                    <w14:schemeClr w14:val="accent2"/>
-                  </w14:solidFill>
-                </w14:textFill>
-              </w:rPr>
-              <w:t>实例方法</w:t>
-            </w:r>
-          </w:p>
-        </w:tc>
-        <w:tc>
-          <w:tcPr>
-            <w:tcW w:w="0" w:type="auto"/>
-            <w:vAlign w:val="center"/>
-          </w:tcPr>
-          <w:p>
-            <w:pPr>
-              <w:rPr>
-                <w:color w:val="ED7D31" w:themeColor="accent2"/>
-                <w14:textFill>
-                  <w14:solidFill>
-                    <w14:schemeClr w14:val="accent2"/>
-                  </w14:solidFill>
-                </w14:textFill>
-              </w:rPr>
-            </w:pPr>
-            <w:r>
-              <w:rPr>
-                <w:rFonts w:hint="eastAsia"/>
-                <w:color w:val="FF0000"/>
-                <w:spacing w:val="7"/>
-              </w:rPr>
-              <w:t>module</w:t>
-            </w:r>
-          </w:p>
-        </w:tc>
-        <w:tc>
-          <w:tcPr>
-            <w:tcW w:w="0" w:type="auto"/>
-            <w:vAlign w:val="center"/>
-          </w:tcPr>
-          <w:p>
-            <w:pPr>
-              <w:rPr>
-                <w:color w:val="ED7D31" w:themeColor="accent2"/>
-                <w14:textFill>
-                  <w14:solidFill>
-                    <w14:schemeClr w14:val="accent2"/>
-                  </w14:solidFill>
-                </w14:textFill>
-              </w:rPr>
-            </w:pPr>
-            <w:r>
-              <w:rPr>
-                <w:rFonts w:hint="eastAsia"/>
-                <w:color w:val="EA82F1"/>
-                <w:szCs w:val="24"/>
-              </w:rPr>
-              <w:t>网络模型</w:t>
-            </w:r>
-          </w:p>
-        </w:tc>
-      </w:tr>
-    </w:tbl>
-    <w:p>
-      <w:pPr>
-        <w:rPr>
-          <w:color w:val="70AD47" w:themeColor="accent6"/>
-          <w14:textFill>
-            <w14:solidFill>
-              <w14:schemeClr w14:val="accent6"/>
-            </w14:solidFill>
-          </w14:textFill>
-        </w:rPr>
-      </w:pPr>
-    </w:p>
-    <w:p>
-      <w:pPr>
-        <w:rPr>
-          <w:color w:val="70AD47" w:themeColor="accent6"/>
-          <w14:textFill>
-            <w14:solidFill>
-              <w14:schemeClr w14:val="accent6"/>
-            </w14:solidFill>
-          </w14:textFill>
-        </w:rPr>
-      </w:pPr>
-    </w:p>
-    <w:p>
-      <w:pPr>
-        <w:outlineLvl w:val="2"/>
-        <w:rPr>
-          <w:color w:val="70AD47" w:themeColor="accent6"/>
-          <w14:textFill>
-            <w14:solidFill>
-              <w14:schemeClr w14:val="accent6"/>
-            </w14:solidFill>
-          </w14:textFill>
-        </w:rPr>
-      </w:pPr>
-      <w:bookmarkStart w:id="22" w:name="_Toc25722"/>
-      <w:r>
-        <w:rPr>
-          <w:rFonts w:hint="eastAsia"/>
-          <w:color w:val="0070C0"/>
-        </w:rPr>
-        <w:t>通用utils：</w:t>
-      </w:r>
-      <w:bookmarkEnd w:id="22"/>
-    </w:p>
-    <w:tbl>
-      <w:tblPr>
-        <w:tblStyle w:val="12"/>
-        <w:tblW w:w="0" w:type="auto"/>
-        <w:tblInd w:w="0" w:type="dxa"/>
-        <w:tblBorders>
-          <w:top w:val="single" w:color="auto" w:sz="4" w:space="0"/>
-          <w:left w:val="single" w:color="auto" w:sz="4" w:space="0"/>
-          <w:bottom w:val="single" w:color="auto" w:sz="4" w:space="0"/>
-          <w:right w:val="single" w:color="auto" w:sz="4" w:space="0"/>
-          <w:insideH w:val="single" w:color="auto" w:sz="4" w:space="0"/>
-          <w:insideV w:val="single" w:color="auto" w:sz="4" w:space="0"/>
-        </w:tblBorders>
-        <w:tblLayout w:type="autofit"/>
-        <w:tblCellMar>
-          <w:top w:w="0" w:type="dxa"/>
-          <w:left w:w="108" w:type="dxa"/>
-          <w:bottom w:w="0" w:type="dxa"/>
-          <w:right w:w="108" w:type="dxa"/>
-        </w:tblCellMar>
-      </w:tblPr>
-      <w:tblGrid>
-        <w:gridCol w:w="5559"/>
-        <w:gridCol w:w="1898"/>
-      </w:tblGrid>
-      <w:tr>
-        <w:tblPrEx>
-          <w:tblBorders>
-            <w:top w:val="single" w:color="auto" w:sz="4" w:space="0"/>
-            <w:left w:val="single" w:color="auto" w:sz="4" w:space="0"/>
-            <w:bottom w:val="single" w:color="auto" w:sz="4" w:space="0"/>
-            <w:right w:val="single" w:color="auto" w:sz="4" w:space="0"/>
-            <w:insideH w:val="single" w:color="auto" w:sz="4" w:space="0"/>
-            <w:insideV w:val="single" w:color="auto" w:sz="4" w:space="0"/>
-          </w:tblBorders>
-          <w:tblCellMar>
-            <w:top w:w="0" w:type="dxa"/>
-            <w:left w:w="108" w:type="dxa"/>
-            <w:bottom w:w="0" w:type="dxa"/>
-            <w:right w:w="108" w:type="dxa"/>
-          </w:tblCellMar>
-        </w:tblPrEx>
-        <w:trPr>
-          <w:trHeight w:val="302" w:hRule="atLeast"/>
-        </w:trPr>
-        <w:tc>
-          <w:tcPr>
-            <w:tcW w:w="0" w:type="auto"/>
-            <w:gridSpan w:val="2"/>
-            <w:vAlign w:val="center"/>
-          </w:tcPr>
-          <w:p>
-            <w:pPr>
-              <w:rPr>
-                <w:color w:val="ED7D31" w:themeColor="accent2"/>
-                <w14:textFill>
-                  <w14:solidFill>
-                    <w14:schemeClr w14:val="accent2"/>
-                  </w14:solidFill>
-                </w14:textFill>
-              </w:rPr>
-            </w:pPr>
-            <w:r>
-              <w:rPr>
-                <w:rFonts w:hint="eastAsia"/>
-                <w:color w:val="ED7D31" w:themeColor="accent2"/>
-                <w14:textFill>
-                  <w14:solidFill>
-                    <w14:schemeClr w14:val="accent2"/>
-                  </w14:solidFill>
-                </w14:textFill>
-              </w:rPr>
-              <w:t>目标model_targets：</w:t>
-            </w:r>
-          </w:p>
-        </w:tc>
-      </w:tr>
-      <w:tr>
-        <w:tblPrEx>
-          <w:tblBorders>
-            <w:top w:val="single" w:color="auto" w:sz="4" w:space="0"/>
-            <w:left w:val="single" w:color="auto" w:sz="4" w:space="0"/>
-            <w:bottom w:val="single" w:color="auto" w:sz="4" w:space="0"/>
-            <w:right w:val="single" w:color="auto" w:sz="4" w:space="0"/>
-            <w:insideH w:val="single" w:color="auto" w:sz="4" w:space="0"/>
-            <w:insideV w:val="single" w:color="auto" w:sz="4" w:space="0"/>
-          </w:tblBorders>
-          <w:tblCellMar>
-            <w:top w:w="0" w:type="dxa"/>
-            <w:left w:w="108" w:type="dxa"/>
-            <w:bottom w:w="0" w:type="dxa"/>
-            <w:right w:w="108" w:type="dxa"/>
-          </w:tblCellMar>
-        </w:tblPrEx>
-        <w:trPr>
-          <w:trHeight w:val="302" w:hRule="atLeast"/>
-        </w:trPr>
-        <w:tc>
-          <w:tcPr>
-            <w:tcW w:w="0" w:type="auto"/>
-            <w:vAlign w:val="center"/>
-          </w:tcPr>
-          <w:p>
-            <w:pPr>
-              <w:rPr>
-                <w:color w:val="FF0000"/>
-                <w:spacing w:val="7"/>
-              </w:rPr>
-            </w:pPr>
-            <w:r>
-              <w:rPr>
-                <w:rFonts w:hint="eastAsia"/>
-                <w:color w:val="FF0000"/>
-                <w:spacing w:val="7"/>
-              </w:rPr>
-              <w:t>ClassifierOutputTarget(category).__call__(output)</w:t>
-            </w:r>
-          </w:p>
-        </w:tc>
-        <w:tc>
-          <w:tcPr>
-            <w:tcW w:w="0" w:type="auto"/>
-            <w:vAlign w:val="center"/>
-          </w:tcPr>
-          <w:p>
-            <w:pPr>
-              <w:rPr>
-                <w:color w:val="ED7D31" w:themeColor="accent2"/>
-                <w14:textFill>
-                  <w14:solidFill>
-                    <w14:schemeClr w14:val="accent2"/>
-                  </w14:solidFill>
-                </w14:textFill>
-              </w:rPr>
-            </w:pPr>
-            <w:r>
-              <w:rPr>
-                <w:rFonts w:hint="eastAsia"/>
-                <w:color w:val="ED7D31" w:themeColor="accent2"/>
-                <w14:textFill>
-                  <w14:solidFill>
-                    <w14:schemeClr w14:val="accent2"/>
-                  </w14:solidFill>
-                </w14:textFill>
-              </w:rPr>
-              <w:t>返回</w:t>
-            </w:r>
-            <w:r>
-              <w:rPr>
-                <w:rFonts w:hint="eastAsia"/>
-                <w:color w:val="EA82F1"/>
-                <w:szCs w:val="24"/>
-              </w:rPr>
-              <w:t>对应类别得分</w:t>
             </w:r>
           </w:p>
         </w:tc>
@@ -18984,7 +18520,7 @@
           <w:color w:val="00B0F0"/>
         </w:rPr>
       </w:pPr>
-      <w:bookmarkStart w:id="23" w:name="_Toc7210"/>
+      <w:bookmarkStart w:id="21" w:name="_Toc7210"/>
       <w:r>
         <w:rPr>
           <w:rFonts w:hint="eastAsia"/>
@@ -18992,7 +18528,7 @@
         </w:rPr>
         <w:t>网络nn：</w:t>
       </w:r>
-      <w:bookmarkEnd w:id="23"/>
+      <w:bookmarkEnd w:id="21"/>
     </w:p>
     <w:tbl>
       <w:tblPr>
@@ -21947,7 +21483,7 @@
       <w:tblGrid>
         <w:gridCol w:w="3746"/>
         <w:gridCol w:w="3196"/>
-        <w:gridCol w:w="2315"/>
+        <w:gridCol w:w="2712"/>
       </w:tblGrid>
       <w:tr>
         <w:tblPrEx>
@@ -23578,7 +23114,7 @@
       </w:tblPr>
       <w:tblGrid>
         <w:gridCol w:w="5125"/>
-        <w:gridCol w:w="4402"/>
+        <w:gridCol w:w="4537"/>
       </w:tblGrid>
       <w:tr>
         <w:tblPrEx>
@@ -24927,7 +24463,7 @@
           <w:color w:val="00B0F0"/>
         </w:rPr>
       </w:pPr>
-      <w:bookmarkStart w:id="24" w:name="_Toc4405"/>
+      <w:bookmarkStart w:id="22" w:name="_Toc4405"/>
       <w:r>
         <w:rPr>
           <w:rFonts w:hint="eastAsia"/>
@@ -24935,7 +24471,7 @@
         </w:rPr>
         <w:t>函数functional：</w:t>
       </w:r>
-      <w:bookmarkEnd w:id="24"/>
+      <w:bookmarkEnd w:id="22"/>
     </w:p>
     <w:p>
       <w:pPr>
@@ -25142,12 +24678,6 @@
             <w:insideH w:val="single" w:color="auto" w:sz="4" w:space="0"/>
             <w:insideV w:val="single" w:color="auto" w:sz="4" w:space="0"/>
           </w:tblBorders>
-          <w:tblCellMar>
-            <w:top w:w="0" w:type="dxa"/>
-            <w:left w:w="108" w:type="dxa"/>
-            <w:bottom w:w="0" w:type="dxa"/>
-            <w:right w:w="108" w:type="dxa"/>
-          </w:tblCellMar>
         </w:tblPrEx>
         <w:tc>
           <w:tcPr>
@@ -26587,12 +26117,6 @@
             <w:insideH w:val="single" w:color="auto" w:sz="4" w:space="0"/>
             <w:insideV w:val="single" w:color="auto" w:sz="4" w:space="0"/>
           </w:tblBorders>
-          <w:tblCellMar>
-            <w:top w:w="0" w:type="dxa"/>
-            <w:left w:w="108" w:type="dxa"/>
-            <w:bottom w:w="0" w:type="dxa"/>
-            <w:right w:w="108" w:type="dxa"/>
-          </w:tblCellMar>
         </w:tblPrEx>
         <w:tc>
           <w:tcPr>
@@ -27723,12 +27247,6 @@
             <w:insideH w:val="single" w:color="auto" w:sz="4" w:space="0"/>
             <w:insideV w:val="single" w:color="auto" w:sz="4" w:space="0"/>
           </w:tblBorders>
-          <w:tblCellMar>
-            <w:top w:w="0" w:type="dxa"/>
-            <w:left w:w="108" w:type="dxa"/>
-            <w:bottom w:w="0" w:type="dxa"/>
-            <w:right w:w="108" w:type="dxa"/>
-          </w:tblCellMar>
         </w:tblPrEx>
         <w:tc>
           <w:tcPr>
@@ -28683,12 +28201,6 @@
             <w:insideH w:val="single" w:color="auto" w:sz="4" w:space="0"/>
             <w:insideV w:val="single" w:color="auto" w:sz="4" w:space="0"/>
           </w:tblBorders>
-          <w:tblCellMar>
-            <w:top w:w="0" w:type="dxa"/>
-            <w:left w:w="108" w:type="dxa"/>
-            <w:bottom w:w="0" w:type="dxa"/>
-            <w:right w:w="108" w:type="dxa"/>
-          </w:tblCellMar>
         </w:tblPrEx>
         <w:tc>
           <w:tcPr>
@@ -30857,7 +30369,7 @@
           <w:color w:val="00B0F0"/>
         </w:rPr>
       </w:pPr>
-      <w:bookmarkStart w:id="25" w:name="_Toc31278"/>
+      <w:bookmarkStart w:id="23" w:name="_Toc31278"/>
       <w:r>
         <w:rPr>
           <w:rFonts w:hint="eastAsia"/>
@@ -30865,7 +30377,7 @@
         </w:rPr>
         <w:t>初始化init：</w:t>
       </w:r>
-      <w:bookmarkEnd w:id="25"/>
+      <w:bookmarkEnd w:id="23"/>
     </w:p>
     <w:tbl>
       <w:tblPr>
@@ -31094,7 +30606,7 @@
           <w:color w:val="00B0F0"/>
         </w:rPr>
       </w:pPr>
-      <w:bookmarkStart w:id="26" w:name="_Toc20900"/>
+      <w:bookmarkStart w:id="24" w:name="_Toc20900"/>
       <w:r>
         <w:rPr>
           <w:rFonts w:hint="eastAsia"/>
@@ -31115,7 +30627,7 @@
         </w:rPr>
         <w:t>：</w:t>
       </w:r>
-      <w:bookmarkEnd w:id="26"/>
+      <w:bookmarkEnd w:id="24"/>
     </w:p>
     <w:tbl>
       <w:tblPr>
@@ -31298,12 +30810,6 @@
             <w:insideH w:val="single" w:color="auto" w:sz="4" w:space="0"/>
             <w:insideV w:val="single" w:color="auto" w:sz="4" w:space="0"/>
           </w:tblBorders>
-          <w:tblCellMar>
-            <w:top w:w="0" w:type="dxa"/>
-            <w:left w:w="108" w:type="dxa"/>
-            <w:bottom w:w="0" w:type="dxa"/>
-            <w:right w:w="108" w:type="dxa"/>
-          </w:tblCellMar>
         </w:tblPrEx>
         <w:tc>
           <w:tcPr>
@@ -31396,7 +30902,7 @@
           </w14:textFill>
         </w:rPr>
       </w:pPr>
-      <w:bookmarkStart w:id="27" w:name="_Toc5139"/>
+      <w:bookmarkStart w:id="25" w:name="_Toc5139"/>
       <w:r>
         <w:rPr>
           <w:rFonts w:hint="eastAsia"/>
@@ -31404,7 +30910,7 @@
         </w:rPr>
         <w:t>优化optim：</w:t>
       </w:r>
-      <w:bookmarkEnd w:id="27"/>
+      <w:bookmarkEnd w:id="25"/>
     </w:p>
     <w:tbl>
       <w:tblPr>
@@ -32410,7 +31916,7 @@
           <w:color w:val="0070C0"/>
         </w:rPr>
       </w:pPr>
-      <w:bookmarkStart w:id="28" w:name="_Toc12928"/>
+      <w:bookmarkStart w:id="26" w:name="_Toc12928"/>
       <w:r>
         <w:rPr>
           <w:rFonts w:hint="eastAsia"/>
@@ -32426,7 +31932,7 @@
         </w:rPr>
         <w:t>lr_scheduler：</w:t>
       </w:r>
-      <w:bookmarkEnd w:id="28"/>
+      <w:bookmarkEnd w:id="26"/>
     </w:p>
     <w:tbl>
       <w:tblPr>
@@ -33113,7 +32619,7 @@
           <w:color w:val="00B0F0"/>
         </w:rPr>
       </w:pPr>
-      <w:bookmarkStart w:id="29" w:name="_Toc9596"/>
+      <w:bookmarkStart w:id="27" w:name="_Toc9596"/>
       <w:r>
         <w:rPr>
           <w:rFonts w:hint="eastAsia"/>
@@ -33121,7 +32627,7 @@
         </w:rPr>
         <w:t>通用utils：</w:t>
       </w:r>
-      <w:bookmarkEnd w:id="29"/>
+      <w:bookmarkEnd w:id="27"/>
     </w:p>
     <w:p>
       <w:pPr>
@@ -33137,7 +32643,7 @@
           <w:color w:val="0070C0"/>
         </w:rPr>
       </w:pPr>
-      <w:bookmarkStart w:id="30" w:name="_Toc9066"/>
+      <w:bookmarkStart w:id="28" w:name="_Toc9066"/>
       <w:r>
         <w:rPr>
           <w:rFonts w:hint="eastAsia"/>
@@ -33145,7 +32651,7 @@
         </w:rPr>
         <w:t>关卡checkpoint：</w:t>
       </w:r>
-      <w:bookmarkEnd w:id="30"/>
+      <w:bookmarkEnd w:id="28"/>
     </w:p>
     <w:tbl>
       <w:tblPr>
@@ -33281,7 +32787,7 @@
           <w:color w:val="0070C0"/>
         </w:rPr>
       </w:pPr>
-      <w:bookmarkStart w:id="31" w:name="_Toc8170"/>
+      <w:bookmarkStart w:id="29" w:name="_Toc8170"/>
       <w:r>
         <w:rPr>
           <w:rFonts w:hint="eastAsia"/>
@@ -33289,7 +32795,7 @@
         </w:rPr>
         <w:t>数据data：</w:t>
       </w:r>
-      <w:bookmarkEnd w:id="31"/>
+      <w:bookmarkEnd w:id="29"/>
     </w:p>
     <w:tbl>
       <w:tblPr>
@@ -33313,8 +32819,8 @@
         </w:tblCellMar>
       </w:tblPr>
       <w:tblGrid>
-        <w:gridCol w:w="1134"/>
-        <w:gridCol w:w="4991"/>
+        <w:gridCol w:w="2720"/>
+        <w:gridCol w:w="4015"/>
       </w:tblGrid>
       <w:tr>
         <w:tblPrEx>
@@ -33333,22 +32839,25 @@
             <w:right w:w="108" w:type="dxa"/>
           </w:tblCellMar>
         </w:tblPrEx>
-        <w:tc>
-          <w:tcPr>
-            <w:tcW w:w="0" w:type="auto"/>
-          </w:tcPr>
-          <w:p>
-            <w:pPr>
-              <w:rPr>
-                <w:color w:val="FF0000"/>
-              </w:rPr>
-            </w:pPr>
-            <w:r>
-              <w:rPr>
-                <w:rFonts w:hint="eastAsia"/>
-                <w:color w:val="FF0000"/>
-              </w:rPr>
-              <w:t>Dataset()</w:t>
+        <w:trPr>
+          <w:trHeight w:val="162" w:hRule="atLeast"/>
+        </w:trPr>
+        <w:tc>
+          <w:tcPr>
+            <w:tcW w:w="0" w:type="auto"/>
+          </w:tcPr>
+          <w:p>
+            <w:pPr>
+              <w:rPr>
+                <w:color w:val="FF0000"/>
+              </w:rPr>
+            </w:pPr>
+            <w:r>
+              <w:rPr>
+                <w:rFonts w:hint="eastAsia"/>
+                <w:color w:val="FF0000"/>
+              </w:rPr>
+              <w:t>Dataset</w:t>
             </w:r>
           </w:p>
         </w:tc>
@@ -33405,7 +32914,248 @@
                   </w14:solidFill>
                 </w14:textFill>
               </w:rPr>
-              <w:t>__init__、__getitem__、__len__</w:t>
+              <w:t>__getitem__、__len__</w:t>
+            </w:r>
+          </w:p>
+        </w:tc>
+      </w:tr>
+      <w:tr>
+        <w:tblPrEx>
+          <w:tblBorders>
+            <w:top w:val="single" w:color="auto" w:sz="4" w:space="0"/>
+            <w:left w:val="single" w:color="auto" w:sz="4" w:space="0"/>
+            <w:bottom w:val="single" w:color="auto" w:sz="4" w:space="0"/>
+            <w:right w:val="single" w:color="auto" w:sz="4" w:space="0"/>
+            <w:insideH w:val="single" w:color="auto" w:sz="4" w:space="0"/>
+            <w:insideV w:val="single" w:color="auto" w:sz="4" w:space="0"/>
+          </w:tblBorders>
+          <w:tblCellMar>
+            <w:top w:w="0" w:type="dxa"/>
+            <w:left w:w="108" w:type="dxa"/>
+            <w:bottom w:w="0" w:type="dxa"/>
+            <w:right w:w="108" w:type="dxa"/>
+          </w:tblCellMar>
+        </w:tblPrEx>
+        <w:tc>
+          <w:tcPr>
+            <w:tcW w:w="0" w:type="auto"/>
+          </w:tcPr>
+          <w:p>
+            <w:pPr>
+              <w:rPr>
+                <w:rFonts w:hint="default" w:eastAsia="华文中宋"/>
+                <w:color w:val="FF0000"/>
+                <w:lang w:val="en-US" w:eastAsia="zh-CN"/>
+              </w:rPr>
+            </w:pPr>
+            <w:r>
+              <w:rPr>
+                <w:rFonts w:hint="eastAsia"/>
+                <w:color w:val="FF0000"/>
+                <w:lang w:val="en-US" w:eastAsia="zh-CN"/>
+              </w:rPr>
+              <w:t>TensorDataset(*tensors)</w:t>
+            </w:r>
+          </w:p>
+        </w:tc>
+        <w:tc>
+          <w:tcPr>
+            <w:tcW w:w="0" w:type="auto"/>
+          </w:tcPr>
+          <w:p>
+            <w:pPr>
+              <w:rPr>
+                <w:rFonts w:hint="eastAsia" w:eastAsia="华文中宋"/>
+                <w:color w:val="EA82F1"/>
+                <w:szCs w:val="24"/>
+                <w:lang w:eastAsia="zh-CN"/>
+              </w:rPr>
+            </w:pPr>
+            <w:r>
+              <w:rPr>
+                <w:rFonts w:hint="eastAsia"/>
+                <w:color w:val="EA82F1"/>
+                <w:szCs w:val="24"/>
+                <w:lang w:eastAsia="zh-CN"/>
+              </w:rPr>
+              <w:t>张量</w:t>
+            </w:r>
+            <w:r>
+              <w:rPr>
+                <w:rFonts w:hint="eastAsia"/>
+                <w:color w:val="ED7D31" w:themeColor="accent2"/>
+                <w:lang w:eastAsia="zh-CN"/>
+                <w14:textFill>
+                  <w14:solidFill>
+                    <w14:schemeClr w14:val="accent2"/>
+                  </w14:solidFill>
+                </w14:textFill>
+              </w:rPr>
+              <w:t>数据集</w:t>
+            </w:r>
+          </w:p>
+        </w:tc>
+      </w:tr>
+      <w:tr>
+        <w:tblPrEx>
+          <w:tblBorders>
+            <w:top w:val="single" w:color="auto" w:sz="4" w:space="0"/>
+            <w:left w:val="single" w:color="auto" w:sz="4" w:space="0"/>
+            <w:bottom w:val="single" w:color="auto" w:sz="4" w:space="0"/>
+            <w:right w:val="single" w:color="auto" w:sz="4" w:space="0"/>
+            <w:insideH w:val="single" w:color="auto" w:sz="4" w:space="0"/>
+            <w:insideV w:val="single" w:color="auto" w:sz="4" w:space="0"/>
+          </w:tblBorders>
+          <w:tblCellMar>
+            <w:top w:w="0" w:type="dxa"/>
+            <w:left w:w="108" w:type="dxa"/>
+            <w:bottom w:w="0" w:type="dxa"/>
+            <w:right w:w="108" w:type="dxa"/>
+          </w:tblCellMar>
+        </w:tblPrEx>
+        <w:tc>
+          <w:tcPr>
+            <w:tcW w:w="0" w:type="auto"/>
+          </w:tcPr>
+          <w:p>
+            <w:pPr>
+              <w:rPr>
+                <w:rFonts w:hint="default"/>
+                <w:color w:val="FF0000"/>
+                <w:lang w:val="en-US" w:eastAsia="zh-CN"/>
+              </w:rPr>
+            </w:pPr>
+            <w:r>
+              <w:rPr>
+                <w:rFonts w:hint="eastAsia"/>
+                <w:color w:val="FF0000"/>
+                <w:lang w:val="en-US" w:eastAsia="zh-CN"/>
+              </w:rPr>
+              <w:t>ConcatDataset(datasets</w:t>
+            </w:r>
+            <w:bookmarkStart w:id="44" w:name="_GoBack"/>
+            <w:bookmarkEnd w:id="44"/>
+            <w:r>
+              <w:rPr>
+                <w:rFonts w:hint="eastAsia"/>
+                <w:color w:val="FF0000"/>
+                <w:lang w:val="en-US" w:eastAsia="zh-CN"/>
+              </w:rPr>
+              <w:t>)</w:t>
+            </w:r>
+          </w:p>
+        </w:tc>
+        <w:tc>
+          <w:tcPr>
+            <w:tcW w:w="0" w:type="auto"/>
+          </w:tcPr>
+          <w:p>
+            <w:pPr>
+              <w:rPr>
+                <w:rFonts w:hint="eastAsia"/>
+                <w:color w:val="EA82F1"/>
+                <w:szCs w:val="24"/>
+                <w:lang w:eastAsia="zh-CN"/>
+              </w:rPr>
+            </w:pPr>
+            <w:r>
+              <w:rPr>
+                <w:rFonts w:hint="eastAsia"/>
+                <w:color w:val="EA82F1"/>
+                <w:szCs w:val="24"/>
+                <w:lang w:eastAsia="zh-CN"/>
+              </w:rPr>
+              <w:t>拼接</w:t>
+            </w:r>
+            <w:r>
+              <w:rPr>
+                <w:rFonts w:hint="eastAsia"/>
+                <w:color w:val="ED7D31" w:themeColor="accent2"/>
+                <w:lang w:eastAsia="zh-CN"/>
+                <w14:textFill>
+                  <w14:solidFill>
+                    <w14:schemeClr w14:val="accent2"/>
+                  </w14:solidFill>
+                </w14:textFill>
+              </w:rPr>
+              <w:t>数据集</w:t>
+            </w:r>
+          </w:p>
+        </w:tc>
+      </w:tr>
+      <w:tr>
+        <w:tblPrEx>
+          <w:tblBorders>
+            <w:top w:val="single" w:color="auto" w:sz="4" w:space="0"/>
+            <w:left w:val="single" w:color="auto" w:sz="4" w:space="0"/>
+            <w:bottom w:val="single" w:color="auto" w:sz="4" w:space="0"/>
+            <w:right w:val="single" w:color="auto" w:sz="4" w:space="0"/>
+            <w:insideH w:val="single" w:color="auto" w:sz="4" w:space="0"/>
+            <w:insideV w:val="single" w:color="auto" w:sz="4" w:space="0"/>
+          </w:tblBorders>
+          <w:tblCellMar>
+            <w:top w:w="0" w:type="dxa"/>
+            <w:left w:w="108" w:type="dxa"/>
+            <w:bottom w:w="0" w:type="dxa"/>
+            <w:right w:w="108" w:type="dxa"/>
+          </w:tblCellMar>
+        </w:tblPrEx>
+        <w:tc>
+          <w:tcPr>
+            <w:tcW w:w="0" w:type="auto"/>
+          </w:tcPr>
+          <w:p>
+            <w:pPr>
+              <w:rPr>
+                <w:rFonts w:hint="default"/>
+                <w:color w:val="FF0000"/>
+                <w:lang w:val="en-US" w:eastAsia="zh-CN"/>
+              </w:rPr>
+            </w:pPr>
+            <w:r>
+              <w:rPr>
+                <w:rFonts w:hint="eastAsia"/>
+                <w:color w:val="FF0000"/>
+                <w:lang w:val="en-US" w:eastAsia="zh-CN"/>
+              </w:rPr>
+              <w:t>Subset(dataset, indices)</w:t>
+            </w:r>
+          </w:p>
+        </w:tc>
+        <w:tc>
+          <w:tcPr>
+            <w:tcW w:w="0" w:type="auto"/>
+          </w:tcPr>
+          <w:p>
+            <w:pPr>
+              <w:rPr>
+                <w:rFonts w:hint="eastAsia"/>
+                <w:color w:val="EA82F1"/>
+                <w:szCs w:val="24"/>
+                <w:lang w:eastAsia="zh-CN"/>
+              </w:rPr>
+            </w:pPr>
+            <w:r>
+              <w:rPr>
+                <w:rFonts w:hint="eastAsia"/>
+                <w:color w:val="ED7D31" w:themeColor="accent2"/>
+                <w:lang w:eastAsia="zh-CN"/>
+                <w14:textFill>
+                  <w14:solidFill>
+                    <w14:schemeClr w14:val="accent2"/>
+                  </w14:solidFill>
+                </w14:textFill>
+              </w:rPr>
+              <w:t>数据集</w:t>
+            </w:r>
+            <w:r>
+              <w:rPr>
+                <w:rFonts w:hint="eastAsia"/>
+                <w:color w:val="EA82F1"/>
+                <w:szCs w:val="24"/>
+                <w:lang w:eastAsia="zh-CN"/>
+              </w:rPr>
+              <w:t>子集</w:t>
             </w:r>
           </w:p>
         </w:tc>
@@ -33873,7 +33623,7 @@
           <w:color w:val="0070C0"/>
         </w:rPr>
       </w:pPr>
-      <w:bookmarkStart w:id="32" w:name="_Toc5821"/>
+      <w:bookmarkStart w:id="30" w:name="_Toc5821"/>
       <w:r>
         <w:rPr>
           <w:rFonts w:hint="eastAsia"/>
@@ -33881,7 +33631,7 @@
         </w:rPr>
         <w:t>张量板tensorboard：</w:t>
       </w:r>
-      <w:bookmarkEnd w:id="32"/>
+      <w:bookmarkEnd w:id="30"/>
     </w:p>
     <w:tbl>
       <w:tblPr>
@@ -34290,7 +34040,7 @@
           <w:color w:val="00B0F0"/>
         </w:rPr>
       </w:pPr>
-      <w:bookmarkStart w:id="33" w:name="_Toc16320"/>
+      <w:bookmarkStart w:id="31" w:name="_Toc16320"/>
       <w:r>
         <w:rPr>
           <w:rFonts w:hint="eastAsia"/>
@@ -34298,7 +34048,7 @@
         </w:rPr>
         <w:t>视觉torchvision：</w:t>
       </w:r>
-      <w:bookmarkEnd w:id="33"/>
+      <w:bookmarkEnd w:id="31"/>
     </w:p>
     <w:p>
       <w:pPr>
@@ -34307,7 +34057,7 @@
           <w:color w:val="0070C0"/>
         </w:rPr>
       </w:pPr>
-      <w:bookmarkStart w:id="34" w:name="_Toc25847"/>
+      <w:bookmarkStart w:id="32" w:name="_Toc25847"/>
       <w:r>
         <w:rPr>
           <w:rFonts w:hint="eastAsia"/>
@@ -34315,7 +34065,7 @@
         </w:rPr>
         <w:t>模型models：</w:t>
       </w:r>
-      <w:bookmarkEnd w:id="34"/>
+      <w:bookmarkEnd w:id="32"/>
     </w:p>
     <w:p>
       <w:pPr>
@@ -34362,7 +34112,7 @@
           <w:color w:val="0070C0"/>
         </w:rPr>
       </w:pPr>
-      <w:bookmarkStart w:id="35" w:name="_Toc31360"/>
+      <w:bookmarkStart w:id="33" w:name="_Toc31360"/>
       <w:r>
         <w:rPr>
           <w:rFonts w:hint="eastAsia"/>
@@ -34370,7 +34120,7 @@
         </w:rPr>
         <w:t>数据集datasets：</w:t>
       </w:r>
-      <w:bookmarkEnd w:id="35"/>
+      <w:bookmarkEnd w:id="33"/>
     </w:p>
     <w:tbl>
       <w:tblPr>
@@ -34916,12 +34666,6 @@
             <w:insideH w:val="single" w:color="auto" w:sz="4" w:space="0"/>
             <w:insideV w:val="single" w:color="auto" w:sz="4" w:space="0"/>
           </w:tblBorders>
-          <w:tblCellMar>
-            <w:top w:w="0" w:type="dxa"/>
-            <w:left w:w="108" w:type="dxa"/>
-            <w:bottom w:w="0" w:type="dxa"/>
-            <w:right w:w="108" w:type="dxa"/>
-          </w:tblCellMar>
         </w:tblPrEx>
         <w:tc>
           <w:tcPr>
@@ -35043,7 +34787,7 @@
           <w:color w:val="0070C0"/>
         </w:rPr>
       </w:pPr>
-      <w:bookmarkStart w:id="36" w:name="_Toc14476"/>
+      <w:bookmarkStart w:id="34" w:name="_Toc14476"/>
       <w:r>
         <w:rPr>
           <w:rFonts w:hint="eastAsia"/>
@@ -35051,7 +34795,7 @@
         </w:rPr>
         <w:t>运算ops：</w:t>
       </w:r>
-      <w:bookmarkEnd w:id="36"/>
+      <w:bookmarkEnd w:id="34"/>
     </w:p>
     <w:tbl>
       <w:tblPr>
@@ -35088,6 +34832,12 @@
             <w:insideH w:val="single" w:color="auto" w:sz="4" w:space="0"/>
             <w:insideV w:val="single" w:color="auto" w:sz="4" w:space="0"/>
           </w:tblBorders>
+          <w:tblCellMar>
+            <w:top w:w="0" w:type="dxa"/>
+            <w:left w:w="108" w:type="dxa"/>
+            <w:bottom w:w="0" w:type="dxa"/>
+            <w:right w:w="108" w:type="dxa"/>
+          </w:tblCellMar>
         </w:tblPrEx>
         <w:tc>
           <w:tcPr>
@@ -35322,7 +35072,7 @@
           <w:color w:val="0070C0"/>
         </w:rPr>
       </w:pPr>
-      <w:bookmarkStart w:id="37" w:name="_Toc6116"/>
+      <w:bookmarkStart w:id="35" w:name="_Toc6116"/>
       <w:r>
         <w:rPr>
           <w:rFonts w:hint="eastAsia"/>
@@ -35330,7 +35080,7 @@
         </w:rPr>
         <w:t>转换transforms：</w:t>
       </w:r>
-      <w:bookmarkEnd w:id="37"/>
+      <w:bookmarkEnd w:id="35"/>
     </w:p>
     <w:tbl>
       <w:tblPr>
@@ -36428,7 +36178,7 @@
           <w:lang w:val="en-US" w:eastAsia="zh-CN"/>
         </w:rPr>
       </w:pPr>
-      <w:bookmarkStart w:id="38" w:name="_Toc11543"/>
+      <w:bookmarkStart w:id="36" w:name="_Toc11543"/>
       <w:r>
         <w:rPr>
           <w:rFonts w:hint="eastAsia"/>
@@ -36437,7 +36187,7 @@
         </w:rPr>
         <w:t>拓展：</w:t>
       </w:r>
-      <w:bookmarkEnd w:id="38"/>
+      <w:bookmarkEnd w:id="36"/>
     </w:p>
     <w:p>
       <w:pPr>
@@ -36447,7 +36197,7 @@
           <w:color w:val="0070C0"/>
         </w:rPr>
       </w:pPr>
-      <w:bookmarkStart w:id="39" w:name="_Toc5308"/>
+      <w:bookmarkStart w:id="37" w:name="_Toc5308"/>
     </w:p>
     <w:p>
       <w:pPr>
@@ -38149,7 +37899,6 @@
           <w:tcPr>
             <w:tcW w:w="0" w:type="auto"/>
             <w:vMerge w:val="continue"/>
-            <w:tcBorders/>
             <w:vAlign w:val="center"/>
           </w:tcPr>
           <w:p>
@@ -38258,18 +38007,11 @@
             <w:insideH w:val="single" w:color="auto" w:sz="4" w:space="0"/>
             <w:insideV w:val="single" w:color="auto" w:sz="4" w:space="0"/>
           </w:tblBorders>
-          <w:tblCellMar>
-            <w:top w:w="0" w:type="dxa"/>
-            <w:left w:w="108" w:type="dxa"/>
-            <w:bottom w:w="0" w:type="dxa"/>
-            <w:right w:w="108" w:type="dxa"/>
-          </w:tblCellMar>
         </w:tblPrEx>
         <w:tc>
           <w:tcPr>
             <w:tcW w:w="0" w:type="auto"/>
             <w:vMerge w:val="continue"/>
-            <w:tcBorders/>
             <w:vAlign w:val="center"/>
           </w:tcPr>
           <w:p>
@@ -38381,6 +38123,495 @@
         <w:rPr>
           <w:rFonts w:hint="eastAsia"/>
           <w:color w:val="0070C0"/>
+        </w:rPr>
+      </w:pPr>
+    </w:p>
+    <w:p>
+      <w:pPr>
+        <w:outlineLvl w:val="2"/>
+        <w:rPr>
+          <w:rFonts w:hint="eastAsia" w:ascii="华文中宋" w:hAnsi="华文中宋" w:eastAsia="华文中宋" w:cs="华文中宋"/>
+          <w:b/>
+          <w:bCs/>
+          <w:color w:val="0070C0"/>
+          <w:spacing w:val="7"/>
+          <w:kern w:val="2"/>
+          <w:sz w:val="21"/>
+          <w:szCs w:val="21"/>
+          <w:lang w:val="en-US" w:eastAsia="zh-CN" w:bidi="ar-SA"/>
+        </w:rPr>
+      </w:pPr>
+      <w:bookmarkStart w:id="38" w:name="_Toc6664"/>
+      <w:r>
+        <w:rPr>
+          <w:rFonts w:hint="eastAsia" w:ascii="华文中宋" w:hAnsi="华文中宋" w:eastAsia="华文中宋" w:cs="华文中宋"/>
+          <w:b/>
+          <w:bCs/>
+          <w:color w:val="0070C0"/>
+          <w:spacing w:val="7"/>
+          <w:kern w:val="2"/>
+          <w:sz w:val="21"/>
+          <w:szCs w:val="21"/>
+          <w:lang w:val="en-US" w:eastAsia="zh-CN" w:bidi="ar-SA"/>
+        </w:rPr>
+        <w:t>激活gradcam：</w:t>
+      </w:r>
+      <w:bookmarkEnd w:id="38"/>
+    </w:p>
+    <w:p>
+      <w:r>
+        <w:rPr>
+          <w:rFonts w:hint="eastAsia"/>
+          <w:color w:val="ED7D31" w:themeColor="accent2"/>
+          <w:spacing w:val="7"/>
+          <w:u w:val="single"/>
+          <w14:textFill>
+            <w14:solidFill>
+              <w14:schemeClr w14:val="accent2"/>
+            </w14:solidFill>
+          </w14:textFill>
+        </w:rPr>
+        <w:t>import pytorch_grad_cam as gradcam</w:t>
+      </w:r>
+    </w:p>
+    <w:tbl>
+      <w:tblPr>
+        <w:tblStyle w:val="12"/>
+        <w:tblW w:w="0" w:type="auto"/>
+        <w:tblInd w:w="0" w:type="dxa"/>
+        <w:tblBorders>
+          <w:top w:val="single" w:color="auto" w:sz="4" w:space="0"/>
+          <w:left w:val="single" w:color="auto" w:sz="4" w:space="0"/>
+          <w:bottom w:val="single" w:color="auto" w:sz="4" w:space="0"/>
+          <w:right w:val="single" w:color="auto" w:sz="4" w:space="0"/>
+          <w:insideH w:val="single" w:color="auto" w:sz="4" w:space="0"/>
+          <w:insideV w:val="single" w:color="auto" w:sz="4" w:space="0"/>
+        </w:tblBorders>
+        <w:tblLayout w:type="autofit"/>
+        <w:tblCellMar>
+          <w:top w:w="0" w:type="dxa"/>
+          <w:left w:w="108" w:type="dxa"/>
+          <w:bottom w:w="0" w:type="dxa"/>
+          <w:right w:w="108" w:type="dxa"/>
+        </w:tblCellMar>
+      </w:tblPr>
+      <w:tblGrid>
+        <w:gridCol w:w="2277"/>
+        <w:gridCol w:w="3129"/>
+        <w:gridCol w:w="2462"/>
+      </w:tblGrid>
+      <w:tr>
+        <w:tblPrEx>
+          <w:tblBorders>
+            <w:top w:val="single" w:color="auto" w:sz="4" w:space="0"/>
+            <w:left w:val="single" w:color="auto" w:sz="4" w:space="0"/>
+            <w:bottom w:val="single" w:color="auto" w:sz="4" w:space="0"/>
+            <w:right w:val="single" w:color="auto" w:sz="4" w:space="0"/>
+            <w:insideH w:val="single" w:color="auto" w:sz="4" w:space="0"/>
+            <w:insideV w:val="single" w:color="auto" w:sz="4" w:space="0"/>
+          </w:tblBorders>
+          <w:tblCellMar>
+            <w:top w:w="0" w:type="dxa"/>
+            <w:left w:w="108" w:type="dxa"/>
+            <w:bottom w:w="0" w:type="dxa"/>
+            <w:right w:w="108" w:type="dxa"/>
+          </w:tblCellMar>
+        </w:tblPrEx>
+        <w:trPr>
+          <w:trHeight w:val="302" w:hRule="atLeast"/>
+        </w:trPr>
+        <w:tc>
+          <w:tcPr>
+            <w:tcW w:w="0" w:type="auto"/>
+            <w:gridSpan w:val="2"/>
+            <w:vAlign w:val="center"/>
+          </w:tcPr>
+          <w:p>
+            <w:pPr>
+              <w:rPr>
+                <w:color w:val="FF0000"/>
+                <w:spacing w:val="7"/>
+              </w:rPr>
+            </w:pPr>
+            <w:r>
+              <w:rPr>
+                <w:rFonts w:hint="eastAsia"/>
+                <w:color w:val="FF0000"/>
+                <w:spacing w:val="7"/>
+              </w:rPr>
+              <w:t>EigenGradCAM(model, target_layers, use_cuda)</w:t>
+            </w:r>
+          </w:p>
+        </w:tc>
+        <w:tc>
+          <w:tcPr>
+            <w:tcW w:w="0" w:type="auto"/>
+            <w:vAlign w:val="center"/>
+          </w:tcPr>
+          <w:p>
+            <w:pPr>
+              <w:rPr>
+                <w:color w:val="ED7D31" w:themeColor="accent2"/>
+                <w14:textFill>
+                  <w14:solidFill>
+                    <w14:schemeClr w14:val="accent2"/>
+                  </w14:solidFill>
+                </w14:textFill>
+              </w:rPr>
+            </w:pPr>
+            <w:r>
+              <w:rPr>
+                <w:rFonts w:hint="eastAsia"/>
+                <w:color w:val="ED7D31" w:themeColor="accent2"/>
+                <w14:textFill>
+                  <w14:solidFill>
+                    <w14:schemeClr w14:val="accent2"/>
+                  </w14:solidFill>
+                </w14:textFill>
+              </w:rPr>
+              <w:t>返回</w:t>
+            </w:r>
+            <w:r>
+              <w:rPr>
+                <w:rFonts w:hint="eastAsia"/>
+                <w:color w:val="EA82F1"/>
+                <w:szCs w:val="24"/>
+              </w:rPr>
+              <w:t>Grad-CAM绘制器</w:t>
+            </w:r>
+          </w:p>
+        </w:tc>
+      </w:tr>
+      <w:tr>
+        <w:tblPrEx>
+          <w:tblBorders>
+            <w:top w:val="single" w:color="auto" w:sz="4" w:space="0"/>
+            <w:left w:val="single" w:color="auto" w:sz="4" w:space="0"/>
+            <w:bottom w:val="single" w:color="auto" w:sz="4" w:space="0"/>
+            <w:right w:val="single" w:color="auto" w:sz="4" w:space="0"/>
+            <w:insideH w:val="single" w:color="auto" w:sz="4" w:space="0"/>
+            <w:insideV w:val="single" w:color="auto" w:sz="4" w:space="0"/>
+          </w:tblBorders>
+          <w:tblCellMar>
+            <w:top w:w="0" w:type="dxa"/>
+            <w:left w:w="108" w:type="dxa"/>
+            <w:bottom w:w="0" w:type="dxa"/>
+            <w:right w:w="108" w:type="dxa"/>
+          </w:tblCellMar>
+        </w:tblPrEx>
+        <w:trPr>
+          <w:trHeight w:val="156" w:hRule="atLeast"/>
+        </w:trPr>
+        <w:tc>
+          <w:tcPr>
+            <w:tcW w:w="0" w:type="auto"/>
+            <w:vAlign w:val="center"/>
+          </w:tcPr>
+          <w:p>
+            <w:r>
+              <w:rPr>
+                <w:rFonts w:hint="eastAsia"/>
+                <w:color w:val="ED7D31" w:themeColor="accent2"/>
+                <w14:textFill>
+                  <w14:solidFill>
+                    <w14:schemeClr w14:val="accent2"/>
+                  </w14:solidFill>
+                </w14:textFill>
+              </w:rPr>
+              <w:t>实例方法</w:t>
+            </w:r>
+          </w:p>
+        </w:tc>
+        <w:tc>
+          <w:tcPr>
+            <w:tcW w:w="0" w:type="auto"/>
+            <w:vAlign w:val="center"/>
+          </w:tcPr>
+          <w:p>
+            <w:pPr>
+              <w:rPr>
+                <w:color w:val="ED7D31" w:themeColor="accent2"/>
+                <w14:textFill>
+                  <w14:solidFill>
+                    <w14:schemeClr w14:val="accent2"/>
+                  </w14:solidFill>
+                </w14:textFill>
+              </w:rPr>
+            </w:pPr>
+            <w:r>
+              <w:rPr>
+                <w:rFonts w:hint="eastAsia"/>
+                <w:color w:val="FF0000"/>
+                <w:spacing w:val="7"/>
+              </w:rPr>
+              <w:t>module</w:t>
+            </w:r>
+          </w:p>
+        </w:tc>
+        <w:tc>
+          <w:tcPr>
+            <w:tcW w:w="0" w:type="auto"/>
+            <w:vAlign w:val="center"/>
+          </w:tcPr>
+          <w:p>
+            <w:pPr>
+              <w:rPr>
+                <w:color w:val="ED7D31" w:themeColor="accent2"/>
+                <w14:textFill>
+                  <w14:solidFill>
+                    <w14:schemeClr w14:val="accent2"/>
+                  </w14:solidFill>
+                </w14:textFill>
+              </w:rPr>
+            </w:pPr>
+            <w:r>
+              <w:rPr>
+                <w:rFonts w:hint="eastAsia"/>
+                <w:color w:val="EA82F1"/>
+                <w:szCs w:val="24"/>
+              </w:rPr>
+              <w:t>网络模型</w:t>
+            </w:r>
+          </w:p>
+        </w:tc>
+      </w:tr>
+    </w:tbl>
+    <w:p>
+      <w:pPr>
+        <w:rPr>
+          <w:color w:val="70AD47" w:themeColor="accent6"/>
+          <w14:textFill>
+            <w14:solidFill>
+              <w14:schemeClr w14:val="accent6"/>
+            </w14:solidFill>
+          </w14:textFill>
+        </w:rPr>
+      </w:pPr>
+    </w:p>
+    <w:p>
+      <w:pPr>
+        <w:rPr>
+          <w:color w:val="70AD47" w:themeColor="accent6"/>
+          <w14:textFill>
+            <w14:solidFill>
+              <w14:schemeClr w14:val="accent6"/>
+            </w14:solidFill>
+          </w14:textFill>
+        </w:rPr>
+      </w:pPr>
+    </w:p>
+    <w:p>
+      <w:pPr>
+        <w:outlineLvl w:val="3"/>
+        <w:rPr>
+          <w:rFonts w:hint="eastAsia" w:ascii="华文中宋" w:hAnsi="华文中宋" w:eastAsia="华文中宋" w:cs="华文中宋"/>
+          <w:b/>
+          <w:bCs/>
+          <w:color w:val="7030A0"/>
+          <w:spacing w:val="0"/>
+          <w:kern w:val="2"/>
+          <w:sz w:val="21"/>
+          <w:szCs w:val="21"/>
+          <w:lang w:val="en-US" w:eastAsia="zh-CN" w:bidi="ar-SA"/>
+        </w:rPr>
+      </w:pPr>
+      <w:bookmarkStart w:id="39" w:name="_Toc25722"/>
+      <w:r>
+        <w:rPr>
+          <w:rFonts w:hint="eastAsia" w:ascii="华文中宋" w:hAnsi="华文中宋" w:eastAsia="华文中宋" w:cs="华文中宋"/>
+          <w:b/>
+          <w:bCs/>
+          <w:color w:val="7030A0"/>
+          <w:spacing w:val="0"/>
+          <w:kern w:val="2"/>
+          <w:sz w:val="21"/>
+          <w:szCs w:val="21"/>
+          <w:lang w:val="en-US" w:eastAsia="zh-CN" w:bidi="ar-SA"/>
+        </w:rPr>
+        <w:t>通用utils：</w:t>
+      </w:r>
+      <w:bookmarkEnd w:id="39"/>
+    </w:p>
+    <w:tbl>
+      <w:tblPr>
+        <w:tblStyle w:val="12"/>
+        <w:tblW w:w="0" w:type="auto"/>
+        <w:tblInd w:w="0" w:type="dxa"/>
+        <w:tblBorders>
+          <w:top w:val="single" w:color="auto" w:sz="4" w:space="0"/>
+          <w:left w:val="single" w:color="auto" w:sz="4" w:space="0"/>
+          <w:bottom w:val="single" w:color="auto" w:sz="4" w:space="0"/>
+          <w:right w:val="single" w:color="auto" w:sz="4" w:space="0"/>
+          <w:insideH w:val="single" w:color="auto" w:sz="4" w:space="0"/>
+          <w:insideV w:val="single" w:color="auto" w:sz="4" w:space="0"/>
+        </w:tblBorders>
+        <w:tblLayout w:type="autofit"/>
+        <w:tblCellMar>
+          <w:top w:w="0" w:type="dxa"/>
+          <w:left w:w="108" w:type="dxa"/>
+          <w:bottom w:w="0" w:type="dxa"/>
+          <w:right w:w="108" w:type="dxa"/>
+        </w:tblCellMar>
+      </w:tblPr>
+      <w:tblGrid>
+        <w:gridCol w:w="5559"/>
+        <w:gridCol w:w="1898"/>
+      </w:tblGrid>
+      <w:tr>
+        <w:tblPrEx>
+          <w:tblBorders>
+            <w:top w:val="single" w:color="auto" w:sz="4" w:space="0"/>
+            <w:left w:val="single" w:color="auto" w:sz="4" w:space="0"/>
+            <w:bottom w:val="single" w:color="auto" w:sz="4" w:space="0"/>
+            <w:right w:val="single" w:color="auto" w:sz="4" w:space="0"/>
+            <w:insideH w:val="single" w:color="auto" w:sz="4" w:space="0"/>
+            <w:insideV w:val="single" w:color="auto" w:sz="4" w:space="0"/>
+          </w:tblBorders>
+          <w:tblCellMar>
+            <w:top w:w="0" w:type="dxa"/>
+            <w:left w:w="108" w:type="dxa"/>
+            <w:bottom w:w="0" w:type="dxa"/>
+            <w:right w:w="108" w:type="dxa"/>
+          </w:tblCellMar>
+        </w:tblPrEx>
+        <w:trPr>
+          <w:trHeight w:val="302" w:hRule="atLeast"/>
+        </w:trPr>
+        <w:tc>
+          <w:tcPr>
+            <w:tcW w:w="0" w:type="auto"/>
+            <w:gridSpan w:val="2"/>
+            <w:vAlign w:val="center"/>
+          </w:tcPr>
+          <w:p>
+            <w:pPr>
+              <w:rPr>
+                <w:color w:val="ED7D31" w:themeColor="accent2"/>
+                <w14:textFill>
+                  <w14:solidFill>
+                    <w14:schemeClr w14:val="accent2"/>
+                  </w14:solidFill>
+                </w14:textFill>
+              </w:rPr>
+            </w:pPr>
+            <w:r>
+              <w:rPr>
+                <w:rFonts w:hint="eastAsia"/>
+                <w:color w:val="ED7D31" w:themeColor="accent2"/>
+                <w14:textFill>
+                  <w14:solidFill>
+                    <w14:schemeClr w14:val="accent2"/>
+                  </w14:solidFill>
+                </w14:textFill>
+              </w:rPr>
+              <w:t>目标model_targets：</w:t>
+            </w:r>
+          </w:p>
+        </w:tc>
+      </w:tr>
+      <w:tr>
+        <w:tblPrEx>
+          <w:tblBorders>
+            <w:top w:val="single" w:color="auto" w:sz="4" w:space="0"/>
+            <w:left w:val="single" w:color="auto" w:sz="4" w:space="0"/>
+            <w:bottom w:val="single" w:color="auto" w:sz="4" w:space="0"/>
+            <w:right w:val="single" w:color="auto" w:sz="4" w:space="0"/>
+            <w:insideH w:val="single" w:color="auto" w:sz="4" w:space="0"/>
+            <w:insideV w:val="single" w:color="auto" w:sz="4" w:space="0"/>
+          </w:tblBorders>
+          <w:tblCellMar>
+            <w:top w:w="0" w:type="dxa"/>
+            <w:left w:w="108" w:type="dxa"/>
+            <w:bottom w:w="0" w:type="dxa"/>
+            <w:right w:w="108" w:type="dxa"/>
+          </w:tblCellMar>
+        </w:tblPrEx>
+        <w:trPr>
+          <w:trHeight w:val="302" w:hRule="atLeast"/>
+        </w:trPr>
+        <w:tc>
+          <w:tcPr>
+            <w:tcW w:w="0" w:type="auto"/>
+            <w:vAlign w:val="center"/>
+          </w:tcPr>
+          <w:p>
+            <w:pPr>
+              <w:rPr>
+                <w:color w:val="FF0000"/>
+                <w:spacing w:val="7"/>
+              </w:rPr>
+            </w:pPr>
+            <w:r>
+              <w:rPr>
+                <w:rFonts w:hint="eastAsia"/>
+                <w:color w:val="FF0000"/>
+                <w:spacing w:val="7"/>
+              </w:rPr>
+              <w:t>ClassifierOutputTarget(category).__call__(output)</w:t>
+            </w:r>
+          </w:p>
+        </w:tc>
+        <w:tc>
+          <w:tcPr>
+            <w:tcW w:w="0" w:type="auto"/>
+            <w:vAlign w:val="center"/>
+          </w:tcPr>
+          <w:p>
+            <w:pPr>
+              <w:rPr>
+                <w:color w:val="ED7D31" w:themeColor="accent2"/>
+                <w14:textFill>
+                  <w14:solidFill>
+                    <w14:schemeClr w14:val="accent2"/>
+                  </w14:solidFill>
+                </w14:textFill>
+              </w:rPr>
+            </w:pPr>
+            <w:r>
+              <w:rPr>
+                <w:rFonts w:hint="eastAsia"/>
+                <w:color w:val="ED7D31" w:themeColor="accent2"/>
+                <w14:textFill>
+                  <w14:solidFill>
+                    <w14:schemeClr w14:val="accent2"/>
+                  </w14:solidFill>
+                </w14:textFill>
+              </w:rPr>
+              <w:t>返回</w:t>
+            </w:r>
+            <w:r>
+              <w:rPr>
+                <w:rFonts w:hint="eastAsia"/>
+                <w:color w:val="EA82F1"/>
+                <w:szCs w:val="24"/>
+              </w:rPr>
+              <w:t>对应类别得分</w:t>
+            </w:r>
+          </w:p>
+        </w:tc>
+      </w:tr>
+    </w:tbl>
+    <w:p>
+      <w:pPr>
+        <w:rPr>
+          <w:color w:val="70AD47" w:themeColor="accent6"/>
+          <w14:textFill>
+            <w14:solidFill>
+              <w14:schemeClr w14:val="accent6"/>
+            </w14:solidFill>
+          </w14:textFill>
+        </w:rPr>
+      </w:pPr>
+    </w:p>
+    <w:p>
+      <w:pPr>
+        <w:rPr>
+          <w:color w:val="70AD47" w:themeColor="accent6"/>
+          <w14:textFill>
+            <w14:solidFill>
+              <w14:schemeClr w14:val="accent6"/>
+            </w14:solidFill>
+          </w14:textFill>
         </w:rPr>
       </w:pPr>
     </w:p>
@@ -40524,7 +40755,6 @@
           <w:tcPr>
             <w:tcW w:w="0" w:type="auto"/>
             <w:vMerge w:val="continue"/>
-            <w:tcBorders/>
             <w:vAlign w:val="center"/>
           </w:tcPr>
           <w:p>
@@ -40661,7 +40891,6 @@
           <w:tcPr>
             <w:tcW w:w="0" w:type="auto"/>
             <w:vMerge w:val="continue"/>
-            <w:tcBorders/>
             <w:vAlign w:val="center"/>
           </w:tcPr>
           <w:p>
@@ -41146,7 +41375,6 @@
           <w:tcPr>
             <w:tcW w:w="0" w:type="auto"/>
             <w:vMerge w:val="continue"/>
-            <w:tcBorders/>
             <w:vAlign w:val="center"/>
           </w:tcPr>
           <w:p>
@@ -41171,7 +41399,7 @@
         <w:tc>
           <w:tcPr>
             <w:tcW w:w="0" w:type="auto"/>
-            <w:shd w:val="clear"/>
+            <w:shd w:val="clear" w:color="auto" w:fill="auto"/>
             <w:vAlign w:val="center"/>
           </w:tcPr>
           <w:p>
@@ -41268,7 +41496,7 @@
         <w:tc>
           <w:tcPr>
             <w:tcW w:w="0" w:type="auto"/>
-            <w:shd w:val="clear"/>
+            <w:shd w:val="clear" w:color="auto" w:fill="auto"/>
             <w:vAlign w:val="center"/>
           </w:tcPr>
           <w:p>
@@ -41301,6 +41529,179 @@
                 <w:lang w:val="en-US" w:eastAsia="zh-CN" w:bidi="ar-SA"/>
               </w:rPr>
               <w:t>step start</w:t>
+            </w:r>
+          </w:p>
+        </w:tc>
+      </w:tr>
+      <w:tr>
+        <w:tblPrEx>
+          <w:tblBorders>
+            <w:top w:val="single" w:color="auto" w:sz="4" w:space="0"/>
+            <w:left w:val="single" w:color="auto" w:sz="4" w:space="0"/>
+            <w:bottom w:val="single" w:color="auto" w:sz="4" w:space="0"/>
+            <w:right w:val="single" w:color="auto" w:sz="4" w:space="0"/>
+            <w:insideH w:val="single" w:color="auto" w:sz="4" w:space="0"/>
+            <w:insideV w:val="single" w:color="auto" w:sz="4" w:space="0"/>
+          </w:tblBorders>
+        </w:tblPrEx>
+        <w:tc>
+          <w:tcPr>
+            <w:tcW w:w="0" w:type="auto"/>
+            <w:vMerge w:val="continue"/>
+            <w:vAlign w:val="center"/>
+          </w:tcPr>
+          <w:p>
+            <w:pPr>
+              <w:pStyle w:val="26"/>
+              <w:bidi w:val="0"/>
+              <w:jc w:val="both"/>
+              <w:rPr>
+                <w:rFonts w:hint="eastAsia" w:cs="华文中宋"/>
+                <w:b/>
+                <w:bCs/>
+                <w:color w:val="ED7D31"/>
+                <w:kern w:val="2"/>
+                <w:sz w:val="21"/>
+                <w:szCs w:val="21"/>
+                <w:vertAlign w:val="baseline"/>
+                <w:lang w:val="en-US" w:eastAsia="zh-CN" w:bidi="ar-SA"/>
+              </w:rPr>
+            </w:pPr>
+          </w:p>
+        </w:tc>
+        <w:tc>
+          <w:tcPr>
+            <w:tcW w:w="0" w:type="auto"/>
+            <w:shd w:val="clear" w:color="auto" w:fill="auto"/>
+            <w:vAlign w:val="center"/>
+          </w:tcPr>
+          <w:p>
+            <w:pPr>
+              <w:pStyle w:val="26"/>
+              <w:bidi w:val="0"/>
+              <w:jc w:val="both"/>
+              <w:rPr>
+                <w:rFonts w:hint="eastAsia" w:cs="华文中宋"/>
+                <w:b/>
+                <w:bCs/>
+                <w:color w:val="FF0000"/>
+                <w:kern w:val="2"/>
+                <w:sz w:val="21"/>
+                <w:szCs w:val="21"/>
+                <w:lang w:val="en-US" w:eastAsia="zh-CN" w:bidi="ar-SA"/>
+              </w:rPr>
+            </w:pPr>
+            <w:r>
+              <w:rPr>
+                <w:rFonts w:hint="eastAsia" w:cs="华文中宋"/>
+                <w:b/>
+                <w:bCs/>
+                <w:color w:val="FF0000"/>
+                <w:kern w:val="2"/>
+                <w:sz w:val="21"/>
+                <w:szCs w:val="21"/>
+                <w:lang w:val="en-US" w:eastAsia="zh-CN" w:bidi="ar-SA"/>
+              </w:rPr>
+              <w:t xml:space="preserve">on_train_batch_end / on_validation_batch_end / </w:t>
+            </w:r>
+          </w:p>
+          <w:p>
+            <w:pPr>
+              <w:pStyle w:val="26"/>
+              <w:bidi w:val="0"/>
+              <w:jc w:val="both"/>
+              <w:rPr>
+                <w:rFonts w:hint="eastAsia" w:cs="华文中宋"/>
+                <w:b/>
+                <w:bCs/>
+                <w:color w:val="FF0000"/>
+                <w:kern w:val="2"/>
+                <w:sz w:val="21"/>
+                <w:szCs w:val="21"/>
+                <w:lang w:val="en-US" w:eastAsia="zh-CN" w:bidi="ar-SA"/>
+              </w:rPr>
+            </w:pPr>
+            <w:r>
+              <w:rPr>
+                <w:rFonts w:hint="eastAsia" w:cs="华文中宋"/>
+                <w:b/>
+                <w:bCs/>
+                <w:color w:val="FF0000"/>
+                <w:kern w:val="2"/>
+                <w:sz w:val="21"/>
+                <w:szCs w:val="21"/>
+                <w:lang w:val="en-US" w:eastAsia="zh-CN" w:bidi="ar-SA"/>
+              </w:rPr>
+              <w:t>on_test_batch_end / on_predict_batch_end</w:t>
+            </w:r>
+          </w:p>
+          <w:p>
+            <w:pPr>
+              <w:pStyle w:val="26"/>
+              <w:bidi w:val="0"/>
+              <w:jc w:val="both"/>
+              <w:rPr>
+                <w:rFonts w:hint="eastAsia" w:cs="华文中宋"/>
+                <w:b/>
+                <w:bCs/>
+                <w:color w:val="FF0000"/>
+                <w:kern w:val="2"/>
+                <w:sz w:val="21"/>
+                <w:szCs w:val="21"/>
+                <w:lang w:val="en-US" w:eastAsia="zh-CN" w:bidi="ar-SA"/>
+              </w:rPr>
+            </w:pPr>
+            <w:r>
+              <w:rPr>
+                <w:rFonts w:hint="eastAsia" w:cs="华文中宋"/>
+                <w:b/>
+                <w:bCs/>
+                <w:color w:val="FF0000"/>
+                <w:kern w:val="2"/>
+                <w:sz w:val="21"/>
+                <w:szCs w:val="21"/>
+                <w:lang w:val="en-US" w:eastAsia="zh-CN" w:bidi="ar-SA"/>
+              </w:rPr>
+              <w:t>(self, outputs, batch, batch_idx, dataloader_idx=0)</w:t>
+            </w:r>
+          </w:p>
+        </w:tc>
+        <w:tc>
+          <w:tcPr>
+            <w:tcW w:w="0" w:type="auto"/>
+            <w:shd w:val="clear" w:color="auto" w:fill="auto"/>
+            <w:vAlign w:val="center"/>
+          </w:tcPr>
+          <w:p>
+            <w:pPr>
+              <w:pStyle w:val="27"/>
+              <w:bidi w:val="0"/>
+              <w:jc w:val="both"/>
+              <w:rPr>
+                <w:rFonts w:hint="default" w:cs="华文中宋"/>
+                <w:b/>
+                <w:bCs/>
+                <w:color w:val="EA82E5"/>
+                <w:kern w:val="2"/>
+                <w:sz w:val="21"/>
+                <w:szCs w:val="21"/>
+                <w:vertAlign w:val="baseline"/>
+                <w:lang w:val="en-US" w:eastAsia="zh-CN" w:bidi="ar-SA"/>
+              </w:rPr>
+            </w:pPr>
+            <w:r>
+              <w:rPr>
+                <w:rFonts w:hint="eastAsia" w:cs="华文中宋"/>
+                <w:b/>
+                <w:bCs/>
+                <w:color w:val="EA82E5"/>
+                <w:kern w:val="2"/>
+                <w:sz w:val="21"/>
+                <w:szCs w:val="21"/>
+                <w:vertAlign w:val="baseline"/>
+                <w:lang w:val="en-US" w:eastAsia="zh-CN" w:bidi="ar-SA"/>
+              </w:rPr>
+              <w:t>step end</w:t>
             </w:r>
           </w:p>
         </w:tc>
@@ -41326,7 +41727,6 @@
           <w:tcPr>
             <w:tcW w:w="0" w:type="auto"/>
             <w:vMerge w:val="continue"/>
-            <w:tcBorders/>
             <w:vAlign w:val="center"/>
           </w:tcPr>
           <w:p>
@@ -41351,7 +41751,7 @@
         <w:tc>
           <w:tcPr>
             <w:tcW w:w="0" w:type="auto"/>
-            <w:shd w:val="clear"/>
+            <w:shd w:val="clear" w:color="auto" w:fill="auto"/>
             <w:vAlign w:val="center"/>
           </w:tcPr>
           <w:p>
@@ -41381,7 +41781,7 @@
                 <w:szCs w:val="21"/>
                 <w:lang w:val="en-US" w:eastAsia="zh-CN" w:bidi="ar-SA"/>
               </w:rPr>
-              <w:t xml:space="preserve">on_train_batch_end / on_validation_batch_end / </w:t>
+              <w:t xml:space="preserve">on_train_epoch_start / on_train_epoch_end / </w:t>
             </w:r>
           </w:p>
           <w:p>
@@ -41411,7 +41811,7 @@
                 <w:szCs w:val="21"/>
                 <w:lang w:val="en-US" w:eastAsia="zh-CN" w:bidi="ar-SA"/>
               </w:rPr>
-              <w:t>on_test_batch_end / on_predict_batch_end</w:t>
+              <w:t xml:space="preserve">on_validation_epoch_start / on_validation_epoch_end / </w:t>
             </w:r>
           </w:p>
           <w:p>
@@ -41441,14 +41841,44 @@
                 <w:szCs w:val="21"/>
                 <w:lang w:val="en-US" w:eastAsia="zh-CN" w:bidi="ar-SA"/>
               </w:rPr>
-              <w:t>(self, outputs, batch, batch_idx, dataloader_idx=0)</w:t>
-            </w:r>
-          </w:p>
-        </w:tc>
-        <w:tc>
-          <w:tcPr>
-            <w:tcW w:w="0" w:type="auto"/>
-            <w:shd w:val="clear"/>
+              <w:t xml:space="preserve">on_test_epoch_start / on_test_epoch_end / </w:t>
+            </w:r>
+          </w:p>
+          <w:p>
+            <w:pPr>
+              <w:pStyle w:val="26"/>
+              <w:bidi w:val="0"/>
+              <w:jc w:val="both"/>
+              <w:rPr>
+                <w:rFonts w:hint="default" w:cs="华文中宋"/>
+                <w:b/>
+                <w:bCs/>
+                <w:color w:val="FF0000"/>
+                <w:kern w:val="2"/>
+                <w:sz w:val="21"/>
+                <w:szCs w:val="21"/>
+                <w:lang w:val="en-US" w:eastAsia="zh-CN" w:bidi="ar-SA"/>
+              </w:rPr>
+            </w:pPr>
+            <w:r>
+              <w:rPr>
+                <w:rFonts w:hint="eastAsia" w:cs="华文中宋"/>
+                <w:b/>
+                <w:bCs/>
+                <w:color w:val="FF0000"/>
+                <w:kern w:val="2"/>
+                <w:sz w:val="21"/>
+                <w:szCs w:val="21"/>
+                <w:lang w:val="en-US" w:eastAsia="zh-CN" w:bidi="ar-SA"/>
+              </w:rPr>
+              <w:t>on_predict_epoch_start / on_predict_epoch_end(self)</w:t>
+            </w:r>
+          </w:p>
+        </w:tc>
+        <w:tc>
+          <w:tcPr>
+            <w:tcW w:w="0" w:type="auto"/>
+            <w:shd w:val="clear" w:color="auto" w:fill="auto"/>
             <w:vAlign w:val="center"/>
           </w:tcPr>
           <w:p>
@@ -41480,7 +41910,7 @@
                 <w:vertAlign w:val="baseline"/>
                 <w:lang w:val="en-US" w:eastAsia="zh-CN" w:bidi="ar-SA"/>
               </w:rPr>
-              <w:t>step end</w:t>
+              <w:t>epoch</w:t>
             </w:r>
           </w:p>
         </w:tc>
@@ -41506,7 +41936,6 @@
           <w:tcPr>
             <w:tcW w:w="0" w:type="auto"/>
             <w:vMerge w:val="continue"/>
-            <w:tcBorders/>
             <w:vAlign w:val="center"/>
           </w:tcPr>
           <w:p>
@@ -41531,7 +41960,7 @@
         <w:tc>
           <w:tcPr>
             <w:tcW w:w="0" w:type="auto"/>
-            <w:shd w:val="clear"/>
+            <w:shd w:val="clear" w:color="auto" w:fill="auto"/>
             <w:vAlign w:val="center"/>
           </w:tcPr>
           <w:p>
@@ -41561,7 +41990,7 @@
                 <w:szCs w:val="21"/>
                 <w:lang w:val="en-US" w:eastAsia="zh-CN" w:bidi="ar-SA"/>
               </w:rPr>
-              <w:t xml:space="preserve">on_train_epoch_start / on_train_epoch_end / </w:t>
+              <w:t>on_before_zero_grad(self, optimizer) /</w:t>
             </w:r>
           </w:p>
           <w:p>
@@ -41582,7 +42011,7 @@
             </w:pPr>
             <w:r>
               <w:rPr>
-                <w:rFonts w:hint="eastAsia" w:cs="华文中宋"/>
+                <w:rFonts w:hint="default" w:cs="华文中宋"/>
                 <w:b/>
                 <w:bCs/>
                 <w:color w:val="FF0000"/>
@@ -41591,14 +42020,9 @@
                 <w:szCs w:val="21"/>
                 <w:lang w:val="en-US" w:eastAsia="zh-CN" w:bidi="ar-SA"/>
               </w:rPr>
-              <w:t xml:space="preserve">on_validation_epoch_start / on_validation_epoch_end / </w:t>
-            </w:r>
-          </w:p>
-          <w:p>
-            <w:pPr>
-              <w:pStyle w:val="26"/>
-              <w:bidi w:val="0"/>
-              <w:jc w:val="both"/>
+              <w:t>on_before_backward(self, loss)</w:t>
+            </w:r>
+            <w:r>
               <w:rPr>
                 <w:rFonts w:hint="eastAsia" w:cs="华文中宋"/>
                 <w:b/>
@@ -41609,10 +42033,16 @@
                 <w:szCs w:val="21"/>
                 <w:lang w:val="en-US" w:eastAsia="zh-CN" w:bidi="ar-SA"/>
               </w:rPr>
-            </w:pPr>
-            <w:r>
-              <w:rPr>
-                <w:rFonts w:hint="eastAsia" w:cs="华文中宋"/>
+              <w:t xml:space="preserve"> / on_after_backward(self) /</w:t>
+            </w:r>
+          </w:p>
+          <w:p>
+            <w:pPr>
+              <w:pStyle w:val="26"/>
+              <w:bidi w:val="0"/>
+              <w:jc w:val="both"/>
+              <w:rPr>
+                <w:rFonts w:hint="default" w:cs="华文中宋"/>
                 <w:b/>
                 <w:bCs/>
                 <w:color w:val="FF0000"/>
@@ -41621,14 +42051,8 @@
                 <w:szCs w:val="21"/>
                 <w:lang w:val="en-US" w:eastAsia="zh-CN" w:bidi="ar-SA"/>
               </w:rPr>
-              <w:t xml:space="preserve">on_test_epoch_start / on_test_epoch_end / </w:t>
-            </w:r>
-          </w:p>
-          <w:p>
-            <w:pPr>
-              <w:pStyle w:val="26"/>
-              <w:bidi w:val="0"/>
-              <w:jc w:val="both"/>
+            </w:pPr>
+            <w:r>
               <w:rPr>
                 <w:rFonts w:hint="default" w:cs="华文中宋"/>
                 <w:b/>
@@ -41639,211 +42063,6 @@
                 <w:szCs w:val="21"/>
                 <w:lang w:val="en-US" w:eastAsia="zh-CN" w:bidi="ar-SA"/>
               </w:rPr>
-            </w:pPr>
-            <w:r>
-              <w:rPr>
-                <w:rFonts w:hint="eastAsia" w:cs="华文中宋"/>
-                <w:b/>
-                <w:bCs/>
-                <w:color w:val="FF0000"/>
-                <w:kern w:val="2"/>
-                <w:sz w:val="21"/>
-                <w:szCs w:val="21"/>
-                <w:lang w:val="en-US" w:eastAsia="zh-CN" w:bidi="ar-SA"/>
-              </w:rPr>
-              <w:t>on_predict_epoch_start / on_predict_epoch_end(self)</w:t>
-            </w:r>
-          </w:p>
-        </w:tc>
-        <w:tc>
-          <w:tcPr>
-            <w:tcW w:w="0" w:type="auto"/>
-            <w:shd w:val="clear"/>
-            <w:vAlign w:val="center"/>
-          </w:tcPr>
-          <w:p>
-            <w:pPr>
-              <w:pStyle w:val="27"/>
-              <w:bidi w:val="0"/>
-              <w:jc w:val="both"/>
-              <w:rPr>
-                <w:rFonts w:hint="default" w:cs="华文中宋"/>
-                <w:b/>
-                <w:bCs/>
-                <w:color w:val="EA82E5"/>
-                <w:kern w:val="2"/>
-                <w:sz w:val="21"/>
-                <w:szCs w:val="21"/>
-                <w:vertAlign w:val="baseline"/>
-                <w:lang w:val="en-US" w:eastAsia="zh-CN" w:bidi="ar-SA"/>
-              </w:rPr>
-            </w:pPr>
-            <w:r>
-              <w:rPr>
-                <w:rFonts w:hint="eastAsia" w:cs="华文中宋"/>
-                <w:b/>
-                <w:bCs/>
-                <w:color w:val="EA82E5"/>
-                <w:kern w:val="2"/>
-                <w:sz w:val="21"/>
-                <w:szCs w:val="21"/>
-                <w:vertAlign w:val="baseline"/>
-                <w:lang w:val="en-US" w:eastAsia="zh-CN" w:bidi="ar-SA"/>
-              </w:rPr>
-              <w:t>epoch</w:t>
-            </w:r>
-          </w:p>
-        </w:tc>
-      </w:tr>
-      <w:tr>
-        <w:tblPrEx>
-          <w:tblBorders>
-            <w:top w:val="single" w:color="auto" w:sz="4" w:space="0"/>
-            <w:left w:val="single" w:color="auto" w:sz="4" w:space="0"/>
-            <w:bottom w:val="single" w:color="auto" w:sz="4" w:space="0"/>
-            <w:right w:val="single" w:color="auto" w:sz="4" w:space="0"/>
-            <w:insideH w:val="single" w:color="auto" w:sz="4" w:space="0"/>
-            <w:insideV w:val="single" w:color="auto" w:sz="4" w:space="0"/>
-          </w:tblBorders>
-          <w:tblCellMar>
-            <w:top w:w="0" w:type="dxa"/>
-            <w:left w:w="108" w:type="dxa"/>
-            <w:bottom w:w="0" w:type="dxa"/>
-            <w:right w:w="108" w:type="dxa"/>
-          </w:tblCellMar>
-        </w:tblPrEx>
-        <w:tc>
-          <w:tcPr>
-            <w:tcW w:w="0" w:type="auto"/>
-            <w:vMerge w:val="continue"/>
-            <w:tcBorders/>
-            <w:vAlign w:val="center"/>
-          </w:tcPr>
-          <w:p>
-            <w:pPr>
-              <w:pStyle w:val="26"/>
-              <w:bidi w:val="0"/>
-              <w:jc w:val="both"/>
-              <w:rPr>
-                <w:rFonts w:hint="eastAsia" w:cs="华文中宋"/>
-                <w:b/>
-                <w:bCs/>
-                <w:color w:val="ED7D31"/>
-                <w:kern w:val="2"/>
-                <w:sz w:val="21"/>
-                <w:szCs w:val="21"/>
-                <w:vertAlign w:val="baseline"/>
-                <w:lang w:val="en-US" w:eastAsia="zh-CN" w:bidi="ar-SA"/>
-              </w:rPr>
-            </w:pPr>
-          </w:p>
-        </w:tc>
-        <w:tc>
-          <w:tcPr>
-            <w:tcW w:w="0" w:type="auto"/>
-            <w:shd w:val="clear"/>
-            <w:vAlign w:val="center"/>
-          </w:tcPr>
-          <w:p>
-            <w:pPr>
-              <w:pStyle w:val="26"/>
-              <w:bidi w:val="0"/>
-              <w:jc w:val="both"/>
-              <w:rPr>
-                <w:rFonts w:hint="eastAsia" w:cs="华文中宋"/>
-                <w:b/>
-                <w:bCs/>
-                <w:color w:val="FF0000"/>
-                <w:kern w:val="2"/>
-                <w:sz w:val="21"/>
-                <w:szCs w:val="21"/>
-                <w:lang w:val="en-US" w:eastAsia="zh-CN" w:bidi="ar-SA"/>
-              </w:rPr>
-            </w:pPr>
-            <w:r>
-              <w:rPr>
-                <w:rFonts w:hint="eastAsia" w:cs="华文中宋"/>
-                <w:b/>
-                <w:bCs/>
-                <w:color w:val="FF0000"/>
-                <w:kern w:val="2"/>
-                <w:sz w:val="21"/>
-                <w:szCs w:val="21"/>
-                <w:lang w:val="en-US" w:eastAsia="zh-CN" w:bidi="ar-SA"/>
-              </w:rPr>
-              <w:t>on_before_zero_grad(self, optimizer) /</w:t>
-            </w:r>
-          </w:p>
-          <w:p>
-            <w:pPr>
-              <w:pStyle w:val="26"/>
-              <w:bidi w:val="0"/>
-              <w:jc w:val="both"/>
-              <w:rPr>
-                <w:rFonts w:hint="eastAsia" w:cs="华文中宋"/>
-                <w:b/>
-                <w:bCs/>
-                <w:color w:val="FF0000"/>
-                <w:kern w:val="2"/>
-                <w:sz w:val="21"/>
-                <w:szCs w:val="21"/>
-                <w:lang w:val="en-US" w:eastAsia="zh-CN" w:bidi="ar-SA"/>
-              </w:rPr>
-            </w:pPr>
-            <w:r>
-              <w:rPr>
-                <w:rFonts w:hint="default" w:cs="华文中宋"/>
-                <w:b/>
-                <w:bCs/>
-                <w:color w:val="FF0000"/>
-                <w:kern w:val="2"/>
-                <w:sz w:val="21"/>
-                <w:szCs w:val="21"/>
-                <w:lang w:val="en-US" w:eastAsia="zh-CN" w:bidi="ar-SA"/>
-              </w:rPr>
-              <w:t>on_before_backward(self, loss)</w:t>
-            </w:r>
-            <w:r>
-              <w:rPr>
-                <w:rFonts w:hint="eastAsia" w:cs="华文中宋"/>
-                <w:b/>
-                <w:bCs/>
-                <w:color w:val="FF0000"/>
-                <w:kern w:val="2"/>
-                <w:sz w:val="21"/>
-                <w:szCs w:val="21"/>
-                <w:lang w:val="en-US" w:eastAsia="zh-CN" w:bidi="ar-SA"/>
-              </w:rPr>
-              <w:t xml:space="preserve"> / on_after_backward(self) /</w:t>
-            </w:r>
-          </w:p>
-          <w:p>
-            <w:pPr>
-              <w:pStyle w:val="26"/>
-              <w:bidi w:val="0"/>
-              <w:jc w:val="both"/>
-              <w:rPr>
-                <w:rFonts w:hint="default" w:cs="华文中宋"/>
-                <w:b/>
-                <w:bCs/>
-                <w:color w:val="FF0000"/>
-                <w:kern w:val="2"/>
-                <w:sz w:val="21"/>
-                <w:szCs w:val="21"/>
-                <w:lang w:val="en-US" w:eastAsia="zh-CN" w:bidi="ar-SA"/>
-              </w:rPr>
-            </w:pPr>
-            <w:r>
-              <w:rPr>
-                <w:rFonts w:hint="default" w:cs="华文中宋"/>
-                <w:b/>
-                <w:bCs/>
-                <w:color w:val="FF0000"/>
-                <w:kern w:val="2"/>
-                <w:sz w:val="21"/>
-                <w:szCs w:val="21"/>
-                <w:lang w:val="en-US" w:eastAsia="zh-CN" w:bidi="ar-SA"/>
-              </w:rPr>
               <w:t>on_before_optimizer_step(self, optimizer)</w:t>
             </w:r>
           </w:p>
@@ -41851,7 +42070,7 @@
         <w:tc>
           <w:tcPr>
             <w:tcW w:w="0" w:type="auto"/>
-            <w:shd w:val="clear"/>
+            <w:shd w:val="clear" w:color="auto" w:fill="auto"/>
             <w:vAlign w:val="center"/>
           </w:tcPr>
           <w:p>
@@ -42372,8 +42591,6 @@
               </w:rPr>
               <w:t>类方法</w:t>
             </w:r>
-            <w:bookmarkStart w:id="44" w:name="_GoBack"/>
-            <w:bookmarkEnd w:id="44"/>
           </w:p>
         </w:tc>
         <w:tc>
@@ -42735,7 +42952,6 @@
           <w:tcPr>
             <w:tcW w:w="0" w:type="auto"/>
             <w:vMerge w:val="continue"/>
-            <w:tcBorders/>
             <w:vAlign w:val="center"/>
           </w:tcPr>
           <w:p>
@@ -42841,7 +43057,6 @@
           <w:tcPr>
             <w:tcW w:w="0" w:type="auto"/>
             <w:vMerge w:val="continue"/>
-            <w:tcBorders/>
             <w:vAlign w:val="center"/>
           </w:tcPr>
           <w:p>
@@ -43325,7 +43540,6 @@
           <w:tcPr>
             <w:tcW w:w="0" w:type="auto"/>
             <w:vMerge w:val="continue"/>
-            <w:tcBorders/>
             <w:vAlign w:val="center"/>
           </w:tcPr>
           <w:p>
@@ -44434,7 +44648,7 @@
         </w:rPr>
         <w:t>：</w:t>
       </w:r>
-      <w:bookmarkEnd w:id="39"/>
+      <w:bookmarkEnd w:id="37"/>
     </w:p>
     <w:tbl>
       <w:tblPr>
@@ -48083,6 +48297,12 @@
             <w:insideH w:val="single" w:color="auto" w:sz="4" w:space="0"/>
             <w:insideV w:val="single" w:color="auto" w:sz="4" w:space="0"/>
           </w:tblBorders>
+          <w:tblCellMar>
+            <w:top w:w="0" w:type="dxa"/>
+            <w:left w:w="108" w:type="dxa"/>
+            <w:bottom w:w="0" w:type="dxa"/>
+            <w:right w:w="108" w:type="dxa"/>
+          </w:tblCellMar>
         </w:tblPrEx>
         <w:tc>
           <w:tcPr>
@@ -52374,6 +52594,12 @@
             <w:insideH w:val="single" w:color="auto" w:sz="4" w:space="0"/>
             <w:insideV w:val="single" w:color="auto" w:sz="4" w:space="0"/>
           </w:tblBorders>
+          <w:tblCellMar>
+            <w:top w:w="0" w:type="dxa"/>
+            <w:left w:w="108" w:type="dxa"/>
+            <w:bottom w:w="0" w:type="dxa"/>
+            <w:right w:w="108" w:type="dxa"/>
+          </w:tblCellMar>
         </w:tblPrEx>
         <w:tc>
           <w:tcPr>

</xml_diff>

<commit_message>
update on 2025-11-12 20:30:06.087067
</commit_message>
<xml_diff>
--- a/py 深度学习.docx
+++ b/py 深度学习.docx
@@ -13621,6 +13621,196 @@
           </w14:textFill>
         </w:rPr>
       </w:pPr>
+    </w:p>
+    <w:p>
+      <w:pPr>
+        <w:outlineLvl w:val="1"/>
+        <w:rPr>
+          <w:rFonts w:hint="default"/>
+          <w:color w:val="00B0F0"/>
+          <w:lang w:val="en-US" w:eastAsia="zh-CN"/>
+        </w:rPr>
+      </w:pPr>
+      <w:r>
+        <w:rPr>
+          <w:rFonts w:hint="eastAsia"/>
+          <w:color w:val="00B0F0"/>
+          <w:lang w:eastAsia="zh-CN"/>
+        </w:rPr>
+        <w:t>应用</w:t>
+      </w:r>
+      <w:r>
+        <w:rPr>
+          <w:rFonts w:hint="eastAsia"/>
+          <w:color w:val="00B0F0"/>
+          <w:lang w:val="en-US" w:eastAsia="zh-CN"/>
+        </w:rPr>
+        <w:t>ao：</w:t>
+      </w:r>
+    </w:p>
+    <w:p>
+      <w:pPr>
+        <w:rPr>
+          <w:color w:val="70AD47" w:themeColor="accent6"/>
+          <w14:textFill>
+            <w14:solidFill>
+              <w14:schemeClr w14:val="accent6"/>
+            </w14:solidFill>
+          </w14:textFill>
+        </w:rPr>
+      </w:pPr>
+    </w:p>
+    <w:p>
+      <w:pPr>
+        <w:outlineLvl w:val="2"/>
+        <w:rPr>
+          <w:rFonts w:hint="default"/>
+          <w:color w:val="0070C0"/>
+          <w:lang w:val="en-US" w:eastAsia="zh-CN"/>
+        </w:rPr>
+      </w:pPr>
+      <w:r>
+        <w:rPr>
+          <w:rFonts w:hint="eastAsia"/>
+          <w:color w:val="0070C0"/>
+          <w:lang w:val="en-US" w:eastAsia="zh-CN"/>
+        </w:rPr>
+        <w:t>量化quantization：</w:t>
+      </w:r>
+    </w:p>
+    <w:tbl>
+      <w:tblPr>
+        <w:tblStyle w:val="12"/>
+        <w:tblW w:w="0" w:type="auto"/>
+        <w:tblInd w:w="0" w:type="dxa"/>
+        <w:tblBorders>
+          <w:top w:val="single" w:color="auto" w:sz="4" w:space="0"/>
+          <w:left w:val="single" w:color="auto" w:sz="4" w:space="0"/>
+          <w:bottom w:val="single" w:color="auto" w:sz="4" w:space="0"/>
+          <w:right w:val="single" w:color="auto" w:sz="4" w:space="0"/>
+          <w:insideH w:val="single" w:color="auto" w:sz="4" w:space="0"/>
+          <w:insideV w:val="single" w:color="auto" w:sz="4" w:space="0"/>
+        </w:tblBorders>
+        <w:tblLayout w:type="autofit"/>
+        <w:tblCellMar>
+          <w:top w:w="0" w:type="dxa"/>
+          <w:left w:w="108" w:type="dxa"/>
+          <w:bottom w:w="0" w:type="dxa"/>
+          <w:right w:w="108" w:type="dxa"/>
+        </w:tblCellMar>
+      </w:tblPr>
+      <w:tblGrid>
+        <w:gridCol w:w="4651"/>
+        <w:gridCol w:w="1518"/>
+      </w:tblGrid>
+      <w:tr>
+        <w:tblPrEx>
+          <w:tblBorders>
+            <w:top w:val="single" w:color="auto" w:sz="4" w:space="0"/>
+            <w:left w:val="single" w:color="auto" w:sz="4" w:space="0"/>
+            <w:bottom w:val="single" w:color="auto" w:sz="4" w:space="0"/>
+            <w:right w:val="single" w:color="auto" w:sz="4" w:space="0"/>
+            <w:insideH w:val="single" w:color="auto" w:sz="4" w:space="0"/>
+            <w:insideV w:val="single" w:color="auto" w:sz="4" w:space="0"/>
+          </w:tblBorders>
+          <w:tblCellMar>
+            <w:top w:w="0" w:type="dxa"/>
+            <w:left w:w="108" w:type="dxa"/>
+            <w:bottom w:w="0" w:type="dxa"/>
+            <w:right w:w="108" w:type="dxa"/>
+          </w:tblCellMar>
+        </w:tblPrEx>
+        <w:trPr>
+          <w:trHeight w:val="90" w:hRule="atLeast"/>
+        </w:trPr>
+        <w:tc>
+          <w:tcPr>
+            <w:tcW w:w="0" w:type="auto"/>
+          </w:tcPr>
+          <w:p>
+            <w:pPr>
+              <w:rPr>
+                <w:rFonts w:hint="default" w:eastAsia="华文中宋"/>
+                <w:color w:val="FF0000"/>
+                <w:spacing w:val="7"/>
+                <w:lang w:val="en-US" w:eastAsia="zh-CN"/>
+              </w:rPr>
+            </w:pPr>
+            <w:r>
+              <w:rPr>
+                <w:rFonts w:hint="eastAsia"/>
+                <w:color w:val="FF0000"/>
+                <w:spacing w:val="7"/>
+                <w:lang w:val="en-US" w:eastAsia="zh-CN"/>
+              </w:rPr>
+              <w:t>fuse_modules(model, attr_pairs, inplace)</w:t>
+            </w:r>
+          </w:p>
+        </w:tc>
+        <w:tc>
+          <w:tcPr>
+            <w:tcW w:w="0" w:type="auto"/>
+          </w:tcPr>
+          <w:p>
+            <w:pPr>
+              <w:rPr>
+                <w:rFonts w:hint="eastAsia" w:eastAsia="华文中宋"/>
+                <w:color w:val="ED7D31" w:themeColor="accent2"/>
+                <w:lang w:eastAsia="zh-CN"/>
+                <w14:textFill>
+                  <w14:solidFill>
+                    <w14:schemeClr w14:val="accent2"/>
+                  </w14:solidFill>
+                </w14:textFill>
+              </w:rPr>
+            </w:pPr>
+            <w:r>
+              <w:rPr>
+                <w:rFonts w:hint="eastAsia"/>
+                <w:color w:val="EA82F1"/>
+                <w:szCs w:val="24"/>
+                <w:lang w:val="en-US" w:eastAsia="zh-CN"/>
+              </w:rPr>
+              <w:t>conv-bn</w:t>
+            </w:r>
+            <w:r>
+              <w:rPr>
+                <w:rFonts w:hint="eastAsia"/>
+                <w:color w:val="EA82F1"/>
+                <w:szCs w:val="24"/>
+                <w:lang w:eastAsia="zh-CN"/>
+              </w:rPr>
+              <w:t>合并</w:t>
+            </w:r>
+          </w:p>
+        </w:tc>
+      </w:tr>
+    </w:tbl>
+    <w:p>
+      <w:pPr>
+        <w:rPr>
+          <w:color w:val="70AD47" w:themeColor="accent6"/>
+          <w14:textFill>
+            <w14:solidFill>
+              <w14:schemeClr w14:val="accent6"/>
+            </w14:solidFill>
+          </w14:textFill>
+        </w:rPr>
+      </w:pPr>
+    </w:p>
+    <w:p>
+      <w:pPr>
+        <w:rPr>
+          <w:color w:val="70AD47" w:themeColor="accent6"/>
+          <w14:textFill>
+            <w14:solidFill>
+              <w14:schemeClr w14:val="accent6"/>
+            </w14:solidFill>
+          </w14:textFill>
+        </w:rPr>
+      </w:pPr>
+      <w:bookmarkStart w:id="44" w:name="_GoBack"/>
+      <w:bookmarkEnd w:id="44"/>
     </w:p>
     <w:p>
       <w:pPr>
@@ -26117,6 +26307,12 @@
             <w:insideH w:val="single" w:color="auto" w:sz="4" w:space="0"/>
             <w:insideV w:val="single" w:color="auto" w:sz="4" w:space="0"/>
           </w:tblBorders>
+          <w:tblCellMar>
+            <w:top w:w="0" w:type="dxa"/>
+            <w:left w:w="108" w:type="dxa"/>
+            <w:bottom w:w="0" w:type="dxa"/>
+            <w:right w:w="108" w:type="dxa"/>
+          </w:tblCellMar>
         </w:tblPrEx>
         <w:tc>
           <w:tcPr>
@@ -27247,6 +27443,12 @@
             <w:insideH w:val="single" w:color="auto" w:sz="4" w:space="0"/>
             <w:insideV w:val="single" w:color="auto" w:sz="4" w:space="0"/>
           </w:tblBorders>
+          <w:tblCellMar>
+            <w:top w:w="0" w:type="dxa"/>
+            <w:left w:w="108" w:type="dxa"/>
+            <w:bottom w:w="0" w:type="dxa"/>
+            <w:right w:w="108" w:type="dxa"/>
+          </w:tblCellMar>
         </w:tblPrEx>
         <w:tc>
           <w:tcPr>
@@ -33031,17 +33233,7 @@
                 <w:color w:val="FF0000"/>
                 <w:lang w:val="en-US" w:eastAsia="zh-CN"/>
               </w:rPr>
-              <w:t>ConcatDataset(datasets</w:t>
-            </w:r>
-            <w:bookmarkStart w:id="44" w:name="_GoBack"/>
-            <w:bookmarkEnd w:id="44"/>
-            <w:r>
-              <w:rPr>
-                <w:rFonts w:hint="eastAsia"/>
-                <w:color w:val="FF0000"/>
-                <w:lang w:val="en-US" w:eastAsia="zh-CN"/>
-              </w:rPr>
-              <w:t>)</w:t>
+              <w:t>ConcatDataset(datasets)</w:t>
             </w:r>
           </w:p>
         </w:tc>
@@ -45311,12 +45503,6 @@
             <w:insideH w:val="single" w:color="auto" w:sz="4" w:space="0"/>
             <w:insideV w:val="single" w:color="auto" w:sz="4" w:space="0"/>
           </w:tblBorders>
-          <w:tblCellMar>
-            <w:top w:w="0" w:type="dxa"/>
-            <w:left w:w="108" w:type="dxa"/>
-            <w:bottom w:w="0" w:type="dxa"/>
-            <w:right w:w="108" w:type="dxa"/>
-          </w:tblCellMar>
         </w:tblPrEx>
         <w:tc>
           <w:tcPr>

</xml_diff>

<commit_message>
update on 2025-11-13 14:04:07.839536
</commit_message>
<xml_diff>
--- a/py 深度学习.docx
+++ b/py 深度学习.docx
@@ -2671,12 +2671,6 @@
             <w:insideH w:val="single" w:color="auto" w:sz="4" w:space="0"/>
             <w:insideV w:val="single" w:color="auto" w:sz="4" w:space="0"/>
           </w:tblBorders>
-          <w:tblCellMar>
-            <w:top w:w="0" w:type="dxa"/>
-            <w:left w:w="108" w:type="dxa"/>
-            <w:bottom w:w="0" w:type="dxa"/>
-            <w:right w:w="108" w:type="dxa"/>
-          </w:tblCellMar>
         </w:tblPrEx>
         <w:tc>
           <w:tcPr>
@@ -7474,12 +7468,6 @@
             <w:insideH w:val="single" w:color="auto" w:sz="4" w:space="0"/>
             <w:insideV w:val="single" w:color="auto" w:sz="4" w:space="0"/>
           </w:tblBorders>
-          <w:tblCellMar>
-            <w:top w:w="0" w:type="dxa"/>
-            <w:left w:w="108" w:type="dxa"/>
-            <w:bottom w:w="0" w:type="dxa"/>
-            <w:right w:w="108" w:type="dxa"/>
-          </w:tblCellMar>
         </w:tblPrEx>
         <w:tc>
           <w:tcPr>
@@ -8786,12 +8774,6 @@
             <w:insideH w:val="single" w:color="auto" w:sz="4" w:space="0"/>
             <w:insideV w:val="single" w:color="auto" w:sz="4" w:space="0"/>
           </w:tblBorders>
-          <w:tblCellMar>
-            <w:top w:w="0" w:type="dxa"/>
-            <w:left w:w="108" w:type="dxa"/>
-            <w:bottom w:w="0" w:type="dxa"/>
-            <w:right w:w="108" w:type="dxa"/>
-          </w:tblCellMar>
         </w:tblPrEx>
         <w:tc>
           <w:tcPr>
@@ -8992,6 +8974,12 @@
             <w:insideH w:val="single" w:color="auto" w:sz="4" w:space="0"/>
             <w:insideV w:val="single" w:color="auto" w:sz="4" w:space="0"/>
           </w:tblBorders>
+          <w:tblCellMar>
+            <w:top w:w="0" w:type="dxa"/>
+            <w:left w:w="108" w:type="dxa"/>
+            <w:bottom w:w="0" w:type="dxa"/>
+            <w:right w:w="108" w:type="dxa"/>
+          </w:tblCellMar>
         </w:tblPrEx>
         <w:tc>
           <w:tcPr>
@@ -10071,6 +10059,12 @@
             <w:insideH w:val="single" w:color="auto" w:sz="4" w:space="0"/>
             <w:insideV w:val="single" w:color="auto" w:sz="4" w:space="0"/>
           </w:tblBorders>
+          <w:tblCellMar>
+            <w:top w:w="0" w:type="dxa"/>
+            <w:left w:w="108" w:type="dxa"/>
+            <w:bottom w:w="0" w:type="dxa"/>
+            <w:right w:w="108" w:type="dxa"/>
+          </w:tblCellMar>
         </w:tblPrEx>
         <w:tc>
           <w:tcPr>
@@ -10717,6 +10711,12 @@
             <w:insideH w:val="single" w:color="auto" w:sz="4" w:space="0"/>
             <w:insideV w:val="single" w:color="auto" w:sz="4" w:space="0"/>
           </w:tblBorders>
+          <w:tblCellMar>
+            <w:top w:w="0" w:type="dxa"/>
+            <w:left w:w="108" w:type="dxa"/>
+            <w:bottom w:w="0" w:type="dxa"/>
+            <w:right w:w="108" w:type="dxa"/>
+          </w:tblCellMar>
         </w:tblPrEx>
         <w:tc>
           <w:tcPr>
@@ -12202,6 +12202,12 @@
             <w:insideH w:val="single" w:color="auto" w:sz="4" w:space="0"/>
             <w:insideV w:val="single" w:color="auto" w:sz="4" w:space="0"/>
           </w:tblBorders>
+          <w:tblCellMar>
+            <w:top w:w="0" w:type="dxa"/>
+            <w:left w:w="108" w:type="dxa"/>
+            <w:bottom w:w="0" w:type="dxa"/>
+            <w:right w:w="108" w:type="dxa"/>
+          </w:tblCellMar>
         </w:tblPrEx>
         <w:tc>
           <w:tcPr>
@@ -13809,8 +13815,6 @@
           </w14:textFill>
         </w:rPr>
       </w:pPr>
-      <w:bookmarkStart w:id="44" w:name="_GoBack"/>
-      <w:bookmarkEnd w:id="44"/>
     </w:p>
     <w:p>
       <w:pPr>
@@ -15139,6 +15143,12 @@
             <w:insideH w:val="single" w:color="auto" w:sz="4" w:space="0"/>
             <w:insideV w:val="single" w:color="auto" w:sz="4" w:space="0"/>
           </w:tblBorders>
+          <w:tblCellMar>
+            <w:top w:w="0" w:type="dxa"/>
+            <w:left w:w="108" w:type="dxa"/>
+            <w:bottom w:w="0" w:type="dxa"/>
+            <w:right w:w="108" w:type="dxa"/>
+          </w:tblCellMar>
         </w:tblPrEx>
         <w:tc>
           <w:tcPr>
@@ -17470,12 +17480,6 @@
             <w:insideH w:val="single" w:color="auto" w:sz="4" w:space="0"/>
             <w:insideV w:val="single" w:color="auto" w:sz="4" w:space="0"/>
           </w:tblBorders>
-          <w:tblCellMar>
-            <w:top w:w="0" w:type="dxa"/>
-            <w:left w:w="108" w:type="dxa"/>
-            <w:bottom w:w="0" w:type="dxa"/>
-            <w:right w:w="108" w:type="dxa"/>
-          </w:tblCellMar>
         </w:tblPrEx>
         <w:tc>
           <w:tcPr>
@@ -17630,6 +17634,12 @@
             <w:insideH w:val="single" w:color="auto" w:sz="4" w:space="0"/>
             <w:insideV w:val="single" w:color="auto" w:sz="4" w:space="0"/>
           </w:tblBorders>
+          <w:tblCellMar>
+            <w:top w:w="0" w:type="dxa"/>
+            <w:left w:w="108" w:type="dxa"/>
+            <w:bottom w:w="0" w:type="dxa"/>
+            <w:right w:w="108" w:type="dxa"/>
+          </w:tblCellMar>
         </w:tblPrEx>
         <w:tc>
           <w:tcPr>
@@ -21673,7 +21683,7 @@
       <w:tblGrid>
         <w:gridCol w:w="3746"/>
         <w:gridCol w:w="3196"/>
-        <w:gridCol w:w="2712"/>
+        <w:gridCol w:w="2315"/>
       </w:tblGrid>
       <w:tr>
         <w:tblPrEx>
@@ -23304,7 +23314,7 @@
       </w:tblPr>
       <w:tblGrid>
         <w:gridCol w:w="5125"/>
-        <w:gridCol w:w="4537"/>
+        <w:gridCol w:w="4402"/>
       </w:tblGrid>
       <w:tr>
         <w:tblPrEx>
@@ -24868,6 +24878,12 @@
             <w:insideH w:val="single" w:color="auto" w:sz="4" w:space="0"/>
             <w:insideV w:val="single" w:color="auto" w:sz="4" w:space="0"/>
           </w:tblBorders>
+          <w:tblCellMar>
+            <w:top w:w="0" w:type="dxa"/>
+            <w:left w:w="108" w:type="dxa"/>
+            <w:bottom w:w="0" w:type="dxa"/>
+            <w:right w:w="108" w:type="dxa"/>
+          </w:tblCellMar>
         </w:tblPrEx>
         <w:tc>
           <w:tcPr>
@@ -27999,12 +28015,6 @@
             <w:insideH w:val="single" w:color="auto" w:sz="4" w:space="0"/>
             <w:insideV w:val="single" w:color="auto" w:sz="4" w:space="0"/>
           </w:tblBorders>
-          <w:tblCellMar>
-            <w:top w:w="0" w:type="dxa"/>
-            <w:left w:w="108" w:type="dxa"/>
-            <w:bottom w:w="0" w:type="dxa"/>
-            <w:right w:w="108" w:type="dxa"/>
-          </w:tblCellMar>
         </w:tblPrEx>
         <w:tc>
           <w:tcPr>
@@ -28403,6 +28413,12 @@
             <w:insideH w:val="single" w:color="auto" w:sz="4" w:space="0"/>
             <w:insideV w:val="single" w:color="auto" w:sz="4" w:space="0"/>
           </w:tblBorders>
+          <w:tblCellMar>
+            <w:top w:w="0" w:type="dxa"/>
+            <w:left w:w="108" w:type="dxa"/>
+            <w:bottom w:w="0" w:type="dxa"/>
+            <w:right w:w="108" w:type="dxa"/>
+          </w:tblCellMar>
         </w:tblPrEx>
         <w:tc>
           <w:tcPr>
@@ -31012,6 +31028,12 @@
             <w:insideH w:val="single" w:color="auto" w:sz="4" w:space="0"/>
             <w:insideV w:val="single" w:color="auto" w:sz="4" w:space="0"/>
           </w:tblBorders>
+          <w:tblCellMar>
+            <w:top w:w="0" w:type="dxa"/>
+            <w:left w:w="108" w:type="dxa"/>
+            <w:bottom w:w="0" w:type="dxa"/>
+            <w:right w:w="108" w:type="dxa"/>
+          </w:tblCellMar>
         </w:tblPrEx>
         <w:tc>
           <w:tcPr>
@@ -33396,12 +33418,6 @@
             <w:insideH w:val="single" w:color="auto" w:sz="4" w:space="0"/>
             <w:insideV w:val="single" w:color="auto" w:sz="4" w:space="0"/>
           </w:tblBorders>
-          <w:tblCellMar>
-            <w:top w:w="0" w:type="dxa"/>
-            <w:left w:w="108" w:type="dxa"/>
-            <w:bottom w:w="0" w:type="dxa"/>
-            <w:right w:w="108" w:type="dxa"/>
-          </w:tblCellMar>
         </w:tblPrEx>
         <w:tc>
           <w:tcPr>
@@ -34858,6 +34874,12 @@
             <w:insideH w:val="single" w:color="auto" w:sz="4" w:space="0"/>
             <w:insideV w:val="single" w:color="auto" w:sz="4" w:space="0"/>
           </w:tblBorders>
+          <w:tblCellMar>
+            <w:top w:w="0" w:type="dxa"/>
+            <w:left w:w="108" w:type="dxa"/>
+            <w:bottom w:w="0" w:type="dxa"/>
+            <w:right w:w="108" w:type="dxa"/>
+          </w:tblCellMar>
         </w:tblPrEx>
         <w:tc>
           <w:tcPr>
@@ -36414,7 +36436,39 @@
           <w:color w:val="0070C0"/>
           <w:lang w:val="en-US" w:eastAsia="zh-CN"/>
         </w:rPr>
-        <w:t>diff-gaussian-rasterization</w:t>
+        <w:t>diff</w:t>
+      </w:r>
+      <w:r>
+        <w:rPr>
+          <w:rFonts w:hint="eastAsia"/>
+          <w:color w:val="0070C0"/>
+          <w:lang w:val="en-US" w:eastAsia="zh-CN"/>
+        </w:rPr>
+        <w:t>_</w:t>
+      </w:r>
+      <w:r>
+        <w:rPr>
+          <w:rFonts w:hint="default"/>
+          <w:color w:val="0070C0"/>
+          <w:lang w:val="en-US" w:eastAsia="zh-CN"/>
+        </w:rPr>
+        <w:t>gaussian</w:t>
+      </w:r>
+      <w:r>
+        <w:rPr>
+          <w:rFonts w:hint="eastAsia"/>
+          <w:color w:val="0070C0"/>
+          <w:lang w:val="en-US" w:eastAsia="zh-CN"/>
+        </w:rPr>
+        <w:t>_</w:t>
+      </w:r>
+      <w:r>
+        <w:rPr>
+          <w:rFonts w:hint="default"/>
+          <w:color w:val="0070C0"/>
+          <w:lang w:val="en-US" w:eastAsia="zh-CN"/>
+        </w:rPr>
+        <w:t>rasterization</w:t>
       </w:r>
       <w:r>
         <w:rPr>
@@ -38199,6 +38253,12 @@
             <w:insideH w:val="single" w:color="auto" w:sz="4" w:space="0"/>
             <w:insideV w:val="single" w:color="auto" w:sz="4" w:space="0"/>
           </w:tblBorders>
+          <w:tblCellMar>
+            <w:top w:w="0" w:type="dxa"/>
+            <w:left w:w="108" w:type="dxa"/>
+            <w:bottom w:w="0" w:type="dxa"/>
+            <w:right w:w="108" w:type="dxa"/>
+          </w:tblCellMar>
         </w:tblPrEx>
         <w:tc>
           <w:tcPr>
@@ -38864,20 +38924,6 @@
         </w:rPr>
         <w:t>import pytorch_lightning as pl</w:t>
       </w:r>
-      <w:r>
-        <w:rPr>
-          <w:rFonts w:hint="eastAsia"/>
-          <w:color w:val="ED7D31" w:themeColor="accent2"/>
-          <w:u w:val="single"/>
-          <w:lang w:val="en-US" w:eastAsia="zh-CN"/>
-          <w14:textFill>
-            <w14:solidFill>
-              <w14:schemeClr w14:val="accent2"/>
-            </w14:solidFill>
-          </w14:textFill>
-        </w:rPr>
-        <w:t>0</w:t>
-      </w:r>
     </w:p>
     <w:p>
       <w:pPr>
@@ -41735,6 +41781,12 @@
             <w:insideH w:val="single" w:color="auto" w:sz="4" w:space="0"/>
             <w:insideV w:val="single" w:color="auto" w:sz="4" w:space="0"/>
           </w:tblBorders>
+          <w:tblCellMar>
+            <w:top w:w="0" w:type="dxa"/>
+            <w:left w:w="108" w:type="dxa"/>
+            <w:bottom w:w="0" w:type="dxa"/>
+            <w:right w:w="108" w:type="dxa"/>
+          </w:tblCellMar>
         </w:tblPrEx>
         <w:tc>
           <w:tcPr>
@@ -42596,8 +42648,8 @@
         </w:tblCellMar>
       </w:tblPr>
       <w:tblGrid>
-        <w:gridCol w:w="1274"/>
-        <w:gridCol w:w="5630"/>
+        <w:gridCol w:w="1057"/>
+        <w:gridCol w:w="4669"/>
         <w:gridCol w:w="3691"/>
       </w:tblGrid>
       <w:tr>
@@ -42629,43 +42681,6 @@
               <w:bidi w:val="0"/>
               <w:jc w:val="both"/>
               <w:rPr>
-                <w:rFonts w:hint="default"/>
-                <w:lang w:val="en-US" w:eastAsia="zh-CN"/>
-              </w:rPr>
-            </w:pPr>
-            <w:r>
-              <w:rPr>
-                <w:rFonts w:hint="eastAsia" w:cs="华文中宋"/>
-                <w:b/>
-                <w:bCs/>
-                <w:color w:val="FF0000"/>
-                <w:kern w:val="2"/>
-                <w:sz w:val="21"/>
-                <w:szCs w:val="21"/>
-                <w:lang w:val="en-US" w:eastAsia="zh-CN" w:bidi="ar-SA"/>
-              </w:rPr>
-              <w:t xml:space="preserve">LightningModule </w:t>
-            </w:r>
-            <w:r>
-              <w:rPr>
-                <w:rFonts w:hint="eastAsia" w:cs="华文中宋"/>
-                <w:b/>
-                <w:bCs/>
-                <w:color w:val="ED7D31" w:themeColor="accent2"/>
-                <w:kern w:val="2"/>
-                <w:sz w:val="21"/>
-                <w:szCs w:val="21"/>
-                <w:lang w:val="en-US" w:eastAsia="zh-CN" w:bidi="ar-SA"/>
-                <w14:textFill>
-                  <w14:solidFill>
-                    <w14:schemeClr w14:val="accent2"/>
-                  </w14:solidFill>
-                </w14:textFill>
-              </w:rPr>
-              <w:t>&lt;- (</w:t>
-            </w:r>
-            <w:r>
-              <w:rPr>
                 <w:rFonts w:hint="eastAsia" w:cs="华文中宋"/>
                 <w:b/>
                 <w:bCs/>
@@ -42681,8 +42696,89 @@
                   </w14:solidFill>
                 </w14:textFill>
               </w:rPr>
-              <w:t>CheckpointHooks, DataHooks, ModelHooks</w:t>
-            </w:r>
+            </w:pPr>
+            <w:r>
+              <w:rPr>
+                <w:rFonts w:hint="eastAsia" w:cs="华文中宋"/>
+                <w:b/>
+                <w:bCs/>
+                <w:color w:val="FF0000"/>
+                <w:kern w:val="2"/>
+                <w:sz w:val="21"/>
+                <w:szCs w:val="21"/>
+                <w:lang w:val="en-US" w:eastAsia="zh-CN" w:bidi="ar-SA"/>
+              </w:rPr>
+              <w:t xml:space="preserve">LightningModule </w:t>
+            </w:r>
+            <w:r>
+              <w:rPr>
+                <w:rFonts w:hint="eastAsia" w:cs="华文中宋"/>
+                <w:b/>
+                <w:bCs/>
+                <w:color w:val="ED7D31" w:themeColor="accent2"/>
+                <w:kern w:val="2"/>
+                <w:sz w:val="21"/>
+                <w:szCs w:val="21"/>
+                <w:lang w:val="en-US" w:eastAsia="zh-CN" w:bidi="ar-SA"/>
+                <w14:textFill>
+                  <w14:solidFill>
+                    <w14:schemeClr w14:val="accent2"/>
+                  </w14:solidFill>
+                </w14:textFill>
+              </w:rPr>
+              <w:t>&lt;- (</w:t>
+            </w:r>
+            <w:r>
+              <w:rPr>
+                <w:rFonts w:hint="eastAsia" w:cs="华文中宋"/>
+                <w:b/>
+                <w:bCs/>
+                <w:color w:val="ED7D31" w:themeColor="accent2"/>
+                <w:kern w:val="2"/>
+                <w:sz w:val="21"/>
+                <w:szCs w:val="21"/>
+                <w:vertAlign w:val="baseline"/>
+                <w:lang w:val="en-US" w:eastAsia="zh-CN" w:bidi="ar-SA"/>
+                <w14:textFill>
+                  <w14:solidFill>
+                    <w14:schemeClr w14:val="accent2"/>
+                  </w14:solidFill>
+                </w14:textFill>
+              </w:rPr>
+              <w:t xml:space="preserve">CheckpointHooks, DataHooks, </w:t>
+            </w:r>
+          </w:p>
+          <w:p>
+            <w:pPr>
+              <w:pStyle w:val="26"/>
+              <w:bidi w:val="0"/>
+              <w:jc w:val="both"/>
+              <w:rPr>
+                <w:rFonts w:hint="default"/>
+                <w:lang w:val="en-US" w:eastAsia="zh-CN"/>
+              </w:rPr>
+            </w:pPr>
+            <w:r>
+              <w:rPr>
+                <w:rFonts w:hint="eastAsia" w:cs="华文中宋"/>
+                <w:b/>
+                <w:bCs/>
+                <w:color w:val="ED7D31" w:themeColor="accent2"/>
+                <w:kern w:val="2"/>
+                <w:sz w:val="21"/>
+                <w:szCs w:val="21"/>
+                <w:vertAlign w:val="baseline"/>
+                <w:lang w:val="en-US" w:eastAsia="zh-CN" w:bidi="ar-SA"/>
+                <w14:textFill>
+                  <w14:solidFill>
+                    <w14:schemeClr w14:val="accent2"/>
+                  </w14:solidFill>
+                </w14:textFill>
+              </w:rPr>
+              <w:t>ModelHooks, nn.Module</w:t>
+            </w:r>
+            <w:bookmarkStart w:id="44" w:name="_GoBack"/>
+            <w:bookmarkEnd w:id="44"/>
             <w:r>
               <w:rPr>
                 <w:rFonts w:hint="eastAsia" w:cs="华文中宋"/>
@@ -45503,6 +45599,12 @@
             <w:insideH w:val="single" w:color="auto" w:sz="4" w:space="0"/>
             <w:insideV w:val="single" w:color="auto" w:sz="4" w:space="0"/>
           </w:tblBorders>
+          <w:tblCellMar>
+            <w:top w:w="0" w:type="dxa"/>
+            <w:left w:w="108" w:type="dxa"/>
+            <w:bottom w:w="0" w:type="dxa"/>
+            <w:right w:w="108" w:type="dxa"/>
+          </w:tblCellMar>
         </w:tblPrEx>
         <w:tc>
           <w:tcPr>
@@ -49095,12 +49197,6 @@
             <w:insideH w:val="single" w:color="auto" w:sz="4" w:space="0"/>
             <w:insideV w:val="single" w:color="auto" w:sz="4" w:space="0"/>
           </w:tblBorders>
-          <w:tblCellMar>
-            <w:top w:w="0" w:type="dxa"/>
-            <w:left w:w="108" w:type="dxa"/>
-            <w:bottom w:w="0" w:type="dxa"/>
-            <w:right w:w="108" w:type="dxa"/>
-          </w:tblCellMar>
         </w:tblPrEx>
         <w:tc>
           <w:tcPr>

</xml_diff>

<commit_message>
update on 2025-11-14 13:38:04.813097
</commit_message>
<xml_diff>
--- a/py 深度学习.docx
+++ b/py 深度学习.docx
@@ -2671,6 +2671,12 @@
             <w:insideH w:val="single" w:color="auto" w:sz="4" w:space="0"/>
             <w:insideV w:val="single" w:color="auto" w:sz="4" w:space="0"/>
           </w:tblBorders>
+          <w:tblCellMar>
+            <w:top w:w="0" w:type="dxa"/>
+            <w:left w:w="108" w:type="dxa"/>
+            <w:bottom w:w="0" w:type="dxa"/>
+            <w:right w:w="108" w:type="dxa"/>
+          </w:tblCellMar>
         </w:tblPrEx>
         <w:tc>
           <w:tcPr>
@@ -7468,6 +7474,12 @@
             <w:insideH w:val="single" w:color="auto" w:sz="4" w:space="0"/>
             <w:insideV w:val="single" w:color="auto" w:sz="4" w:space="0"/>
           </w:tblBorders>
+          <w:tblCellMar>
+            <w:top w:w="0" w:type="dxa"/>
+            <w:left w:w="108" w:type="dxa"/>
+            <w:bottom w:w="0" w:type="dxa"/>
+            <w:right w:w="108" w:type="dxa"/>
+          </w:tblCellMar>
         </w:tblPrEx>
         <w:tc>
           <w:tcPr>
@@ -7858,8 +7870,8 @@
           <w:color w:val="00B0F0"/>
         </w:rPr>
       </w:pPr>
-      <w:bookmarkStart w:id="9" w:name="_Toc19634"/>
-      <w:bookmarkStart w:id="10" w:name="_Toc30205"/>
+      <w:bookmarkStart w:id="9" w:name="_Toc30205"/>
+      <w:bookmarkStart w:id="10" w:name="_Toc19634"/>
       <w:r>
         <w:rPr>
           <w:rFonts w:hint="eastAsia"/>
@@ -7906,12 +7918,6 @@
             <w:insideH w:val="single" w:color="auto" w:sz="4" w:space="0"/>
             <w:insideV w:val="single" w:color="auto" w:sz="4" w:space="0"/>
           </w:tblBorders>
-          <w:tblCellMar>
-            <w:top w:w="0" w:type="dxa"/>
-            <w:left w:w="108" w:type="dxa"/>
-            <w:bottom w:w="0" w:type="dxa"/>
-            <w:right w:w="108" w:type="dxa"/>
-          </w:tblCellMar>
         </w:tblPrEx>
         <w:tc>
           <w:tcPr>
@@ -8234,8 +8240,8 @@
           <w:color w:val="00B0F0"/>
         </w:rPr>
       </w:pPr>
-      <w:bookmarkStart w:id="11" w:name="_Toc14682"/>
-      <w:bookmarkStart w:id="12" w:name="_Toc5488"/>
+      <w:bookmarkStart w:id="11" w:name="_Toc5488"/>
+      <w:bookmarkStart w:id="12" w:name="_Toc14682"/>
       <w:r>
         <w:rPr>
           <w:rFonts w:hint="eastAsia"/>
@@ -8384,12 +8390,6 @@
             <w:insideH w:val="single" w:color="auto" w:sz="4" w:space="0"/>
             <w:insideV w:val="single" w:color="auto" w:sz="4" w:space="0"/>
           </w:tblBorders>
-          <w:tblCellMar>
-            <w:top w:w="0" w:type="dxa"/>
-            <w:left w:w="108" w:type="dxa"/>
-            <w:bottom w:w="0" w:type="dxa"/>
-            <w:right w:w="108" w:type="dxa"/>
-          </w:tblCellMar>
         </w:tblPrEx>
         <w:tc>
           <w:tcPr>
@@ -8774,6 +8774,12 @@
             <w:insideH w:val="single" w:color="auto" w:sz="4" w:space="0"/>
             <w:insideV w:val="single" w:color="auto" w:sz="4" w:space="0"/>
           </w:tblBorders>
+          <w:tblCellMar>
+            <w:top w:w="0" w:type="dxa"/>
+            <w:left w:w="108" w:type="dxa"/>
+            <w:bottom w:w="0" w:type="dxa"/>
+            <w:right w:w="108" w:type="dxa"/>
+          </w:tblCellMar>
         </w:tblPrEx>
         <w:tc>
           <w:tcPr>
@@ -12442,12 +12448,6 @@
             <w:insideH w:val="single" w:color="auto" w:sz="4" w:space="0"/>
             <w:insideV w:val="single" w:color="auto" w:sz="4" w:space="0"/>
           </w:tblBorders>
-          <w:tblCellMar>
-            <w:top w:w="0" w:type="dxa"/>
-            <w:left w:w="108" w:type="dxa"/>
-            <w:bottom w:w="0" w:type="dxa"/>
-            <w:right w:w="108" w:type="dxa"/>
-          </w:tblCellMar>
         </w:tblPrEx>
         <w:tc>
           <w:tcPr>
@@ -13047,12 +13047,6 @@
             <w:insideH w:val="single" w:color="auto" w:sz="4" w:space="0"/>
             <w:insideV w:val="single" w:color="auto" w:sz="4" w:space="0"/>
           </w:tblBorders>
-          <w:tblCellMar>
-            <w:top w:w="0" w:type="dxa"/>
-            <w:left w:w="108" w:type="dxa"/>
-            <w:bottom w:w="0" w:type="dxa"/>
-            <w:right w:w="108" w:type="dxa"/>
-          </w:tblCellMar>
         </w:tblPrEx>
         <w:tc>
           <w:tcPr>
@@ -15246,12 +15240,6 @@
             <w:insideH w:val="single" w:color="auto" w:sz="4" w:space="0"/>
             <w:insideV w:val="single" w:color="auto" w:sz="4" w:space="0"/>
           </w:tblBorders>
-          <w:tblCellMar>
-            <w:top w:w="0" w:type="dxa"/>
-            <w:left w:w="108" w:type="dxa"/>
-            <w:bottom w:w="0" w:type="dxa"/>
-            <w:right w:w="108" w:type="dxa"/>
-          </w:tblCellMar>
         </w:tblPrEx>
         <w:tc>
           <w:tcPr>
@@ -25336,11 +25324,12 @@
           <m:fName>
             <m:r>
               <m:rPr>
-                <m:sty m:val="bi"/>
+                <m:sty m:val="b"/>
               </m:rPr>
               <w:rPr>
-                <w:rFonts w:ascii="Cambria Math" w:hAnsi="Cambria Math"/>
-                <w:color w:val="ED7D31" w:themeColor="accent2"/>
+                <w:rFonts w:hint="default" w:ascii="Cambria Math" w:hAnsi="Cambria Math"/>
+                <w:color w:val="ED7D31" w:themeColor="accent2"/>
+                <w:spacing w:val="7"/>
                 <w14:textFill>
                   <w14:solidFill>
                     <w14:schemeClr w14:val="accent2"/>
@@ -25582,12 +25571,6 @@
             <w:insideH w:val="single" w:color="auto" w:sz="4" w:space="0"/>
             <w:insideV w:val="single" w:color="auto" w:sz="4" w:space="0"/>
           </w:tblBorders>
-          <w:tblCellMar>
-            <w:top w:w="0" w:type="dxa"/>
-            <w:left w:w="108" w:type="dxa"/>
-            <w:bottom w:w="0" w:type="dxa"/>
-            <w:right w:w="108" w:type="dxa"/>
-          </w:tblCellMar>
         </w:tblPrEx>
         <w:tc>
           <w:tcPr>
@@ -28015,6 +27998,12 @@
             <w:insideH w:val="single" w:color="auto" w:sz="4" w:space="0"/>
             <w:insideV w:val="single" w:color="auto" w:sz="4" w:space="0"/>
           </w:tblBorders>
+          <w:tblCellMar>
+            <w:top w:w="0" w:type="dxa"/>
+            <w:left w:w="108" w:type="dxa"/>
+            <w:bottom w:w="0" w:type="dxa"/>
+            <w:right w:w="108" w:type="dxa"/>
+          </w:tblCellMar>
         </w:tblPrEx>
         <w:tc>
           <w:tcPr>
@@ -28496,10 +28485,10 @@
                 <m:fName>
                   <m:r>
                     <m:rPr>
-                      <m:sty m:val="bi"/>
+                      <m:sty m:val="b"/>
                     </m:rPr>
                     <w:rPr>
-                      <w:rFonts w:ascii="Cambria Math" w:hAnsi="Cambria Math"/>
+                      <w:rFonts w:hint="default" w:ascii="Cambria Math" w:hAnsi="Cambria Math"/>
                       <w:color w:val="ED7D31" w:themeColor="accent2"/>
                       <w:spacing w:val="7"/>
                       <w14:textFill>
@@ -29147,8 +29136,10 @@
           <w:p>
             <w:pPr>
               <w:rPr>
-                <w:color w:val="ED7D31" w:themeColor="accent2"/>
-                <w:spacing w:val="7"/>
+                <w:rFonts w:hint="eastAsia"/>
+                <w:color w:val="ED7D31" w:themeColor="accent2"/>
+                <w:spacing w:val="7"/>
+                <w:lang w:val="en-US" w:eastAsia="zh-CN"/>
                 <w14:textFill>
                   <w14:solidFill>
                     <w14:schemeClr w14:val="accent2"/>
@@ -29169,13 +29160,40 @@
                 <w:rFonts w:hint="eastAsia"/>
                 <w:color w:val="ED7D31" w:themeColor="accent2"/>
                 <w:spacing w:val="7"/>
-                <w14:textFill>
-                  <w14:solidFill>
-                    <w14:schemeClr w14:val="accent2"/>
-                  </w14:solidFill>
-                </w14:textFill>
-              </w:rPr>
-              <w:t>：softmax → nll_loss</w:t>
+                <w:lang w:val="en-US" w:eastAsia="zh-CN"/>
+                <w14:textFill>
+                  <w14:solidFill>
+                    <w14:schemeClr w14:val="accent2"/>
+                  </w14:solidFill>
+                </w14:textFill>
+              </w:rPr>
+              <w:t xml:space="preserve"> (正概率的负对数)：</w:t>
+            </w:r>
+          </w:p>
+          <w:p>
+            <w:pPr>
+              <w:rPr>
+                <w:color w:val="ED7D31" w:themeColor="accent2"/>
+                <w:spacing w:val="7"/>
+                <w14:textFill>
+                  <w14:solidFill>
+                    <w14:schemeClr w14:val="accent2"/>
+                  </w14:solidFill>
+                </w14:textFill>
+              </w:rPr>
+            </w:pPr>
+            <w:r>
+              <w:rPr>
+                <w:rFonts w:hint="eastAsia"/>
+                <w:color w:val="ED7D31" w:themeColor="accent2"/>
+                <w:spacing w:val="7"/>
+                <w14:textFill>
+                  <w14:solidFill>
+                    <w14:schemeClr w14:val="accent2"/>
+                  </w14:solidFill>
+                </w14:textFill>
+              </w:rPr>
+              <w:t>softmax → nll_loss</w:t>
             </w:r>
           </w:p>
         </w:tc>
@@ -29232,6 +29250,59 @@
           <w:p>
             <w:pPr>
               <w:rPr>
+                <w:rFonts w:hint="default" w:eastAsia="华文中宋"/>
+                <w:color w:val="ED7D31" w:themeColor="accent2"/>
+                <w:spacing w:val="7"/>
+                <w:lang w:val="en-US" w:eastAsia="zh-CN"/>
+                <w14:textFill>
+                  <w14:solidFill>
+                    <w14:schemeClr w14:val="accent2"/>
+                  </w14:solidFill>
+                </w14:textFill>
+              </w:rPr>
+            </w:pPr>
+            <w:r>
+              <w:rPr>
+                <w:rFonts w:hint="eastAsia"/>
+                <w:color w:val="EA82F1"/>
+                <w:spacing w:val="7"/>
+              </w:rPr>
+              <w:t>二元交叉熵</w:t>
+            </w:r>
+            <w:r>
+              <w:rPr>
+                <w:rFonts w:hint="eastAsia"/>
+                <w:color w:val="ED7D31" w:themeColor="accent2"/>
+                <w:spacing w:val="7"/>
+                <w:lang w:val="en-US" w:eastAsia="zh-CN"/>
+                <w14:textFill>
+                  <w14:solidFill>
+                    <w14:schemeClr w14:val="accent2"/>
+                  </w14:solidFill>
+                </w14:textFill>
+              </w:rPr>
+              <w:t xml:space="preserve"> (正负概率的负对数)</w:t>
+            </w:r>
+            <w:bookmarkStart w:id="44" w:name="_GoBack"/>
+            <w:bookmarkEnd w:id="44"/>
+            <w:r>
+              <w:rPr>
+                <w:rFonts w:hint="eastAsia"/>
+                <w:color w:val="ED7D31" w:themeColor="accent2"/>
+                <w:spacing w:val="7"/>
+                <w:lang w:val="en-US" w:eastAsia="zh-CN"/>
+                <w14:textFill>
+                  <w14:solidFill>
+                    <w14:schemeClr w14:val="accent2"/>
+                  </w14:solidFill>
+                </w14:textFill>
+              </w:rPr>
+              <w:t>：</w:t>
+            </w:r>
+          </w:p>
+          <w:p>
+            <w:pPr>
+              <w:rPr>
                 <w:rFonts w:ascii="Cambria Math" w:hAnsi="Cambria Math"/>
                 <w:color w:val="ED7D31" w:themeColor="accent2"/>
                 <w:spacing w:val="7"/>
@@ -29243,273 +29314,254 @@
                 <w:oMath/>
               </w:rPr>
             </w:pPr>
-            <w:r>
-              <w:rPr>
-                <w:rFonts w:hint="eastAsia"/>
-                <w:color w:val="EA82F1"/>
-                <w:spacing w:val="7"/>
-              </w:rPr>
-              <w:t>二元交叉熵</w:t>
-            </w:r>
-            <w:r>
-              <w:rPr>
-                <w:rFonts w:hint="eastAsia"/>
-                <w:color w:val="ED7D31" w:themeColor="accent2"/>
-                <w:spacing w:val="7"/>
-                <w14:textFill>
-                  <w14:solidFill>
-                    <w14:schemeClr w14:val="accent2"/>
-                  </w14:solidFill>
-                </w14:textFill>
-              </w:rPr>
-              <w:t>：</w:t>
-            </w:r>
-            <m:oMath>
-              <m:r>
-                <m:rPr>
-                  <m:sty m:val="bi"/>
-                </m:rPr>
-                <w:rPr>
-                  <w:rFonts w:ascii="Cambria Math" w:hAnsi="Cambria Math"/>
-                  <w:color w:val="ED7D31" w:themeColor="accent2"/>
-                  <w:spacing w:val="7"/>
-                  <w14:textFill>
-                    <w14:solidFill>
-                      <w14:schemeClr w14:val="accent2"/>
-                    </w14:solidFill>
-                  </w14:textFill>
-                </w:rPr>
-                <m:t>−[y</m:t>
-              </m:r>
-              <m:r>
-                <m:rPr>
-                  <m:sty m:val="bi"/>
-                </m:rPr>
-                <w:rPr>
-                  <w:rFonts w:hint="eastAsia" w:ascii="Cambria Math" w:hAnsi="Cambria Math"/>
-                  <w:color w:val="ED7D31" w:themeColor="accent2"/>
-                  <w:spacing w:val="7"/>
-                  <w14:textFill>
-                    <w14:solidFill>
-                      <w14:schemeClr w14:val="accent2"/>
-                    </w14:solidFill>
-                  </w14:textFill>
-                </w:rPr>
-                <m:t>·</m:t>
-              </m:r>
-              <m:func>
-                <m:funcPr>
-                  <m:ctrlPr>
-                    <w:rPr>
-                      <w:rFonts w:ascii="Cambria Math" w:hAnsi="Cambria Math"/>
-                      <w:i/>
-                      <w:iCs/>
-                      <w:color w:val="ED7D31" w:themeColor="accent2"/>
-                      <w:spacing w:val="7"/>
-                      <w14:textFill>
-                        <w14:solidFill>
-                          <w14:schemeClr w14:val="accent2"/>
-                        </w14:solidFill>
-                      </w14:textFill>
-                    </w:rPr>
-                  </m:ctrlPr>
-                </m:funcPr>
-                <m:fName>
-                  <m:r>
-                    <m:rPr>
-                      <m:sty m:val="bi"/>
-                    </m:rPr>
-                    <w:rPr>
-                      <w:rFonts w:ascii="Cambria Math" w:hAnsi="Cambria Math"/>
-                      <w:color w:val="ED7D31" w:themeColor="accent2"/>
-                      <w:spacing w:val="7"/>
-                      <w14:textFill>
-                        <w14:solidFill>
-                          <w14:schemeClr w14:val="accent2"/>
-                        </w14:solidFill>
-                      </w14:textFill>
-                    </w:rPr>
-                    <m:t>ln</m:t>
-                  </m:r>
-                  <m:ctrlPr>
-                    <w:rPr>
-                      <w:rFonts w:ascii="Cambria Math" w:hAnsi="Cambria Math"/>
-                      <w:i/>
-                      <w:iCs/>
-                      <w:color w:val="ED7D31" w:themeColor="accent2"/>
-                      <w:spacing w:val="7"/>
-                      <w14:textFill>
-                        <w14:solidFill>
-                          <w14:schemeClr w14:val="accent2"/>
-                        </w14:solidFill>
-                      </w14:textFill>
-                    </w:rPr>
-                  </m:ctrlPr>
-                </m:fName>
-                <m:e>
-                  <m:r>
-                    <m:rPr>
-                      <m:sty m:val="bi"/>
-                    </m:rPr>
-                    <w:rPr>
-                      <w:rFonts w:ascii="Cambria Math" w:hAnsi="Cambria Math"/>
-                      <w:color w:val="ED7D31" w:themeColor="accent2"/>
-                      <w:spacing w:val="7"/>
-                      <w14:textFill>
-                        <w14:solidFill>
-                          <w14:schemeClr w14:val="accent2"/>
-                        </w14:solidFill>
-                      </w14:textFill>
-                    </w:rPr>
-                    <m:t>p</m:t>
-                  </m:r>
-                  <m:ctrlPr>
-                    <w:rPr>
-                      <w:rFonts w:ascii="Cambria Math" w:hAnsi="Cambria Math"/>
-                      <w:i/>
-                      <w:iCs/>
-                      <w:color w:val="ED7D31" w:themeColor="accent2"/>
-                      <w:spacing w:val="7"/>
-                      <w14:textFill>
-                        <w14:solidFill>
-                          <w14:schemeClr w14:val="accent2"/>
-                        </w14:solidFill>
-                      </w14:textFill>
-                    </w:rPr>
-                  </m:ctrlPr>
-                </m:e>
-              </m:func>
-              <m:r>
-                <m:rPr>
-                  <m:sty m:val="bi"/>
-                </m:rPr>
-                <w:rPr>
-                  <w:rFonts w:ascii="Cambria Math" w:hAnsi="Cambria Math"/>
-                  <w:color w:val="ED7D31" w:themeColor="accent2"/>
-                  <w:spacing w:val="7"/>
-                  <w14:textFill>
-                    <w14:solidFill>
-                      <w14:schemeClr w14:val="accent2"/>
-                    </w14:solidFill>
-                  </w14:textFill>
-                </w:rPr>
-                <m:t>+(1−y)</m:t>
-              </m:r>
-              <m:r>
-                <m:rPr>
-                  <m:sty m:val="bi"/>
-                </m:rPr>
-                <w:rPr>
-                  <w:rFonts w:hint="eastAsia" w:ascii="Cambria Math" w:hAnsi="Cambria Math"/>
-                  <w:color w:val="ED7D31" w:themeColor="accent2"/>
-                  <w:spacing w:val="7"/>
-                  <w14:textFill>
-                    <w14:solidFill>
-                      <w14:schemeClr w14:val="accent2"/>
-                    </w14:solidFill>
-                  </w14:textFill>
-                </w:rPr>
-                <m:t>·</m:t>
-              </m:r>
-              <m:func>
-                <m:funcPr>
-                  <m:ctrlPr>
-                    <w:rPr>
-                      <w:rFonts w:ascii="Cambria Math" w:hAnsi="Cambria Math"/>
-                      <w:i/>
-                      <w:iCs/>
-                      <w:color w:val="ED7D31" w:themeColor="accent2"/>
-                      <w:spacing w:val="7"/>
-                      <w14:textFill>
-                        <w14:solidFill>
-                          <w14:schemeClr w14:val="accent2"/>
-                        </w14:solidFill>
-                      </w14:textFill>
-                    </w:rPr>
-                  </m:ctrlPr>
-                </m:funcPr>
-                <m:fName>
-                  <m:r>
-                    <m:rPr>
-                      <m:sty m:val="bi"/>
-                    </m:rPr>
-                    <w:rPr>
-                      <w:rFonts w:ascii="Cambria Math" w:hAnsi="Cambria Math"/>
-                      <w:color w:val="ED7D31" w:themeColor="accent2"/>
-                      <w:spacing w:val="7"/>
-                      <w14:textFill>
-                        <w14:solidFill>
-                          <w14:schemeClr w14:val="accent2"/>
-                        </w14:solidFill>
-                      </w14:textFill>
-                    </w:rPr>
-                    <m:t>ln</m:t>
-                  </m:r>
-                  <m:ctrlPr>
-                    <w:rPr>
-                      <w:rFonts w:ascii="Cambria Math" w:hAnsi="Cambria Math"/>
-                      <w:i/>
-                      <w:iCs/>
-                      <w:color w:val="ED7D31" w:themeColor="accent2"/>
-                      <w:spacing w:val="7"/>
-                      <w14:textFill>
-                        <w14:solidFill>
-                          <w14:schemeClr w14:val="accent2"/>
-                        </w14:solidFill>
-                      </w14:textFill>
-                    </w:rPr>
-                  </m:ctrlPr>
-                </m:fName>
-                <m:e>
-                  <m:r>
-                    <m:rPr>
-                      <m:sty m:val="bi"/>
-                    </m:rPr>
-                    <w:rPr>
-                      <w:rFonts w:ascii="Cambria Math" w:hAnsi="Cambria Math"/>
-                      <w:color w:val="ED7D31" w:themeColor="accent2"/>
-                      <w:spacing w:val="7"/>
-                      <w14:textFill>
-                        <w14:solidFill>
-                          <w14:schemeClr w14:val="accent2"/>
-                        </w14:solidFill>
-                      </w14:textFill>
-                    </w:rPr>
-                    <m:t>(1−p)</m:t>
-                  </m:r>
-                  <m:ctrlPr>
-                    <w:rPr>
-                      <w:rFonts w:ascii="Cambria Math" w:hAnsi="Cambria Math"/>
-                      <w:i/>
-                      <w:iCs/>
-                      <w:color w:val="ED7D31" w:themeColor="accent2"/>
-                      <w:spacing w:val="7"/>
-                      <w14:textFill>
-                        <w14:solidFill>
-                          <w14:schemeClr w14:val="accent2"/>
-                        </w14:solidFill>
-                      </w14:textFill>
-                    </w:rPr>
-                  </m:ctrlPr>
-                </m:e>
-              </m:func>
-              <m:r>
-                <m:rPr>
-                  <m:sty m:val="bi"/>
-                </m:rPr>
-                <w:rPr>
-                  <w:rFonts w:ascii="Cambria Math" w:hAnsi="Cambria Math"/>
-                  <w:color w:val="ED7D31" w:themeColor="accent2"/>
-                  <w:spacing w:val="7"/>
-                  <w14:textFill>
-                    <w14:solidFill>
-                      <w14:schemeClr w14:val="accent2"/>
-                    </w14:solidFill>
-                  </w14:textFill>
-                </w:rPr>
-                <m:t>]</m:t>
-              </m:r>
-            </m:oMath>
+            <m:oMathPara>
+              <m:oMath>
+                <m:r>
+                  <m:rPr>
+                    <m:sty m:val="bi"/>
+                  </m:rPr>
+                  <w:rPr>
+                    <w:rFonts w:ascii="Cambria Math" w:hAnsi="Cambria Math"/>
+                    <w:color w:val="ED7D31" w:themeColor="accent2"/>
+                    <w:spacing w:val="7"/>
+                    <w14:textFill>
+                      <w14:solidFill>
+                        <w14:schemeClr w14:val="accent2"/>
+                      </w14:solidFill>
+                    </w14:textFill>
+                  </w:rPr>
+                  <m:t>−[y</m:t>
+                </m:r>
+                <m:r>
+                  <m:rPr>
+                    <m:sty m:val="bi"/>
+                  </m:rPr>
+                  <w:rPr>
+                    <w:rFonts w:hint="eastAsia" w:ascii="Cambria Math" w:hAnsi="Cambria Math"/>
+                    <w:color w:val="ED7D31" w:themeColor="accent2"/>
+                    <w:spacing w:val="7"/>
+                    <w14:textFill>
+                      <w14:solidFill>
+                        <w14:schemeClr w14:val="accent2"/>
+                      </w14:solidFill>
+                    </w14:textFill>
+                  </w:rPr>
+                  <m:t>·</m:t>
+                </m:r>
+                <m:func>
+                  <m:funcPr>
+                    <m:ctrlPr>
+                      <w:rPr>
+                        <w:rFonts w:ascii="Cambria Math" w:hAnsi="Cambria Math"/>
+                        <w:i/>
+                        <w:iCs/>
+                        <w:color w:val="ED7D31" w:themeColor="accent2"/>
+                        <w:spacing w:val="7"/>
+                        <w14:textFill>
+                          <w14:solidFill>
+                            <w14:schemeClr w14:val="accent2"/>
+                          </w14:solidFill>
+                        </w14:textFill>
+                      </w:rPr>
+                    </m:ctrlPr>
+                  </m:funcPr>
+                  <m:fName>
+                    <m:r>
+                      <m:rPr>
+                        <m:sty m:val="b"/>
+                      </m:rPr>
+                      <w:rPr>
+                        <w:rFonts w:hint="default" w:ascii="Cambria Math" w:hAnsi="Cambria Math"/>
+                        <w:color w:val="ED7D31" w:themeColor="accent2"/>
+                        <w:spacing w:val="7"/>
+                        <w14:textFill>
+                          <w14:solidFill>
+                            <w14:schemeClr w14:val="accent2"/>
+                          </w14:solidFill>
+                        </w14:textFill>
+                      </w:rPr>
+                      <m:t>ln</m:t>
+                    </m:r>
+                    <m:ctrlPr>
+                      <w:rPr>
+                        <w:rFonts w:ascii="Cambria Math" w:hAnsi="Cambria Math"/>
+                        <w:i/>
+                        <w:iCs/>
+                        <w:color w:val="ED7D31" w:themeColor="accent2"/>
+                        <w:spacing w:val="7"/>
+                        <w14:textFill>
+                          <w14:solidFill>
+                            <w14:schemeClr w14:val="accent2"/>
+                          </w14:solidFill>
+                        </w14:textFill>
+                      </w:rPr>
+                    </m:ctrlPr>
+                  </m:fName>
+                  <m:e>
+                    <m:r>
+                      <m:rPr>
+                        <m:sty m:val="bi"/>
+                      </m:rPr>
+                      <w:rPr>
+                        <w:rFonts w:ascii="Cambria Math" w:hAnsi="Cambria Math"/>
+                        <w:color w:val="ED7D31" w:themeColor="accent2"/>
+                        <w:spacing w:val="7"/>
+                        <w14:textFill>
+                          <w14:solidFill>
+                            <w14:schemeClr w14:val="accent2"/>
+                          </w14:solidFill>
+                        </w14:textFill>
+                      </w:rPr>
+                      <m:t>p</m:t>
+                    </m:r>
+                    <m:ctrlPr>
+                      <w:rPr>
+                        <w:rFonts w:ascii="Cambria Math" w:hAnsi="Cambria Math"/>
+                        <w:i/>
+                        <w:iCs/>
+                        <w:color w:val="ED7D31" w:themeColor="accent2"/>
+                        <w:spacing w:val="7"/>
+                        <w14:textFill>
+                          <w14:solidFill>
+                            <w14:schemeClr w14:val="accent2"/>
+                          </w14:solidFill>
+                        </w14:textFill>
+                      </w:rPr>
+                    </m:ctrlPr>
+                  </m:e>
+                </m:func>
+                <m:r>
+                  <m:rPr>
+                    <m:sty m:val="bi"/>
+                  </m:rPr>
+                  <w:rPr>
+                    <w:rFonts w:ascii="Cambria Math" w:hAnsi="Cambria Math"/>
+                    <w:color w:val="ED7D31" w:themeColor="accent2"/>
+                    <w:spacing w:val="7"/>
+                    <w14:textFill>
+                      <w14:solidFill>
+                        <w14:schemeClr w14:val="accent2"/>
+                      </w14:solidFill>
+                    </w14:textFill>
+                  </w:rPr>
+                  <m:t>+(1−y)</m:t>
+                </m:r>
+                <m:r>
+                  <m:rPr>
+                    <m:sty m:val="bi"/>
+                  </m:rPr>
+                  <w:rPr>
+                    <w:rFonts w:hint="eastAsia" w:ascii="Cambria Math" w:hAnsi="Cambria Math"/>
+                    <w:color w:val="ED7D31" w:themeColor="accent2"/>
+                    <w:spacing w:val="7"/>
+                    <w14:textFill>
+                      <w14:solidFill>
+                        <w14:schemeClr w14:val="accent2"/>
+                      </w14:solidFill>
+                    </w14:textFill>
+                  </w:rPr>
+                  <m:t>·</m:t>
+                </m:r>
+                <m:func>
+                  <m:funcPr>
+                    <m:ctrlPr>
+                      <w:rPr>
+                        <w:rFonts w:ascii="Cambria Math" w:hAnsi="Cambria Math"/>
+                        <w:i/>
+                        <w:iCs/>
+                        <w:color w:val="ED7D31" w:themeColor="accent2"/>
+                        <w:spacing w:val="7"/>
+                        <w14:textFill>
+                          <w14:solidFill>
+                            <w14:schemeClr w14:val="accent2"/>
+                          </w14:solidFill>
+                        </w14:textFill>
+                      </w:rPr>
+                    </m:ctrlPr>
+                  </m:funcPr>
+                  <m:fName>
+                    <m:r>
+                      <m:rPr>
+                        <m:sty m:val="b"/>
+                      </m:rPr>
+                      <w:rPr>
+                        <w:rFonts w:hint="default" w:ascii="Cambria Math" w:hAnsi="Cambria Math"/>
+                        <w:color w:val="ED7D31" w:themeColor="accent2"/>
+                        <w:spacing w:val="7"/>
+                        <w14:textFill>
+                          <w14:solidFill>
+                            <w14:schemeClr w14:val="accent2"/>
+                          </w14:solidFill>
+                        </w14:textFill>
+                      </w:rPr>
+                      <m:t>ln</m:t>
+                    </m:r>
+                    <m:ctrlPr>
+                      <w:rPr>
+                        <w:rFonts w:ascii="Cambria Math" w:hAnsi="Cambria Math"/>
+                        <w:i/>
+                        <w:iCs/>
+                        <w:color w:val="ED7D31" w:themeColor="accent2"/>
+                        <w:spacing w:val="7"/>
+                        <w14:textFill>
+                          <w14:solidFill>
+                            <w14:schemeClr w14:val="accent2"/>
+                          </w14:solidFill>
+                        </w14:textFill>
+                      </w:rPr>
+                    </m:ctrlPr>
+                  </m:fName>
+                  <m:e>
+                    <m:r>
+                      <m:rPr>
+                        <m:sty m:val="bi"/>
+                      </m:rPr>
+                      <w:rPr>
+                        <w:rFonts w:ascii="Cambria Math" w:hAnsi="Cambria Math"/>
+                        <w:color w:val="ED7D31" w:themeColor="accent2"/>
+                        <w:spacing w:val="7"/>
+                        <w14:textFill>
+                          <w14:solidFill>
+                            <w14:schemeClr w14:val="accent2"/>
+                          </w14:solidFill>
+                        </w14:textFill>
+                      </w:rPr>
+                      <m:t>(1−p)</m:t>
+                    </m:r>
+                    <m:ctrlPr>
+                      <w:rPr>
+                        <w:rFonts w:ascii="Cambria Math" w:hAnsi="Cambria Math"/>
+                        <w:i/>
+                        <w:iCs/>
+                        <w:color w:val="ED7D31" w:themeColor="accent2"/>
+                        <w:spacing w:val="7"/>
+                        <w14:textFill>
+                          <w14:solidFill>
+                            <w14:schemeClr w14:val="accent2"/>
+                          </w14:solidFill>
+                        </w14:textFill>
+                      </w:rPr>
+                    </m:ctrlPr>
+                  </m:e>
+                </m:func>
+                <m:r>
+                  <m:rPr>
+                    <m:sty m:val="bi"/>
+                  </m:rPr>
+                  <w:rPr>
+                    <w:rFonts w:ascii="Cambria Math" w:hAnsi="Cambria Math"/>
+                    <w:color w:val="ED7D31" w:themeColor="accent2"/>
+                    <w:spacing w:val="7"/>
+                    <w14:textFill>
+                      <w14:solidFill>
+                        <w14:schemeClr w14:val="accent2"/>
+                      </w14:solidFill>
+                    </w14:textFill>
+                  </w:rPr>
+                  <m:t>]</m:t>
+                </m:r>
+              </m:oMath>
+            </m:oMathPara>
           </w:p>
         </w:tc>
       </w:tr>
@@ -29713,11 +29765,12 @@
                 <m:fName>
                   <m:r>
                     <m:rPr>
-                      <m:sty m:val="bi"/>
+                      <m:sty m:val="b"/>
                     </m:rPr>
                     <w:rPr>
-                      <w:rFonts w:ascii="Cambria Math" w:hAnsi="Cambria Math"/>
+                      <w:rFonts w:hint="default" w:ascii="Cambria Math" w:hAnsi="Cambria Math"/>
                       <w:color w:val="ED7D31" w:themeColor="accent2"/>
+                      <w:spacing w:val="7"/>
                       <w14:textFill>
                         <w14:solidFill>
                           <w14:schemeClr w14:val="accent2"/>
@@ -29995,11 +30048,12 @@
                 <m:fName>
                   <m:r>
                     <m:rPr>
-                      <m:sty m:val="bi"/>
+                      <m:sty m:val="b"/>
                     </m:rPr>
                     <w:rPr>
-                      <w:rFonts w:ascii="Cambria Math" w:hAnsi="Cambria Math"/>
+                      <w:rFonts w:hint="default" w:ascii="Cambria Math" w:hAnsi="Cambria Math"/>
                       <w:color w:val="ED7D31" w:themeColor="accent2"/>
+                      <w:spacing w:val="7"/>
                       <w14:textFill>
                         <w14:solidFill>
                           <w14:schemeClr w14:val="accent2"/>
@@ -30882,12 +30936,6 @@
             <w:insideH w:val="single" w:color="auto" w:sz="4" w:space="0"/>
             <w:insideV w:val="single" w:color="auto" w:sz="4" w:space="0"/>
           </w:tblBorders>
-          <w:tblCellMar>
-            <w:top w:w="0" w:type="dxa"/>
-            <w:left w:w="108" w:type="dxa"/>
-            <w:bottom w:w="0" w:type="dxa"/>
-            <w:right w:w="108" w:type="dxa"/>
-          </w:tblCellMar>
         </w:tblPrEx>
         <w:tc>
           <w:tcPr>
@@ -33418,6 +33466,12 @@
             <w:insideH w:val="single" w:color="auto" w:sz="4" w:space="0"/>
             <w:insideV w:val="single" w:color="auto" w:sz="4" w:space="0"/>
           </w:tblBorders>
+          <w:tblCellMar>
+            <w:top w:w="0" w:type="dxa"/>
+            <w:left w:w="108" w:type="dxa"/>
+            <w:bottom w:w="0" w:type="dxa"/>
+            <w:right w:w="108" w:type="dxa"/>
+          </w:tblCellMar>
         </w:tblPrEx>
         <w:tc>
           <w:tcPr>
@@ -35333,12 +35387,6 @@
             <w:insideH w:val="single" w:color="auto" w:sz="4" w:space="0"/>
             <w:insideV w:val="single" w:color="auto" w:sz="4" w:space="0"/>
           </w:tblBorders>
-          <w:tblCellMar>
-            <w:top w:w="0" w:type="dxa"/>
-            <w:left w:w="108" w:type="dxa"/>
-            <w:bottom w:w="0" w:type="dxa"/>
-            <w:right w:w="108" w:type="dxa"/>
-          </w:tblCellMar>
         </w:tblPrEx>
         <w:tc>
           <w:tcPr>
@@ -39019,12 +39067,6 @@
             <w:insideH w:val="single" w:color="auto" w:sz="4" w:space="0"/>
             <w:insideV w:val="single" w:color="auto" w:sz="4" w:space="0"/>
           </w:tblBorders>
-          <w:tblCellMar>
-            <w:top w:w="0" w:type="dxa"/>
-            <w:left w:w="108" w:type="dxa"/>
-            <w:bottom w:w="0" w:type="dxa"/>
-            <w:right w:w="108" w:type="dxa"/>
-          </w:tblCellMar>
         </w:tblPrEx>
         <w:tc>
           <w:tcPr>
@@ -42777,8 +42819,6 @@
               </w:rPr>
               <w:t>ModelHooks, nn.Module</w:t>
             </w:r>
-            <w:bookmarkStart w:id="44" w:name="_GoBack"/>
-            <w:bookmarkEnd w:id="44"/>
             <w:r>
               <w:rPr>
                 <w:rFonts w:hint="eastAsia" w:cs="华文中宋"/>
@@ -48585,12 +48625,6 @@
             <w:insideH w:val="single" w:color="auto" w:sz="4" w:space="0"/>
             <w:insideV w:val="single" w:color="auto" w:sz="4" w:space="0"/>
           </w:tblBorders>
-          <w:tblCellMar>
-            <w:top w:w="0" w:type="dxa"/>
-            <w:left w:w="108" w:type="dxa"/>
-            <w:bottom w:w="0" w:type="dxa"/>
-            <w:right w:w="108" w:type="dxa"/>
-          </w:tblCellMar>
         </w:tblPrEx>
         <w:tc>
           <w:tcPr>
@@ -49197,6 +49231,12 @@
             <w:insideH w:val="single" w:color="auto" w:sz="4" w:space="0"/>
             <w:insideV w:val="single" w:color="auto" w:sz="4" w:space="0"/>
           </w:tblBorders>
+          <w:tblCellMar>
+            <w:top w:w="0" w:type="dxa"/>
+            <w:left w:w="108" w:type="dxa"/>
+            <w:bottom w:w="0" w:type="dxa"/>
+            <w:right w:w="108" w:type="dxa"/>
+          </w:tblCellMar>
         </w:tblPrEx>
         <w:tc>
           <w:tcPr>

</xml_diff>

<commit_message>
update on 2025-11-18 16:32:02.391814
</commit_message>
<xml_diff>
--- a/py 深度学习.docx
+++ b/py 深度学习.docx
@@ -173,12 +173,6 @@
             <w:insideH w:val="single" w:color="auto" w:sz="4" w:space="0"/>
             <w:insideV w:val="single" w:color="auto" w:sz="4" w:space="0"/>
           </w:tblBorders>
-          <w:tblCellMar>
-            <w:top w:w="0" w:type="dxa"/>
-            <w:left w:w="108" w:type="dxa"/>
-            <w:bottom w:w="0" w:type="dxa"/>
-            <w:right w:w="108" w:type="dxa"/>
-          </w:tblCellMar>
         </w:tblPrEx>
         <w:tc>
           <w:tcPr>
@@ -254,12 +248,6 @@
             <w:insideH w:val="single" w:color="auto" w:sz="4" w:space="0"/>
             <w:insideV w:val="single" w:color="auto" w:sz="4" w:space="0"/>
           </w:tblBorders>
-          <w:tblCellMar>
-            <w:top w:w="0" w:type="dxa"/>
-            <w:left w:w="108" w:type="dxa"/>
-            <w:bottom w:w="0" w:type="dxa"/>
-            <w:right w:w="108" w:type="dxa"/>
-          </w:tblCellMar>
         </w:tblPrEx>
         <w:tc>
           <w:tcPr>
@@ -335,12 +323,6 @@
             <w:insideH w:val="single" w:color="auto" w:sz="4" w:space="0"/>
             <w:insideV w:val="single" w:color="auto" w:sz="4" w:space="0"/>
           </w:tblBorders>
-          <w:tblCellMar>
-            <w:top w:w="0" w:type="dxa"/>
-            <w:left w:w="108" w:type="dxa"/>
-            <w:bottom w:w="0" w:type="dxa"/>
-            <w:right w:w="108" w:type="dxa"/>
-          </w:tblCellMar>
         </w:tblPrEx>
         <w:tc>
           <w:tcPr>
@@ -394,12 +376,6 @@
             <w:insideH w:val="single" w:color="auto" w:sz="4" w:space="0"/>
             <w:insideV w:val="single" w:color="auto" w:sz="4" w:space="0"/>
           </w:tblBorders>
-          <w:tblCellMar>
-            <w:top w:w="0" w:type="dxa"/>
-            <w:left w:w="108" w:type="dxa"/>
-            <w:bottom w:w="0" w:type="dxa"/>
-            <w:right w:w="108" w:type="dxa"/>
-          </w:tblCellMar>
         </w:tblPrEx>
         <w:tc>
           <w:tcPr>
@@ -7870,8 +7846,8 @@
           <w:color w:val="00B0F0"/>
         </w:rPr>
       </w:pPr>
-      <w:bookmarkStart w:id="9" w:name="_Toc30205"/>
-      <w:bookmarkStart w:id="10" w:name="_Toc19634"/>
+      <w:bookmarkStart w:id="9" w:name="_Toc19634"/>
+      <w:bookmarkStart w:id="10" w:name="_Toc30205"/>
       <w:r>
         <w:rPr>
           <w:rFonts w:hint="eastAsia"/>
@@ -8246,8 +8222,8 @@
           <w:color w:val="00B0F0"/>
         </w:rPr>
       </w:pPr>
-      <w:bookmarkStart w:id="11" w:name="_Toc5488"/>
-      <w:bookmarkStart w:id="12" w:name="_Toc14682"/>
+      <w:bookmarkStart w:id="11" w:name="_Toc14682"/>
+      <w:bookmarkStart w:id="12" w:name="_Toc5488"/>
       <w:r>
         <w:rPr>
           <w:rFonts w:hint="eastAsia"/>
@@ -8739,8 +8715,8 @@
           <w:color w:val="00B0F0"/>
         </w:rPr>
       </w:pPr>
-      <w:bookmarkStart w:id="13" w:name="_Toc18880"/>
-      <w:bookmarkStart w:id="14" w:name="_Toc3527"/>
+      <w:bookmarkStart w:id="13" w:name="_Toc3527"/>
+      <w:bookmarkStart w:id="14" w:name="_Toc18880"/>
       <w:r>
         <w:rPr>
           <w:rFonts w:hint="eastAsia"/>
@@ -12202,6 +12178,12 @@
             <w:insideH w:val="single" w:color="auto" w:sz="4" w:space="0"/>
             <w:insideV w:val="single" w:color="auto" w:sz="4" w:space="0"/>
           </w:tblBorders>
+          <w:tblCellMar>
+            <w:top w:w="0" w:type="dxa"/>
+            <w:left w:w="108" w:type="dxa"/>
+            <w:bottom w:w="0" w:type="dxa"/>
+            <w:right w:w="108" w:type="dxa"/>
+          </w:tblCellMar>
         </w:tblPrEx>
         <w:tc>
           <w:tcPr>
@@ -32708,18 +32690,7 @@
                 <w:spacing w:val="7"/>
                 <w:lang w:val="en-US" w:eastAsia="zh-CN"/>
               </w:rPr>
-              <w:t>T_max, eta_min, last_epoch=-1</w:t>
-            </w:r>
-            <w:bookmarkStart w:id="44" w:name="_GoBack"/>
-            <w:bookmarkEnd w:id="44"/>
-            <w:r>
-              <w:rPr>
-                <w:rFonts w:hint="eastAsia"/>
-                <w:color w:val="FF0000"/>
-                <w:spacing w:val="7"/>
-                <w:lang w:val="en-US" w:eastAsia="zh-CN"/>
-              </w:rPr>
-              <w:t>)</w:t>
+              <w:t>T_max, eta_min, last_epoch=-1)</w:t>
             </w:r>
           </w:p>
         </w:tc>
@@ -32760,12 +32731,6 @@
             <w:insideH w:val="single" w:color="auto" w:sz="4" w:space="0"/>
             <w:insideV w:val="single" w:color="auto" w:sz="4" w:space="0"/>
           </w:tblBorders>
-          <w:tblCellMar>
-            <w:top w:w="0" w:type="dxa"/>
-            <w:left w:w="108" w:type="dxa"/>
-            <w:bottom w:w="0" w:type="dxa"/>
-            <w:right w:w="108" w:type="dxa"/>
-          </w:tblCellMar>
         </w:tblPrEx>
         <w:tc>
           <w:tcPr>
@@ -34276,12 +34241,6 @@
             <w:insideH w:val="single" w:color="auto" w:sz="4" w:space="0"/>
             <w:insideV w:val="single" w:color="auto" w:sz="4" w:space="0"/>
           </w:tblBorders>
-          <w:tblCellMar>
-            <w:top w:w="0" w:type="dxa"/>
-            <w:left w:w="108" w:type="dxa"/>
-            <w:bottom w:w="0" w:type="dxa"/>
-            <w:right w:w="108" w:type="dxa"/>
-          </w:tblCellMar>
         </w:tblPrEx>
         <w:tc>
           <w:tcPr>
@@ -44216,7 +44175,22 @@
                 <w:szCs w:val="21"/>
                 <w:lang w:val="en-US" w:eastAsia="zh-CN" w:bidi="ar-SA"/>
               </w:rPr>
-              <w:t>max_epochs, check_val_every_n_epoch)</w:t>
+              <w:t>max_epochs, check_val_every_n_epoch, sync_batchnorm=True</w:t>
+            </w:r>
+            <w:bookmarkStart w:id="44" w:name="_GoBack"/>
+            <w:bookmarkEnd w:id="44"/>
+            <w:r>
+              <w:rPr>
+                <w:rFonts w:hint="eastAsia" w:cs="华文中宋"/>
+                <w:b/>
+                <w:bCs/>
+                <w:color w:val="FF0000"/>
+                <w:kern w:val="2"/>
+                <w:sz w:val="21"/>
+                <w:szCs w:val="21"/>
+                <w:lang w:val="en-US" w:eastAsia="zh-CN" w:bidi="ar-SA"/>
+              </w:rPr>
+              <w:t>)</w:t>
             </w:r>
           </w:p>
         </w:tc>
@@ -44387,7 +44361,6 @@
           <w:tcPr>
             <w:tcW w:w="0" w:type="auto"/>
             <w:vMerge w:val="continue"/>
-            <w:tcBorders/>
             <w:vAlign w:val="center"/>
           </w:tcPr>
           <w:p>
@@ -46141,12 +46114,6 @@
             <w:insideH w:val="single" w:color="auto" w:sz="4" w:space="0"/>
             <w:insideV w:val="single" w:color="auto" w:sz="4" w:space="0"/>
           </w:tblBorders>
-          <w:tblCellMar>
-            <w:top w:w="0" w:type="dxa"/>
-            <w:left w:w="108" w:type="dxa"/>
-            <w:bottom w:w="0" w:type="dxa"/>
-            <w:right w:w="108" w:type="dxa"/>
-          </w:tblCellMar>
         </w:tblPrEx>
         <w:tc>
           <w:tcPr>
@@ -48112,12 +48079,6 @@
             <w:insideH w:val="single" w:color="auto" w:sz="4" w:space="0"/>
             <w:insideV w:val="single" w:color="auto" w:sz="4" w:space="0"/>
           </w:tblBorders>
-          <w:tblCellMar>
-            <w:top w:w="0" w:type="dxa"/>
-            <w:left w:w="108" w:type="dxa"/>
-            <w:bottom w:w="0" w:type="dxa"/>
-            <w:right w:w="108" w:type="dxa"/>
-          </w:tblCellMar>
         </w:tblPrEx>
         <w:tc>
           <w:tcPr>

</xml_diff>